<commit_message>
Update PDF CTA slide text and add clickable link to jsPDF
</commit_message>
<xml_diff>
--- a/google_adsens.docx
+++ b/google_adsens.docx
@@ -18586,15 +18586,14 @@
         <w:t>!</w:t>
       </w:r>
     </w:p>
-    <w:p/>
     <w:p>
-      <w:r>
-        <w:rPr>
-          <w:b/>
-          <w:bCs/>
-        </w:rPr>
-        <w:t xml:space="preserve">2. </w:t>
-      </w:r>
+      <w:pPr>
+        <w:pStyle w:val="ListParagraph"/>
+        <w:numPr>
+          <w:ilvl w:val="0"/>
+          <w:numId w:val="9"/>
+        </w:numPr>
+      </w:pPr>
       <w:proofErr w:type="spellStart"/>
       <w:r>
         <w:rPr>
@@ -19030,11 +19029,149 @@
       </w:r>
       <w:proofErr w:type="spellEnd"/>
       <w:r>
-        <w:t xml:space="preserve"> </w:t>
-      </w:r>
+        <w:t xml:space="preserve"> un </w:t>
+      </w:r>
+      <w:proofErr w:type="spellStart"/>
+      <w:r>
+        <w:t>vizitator</w:t>
+      </w:r>
+      <w:proofErr w:type="spellEnd"/>
+      <w:r>
+        <w:t xml:space="preserve"> care face 3 click-</w:t>
+      </w:r>
+      <w:proofErr w:type="spellStart"/>
       <w:r>
         <w:lastRenderedPageBreak/>
-        <w:t xml:space="preserve">un </w:t>
+        <w:t>uri</w:t>
+      </w:r>
+      <w:proofErr w:type="spellEnd"/>
+      <w:r>
+        <w:t xml:space="preserve"> </w:t>
+      </w:r>
+      <w:proofErr w:type="spellStart"/>
+      <w:r>
+        <w:t>este</w:t>
+      </w:r>
+      <w:proofErr w:type="spellEnd"/>
+      <w:r>
+        <w:t xml:space="preserve"> de sub </w:t>
+      </w:r>
+      <w:r>
+        <w:rPr>
+          <w:b/>
+          <w:bCs/>
+        </w:rPr>
+        <w:t xml:space="preserve">0.0001 </w:t>
+      </w:r>
+      <w:proofErr w:type="spellStart"/>
+      <w:r>
+        <w:rPr>
+          <w:b/>
+          <w:bCs/>
+        </w:rPr>
+        <w:t>dolari</w:t>
+      </w:r>
+      <w:proofErr w:type="spellEnd"/>
+      <w:r>
+        <w:t> (</w:t>
+      </w:r>
+      <w:proofErr w:type="spellStart"/>
+      <w:r>
+        <w:t>adică</w:t>
+      </w:r>
+      <w:proofErr w:type="spellEnd"/>
+      <w:r>
+        <w:t xml:space="preserve"> </w:t>
+      </w:r>
+      <w:proofErr w:type="spellStart"/>
+      <w:r>
+        <w:t>îți</w:t>
+      </w:r>
+      <w:proofErr w:type="spellEnd"/>
+      <w:r>
+        <w:t xml:space="preserve"> </w:t>
+      </w:r>
+      <w:proofErr w:type="spellStart"/>
+      <w:r>
+        <w:t>trebuie</w:t>
+      </w:r>
+      <w:proofErr w:type="spellEnd"/>
+      <w:r>
+        <w:t xml:space="preserve"> 10.000 de </w:t>
+      </w:r>
+      <w:proofErr w:type="spellStart"/>
+      <w:r>
+        <w:t>vizitatori</w:t>
+      </w:r>
+      <w:proofErr w:type="spellEnd"/>
+      <w:r>
+        <w:t xml:space="preserve"> care </w:t>
+      </w:r>
+      <w:proofErr w:type="spellStart"/>
+      <w:r>
+        <w:t>dau</w:t>
+      </w:r>
+      <w:proofErr w:type="spellEnd"/>
+      <w:r>
+        <w:t xml:space="preserve"> click-</w:t>
+      </w:r>
+      <w:proofErr w:type="spellStart"/>
+      <w:r>
+        <w:t>uri</w:t>
+      </w:r>
+      <w:proofErr w:type="spellEnd"/>
+      <w:r>
+        <w:t xml:space="preserve"> ca </w:t>
+      </w:r>
+      <w:proofErr w:type="spellStart"/>
+      <w:r>
+        <w:t>să</w:t>
+      </w:r>
+      <w:proofErr w:type="spellEnd"/>
+      <w:r>
+        <w:t xml:space="preserve"> </w:t>
+      </w:r>
+      <w:proofErr w:type="spellStart"/>
+      <w:r>
+        <w:t>plătești</w:t>
+      </w:r>
+      <w:proofErr w:type="spellEnd"/>
+      <w:r>
+        <w:t xml:space="preserve"> 1 </w:t>
+      </w:r>
+      <w:proofErr w:type="spellStart"/>
+      <w:r>
+        <w:t>dolar</w:t>
+      </w:r>
+      <w:proofErr w:type="spellEnd"/>
+      <w:r>
+        <w:t>).</w:t>
+      </w:r>
+    </w:p>
+    <w:p>
+      <w:proofErr w:type="spellStart"/>
+      <w:r>
+        <w:t>În</w:t>
+      </w:r>
+      <w:proofErr w:type="spellEnd"/>
+      <w:r>
+        <w:t xml:space="preserve"> </w:t>
+      </w:r>
+      <w:proofErr w:type="spellStart"/>
+      <w:r>
+        <w:t>acest</w:t>
+      </w:r>
+      <w:proofErr w:type="spellEnd"/>
+      <w:r>
+        <w:t xml:space="preserve"> moment, pe </w:t>
+      </w:r>
+      <w:proofErr w:type="spellStart"/>
+      <w:r>
+        <w:t>pagina</w:t>
+      </w:r>
+      <w:proofErr w:type="spellEnd"/>
+      <w:r>
+        <w:t xml:space="preserve"> de **Demo** (`/start`), un </w:t>
       </w:r>
       <w:proofErr w:type="spellStart"/>
       <w:r>
@@ -19042,15 +19179,838 @@
       </w:r>
       <w:proofErr w:type="spellEnd"/>
       <w:r>
-        <w:t xml:space="preserve"> care face 3 click-</w:t>
-      </w:r>
-      <w:proofErr w:type="spellStart"/>
-      <w:r>
-        <w:t>uri</w:t>
-      </w:r>
-      <w:proofErr w:type="spellEnd"/>
-      <w:r>
-        <w:t xml:space="preserve"> </w:t>
+        <w:t xml:space="preserve"> (de pe TikTok) se </w:t>
+      </w:r>
+      <w:proofErr w:type="spellStart"/>
+      <w:r>
+        <w:t>supune</w:t>
+      </w:r>
+      <w:proofErr w:type="spellEnd"/>
+      <w:r>
+        <w:t xml:space="preserve"> </w:t>
+      </w:r>
+      <w:proofErr w:type="spellStart"/>
+      <w:r>
+        <w:t>următoarelor</w:t>
+      </w:r>
+      <w:proofErr w:type="spellEnd"/>
+      <w:r>
+        <w:t xml:space="preserve"> reguli </w:t>
+      </w:r>
+      <w:proofErr w:type="spellStart"/>
+      <w:r>
+        <w:t>exacte</w:t>
+      </w:r>
+      <w:proofErr w:type="spellEnd"/>
+      <w:r>
+        <w:t xml:space="preserve"> pe care le-am </w:t>
+      </w:r>
+      <w:proofErr w:type="spellStart"/>
+      <w:r>
+        <w:t>scris</w:t>
+      </w:r>
+      <w:proofErr w:type="spellEnd"/>
+      <w:r>
+        <w:t xml:space="preserve"> </w:t>
+      </w:r>
+      <w:proofErr w:type="spellStart"/>
+      <w:r>
+        <w:t>în</w:t>
+      </w:r>
+      <w:proofErr w:type="spellEnd"/>
+      <w:r>
+        <w:t xml:space="preserve"> cod: 1. **Are </w:t>
+      </w:r>
+      <w:proofErr w:type="spellStart"/>
+      <w:r>
+        <w:t>voie</w:t>
+      </w:r>
+      <w:proofErr w:type="spellEnd"/>
+      <w:r>
+        <w:t xml:space="preserve"> </w:t>
+      </w:r>
+      <w:proofErr w:type="spellStart"/>
+      <w:r>
+        <w:t>să</w:t>
+      </w:r>
+      <w:proofErr w:type="spellEnd"/>
+      <w:r>
+        <w:t xml:space="preserve"> </w:t>
+      </w:r>
+      <w:proofErr w:type="spellStart"/>
+      <w:r>
+        <w:t>apese</w:t>
+      </w:r>
+      <w:proofErr w:type="spellEnd"/>
+      <w:r>
+        <w:t xml:space="preserve"> </w:t>
+      </w:r>
+      <w:proofErr w:type="spellStart"/>
+      <w:r>
+        <w:t>butonul</w:t>
+      </w:r>
+      <w:proofErr w:type="spellEnd"/>
+      <w:r>
+        <w:t xml:space="preserve"> "</w:t>
+      </w:r>
+      <w:proofErr w:type="spellStart"/>
+      <w:r>
+        <w:t>Generează</w:t>
+      </w:r>
+      <w:proofErr w:type="spellEnd"/>
+      <w:r>
+        <w:t xml:space="preserve"> </w:t>
+      </w:r>
+      <w:proofErr w:type="spellStart"/>
+      <w:r>
+        <w:t>Planul</w:t>
+      </w:r>
+      <w:proofErr w:type="spellEnd"/>
+      <w:r>
+        <w:t xml:space="preserve">" EXACT O DATĂ.** </w:t>
+      </w:r>
+      <w:proofErr w:type="spellStart"/>
+      <w:r>
+        <w:t>Dacă</w:t>
+      </w:r>
+      <w:proofErr w:type="spellEnd"/>
+      <w:r>
+        <w:t xml:space="preserve"> </w:t>
+      </w:r>
+      <w:proofErr w:type="spellStart"/>
+      <w:r>
+        <w:t>revine</w:t>
+      </w:r>
+      <w:proofErr w:type="spellEnd"/>
+      <w:r>
+        <w:t xml:space="preserve"> la </w:t>
+      </w:r>
+      <w:proofErr w:type="spellStart"/>
+      <w:r>
+        <w:t>pagina</w:t>
+      </w:r>
+      <w:proofErr w:type="spellEnd"/>
+      <w:r>
+        <w:t xml:space="preserve"> de start </w:t>
+      </w:r>
+      <w:proofErr w:type="spellStart"/>
+      <w:r>
+        <w:t>și</w:t>
+      </w:r>
+      <w:proofErr w:type="spellEnd"/>
+      <w:r>
+        <w:t xml:space="preserve"> </w:t>
+      </w:r>
+      <w:proofErr w:type="spellStart"/>
+      <w:r>
+        <w:t>încearcă</w:t>
+      </w:r>
+      <w:proofErr w:type="spellEnd"/>
+      <w:r>
+        <w:t xml:space="preserve"> </w:t>
+      </w:r>
+      <w:proofErr w:type="spellStart"/>
+      <w:r>
+        <w:t>să</w:t>
+      </w:r>
+      <w:proofErr w:type="spellEnd"/>
+      <w:r>
+        <w:t xml:space="preserve"> </w:t>
+      </w:r>
+      <w:proofErr w:type="spellStart"/>
+      <w:r>
+        <w:t>genereze</w:t>
+      </w:r>
+      <w:proofErr w:type="spellEnd"/>
+      <w:r>
+        <w:t xml:space="preserve"> un al </w:t>
+      </w:r>
+      <w:proofErr w:type="spellStart"/>
+      <w:r>
+        <w:t>doilea</w:t>
+      </w:r>
+      <w:proofErr w:type="spellEnd"/>
+      <w:r>
+        <w:t xml:space="preserve"> plan, </w:t>
+      </w:r>
+      <w:proofErr w:type="spellStart"/>
+      <w:r>
+        <w:t>aplicația</w:t>
+      </w:r>
+      <w:proofErr w:type="spellEnd"/>
+      <w:r>
+        <w:t xml:space="preserve"> </w:t>
+      </w:r>
+      <w:proofErr w:type="spellStart"/>
+      <w:r>
+        <w:t>îl</w:t>
+      </w:r>
+      <w:proofErr w:type="spellEnd"/>
+      <w:r>
+        <w:t xml:space="preserve"> </w:t>
+      </w:r>
+      <w:proofErr w:type="spellStart"/>
+      <w:r>
+        <w:t>blochează</w:t>
+      </w:r>
+      <w:proofErr w:type="spellEnd"/>
+      <w:r>
+        <w:t xml:space="preserve">, nu </w:t>
+      </w:r>
+      <w:proofErr w:type="spellStart"/>
+      <w:r>
+        <w:t>generează</w:t>
+      </w:r>
+      <w:proofErr w:type="spellEnd"/>
+      <w:r>
+        <w:t xml:space="preserve"> </w:t>
+      </w:r>
+      <w:proofErr w:type="spellStart"/>
+      <w:r>
+        <w:t>nimic</w:t>
+      </w:r>
+      <w:proofErr w:type="spellEnd"/>
+      <w:r>
+        <w:t xml:space="preserve"> </w:t>
+      </w:r>
+      <w:proofErr w:type="spellStart"/>
+      <w:r>
+        <w:t>și</w:t>
+      </w:r>
+      <w:proofErr w:type="spellEnd"/>
+      <w:r>
+        <w:t xml:space="preserve"> </w:t>
+      </w:r>
+      <w:proofErr w:type="spellStart"/>
+      <w:r>
+        <w:t>îi</w:t>
+      </w:r>
+      <w:proofErr w:type="spellEnd"/>
+      <w:r>
+        <w:t xml:space="preserve"> </w:t>
+      </w:r>
+      <w:proofErr w:type="spellStart"/>
+      <w:r>
+        <w:t>dă</w:t>
+      </w:r>
+      <w:proofErr w:type="spellEnd"/>
+      <w:r>
+        <w:t xml:space="preserve"> </w:t>
+      </w:r>
+      <w:proofErr w:type="spellStart"/>
+      <w:r>
+        <w:t>mesajul</w:t>
+      </w:r>
+      <w:proofErr w:type="spellEnd"/>
+      <w:r>
+        <w:t xml:space="preserve">: *"Ai </w:t>
+      </w:r>
+      <w:proofErr w:type="spellStart"/>
+      <w:r>
+        <w:t>atins</w:t>
+      </w:r>
+      <w:proofErr w:type="spellEnd"/>
+      <w:r>
+        <w:t xml:space="preserve"> </w:t>
+      </w:r>
+      <w:proofErr w:type="spellStart"/>
+      <w:r>
+        <w:t>limita</w:t>
+      </w:r>
+      <w:proofErr w:type="spellEnd"/>
+      <w:r>
+        <w:t xml:space="preserve"> de </w:t>
+      </w:r>
+      <w:proofErr w:type="spellStart"/>
+      <w:r>
+        <w:t>generări</w:t>
+      </w:r>
+      <w:proofErr w:type="spellEnd"/>
+      <w:r>
+        <w:t xml:space="preserve"> </w:t>
+      </w:r>
+      <w:proofErr w:type="spellStart"/>
+      <w:r>
+        <w:t>gratuite</w:t>
+      </w:r>
+      <w:proofErr w:type="spellEnd"/>
+      <w:r>
+        <w:t xml:space="preserve"> pe Demo. </w:t>
+      </w:r>
+      <w:proofErr w:type="spellStart"/>
+      <w:r>
+        <w:t>Creează</w:t>
+      </w:r>
+      <w:proofErr w:type="spellEnd"/>
+      <w:r>
+        <w:t xml:space="preserve"> un </w:t>
+      </w:r>
+      <w:proofErr w:type="spellStart"/>
+      <w:r>
+        <w:t>cont</w:t>
+      </w:r>
+      <w:proofErr w:type="spellEnd"/>
+      <w:r>
+        <w:t xml:space="preserve"> </w:t>
+      </w:r>
+      <w:proofErr w:type="spellStart"/>
+      <w:r>
+        <w:t>pentru</w:t>
+      </w:r>
+      <w:proofErr w:type="spellEnd"/>
+      <w:r>
+        <w:t xml:space="preserve"> a </w:t>
+      </w:r>
+      <w:proofErr w:type="gramStart"/>
+      <w:r>
+        <w:t>continua</w:t>
+      </w:r>
+      <w:proofErr w:type="gramEnd"/>
+      <w:r>
+        <w:t xml:space="preserve">."* 2. **Are </w:t>
+      </w:r>
+      <w:proofErr w:type="spellStart"/>
+      <w:r>
+        <w:t>voie</w:t>
+      </w:r>
+      <w:proofErr w:type="spellEnd"/>
+      <w:r>
+        <w:t xml:space="preserve"> </w:t>
+      </w:r>
+      <w:proofErr w:type="spellStart"/>
+      <w:r>
+        <w:t>să</w:t>
+      </w:r>
+      <w:proofErr w:type="spellEnd"/>
+      <w:r>
+        <w:t xml:space="preserve"> </w:t>
+      </w:r>
+      <w:proofErr w:type="spellStart"/>
+      <w:r>
+        <w:t>folosească</w:t>
+      </w:r>
+      <w:proofErr w:type="spellEnd"/>
+      <w:r>
+        <w:t xml:space="preserve"> </w:t>
+      </w:r>
+      <w:proofErr w:type="spellStart"/>
+      <w:r>
+        <w:t>Instrumentele</w:t>
+      </w:r>
+      <w:proofErr w:type="spellEnd"/>
+      <w:r>
+        <w:t xml:space="preserve"> de </w:t>
+      </w:r>
+      <w:proofErr w:type="spellStart"/>
+      <w:r>
+        <w:t>editare</w:t>
+      </w:r>
+      <w:proofErr w:type="spellEnd"/>
+      <w:r>
+        <w:t xml:space="preserve"> EXACT DE DOUĂ </w:t>
+      </w:r>
+      <w:proofErr w:type="gramStart"/>
+      <w:r>
+        <w:t>ORI.*</w:t>
+      </w:r>
+      <w:proofErr w:type="gramEnd"/>
+      <w:r>
+        <w:t xml:space="preserve">* (Ex: </w:t>
+      </w:r>
+      <w:proofErr w:type="spellStart"/>
+      <w:r>
+        <w:t>apasă</w:t>
+      </w:r>
+      <w:proofErr w:type="spellEnd"/>
+      <w:r>
+        <w:t xml:space="preserve"> "</w:t>
+      </w:r>
+      <w:proofErr w:type="spellStart"/>
+      <w:r>
+        <w:t>Optimizare</w:t>
+      </w:r>
+      <w:proofErr w:type="spellEnd"/>
+      <w:r>
+        <w:t xml:space="preserve"> </w:t>
+      </w:r>
+      <w:proofErr w:type="spellStart"/>
+      <w:r>
+        <w:t>Fonduri</w:t>
+      </w:r>
+      <w:proofErr w:type="spellEnd"/>
+      <w:r>
+        <w:t xml:space="preserve"> UE" </w:t>
+      </w:r>
+      <w:proofErr w:type="spellStart"/>
+      <w:r>
+        <w:t>și</w:t>
+      </w:r>
+      <w:proofErr w:type="spellEnd"/>
+      <w:r>
+        <w:t xml:space="preserve"> "</w:t>
+      </w:r>
+      <w:proofErr w:type="spellStart"/>
+      <w:r>
+        <w:t>Rescrie</w:t>
+      </w:r>
+      <w:proofErr w:type="spellEnd"/>
+      <w:r>
+        <w:t xml:space="preserve"> </w:t>
+      </w:r>
+      <w:proofErr w:type="spellStart"/>
+      <w:r>
+        <w:t>Tonul</w:t>
+      </w:r>
+      <w:proofErr w:type="spellEnd"/>
+      <w:r>
+        <w:t xml:space="preserve">"). </w:t>
+      </w:r>
+      <w:proofErr w:type="spellStart"/>
+      <w:r>
+        <w:t>Dacă</w:t>
+      </w:r>
+      <w:proofErr w:type="spellEnd"/>
+      <w:r>
+        <w:t xml:space="preserve"> </w:t>
+      </w:r>
+      <w:proofErr w:type="spellStart"/>
+      <w:r>
+        <w:t>încearcă</w:t>
+      </w:r>
+      <w:proofErr w:type="spellEnd"/>
+      <w:r>
+        <w:t xml:space="preserve"> </w:t>
+      </w:r>
+      <w:proofErr w:type="spellStart"/>
+      <w:r>
+        <w:t>să</w:t>
+      </w:r>
+      <w:proofErr w:type="spellEnd"/>
+      <w:r>
+        <w:t xml:space="preserve"> </w:t>
+      </w:r>
+      <w:proofErr w:type="spellStart"/>
+      <w:r>
+        <w:t>apese</w:t>
+      </w:r>
+      <w:proofErr w:type="spellEnd"/>
+      <w:r>
+        <w:t xml:space="preserve"> pe </w:t>
+      </w:r>
+      <w:proofErr w:type="spellStart"/>
+      <w:r>
+        <w:t>orice</w:t>
+      </w:r>
+      <w:proofErr w:type="spellEnd"/>
+      <w:r>
+        <w:t xml:space="preserve"> instrument a 3-a </w:t>
+      </w:r>
+      <w:proofErr w:type="spellStart"/>
+      <w:r>
+        <w:t>oară</w:t>
+      </w:r>
+      <w:proofErr w:type="spellEnd"/>
+      <w:r>
+        <w:t xml:space="preserve">, </w:t>
+      </w:r>
+      <w:proofErr w:type="spellStart"/>
+      <w:r>
+        <w:t>aplicația</w:t>
+      </w:r>
+      <w:proofErr w:type="spellEnd"/>
+      <w:r>
+        <w:t xml:space="preserve"> </w:t>
+      </w:r>
+      <w:proofErr w:type="spellStart"/>
+      <w:r>
+        <w:t>îl</w:t>
+      </w:r>
+      <w:proofErr w:type="spellEnd"/>
+      <w:r>
+        <w:t xml:space="preserve"> </w:t>
+      </w:r>
+      <w:proofErr w:type="spellStart"/>
+      <w:r>
+        <w:t>blochează</w:t>
+      </w:r>
+      <w:proofErr w:type="spellEnd"/>
+      <w:r>
+        <w:t xml:space="preserve"> </w:t>
+      </w:r>
+      <w:proofErr w:type="spellStart"/>
+      <w:r>
+        <w:t>și</w:t>
+      </w:r>
+      <w:proofErr w:type="spellEnd"/>
+      <w:r>
+        <w:t xml:space="preserve"> </w:t>
+      </w:r>
+      <w:proofErr w:type="spellStart"/>
+      <w:r>
+        <w:t>îi</w:t>
+      </w:r>
+      <w:proofErr w:type="spellEnd"/>
+      <w:r>
+        <w:t xml:space="preserve"> </w:t>
+      </w:r>
+      <w:proofErr w:type="spellStart"/>
+      <w:r>
+        <w:t>dă</w:t>
+      </w:r>
+      <w:proofErr w:type="spellEnd"/>
+      <w:r>
+        <w:t xml:space="preserve"> </w:t>
+      </w:r>
+      <w:proofErr w:type="spellStart"/>
+      <w:r>
+        <w:t>mesajul</w:t>
+      </w:r>
+      <w:proofErr w:type="spellEnd"/>
+      <w:r>
+        <w:t xml:space="preserve">: *"Ai </w:t>
+      </w:r>
+      <w:proofErr w:type="spellStart"/>
+      <w:r>
+        <w:t>atins</w:t>
+      </w:r>
+      <w:proofErr w:type="spellEnd"/>
+      <w:r>
+        <w:t xml:space="preserve"> </w:t>
+      </w:r>
+      <w:proofErr w:type="spellStart"/>
+      <w:r>
+        <w:t>limita</w:t>
+      </w:r>
+      <w:proofErr w:type="spellEnd"/>
+      <w:r>
+        <w:t xml:space="preserve"> de </w:t>
+      </w:r>
+      <w:proofErr w:type="spellStart"/>
+      <w:r>
+        <w:t>editări</w:t>
+      </w:r>
+      <w:proofErr w:type="spellEnd"/>
+      <w:r>
+        <w:t xml:space="preserve"> </w:t>
+      </w:r>
+      <w:proofErr w:type="spellStart"/>
+      <w:r>
+        <w:t>gratuite</w:t>
+      </w:r>
+      <w:proofErr w:type="spellEnd"/>
+      <w:r>
+        <w:t xml:space="preserve"> din Demo. </w:t>
+      </w:r>
+      <w:proofErr w:type="spellStart"/>
+      <w:r>
+        <w:t>Pentru</w:t>
+      </w:r>
+      <w:proofErr w:type="spellEnd"/>
+      <w:r>
+        <w:t xml:space="preserve"> a continua </w:t>
+      </w:r>
+      <w:proofErr w:type="spellStart"/>
+      <w:r>
+        <w:t>editarea</w:t>
+      </w:r>
+      <w:proofErr w:type="spellEnd"/>
+      <w:r>
+        <w:t xml:space="preserve">, </w:t>
+      </w:r>
+      <w:proofErr w:type="spellStart"/>
+      <w:r>
+        <w:t>te</w:t>
+      </w:r>
+      <w:proofErr w:type="spellEnd"/>
+      <w:r>
+        <w:t xml:space="preserve"> </w:t>
+      </w:r>
+      <w:proofErr w:type="spellStart"/>
+      <w:r>
+        <w:t>rugăm</w:t>
+      </w:r>
+      <w:proofErr w:type="spellEnd"/>
+      <w:r>
+        <w:t xml:space="preserve"> </w:t>
+      </w:r>
+      <w:proofErr w:type="spellStart"/>
+      <w:r>
+        <w:t>să</w:t>
+      </w:r>
+      <w:proofErr w:type="spellEnd"/>
+      <w:r>
+        <w:t xml:space="preserve"> </w:t>
+      </w:r>
+      <w:proofErr w:type="spellStart"/>
+      <w:r>
+        <w:t>creezi</w:t>
+      </w:r>
+      <w:proofErr w:type="spellEnd"/>
+      <w:r>
+        <w:t xml:space="preserve"> un </w:t>
+      </w:r>
+      <w:proofErr w:type="spellStart"/>
+      <w:r>
+        <w:t>cont</w:t>
+      </w:r>
+      <w:proofErr w:type="spellEnd"/>
+      <w:r>
+        <w:t xml:space="preserve"> </w:t>
+      </w:r>
+      <w:proofErr w:type="spellStart"/>
+      <w:r>
+        <w:t>gratuit</w:t>
+      </w:r>
+      <w:proofErr w:type="spellEnd"/>
+      <w:r>
+        <w:t xml:space="preserve">!"* </w:t>
+      </w:r>
+      <w:proofErr w:type="spellStart"/>
+      <w:r>
+        <w:t>Aceste</w:t>
+      </w:r>
+      <w:proofErr w:type="spellEnd"/>
+      <w:r>
+        <w:t xml:space="preserve"> </w:t>
+      </w:r>
+      <w:proofErr w:type="spellStart"/>
+      <w:r>
+        <w:t>două</w:t>
+      </w:r>
+      <w:proofErr w:type="spellEnd"/>
+      <w:r>
+        <w:t xml:space="preserve"> </w:t>
+      </w:r>
+      <w:proofErr w:type="spellStart"/>
+      <w:r>
+        <w:t>limitări</w:t>
+      </w:r>
+      <w:proofErr w:type="spellEnd"/>
+      <w:r>
+        <w:t xml:space="preserve"> sunt </w:t>
+      </w:r>
+      <w:proofErr w:type="spellStart"/>
+      <w:r>
+        <w:t>puse</w:t>
+      </w:r>
+      <w:proofErr w:type="spellEnd"/>
+      <w:r>
+        <w:t xml:space="preserve"> de </w:t>
+      </w:r>
+      <w:proofErr w:type="spellStart"/>
+      <w:r>
+        <w:t>noi</w:t>
+      </w:r>
+      <w:proofErr w:type="spellEnd"/>
+      <w:r>
+        <w:t xml:space="preserve"> </w:t>
+      </w:r>
+      <w:proofErr w:type="spellStart"/>
+      <w:r>
+        <w:t>intenționat</w:t>
+      </w:r>
+      <w:proofErr w:type="spellEnd"/>
+      <w:r>
+        <w:t>, ca o **</w:t>
+      </w:r>
+      <w:proofErr w:type="spellStart"/>
+      <w:r>
+        <w:t>strategie</w:t>
+      </w:r>
+      <w:proofErr w:type="spellEnd"/>
+      <w:r>
+        <w:t xml:space="preserve"> de </w:t>
+      </w:r>
+      <w:proofErr w:type="spellStart"/>
+      <w:r>
+        <w:t>vânzare</w:t>
+      </w:r>
+      <w:proofErr w:type="spellEnd"/>
+      <w:r>
+        <w:t xml:space="preserve">** (ca </w:t>
+      </w:r>
+      <w:proofErr w:type="spellStart"/>
+      <w:r>
+        <w:t>să</w:t>
+      </w:r>
+      <w:proofErr w:type="spellEnd"/>
+      <w:r>
+        <w:t xml:space="preserve"> se </w:t>
+      </w:r>
+      <w:proofErr w:type="spellStart"/>
+      <w:r>
+        <w:t>lovească</w:t>
+      </w:r>
+      <w:proofErr w:type="spellEnd"/>
+      <w:r>
+        <w:t xml:space="preserve"> de "</w:t>
+      </w:r>
+      <w:proofErr w:type="spellStart"/>
+      <w:r>
+        <w:t>Zid</w:t>
+      </w:r>
+      <w:proofErr w:type="spellEnd"/>
+      <w:r>
+        <w:t xml:space="preserve">" </w:t>
+      </w:r>
+      <w:proofErr w:type="spellStart"/>
+      <w:r>
+        <w:t>și</w:t>
+      </w:r>
+      <w:proofErr w:type="spellEnd"/>
+      <w:r>
+        <w:t xml:space="preserve"> </w:t>
+      </w:r>
+      <w:proofErr w:type="spellStart"/>
+      <w:r>
+        <w:t>să-și</w:t>
+      </w:r>
+      <w:proofErr w:type="spellEnd"/>
+      <w:r>
+        <w:t xml:space="preserve"> </w:t>
+      </w:r>
+      <w:proofErr w:type="spellStart"/>
+      <w:r>
+        <w:t>facă</w:t>
+      </w:r>
+      <w:proofErr w:type="spellEnd"/>
+      <w:r>
+        <w:t xml:space="preserve"> </w:t>
+      </w:r>
+      <w:proofErr w:type="spellStart"/>
+      <w:r>
+        <w:t>cont</w:t>
+      </w:r>
+      <w:proofErr w:type="spellEnd"/>
+      <w:r>
+        <w:t>).</w:t>
+      </w:r>
+    </w:p>
+    <w:p>
+      <w:r>
+        <w:t xml:space="preserve">Perfect! Ne-am </w:t>
+      </w:r>
+      <w:proofErr w:type="spellStart"/>
+      <w:r>
+        <w:t>aliniat</w:t>
+      </w:r>
+      <w:proofErr w:type="spellEnd"/>
+      <w:r>
+        <w:t xml:space="preserve"> 100%. </w:t>
+      </w:r>
+      <w:proofErr w:type="spellStart"/>
+      <w:r>
+        <w:t>Limitele</w:t>
+      </w:r>
+      <w:proofErr w:type="spellEnd"/>
+      <w:r>
+        <w:t xml:space="preserve"> au </w:t>
+      </w:r>
+      <w:proofErr w:type="spellStart"/>
+      <w:r>
+        <w:t>rămas</w:t>
+      </w:r>
+      <w:proofErr w:type="spellEnd"/>
+      <w:r>
+        <w:t xml:space="preserve"> exact </w:t>
+      </w:r>
+      <w:proofErr w:type="spellStart"/>
+      <w:r>
+        <w:t>acelea</w:t>
+      </w:r>
+      <w:proofErr w:type="spellEnd"/>
+      <w:r>
+        <w:t xml:space="preserve"> (1 </w:t>
+      </w:r>
+      <w:proofErr w:type="spellStart"/>
+      <w:r>
+        <w:t>Generare</w:t>
+      </w:r>
+      <w:proofErr w:type="spellEnd"/>
+      <w:r>
+        <w:t xml:space="preserve">, 2 </w:t>
+      </w:r>
+      <w:proofErr w:type="spellStart"/>
+      <w:r>
+        <w:t>Editări</w:t>
+      </w:r>
+      <w:proofErr w:type="spellEnd"/>
+      <w:r>
+        <w:t xml:space="preserve">), </w:t>
+      </w:r>
+      <w:proofErr w:type="spellStart"/>
+      <w:r>
+        <w:t>iar</w:t>
+      </w:r>
+      <w:proofErr w:type="spellEnd"/>
+      <w:r>
+        <w:t xml:space="preserve"> "</w:t>
+      </w:r>
+      <w:proofErr w:type="spellStart"/>
+      <w:r>
+        <w:t>Inspiră-mă</w:t>
+      </w:r>
+      <w:proofErr w:type="spellEnd"/>
+      <w:r>
+        <w:t xml:space="preserve">" </w:t>
+      </w:r>
+      <w:proofErr w:type="spellStart"/>
+      <w:r>
+        <w:t>rămâne</w:t>
+      </w:r>
+      <w:proofErr w:type="spellEnd"/>
+      <w:r>
+        <w:t xml:space="preserve"> </w:t>
+      </w:r>
+      <w:proofErr w:type="spellStart"/>
+      <w:r>
+        <w:t>nelimitat</w:t>
+      </w:r>
+      <w:proofErr w:type="spellEnd"/>
+      <w:r>
+        <w:t xml:space="preserve"> </w:t>
+      </w:r>
+      <w:proofErr w:type="spellStart"/>
+      <w:r>
+        <w:t>pentru</w:t>
+      </w:r>
+      <w:proofErr w:type="spellEnd"/>
+      <w:r>
+        <w:t xml:space="preserve"> o </w:t>
+      </w:r>
+      <w:proofErr w:type="spellStart"/>
+      <w:r>
+        <w:t>experiență</w:t>
+      </w:r>
+      <w:proofErr w:type="spellEnd"/>
+      <w:r>
+        <w:t xml:space="preserve"> </w:t>
+      </w:r>
+      <w:proofErr w:type="spellStart"/>
+      <w:r>
+        <w:t>perfectă</w:t>
+      </w:r>
+      <w:proofErr w:type="spellEnd"/>
+      <w:r>
+        <w:t>.</w:t>
+      </w:r>
+    </w:p>
+    <w:p>
+      <w:proofErr w:type="spellStart"/>
+      <w:r>
+        <w:t>Totul</w:t>
+      </w:r>
+      <w:proofErr w:type="spellEnd"/>
+      <w:r>
+        <w:t xml:space="preserve"> pe </w:t>
+      </w:r>
+      <w:proofErr w:type="spellStart"/>
+      <w:r>
+        <w:t>pagina</w:t>
+      </w:r>
+      <w:proofErr w:type="spellEnd"/>
+      <w:r>
+        <w:t xml:space="preserve"> de Demo </w:t>
       </w:r>
       <w:proofErr w:type="spellStart"/>
       <w:r>
@@ -19058,100 +20018,50 @@
       </w:r>
       <w:proofErr w:type="spellEnd"/>
       <w:r>
-        <w:t xml:space="preserve"> de sub </w:t>
-      </w:r>
-      <w:r>
-        <w:rPr>
-          <w:b/>
-          <w:bCs/>
-        </w:rPr>
-        <w:t xml:space="preserve">0.0001 </w:t>
-      </w:r>
-      <w:proofErr w:type="spellStart"/>
-      <w:r>
-        <w:rPr>
-          <w:b/>
-          <w:bCs/>
-        </w:rPr>
-        <w:t>dolari</w:t>
-      </w:r>
-      <w:proofErr w:type="spellEnd"/>
-      <w:r>
-        <w:t> (</w:t>
-      </w:r>
-      <w:proofErr w:type="spellStart"/>
-      <w:r>
-        <w:t>adică</w:t>
-      </w:r>
-      <w:proofErr w:type="spellEnd"/>
-      <w:r>
-        <w:t xml:space="preserve"> </w:t>
-      </w:r>
-      <w:proofErr w:type="spellStart"/>
-      <w:r>
-        <w:t>îți</w:t>
-      </w:r>
-      <w:proofErr w:type="spellEnd"/>
-      <w:r>
-        <w:t xml:space="preserve"> </w:t>
-      </w:r>
-      <w:proofErr w:type="spellStart"/>
-      <w:r>
-        <w:t>trebuie</w:t>
-      </w:r>
-      <w:proofErr w:type="spellEnd"/>
-      <w:r>
-        <w:t xml:space="preserve"> 10.000 de </w:t>
-      </w:r>
-      <w:proofErr w:type="spellStart"/>
-      <w:r>
-        <w:t>vizitatori</w:t>
-      </w:r>
-      <w:proofErr w:type="spellEnd"/>
-      <w:r>
-        <w:t xml:space="preserve"> care </w:t>
-      </w:r>
-      <w:proofErr w:type="spellStart"/>
-      <w:r>
-        <w:t>dau</w:t>
-      </w:r>
-      <w:proofErr w:type="spellEnd"/>
-      <w:r>
-        <w:t xml:space="preserve"> click-</w:t>
-      </w:r>
-      <w:proofErr w:type="spellStart"/>
-      <w:r>
-        <w:t>uri</w:t>
-      </w:r>
-      <w:proofErr w:type="spellEnd"/>
-      <w:r>
-        <w:t xml:space="preserve"> ca </w:t>
-      </w:r>
-      <w:proofErr w:type="spellStart"/>
-      <w:r>
-        <w:t>să</w:t>
-      </w:r>
-      <w:proofErr w:type="spellEnd"/>
-      <w:r>
-        <w:t xml:space="preserve"> </w:t>
-      </w:r>
-      <w:proofErr w:type="spellStart"/>
-      <w:r>
-        <w:t>plătești</w:t>
-      </w:r>
-      <w:proofErr w:type="spellEnd"/>
-      <w:r>
-        <w:t xml:space="preserve"> 1 </w:t>
-      </w:r>
-      <w:proofErr w:type="spellStart"/>
-      <w:r>
-        <w:t>dolar</w:t>
-      </w:r>
-      <w:proofErr w:type="spellEnd"/>
-      <w:r>
-        <w:t>).</w:t>
+        <w:t xml:space="preserve"> </w:t>
+      </w:r>
+      <w:proofErr w:type="spellStart"/>
+      <w:r>
+        <w:t>complet</w:t>
+      </w:r>
+      <w:proofErr w:type="spellEnd"/>
+      <w:r>
+        <w:t xml:space="preserve"> </w:t>
+      </w:r>
+      <w:proofErr w:type="spellStart"/>
+      <w:r>
+        <w:t>funcțional</w:t>
+      </w:r>
+      <w:proofErr w:type="spellEnd"/>
+      <w:r>
+        <w:t xml:space="preserve"> </w:t>
+      </w:r>
+      <w:proofErr w:type="spellStart"/>
+      <w:r>
+        <w:t>și</w:t>
+      </w:r>
+      <w:proofErr w:type="spellEnd"/>
+      <w:r>
+        <w:t xml:space="preserve"> </w:t>
+      </w:r>
+      <w:proofErr w:type="spellStart"/>
+      <w:r>
+        <w:t>limitat</w:t>
+      </w:r>
+      <w:proofErr w:type="spellEnd"/>
+      <w:r>
+        <w:t xml:space="preserve"> exact cum am </w:t>
+      </w:r>
+      <w:proofErr w:type="spellStart"/>
+      <w:r>
+        <w:t>plănuit</w:t>
+      </w:r>
+      <w:proofErr w:type="spellEnd"/>
+      <w:r>
+        <w:t>.</w:t>
       </w:r>
     </w:p>
+    <w:p/>
     <w:sectPr>
       <w:pgSz w:w="12240" w:h="15840"/>
       <w:pgMar w:top="1440" w:right="1440" w:bottom="1440" w:left="1440" w:header="720" w:footer="720" w:gutter="0"/>

</xml_diff>

<commit_message>
Implement shareable PDF links with Firebase and login wall
</commit_message>
<xml_diff>
--- a/google_adsens.docx
+++ b/google_adsens.docx
@@ -4117,15 +4117,7 @@
       </w:r>
       <w:proofErr w:type="spellEnd"/>
       <w:r>
-        <w:t xml:space="preserve"> le-</w:t>
-      </w:r>
-      <w:proofErr w:type="gramStart"/>
-      <w:r>
-        <w:t>a</w:t>
-      </w:r>
-      <w:proofErr w:type="gramEnd"/>
-      <w:r>
-        <w:t xml:space="preserve"> </w:t>
+        <w:t xml:space="preserve"> le-a </w:t>
       </w:r>
       <w:proofErr w:type="spellStart"/>
       <w:r>
@@ -7696,15 +7688,7 @@
       </w:r>
       <w:proofErr w:type="spellEnd"/>
       <w:r>
-        <w:t xml:space="preserve"> le-</w:t>
-      </w:r>
-      <w:proofErr w:type="gramStart"/>
-      <w:r>
-        <w:t>a</w:t>
-      </w:r>
-      <w:proofErr w:type="gramEnd"/>
-      <w:r>
-        <w:t xml:space="preserve"> </w:t>
+        <w:t xml:space="preserve"> le-a </w:t>
       </w:r>
       <w:proofErr w:type="spellStart"/>
       <w:r>
@@ -10993,15 +10977,7 @@
       </w:r>
       <w:proofErr w:type="spellEnd"/>
       <w:r>
-        <w:t xml:space="preserve"> </w:t>
-      </w:r>
-      <w:proofErr w:type="gramStart"/>
-      <w:r>
-        <w:t>un plan</w:t>
-      </w:r>
-      <w:proofErr w:type="gramEnd"/>
-      <w:r>
-        <w:t xml:space="preserve"> </w:t>
+        <w:t xml:space="preserve"> un plan </w:t>
       </w:r>
       <w:proofErr w:type="spellStart"/>
       <w:r>
@@ -16017,12 +15993,10 @@
         <w:t xml:space="preserve"> de pe TikTok, Facebook, Instagram, Telegram </w:t>
       </w:r>
       <w:proofErr w:type="spellStart"/>
-      <w:proofErr w:type="gramStart"/>
       <w:r>
         <w:t>etc.Cum</w:t>
       </w:r>
       <w:proofErr w:type="spellEnd"/>
-      <w:proofErr w:type="gramEnd"/>
       <w:r>
         <w:t xml:space="preserve"> </w:t>
       </w:r>
@@ -16093,15 +16067,7 @@
       </w:r>
       <w:proofErr w:type="spellEnd"/>
       <w:r>
-        <w:t xml:space="preserve"> </w:t>
-      </w:r>
-      <w:proofErr w:type="gramStart"/>
-      <w:r>
-        <w:t>un link</w:t>
-      </w:r>
-      <w:proofErr w:type="gramEnd"/>
-      <w:r>
-        <w:t xml:space="preserve"> special, de </w:t>
+        <w:t xml:space="preserve"> un link special, de </w:t>
       </w:r>
       <w:proofErr w:type="spellStart"/>
       <w:r>
@@ -16875,17 +16841,12 @@
         <w:t xml:space="preserve">cum pot </w:t>
       </w:r>
       <w:proofErr w:type="spellStart"/>
-      <w:proofErr w:type="gramStart"/>
       <w:r>
         <w:t>verifica</w:t>
       </w:r>
       <w:proofErr w:type="spellEnd"/>
       <w:r>
-        <w:t xml:space="preserve"> ?</w:t>
-      </w:r>
-      <w:proofErr w:type="gramEnd"/>
-      <w:r>
-        <w:t xml:space="preserve"> am telegram, </w:t>
+        <w:t xml:space="preserve"> ? am telegram, </w:t>
       </w:r>
       <w:proofErr w:type="spellStart"/>
       <w:r>
@@ -17673,15 +17634,7 @@
       </w:r>
       <w:proofErr w:type="spellEnd"/>
       <w:r>
-        <w:t>-</w:t>
-      </w:r>
-      <w:proofErr w:type="gramStart"/>
-      <w:r>
-        <w:t>un Story</w:t>
-      </w:r>
-      <w:proofErr w:type="gramEnd"/>
-      <w:r>
-        <w:t xml:space="preserve"> pe Instagram pe </w:t>
+        <w:t xml:space="preserve">-un Story pe Instagram pe </w:t>
       </w:r>
       <w:proofErr w:type="spellStart"/>
       <w:r>
@@ -19459,15 +19412,7 @@
       </w:r>
       <w:proofErr w:type="spellEnd"/>
       <w:r>
-        <w:t xml:space="preserve"> a </w:t>
-      </w:r>
-      <w:proofErr w:type="gramStart"/>
-      <w:r>
-        <w:t>continua</w:t>
-      </w:r>
-      <w:proofErr w:type="gramEnd"/>
-      <w:r>
-        <w:t xml:space="preserve">."* 2. **Are </w:t>
+        <w:t xml:space="preserve"> a continua."* 2. **Are </w:t>
       </w:r>
       <w:proofErr w:type="spellStart"/>
       <w:r>
@@ -19507,15 +19452,7 @@
       </w:r>
       <w:proofErr w:type="spellEnd"/>
       <w:r>
-        <w:t xml:space="preserve"> EXACT DE DOUĂ </w:t>
-      </w:r>
-      <w:proofErr w:type="gramStart"/>
-      <w:r>
-        <w:t>ORI.*</w:t>
-      </w:r>
-      <w:proofErr w:type="gramEnd"/>
-      <w:r>
-        <w:t xml:space="preserve">* (Ex: </w:t>
+        <w:t xml:space="preserve"> EXACT DE DOUĂ ORI.** (Ex: </w:t>
       </w:r>
       <w:proofErr w:type="spellStart"/>
       <w:r>
@@ -20061,7 +19998,3462 @@
         <w:t>.</w:t>
       </w:r>
     </w:p>
+    <w:p>
+      <w:proofErr w:type="spellStart"/>
+      <w:r>
+        <w:t>Acum</w:t>
+      </w:r>
+      <w:proofErr w:type="spellEnd"/>
+      <w:r>
+        <w:t xml:space="preserve"> </w:t>
+      </w:r>
+      <w:proofErr w:type="spellStart"/>
+      <w:r>
+        <w:t>înțeleg</w:t>
+      </w:r>
+      <w:proofErr w:type="spellEnd"/>
+      <w:r>
+        <w:t xml:space="preserve">! Ai </w:t>
+      </w:r>
+      <w:proofErr w:type="spellStart"/>
+      <w:r>
+        <w:t>dreptate</w:t>
+      </w:r>
+      <w:proofErr w:type="spellEnd"/>
+      <w:r>
+        <w:t xml:space="preserve">, </w:t>
+      </w:r>
+      <w:proofErr w:type="spellStart"/>
+      <w:r>
+        <w:t>este</w:t>
+      </w:r>
+      <w:proofErr w:type="spellEnd"/>
+      <w:r>
+        <w:t xml:space="preserve"> </w:t>
+      </w:r>
+      <w:proofErr w:type="spellStart"/>
+      <w:r>
+        <w:t>foarte</w:t>
+      </w:r>
+      <w:proofErr w:type="spellEnd"/>
+      <w:r>
+        <w:t xml:space="preserve"> </w:t>
+      </w:r>
+      <w:proofErr w:type="spellStart"/>
+      <w:r>
+        <w:t>frustrant</w:t>
+      </w:r>
+      <w:proofErr w:type="spellEnd"/>
+      <w:r>
+        <w:t xml:space="preserve"> </w:t>
+      </w:r>
+      <w:proofErr w:type="spellStart"/>
+      <w:r>
+        <w:t>să</w:t>
+      </w:r>
+      <w:proofErr w:type="spellEnd"/>
+      <w:r>
+        <w:t xml:space="preserve"> </w:t>
+      </w:r>
+      <w:proofErr w:type="spellStart"/>
+      <w:r>
+        <w:t>lucrezi</w:t>
+      </w:r>
+      <w:proofErr w:type="spellEnd"/>
+      <w:r>
+        <w:t xml:space="preserve"> </w:t>
+      </w:r>
+      <w:proofErr w:type="spellStart"/>
+      <w:r>
+        <w:t>și</w:t>
+      </w:r>
+      <w:proofErr w:type="spellEnd"/>
+      <w:r>
+        <w:t xml:space="preserve"> </w:t>
+      </w:r>
+      <w:proofErr w:type="spellStart"/>
+      <w:r>
+        <w:t>să</w:t>
+      </w:r>
+      <w:proofErr w:type="spellEnd"/>
+      <w:r>
+        <w:t xml:space="preserve"> </w:t>
+      </w:r>
+      <w:proofErr w:type="spellStart"/>
+      <w:r>
+        <w:t>te</w:t>
+      </w:r>
+      <w:proofErr w:type="spellEnd"/>
+      <w:r>
+        <w:t xml:space="preserve"> </w:t>
+      </w:r>
+      <w:proofErr w:type="spellStart"/>
+      <w:r>
+        <w:t>blocheze</w:t>
+      </w:r>
+      <w:proofErr w:type="spellEnd"/>
+      <w:r>
+        <w:t xml:space="preserve"> </w:t>
+      </w:r>
+      <w:proofErr w:type="spellStart"/>
+      <w:r>
+        <w:t>propriile</w:t>
+      </w:r>
+      <w:proofErr w:type="spellEnd"/>
+      <w:r>
+        <w:t xml:space="preserve"> tale </w:t>
+      </w:r>
+      <w:proofErr w:type="spellStart"/>
+      <w:r>
+        <w:t>limite</w:t>
+      </w:r>
+      <w:proofErr w:type="spellEnd"/>
+      <w:r>
+        <w:t xml:space="preserve"> </w:t>
+      </w:r>
+      <w:proofErr w:type="spellStart"/>
+      <w:r>
+        <w:t>atunci</w:t>
+      </w:r>
+      <w:proofErr w:type="spellEnd"/>
+      <w:r>
+        <w:t xml:space="preserve"> </w:t>
+      </w:r>
+      <w:proofErr w:type="spellStart"/>
+      <w:r>
+        <w:t>când</w:t>
+      </w:r>
+      <w:proofErr w:type="spellEnd"/>
+      <w:r>
+        <w:t xml:space="preserve"> </w:t>
+      </w:r>
+      <w:proofErr w:type="spellStart"/>
+      <w:r>
+        <w:t>vrei</w:t>
+      </w:r>
+      <w:proofErr w:type="spellEnd"/>
+      <w:r>
+        <w:t xml:space="preserve"> </w:t>
+      </w:r>
+      <w:proofErr w:type="spellStart"/>
+      <w:r>
+        <w:t>să</w:t>
+      </w:r>
+      <w:proofErr w:type="spellEnd"/>
+      <w:r>
+        <w:t xml:space="preserve"> </w:t>
+      </w:r>
+      <w:proofErr w:type="spellStart"/>
+      <w:r>
+        <w:t>testezi</w:t>
+      </w:r>
+      <w:proofErr w:type="spellEnd"/>
+      <w:r>
+        <w:t xml:space="preserve"> ca administrator.</w:t>
+      </w:r>
+    </w:p>
+    <w:p>
+      <w:r>
+        <w:t xml:space="preserve">Am </w:t>
+      </w:r>
+      <w:proofErr w:type="spellStart"/>
+      <w:r>
+        <w:t>creat</w:t>
+      </w:r>
+      <w:proofErr w:type="spellEnd"/>
+      <w:r>
+        <w:t xml:space="preserve"> </w:t>
+      </w:r>
+      <w:proofErr w:type="spellStart"/>
+      <w:r>
+        <w:t>acum</w:t>
+      </w:r>
+      <w:proofErr w:type="spellEnd"/>
+      <w:r>
+        <w:t xml:space="preserve"> o "</w:t>
+      </w:r>
+      <w:proofErr w:type="spellStart"/>
+      <w:r>
+        <w:t>ușă</w:t>
+      </w:r>
+      <w:proofErr w:type="spellEnd"/>
+      <w:r>
+        <w:t xml:space="preserve"> din spate" (un link secret) pe care o </w:t>
+      </w:r>
+      <w:proofErr w:type="spellStart"/>
+      <w:r>
+        <w:t>poți</w:t>
+      </w:r>
+      <w:proofErr w:type="spellEnd"/>
+      <w:r>
+        <w:t xml:space="preserve"> </w:t>
+      </w:r>
+      <w:proofErr w:type="spellStart"/>
+      <w:r>
+        <w:t>folosi</w:t>
+      </w:r>
+      <w:proofErr w:type="spellEnd"/>
+      <w:r>
+        <w:t> </w:t>
+      </w:r>
+      <w:proofErr w:type="spellStart"/>
+      <w:r>
+        <w:rPr>
+          <w:b/>
+          <w:bCs/>
+        </w:rPr>
+        <w:t>doar</w:t>
+      </w:r>
+      <w:proofErr w:type="spellEnd"/>
+      <w:r>
+        <w:rPr>
+          <w:b/>
+          <w:bCs/>
+        </w:rPr>
+        <w:t xml:space="preserve"> </w:t>
+      </w:r>
+      <w:proofErr w:type="spellStart"/>
+      <w:r>
+        <w:rPr>
+          <w:b/>
+          <w:bCs/>
+        </w:rPr>
+        <w:t>tu</w:t>
+      </w:r>
+      <w:proofErr w:type="spellEnd"/>
+      <w:r>
+        <w:t xml:space="preserve">, ca </w:t>
+      </w:r>
+      <w:proofErr w:type="spellStart"/>
+      <w:r>
+        <w:t>să</w:t>
+      </w:r>
+      <w:proofErr w:type="spellEnd"/>
+      <w:r>
+        <w:t xml:space="preserve"> </w:t>
+      </w:r>
+      <w:proofErr w:type="spellStart"/>
+      <w:r>
+        <w:t>testezi</w:t>
+      </w:r>
+      <w:proofErr w:type="spellEnd"/>
+      <w:r>
+        <w:t xml:space="preserve"> </w:t>
+      </w:r>
+      <w:proofErr w:type="spellStart"/>
+      <w:r>
+        <w:t>complet</w:t>
+      </w:r>
+      <w:proofErr w:type="spellEnd"/>
+      <w:r>
+        <w:t xml:space="preserve"> </w:t>
+      </w:r>
+      <w:proofErr w:type="spellStart"/>
+      <w:r>
+        <w:t>nestingherită</w:t>
+      </w:r>
+      <w:proofErr w:type="spellEnd"/>
+      <w:r>
+        <w:t xml:space="preserve">, </w:t>
+      </w:r>
+      <w:proofErr w:type="spellStart"/>
+      <w:r>
+        <w:t>fără</w:t>
+      </w:r>
+      <w:proofErr w:type="spellEnd"/>
+      <w:r>
+        <w:t xml:space="preserve"> </w:t>
+      </w:r>
+      <w:proofErr w:type="spellStart"/>
+      <w:r>
+        <w:t>nicio</w:t>
+      </w:r>
+      <w:proofErr w:type="spellEnd"/>
+      <w:r>
+        <w:t xml:space="preserve"> </w:t>
+      </w:r>
+      <w:proofErr w:type="spellStart"/>
+      <w:r>
+        <w:t>limită</w:t>
+      </w:r>
+      <w:proofErr w:type="spellEnd"/>
+      <w:r>
+        <w:t xml:space="preserve"> de </w:t>
+      </w:r>
+      <w:proofErr w:type="spellStart"/>
+      <w:r>
+        <w:t>generare</w:t>
+      </w:r>
+      <w:proofErr w:type="spellEnd"/>
+      <w:r>
+        <w:t xml:space="preserve"> </w:t>
+      </w:r>
+      <w:proofErr w:type="spellStart"/>
+      <w:r>
+        <w:t>sau</w:t>
+      </w:r>
+      <w:proofErr w:type="spellEnd"/>
+      <w:r>
+        <w:t xml:space="preserve"> de </w:t>
+      </w:r>
+      <w:proofErr w:type="spellStart"/>
+      <w:r>
+        <w:t>editări</w:t>
+      </w:r>
+      <w:proofErr w:type="spellEnd"/>
+      <w:r>
+        <w:t>.</w:t>
+      </w:r>
+    </w:p>
+    <w:p>
+      <w:pPr>
+        <w:rPr>
+          <w:color w:val="47D459" w:themeColor="accent3" w:themeTint="99"/>
+        </w:rPr>
+      </w:pPr>
+      <w:proofErr w:type="spellStart"/>
+      <w:r>
+        <w:t>Pentru</w:t>
+      </w:r>
+      <w:proofErr w:type="spellEnd"/>
+      <w:r>
+        <w:t xml:space="preserve"> a </w:t>
+      </w:r>
+      <w:proofErr w:type="spellStart"/>
+      <w:r>
+        <w:t>ocoli</w:t>
+      </w:r>
+      <w:proofErr w:type="spellEnd"/>
+      <w:r>
+        <w:t xml:space="preserve"> </w:t>
+      </w:r>
+      <w:proofErr w:type="spellStart"/>
+      <w:r>
+        <w:t>toate</w:t>
+      </w:r>
+      <w:proofErr w:type="spellEnd"/>
+      <w:r>
+        <w:t xml:space="preserve"> </w:t>
+      </w:r>
+      <w:proofErr w:type="spellStart"/>
+      <w:r>
+        <w:t>blocajele</w:t>
+      </w:r>
+      <w:proofErr w:type="spellEnd"/>
+      <w:r>
+        <w:t xml:space="preserve">, de </w:t>
+      </w:r>
+      <w:proofErr w:type="spellStart"/>
+      <w:r>
+        <w:t>acum</w:t>
+      </w:r>
+      <w:proofErr w:type="spellEnd"/>
+      <w:r>
+        <w:t xml:space="preserve"> </w:t>
+      </w:r>
+      <w:proofErr w:type="spellStart"/>
+      <w:r>
+        <w:t>înainte</w:t>
+      </w:r>
+      <w:proofErr w:type="spellEnd"/>
+      <w:r>
+        <w:t xml:space="preserve"> </w:t>
+      </w:r>
+      <w:proofErr w:type="spellStart"/>
+      <w:r>
+        <w:t>intră</w:t>
+      </w:r>
+      <w:proofErr w:type="spellEnd"/>
+      <w:r>
+        <w:t xml:space="preserve"> pe Demo </w:t>
+      </w:r>
+      <w:proofErr w:type="spellStart"/>
+      <w:r>
+        <w:t>folosind</w:t>
+      </w:r>
+      <w:proofErr w:type="spellEnd"/>
+      <w:r>
+        <w:t xml:space="preserve"> </w:t>
+      </w:r>
+      <w:proofErr w:type="spellStart"/>
+      <w:r>
+        <w:t>acest</w:t>
+      </w:r>
+      <w:proofErr w:type="spellEnd"/>
+      <w:r>
+        <w:t xml:space="preserve"> link: </w:t>
+      </w:r>
+      <w:r>
+        <w:rPr>
+          <w:rFonts w:ascii="Segoe UI Emoji" w:hAnsi="Segoe UI Emoji" w:cs="Segoe UI Emoji"/>
+          <w:color w:val="47D459" w:themeColor="accent3" w:themeTint="99"/>
+        </w:rPr>
+        <w:t>👉</w:t>
+      </w:r>
+      <w:r>
+        <w:rPr>
+          <w:color w:val="47D459" w:themeColor="accent3" w:themeTint="99"/>
+        </w:rPr>
+        <w:t> </w:t>
+      </w:r>
+      <w:hyperlink r:id="rId9" w:history="1">
+        <w:r>
+          <w:rPr>
+            <w:rStyle w:val="Hyperlink"/>
+            <w:b/>
+            <w:bCs/>
+            <w:color w:val="47D459" w:themeColor="accent3" w:themeTint="99"/>
+          </w:rPr>
+          <w:t>https://ideea-ta-ai.vercel.app/start?dev=true</w:t>
+        </w:r>
+      </w:hyperlink>
+    </w:p>
+    <w:p>
+      <w:r>
+        <w:t xml:space="preserve">Acel </w:t>
+      </w:r>
+      <w:proofErr w:type="spellStart"/>
+      <w:r>
+        <w:t>cuvânt</w:t>
+      </w:r>
+      <w:proofErr w:type="spellEnd"/>
+      <w:r>
+        <w:t xml:space="preserve"> ?dev=true de la </w:t>
+      </w:r>
+      <w:proofErr w:type="spellStart"/>
+      <w:r>
+        <w:t>finalul</w:t>
+      </w:r>
+      <w:proofErr w:type="spellEnd"/>
+      <w:r>
+        <w:t xml:space="preserve"> link-</w:t>
+      </w:r>
+      <w:proofErr w:type="spellStart"/>
+      <w:r>
+        <w:t>ului</w:t>
+      </w:r>
+      <w:proofErr w:type="spellEnd"/>
+      <w:r>
+        <w:t xml:space="preserve"> </w:t>
+      </w:r>
+      <w:proofErr w:type="spellStart"/>
+      <w:r>
+        <w:t>îi</w:t>
+      </w:r>
+      <w:proofErr w:type="spellEnd"/>
+      <w:r>
+        <w:t xml:space="preserve"> </w:t>
+      </w:r>
+      <w:proofErr w:type="spellStart"/>
+      <w:r>
+        <w:t>spune</w:t>
+      </w:r>
+      <w:proofErr w:type="spellEnd"/>
+      <w:r>
+        <w:t xml:space="preserve"> </w:t>
+      </w:r>
+      <w:proofErr w:type="spellStart"/>
+      <w:r>
+        <w:t>codului</w:t>
+      </w:r>
+      <w:proofErr w:type="spellEnd"/>
+      <w:r>
+        <w:t xml:space="preserve"> meu: </w:t>
+      </w:r>
+      <w:r>
+        <w:rPr>
+          <w:i/>
+          <w:iCs/>
+        </w:rPr>
+        <w:t>"</w:t>
+      </w:r>
+      <w:proofErr w:type="spellStart"/>
+      <w:r>
+        <w:rPr>
+          <w:i/>
+          <w:iCs/>
+        </w:rPr>
+        <w:t>Ignoră</w:t>
+      </w:r>
+      <w:proofErr w:type="spellEnd"/>
+      <w:r>
+        <w:rPr>
+          <w:i/>
+          <w:iCs/>
+        </w:rPr>
+        <w:t xml:space="preserve"> </w:t>
+      </w:r>
+      <w:proofErr w:type="spellStart"/>
+      <w:r>
+        <w:rPr>
+          <w:i/>
+          <w:iCs/>
+        </w:rPr>
+        <w:t>regulile</w:t>
+      </w:r>
+      <w:proofErr w:type="spellEnd"/>
+      <w:r>
+        <w:rPr>
+          <w:i/>
+          <w:iCs/>
+        </w:rPr>
+        <w:t xml:space="preserve">, sunt </w:t>
+      </w:r>
+      <w:proofErr w:type="spellStart"/>
+      <w:r>
+        <w:rPr>
+          <w:i/>
+          <w:iCs/>
+        </w:rPr>
+        <w:t>eu</w:t>
+      </w:r>
+      <w:proofErr w:type="spellEnd"/>
+      <w:r>
+        <w:rPr>
+          <w:i/>
+          <w:iCs/>
+        </w:rPr>
+        <w:t xml:space="preserve">, </w:t>
+      </w:r>
+      <w:proofErr w:type="spellStart"/>
+      <w:r>
+        <w:rPr>
+          <w:i/>
+          <w:iCs/>
+        </w:rPr>
+        <w:t>lasă-mă</w:t>
+      </w:r>
+      <w:proofErr w:type="spellEnd"/>
+      <w:r>
+        <w:rPr>
+          <w:i/>
+          <w:iCs/>
+        </w:rPr>
+        <w:t xml:space="preserve"> </w:t>
+      </w:r>
+      <w:proofErr w:type="spellStart"/>
+      <w:r>
+        <w:rPr>
+          <w:i/>
+          <w:iCs/>
+        </w:rPr>
+        <w:t>să</w:t>
+      </w:r>
+      <w:proofErr w:type="spellEnd"/>
+      <w:r>
+        <w:rPr>
+          <w:i/>
+          <w:iCs/>
+        </w:rPr>
+        <w:t xml:space="preserve"> </w:t>
+      </w:r>
+      <w:proofErr w:type="spellStart"/>
+      <w:r>
+        <w:rPr>
+          <w:i/>
+          <w:iCs/>
+        </w:rPr>
+        <w:t>testez</w:t>
+      </w:r>
+      <w:proofErr w:type="spellEnd"/>
+      <w:r>
+        <w:rPr>
+          <w:i/>
+          <w:iCs/>
+        </w:rPr>
+        <w:t xml:space="preserve"> la </w:t>
+      </w:r>
+      <w:proofErr w:type="spellStart"/>
+      <w:r>
+        <w:rPr>
+          <w:i/>
+          <w:iCs/>
+        </w:rPr>
+        <w:t>infinit</w:t>
+      </w:r>
+      <w:proofErr w:type="spellEnd"/>
+      <w:r>
+        <w:rPr>
+          <w:i/>
+          <w:iCs/>
+        </w:rPr>
+        <w:t>"</w:t>
+      </w:r>
+      <w:r>
+        <w:t xml:space="preserve">. </w:t>
+      </w:r>
+      <w:proofErr w:type="spellStart"/>
+      <w:r>
+        <w:t>Vizitatorii</w:t>
+      </w:r>
+      <w:proofErr w:type="spellEnd"/>
+      <w:r>
+        <w:t xml:space="preserve"> de pe TikTok, evident, </w:t>
+      </w:r>
+      <w:proofErr w:type="spellStart"/>
+      <w:r>
+        <w:t>vor</w:t>
+      </w:r>
+      <w:proofErr w:type="spellEnd"/>
+      <w:r>
+        <w:t xml:space="preserve"> intra </w:t>
+      </w:r>
+      <w:proofErr w:type="spellStart"/>
+      <w:r>
+        <w:t>doar</w:t>
+      </w:r>
+      <w:proofErr w:type="spellEnd"/>
+      <w:r>
+        <w:t xml:space="preserve"> pe link-ul normal (</w:t>
+      </w:r>
+      <w:proofErr w:type="spellStart"/>
+      <w:r>
+        <w:t>fără</w:t>
+      </w:r>
+      <w:proofErr w:type="spellEnd"/>
+      <w:r>
+        <w:t xml:space="preserve"> </w:t>
+      </w:r>
+      <w:proofErr w:type="spellStart"/>
+      <w:r>
+        <w:t>partea</w:t>
+      </w:r>
+      <w:proofErr w:type="spellEnd"/>
+      <w:r>
+        <w:t xml:space="preserve"> cu dev=true) </w:t>
+      </w:r>
+      <w:proofErr w:type="spellStart"/>
+      <w:r>
+        <w:t>și</w:t>
+      </w:r>
+      <w:proofErr w:type="spellEnd"/>
+      <w:r>
+        <w:t xml:space="preserve"> </w:t>
+      </w:r>
+      <w:proofErr w:type="spellStart"/>
+      <w:r>
+        <w:t>ei</w:t>
+      </w:r>
+      <w:proofErr w:type="spellEnd"/>
+      <w:r>
+        <w:t xml:space="preserve"> </w:t>
+      </w:r>
+      <w:proofErr w:type="spellStart"/>
+      <w:r>
+        <w:t>vor</w:t>
+      </w:r>
+      <w:proofErr w:type="spellEnd"/>
+      <w:r>
+        <w:t xml:space="preserve"> fi </w:t>
+      </w:r>
+      <w:proofErr w:type="spellStart"/>
+      <w:r>
+        <w:t>blocați</w:t>
+      </w:r>
+      <w:proofErr w:type="spellEnd"/>
+      <w:r>
+        <w:t xml:space="preserve"> conform </w:t>
+      </w:r>
+      <w:proofErr w:type="spellStart"/>
+      <w:r>
+        <w:t>planului</w:t>
+      </w:r>
+      <w:proofErr w:type="spellEnd"/>
+      <w:r>
+        <w:t>!</w:t>
+      </w:r>
+    </w:p>
+    <w:p>
+      <w:r>
+        <w:rPr>
+          <w:i/>
+          <w:iCs/>
+        </w:rPr>
+        <w:t xml:space="preserve">P.S. </w:t>
+      </w:r>
+      <w:proofErr w:type="spellStart"/>
+      <w:r>
+        <w:rPr>
+          <w:i/>
+          <w:iCs/>
+        </w:rPr>
+        <w:t>Ține</w:t>
+      </w:r>
+      <w:proofErr w:type="spellEnd"/>
+      <w:r>
+        <w:rPr>
+          <w:i/>
+          <w:iCs/>
+        </w:rPr>
+        <w:t xml:space="preserve"> </w:t>
+      </w:r>
+      <w:proofErr w:type="spellStart"/>
+      <w:r>
+        <w:rPr>
+          <w:i/>
+          <w:iCs/>
+        </w:rPr>
+        <w:t>minte</w:t>
+      </w:r>
+      <w:proofErr w:type="spellEnd"/>
+      <w:r>
+        <w:rPr>
+          <w:i/>
+          <w:iCs/>
+        </w:rPr>
+        <w:t xml:space="preserve"> </w:t>
+      </w:r>
+      <w:proofErr w:type="spellStart"/>
+      <w:r>
+        <w:rPr>
+          <w:i/>
+          <w:iCs/>
+        </w:rPr>
+        <w:t>doar</w:t>
+      </w:r>
+      <w:proofErr w:type="spellEnd"/>
+      <w:r>
+        <w:rPr>
+          <w:i/>
+          <w:iCs/>
+        </w:rPr>
+        <w:t xml:space="preserve"> </w:t>
+      </w:r>
+      <w:proofErr w:type="spellStart"/>
+      <w:r>
+        <w:rPr>
+          <w:i/>
+          <w:iCs/>
+        </w:rPr>
+        <w:t>că</w:t>
+      </w:r>
+      <w:proofErr w:type="spellEnd"/>
+      <w:r>
+        <w:rPr>
+          <w:i/>
+          <w:iCs/>
+        </w:rPr>
+        <w:t xml:space="preserve">, </w:t>
+      </w:r>
+      <w:proofErr w:type="spellStart"/>
+      <w:r>
+        <w:rPr>
+          <w:i/>
+          <w:iCs/>
+        </w:rPr>
+        <w:t>deși</w:t>
+      </w:r>
+      <w:proofErr w:type="spellEnd"/>
+      <w:r>
+        <w:rPr>
+          <w:i/>
+          <w:iCs/>
+        </w:rPr>
+        <w:t xml:space="preserve"> pe Demo ai </w:t>
+      </w:r>
+      <w:proofErr w:type="spellStart"/>
+      <w:r>
+        <w:rPr>
+          <w:i/>
+          <w:iCs/>
+        </w:rPr>
+        <w:t>scăpat</w:t>
+      </w:r>
+      <w:proofErr w:type="spellEnd"/>
+      <w:r>
+        <w:rPr>
+          <w:i/>
+          <w:iCs/>
+        </w:rPr>
+        <w:t xml:space="preserve"> de </w:t>
+      </w:r>
+      <w:proofErr w:type="spellStart"/>
+      <w:r>
+        <w:rPr>
+          <w:i/>
+          <w:iCs/>
+        </w:rPr>
+        <w:t>limita</w:t>
+      </w:r>
+      <w:proofErr w:type="spellEnd"/>
+      <w:r>
+        <w:rPr>
+          <w:i/>
+          <w:iCs/>
+        </w:rPr>
+        <w:t xml:space="preserve"> </w:t>
+      </w:r>
+      <w:proofErr w:type="spellStart"/>
+      <w:r>
+        <w:rPr>
+          <w:i/>
+          <w:iCs/>
+        </w:rPr>
+        <w:t>pusă</w:t>
+      </w:r>
+      <w:proofErr w:type="spellEnd"/>
+      <w:r>
+        <w:rPr>
+          <w:i/>
+          <w:iCs/>
+        </w:rPr>
+        <w:t xml:space="preserve"> de mine </w:t>
+      </w:r>
+      <w:proofErr w:type="spellStart"/>
+      <w:r>
+        <w:rPr>
+          <w:i/>
+          <w:iCs/>
+        </w:rPr>
+        <w:t>în</w:t>
+      </w:r>
+      <w:proofErr w:type="spellEnd"/>
+      <w:r>
+        <w:rPr>
+          <w:i/>
+          <w:iCs/>
+        </w:rPr>
+        <w:t xml:space="preserve"> cod cu </w:t>
+      </w:r>
+      <w:proofErr w:type="spellStart"/>
+      <w:r>
+        <w:rPr>
+          <w:i/>
+          <w:iCs/>
+        </w:rPr>
+        <w:t>acest</w:t>
+      </w:r>
+      <w:proofErr w:type="spellEnd"/>
+      <w:r>
+        <w:rPr>
+          <w:i/>
+          <w:iCs/>
+        </w:rPr>
+        <w:t xml:space="preserve"> link, </w:t>
+      </w:r>
+      <w:proofErr w:type="spellStart"/>
+      <w:r>
+        <w:rPr>
+          <w:i/>
+          <w:iCs/>
+        </w:rPr>
+        <w:t>dacă</w:t>
+      </w:r>
+      <w:proofErr w:type="spellEnd"/>
+      <w:r>
+        <w:rPr>
+          <w:i/>
+          <w:iCs/>
+        </w:rPr>
+        <w:t xml:space="preserve"> </w:t>
+      </w:r>
+      <w:proofErr w:type="spellStart"/>
+      <w:r>
+        <w:rPr>
+          <w:i/>
+          <w:iCs/>
+        </w:rPr>
+        <w:t>apeși</w:t>
+      </w:r>
+      <w:proofErr w:type="spellEnd"/>
+      <w:r>
+        <w:rPr>
+          <w:i/>
+          <w:iCs/>
+        </w:rPr>
+        <w:t xml:space="preserve"> pe „</w:t>
+      </w:r>
+      <w:proofErr w:type="spellStart"/>
+      <w:r>
+        <w:rPr>
+          <w:i/>
+          <w:iCs/>
+        </w:rPr>
+        <w:t>Generează</w:t>
+      </w:r>
+      <w:proofErr w:type="spellEnd"/>
+      <w:r>
+        <w:rPr>
+          <w:i/>
+          <w:iCs/>
+        </w:rPr>
+        <w:t xml:space="preserve">” de </w:t>
+      </w:r>
+      <w:proofErr w:type="spellStart"/>
+      <w:r>
+        <w:rPr>
+          <w:i/>
+          <w:iCs/>
+        </w:rPr>
+        <w:t>peste</w:t>
+      </w:r>
+      <w:proofErr w:type="spellEnd"/>
+      <w:r>
+        <w:rPr>
+          <w:i/>
+          <w:iCs/>
+        </w:rPr>
+        <w:t xml:space="preserve"> 15 </w:t>
+      </w:r>
+      <w:proofErr w:type="spellStart"/>
+      <w:r>
+        <w:rPr>
+          <w:i/>
+          <w:iCs/>
+        </w:rPr>
+        <w:t>ori</w:t>
+      </w:r>
+      <w:proofErr w:type="spellEnd"/>
+      <w:r>
+        <w:rPr>
+          <w:i/>
+          <w:iCs/>
+        </w:rPr>
+        <w:t xml:space="preserve"> </w:t>
+      </w:r>
+      <w:proofErr w:type="spellStart"/>
+      <w:r>
+        <w:rPr>
+          <w:i/>
+          <w:iCs/>
+        </w:rPr>
+        <w:t>în</w:t>
+      </w:r>
+      <w:proofErr w:type="spellEnd"/>
+      <w:r>
+        <w:rPr>
+          <w:i/>
+          <w:iCs/>
+        </w:rPr>
+        <w:t xml:space="preserve"> </w:t>
+      </w:r>
+      <w:proofErr w:type="spellStart"/>
+      <w:r>
+        <w:rPr>
+          <w:i/>
+          <w:iCs/>
+        </w:rPr>
+        <w:t>același</w:t>
+      </w:r>
+      <w:proofErr w:type="spellEnd"/>
+      <w:r>
+        <w:rPr>
+          <w:i/>
+          <w:iCs/>
+        </w:rPr>
+        <w:t xml:space="preserve"> </w:t>
+      </w:r>
+      <w:proofErr w:type="spellStart"/>
+      <w:r>
+        <w:rPr>
+          <w:i/>
+          <w:iCs/>
+        </w:rPr>
+        <w:t>minut</w:t>
+      </w:r>
+      <w:proofErr w:type="spellEnd"/>
+      <w:r>
+        <w:rPr>
+          <w:i/>
+          <w:iCs/>
+        </w:rPr>
+        <w:t>, Google (</w:t>
+      </w:r>
+      <w:proofErr w:type="spellStart"/>
+      <w:r>
+        <w:rPr>
+          <w:i/>
+          <w:iCs/>
+        </w:rPr>
+        <w:t>fiind</w:t>
+      </w:r>
+      <w:proofErr w:type="spellEnd"/>
+      <w:r>
+        <w:rPr>
+          <w:i/>
+          <w:iCs/>
+        </w:rPr>
+        <w:t xml:space="preserve"> pe </w:t>
+      </w:r>
+      <w:proofErr w:type="spellStart"/>
+      <w:r>
+        <w:rPr>
+          <w:i/>
+          <w:iCs/>
+        </w:rPr>
+        <w:t>cont</w:t>
+      </w:r>
+      <w:proofErr w:type="spellEnd"/>
+      <w:r>
+        <w:rPr>
+          <w:i/>
+          <w:iCs/>
+        </w:rPr>
+        <w:t xml:space="preserve"> </w:t>
+      </w:r>
+      <w:proofErr w:type="spellStart"/>
+      <w:r>
+        <w:rPr>
+          <w:i/>
+          <w:iCs/>
+        </w:rPr>
+        <w:t>gratuit</w:t>
+      </w:r>
+      <w:proofErr w:type="spellEnd"/>
+      <w:r>
+        <w:rPr>
+          <w:i/>
+          <w:iCs/>
+        </w:rPr>
+        <w:t xml:space="preserve">) </w:t>
+      </w:r>
+      <w:proofErr w:type="spellStart"/>
+      <w:r>
+        <w:rPr>
+          <w:i/>
+          <w:iCs/>
+        </w:rPr>
+        <w:t>te</w:t>
+      </w:r>
+      <w:proofErr w:type="spellEnd"/>
+      <w:r>
+        <w:rPr>
+          <w:i/>
+          <w:iCs/>
+        </w:rPr>
+        <w:t xml:space="preserve"> </w:t>
+      </w:r>
+      <w:proofErr w:type="spellStart"/>
+      <w:r>
+        <w:rPr>
+          <w:i/>
+          <w:iCs/>
+        </w:rPr>
+        <w:t>va</w:t>
+      </w:r>
+      <w:proofErr w:type="spellEnd"/>
+      <w:r>
+        <w:rPr>
+          <w:i/>
+          <w:iCs/>
+        </w:rPr>
+        <w:t xml:space="preserve"> taxa cu o </w:t>
+      </w:r>
+      <w:proofErr w:type="spellStart"/>
+      <w:r>
+        <w:rPr>
+          <w:i/>
+          <w:iCs/>
+        </w:rPr>
+        <w:t>mică</w:t>
+      </w:r>
+      <w:proofErr w:type="spellEnd"/>
+      <w:r>
+        <w:rPr>
+          <w:i/>
+          <w:iCs/>
+        </w:rPr>
+        <w:t xml:space="preserve"> </w:t>
+      </w:r>
+      <w:proofErr w:type="spellStart"/>
+      <w:r>
+        <w:rPr>
+          <w:i/>
+          <w:iCs/>
+        </w:rPr>
+        <w:t>pauză</w:t>
+      </w:r>
+      <w:proofErr w:type="spellEnd"/>
+      <w:r>
+        <w:rPr>
+          <w:i/>
+          <w:iCs/>
+        </w:rPr>
+        <w:t xml:space="preserve"> de un </w:t>
+      </w:r>
+      <w:proofErr w:type="spellStart"/>
+      <w:r>
+        <w:rPr>
+          <w:i/>
+          <w:iCs/>
+        </w:rPr>
+        <w:t>minut</w:t>
+      </w:r>
+      <w:proofErr w:type="spellEnd"/>
+      <w:r>
+        <w:rPr>
+          <w:i/>
+          <w:iCs/>
+        </w:rPr>
+        <w:t xml:space="preserve"> (</w:t>
+      </w:r>
+      <w:proofErr w:type="spellStart"/>
+      <w:r>
+        <w:rPr>
+          <w:i/>
+          <w:iCs/>
+        </w:rPr>
+        <w:t>eroarea</w:t>
+      </w:r>
+      <w:proofErr w:type="spellEnd"/>
+      <w:r>
+        <w:rPr>
+          <w:i/>
+          <w:iCs/>
+        </w:rPr>
+        <w:t xml:space="preserve"> Quota Exceeded), </w:t>
+      </w:r>
+      <w:proofErr w:type="spellStart"/>
+      <w:r>
+        <w:rPr>
+          <w:i/>
+          <w:iCs/>
+        </w:rPr>
+        <w:t>ceea</w:t>
+      </w:r>
+      <w:proofErr w:type="spellEnd"/>
+      <w:r>
+        <w:rPr>
+          <w:i/>
+          <w:iCs/>
+        </w:rPr>
+        <w:t xml:space="preserve"> </w:t>
+      </w:r>
+      <w:proofErr w:type="spellStart"/>
+      <w:r>
+        <w:rPr>
+          <w:i/>
+          <w:iCs/>
+        </w:rPr>
+        <w:t>ce</w:t>
+      </w:r>
+      <w:proofErr w:type="spellEnd"/>
+      <w:r>
+        <w:rPr>
+          <w:i/>
+          <w:iCs/>
+        </w:rPr>
+        <w:t xml:space="preserve"> e </w:t>
+      </w:r>
+      <w:proofErr w:type="spellStart"/>
+      <w:r>
+        <w:rPr>
+          <w:i/>
+          <w:iCs/>
+        </w:rPr>
+        <w:t>absolut</w:t>
+      </w:r>
+      <w:proofErr w:type="spellEnd"/>
+      <w:r>
+        <w:rPr>
+          <w:i/>
+          <w:iCs/>
+        </w:rPr>
+        <w:t xml:space="preserve"> normal </w:t>
+      </w:r>
+      <w:proofErr w:type="spellStart"/>
+      <w:r>
+        <w:rPr>
+          <w:i/>
+          <w:iCs/>
+        </w:rPr>
+        <w:t>în</w:t>
+      </w:r>
+      <w:proofErr w:type="spellEnd"/>
+      <w:r>
+        <w:rPr>
+          <w:i/>
+          <w:iCs/>
+        </w:rPr>
+        <w:t xml:space="preserve"> </w:t>
+      </w:r>
+      <w:proofErr w:type="spellStart"/>
+      <w:r>
+        <w:rPr>
+          <w:i/>
+          <w:iCs/>
+        </w:rPr>
+        <w:t>faza</w:t>
+      </w:r>
+      <w:proofErr w:type="spellEnd"/>
+      <w:r>
+        <w:rPr>
+          <w:i/>
+          <w:iCs/>
+        </w:rPr>
+        <w:t xml:space="preserve"> de </w:t>
+      </w:r>
+      <w:proofErr w:type="spellStart"/>
+      <w:r>
+        <w:rPr>
+          <w:i/>
+          <w:iCs/>
+        </w:rPr>
+        <w:t>testare</w:t>
+      </w:r>
+      <w:proofErr w:type="spellEnd"/>
+      <w:r>
+        <w:rPr>
+          <w:i/>
+          <w:iCs/>
+        </w:rPr>
+        <w:t>.</w:t>
+      </w:r>
+    </w:p>
+    <w:p>
+      <w:r>
+        <w:t xml:space="preserve">Va dura ~1 </w:t>
+      </w:r>
+      <w:proofErr w:type="spellStart"/>
+      <w:r>
+        <w:t>minut</w:t>
+      </w:r>
+      <w:proofErr w:type="spellEnd"/>
+      <w:r>
+        <w:t xml:space="preserve"> </w:t>
+      </w:r>
+      <w:proofErr w:type="spellStart"/>
+      <w:r>
+        <w:t>să</w:t>
+      </w:r>
+      <w:proofErr w:type="spellEnd"/>
+      <w:r>
+        <w:t xml:space="preserve"> se </w:t>
+      </w:r>
+      <w:proofErr w:type="spellStart"/>
+      <w:r>
+        <w:t>actualizeze</w:t>
+      </w:r>
+      <w:proofErr w:type="spellEnd"/>
+      <w:r>
+        <w:t xml:space="preserve"> pe </w:t>
+      </w:r>
+      <w:proofErr w:type="spellStart"/>
+      <w:r>
+        <w:t>Vercel</w:t>
+      </w:r>
+      <w:proofErr w:type="spellEnd"/>
+      <w:r>
+        <w:t xml:space="preserve">, </w:t>
+      </w:r>
+      <w:proofErr w:type="spellStart"/>
+      <w:r>
+        <w:t>după</w:t>
+      </w:r>
+      <w:proofErr w:type="spellEnd"/>
+      <w:r>
+        <w:t xml:space="preserve"> care </w:t>
+      </w:r>
+      <w:proofErr w:type="spellStart"/>
+      <w:r>
+        <w:t>te</w:t>
+      </w:r>
+      <w:proofErr w:type="spellEnd"/>
+      <w:r>
+        <w:t xml:space="preserve"> </w:t>
+      </w:r>
+      <w:proofErr w:type="spellStart"/>
+      <w:r>
+        <w:t>poți</w:t>
+      </w:r>
+      <w:proofErr w:type="spellEnd"/>
+      <w:r>
+        <w:t xml:space="preserve"> </w:t>
+      </w:r>
+      <w:proofErr w:type="spellStart"/>
+      <w:r>
+        <w:t>juca</w:t>
+      </w:r>
+      <w:proofErr w:type="spellEnd"/>
+      <w:r>
+        <w:t xml:space="preserve"> </w:t>
+      </w:r>
+      <w:proofErr w:type="spellStart"/>
+      <w:r>
+        <w:t>prin</w:t>
+      </w:r>
+      <w:proofErr w:type="spellEnd"/>
+      <w:r>
+        <w:t xml:space="preserve"> </w:t>
+      </w:r>
+      <w:proofErr w:type="spellStart"/>
+      <w:r>
+        <w:t>acel</w:t>
+      </w:r>
+      <w:proofErr w:type="spellEnd"/>
+      <w:r>
+        <w:t xml:space="preserve"> link secret! </w:t>
+      </w:r>
+      <w:proofErr w:type="spellStart"/>
+      <w:r>
+        <w:t>Când</w:t>
+      </w:r>
+      <w:proofErr w:type="spellEnd"/>
+      <w:r>
+        <w:t xml:space="preserve"> </w:t>
+      </w:r>
+      <w:proofErr w:type="spellStart"/>
+      <w:r>
+        <w:t>ești</w:t>
+      </w:r>
+      <w:proofErr w:type="spellEnd"/>
+      <w:r>
+        <w:t xml:space="preserve"> gata, </w:t>
+      </w:r>
+      <w:proofErr w:type="spellStart"/>
+      <w:r>
+        <w:t>dăm</w:t>
+      </w:r>
+      <w:proofErr w:type="spellEnd"/>
+      <w:r>
+        <w:t xml:space="preserve"> </w:t>
+      </w:r>
+      <w:proofErr w:type="spellStart"/>
+      <w:r>
+        <w:t>drumul</w:t>
+      </w:r>
+      <w:proofErr w:type="spellEnd"/>
+      <w:r>
+        <w:t xml:space="preserve"> la zona de </w:t>
+      </w:r>
+      <w:proofErr w:type="spellStart"/>
+      <w:r>
+        <w:t>Reclame</w:t>
+      </w:r>
+      <w:proofErr w:type="spellEnd"/>
+      <w:r>
+        <w:t xml:space="preserve"> / Link-</w:t>
+      </w:r>
+      <w:proofErr w:type="spellStart"/>
+      <w:r>
+        <w:t>uri</w:t>
+      </w:r>
+      <w:proofErr w:type="spellEnd"/>
+      <w:r>
+        <w:t>?</w:t>
+      </w:r>
+    </w:p>
     <w:p/>
+    <w:p>
+      <w:r>
+        <w:t>Demo:</w:t>
+      </w:r>
+    </w:p>
+    <w:p>
+      <w:pPr>
+        <w:rPr>
+          <w:b/>
+          <w:bCs/>
+        </w:rPr>
+      </w:pPr>
+      <w:proofErr w:type="spellStart"/>
+      <w:r>
+        <w:rPr>
+          <w:b/>
+          <w:bCs/>
+        </w:rPr>
+        <w:lastRenderedPageBreak/>
+        <w:t>mplementare</w:t>
+      </w:r>
+      <w:proofErr w:type="spellEnd"/>
+      <w:r>
+        <w:rPr>
+          <w:b/>
+          <w:bCs/>
+        </w:rPr>
+        <w:t xml:space="preserve"> Link-</w:t>
+      </w:r>
+      <w:proofErr w:type="spellStart"/>
+      <w:r>
+        <w:rPr>
+          <w:b/>
+          <w:bCs/>
+        </w:rPr>
+        <w:t>uri</w:t>
+      </w:r>
+      <w:proofErr w:type="spellEnd"/>
+      <w:r>
+        <w:rPr>
+          <w:b/>
+          <w:bCs/>
+        </w:rPr>
+        <w:t xml:space="preserve"> </w:t>
+      </w:r>
+      <w:proofErr w:type="spellStart"/>
+      <w:r>
+        <w:rPr>
+          <w:b/>
+          <w:bCs/>
+        </w:rPr>
+        <w:t>Inteligente</w:t>
+      </w:r>
+      <w:proofErr w:type="spellEnd"/>
+      <w:r>
+        <w:rPr>
+          <w:b/>
+          <w:bCs/>
+        </w:rPr>
+        <w:t xml:space="preserve"> din PDF (</w:t>
+      </w:r>
+      <w:proofErr w:type="spellStart"/>
+      <w:r>
+        <w:rPr>
+          <w:b/>
+          <w:bCs/>
+        </w:rPr>
+        <w:t>Mecanism</w:t>
+      </w:r>
+      <w:proofErr w:type="spellEnd"/>
+      <w:r>
+        <w:rPr>
+          <w:b/>
+          <w:bCs/>
+        </w:rPr>
+        <w:t xml:space="preserve"> de </w:t>
+      </w:r>
+      <w:proofErr w:type="spellStart"/>
+      <w:r>
+        <w:rPr>
+          <w:b/>
+          <w:bCs/>
+        </w:rPr>
+        <w:t>Viralitate</w:t>
+      </w:r>
+      <w:proofErr w:type="spellEnd"/>
+      <w:r>
+        <w:rPr>
+          <w:b/>
+          <w:bCs/>
+        </w:rPr>
+        <w:t>)</w:t>
+      </w:r>
+    </w:p>
+    <w:p>
+      <w:r>
+        <w:t xml:space="preserve">Ai </w:t>
+      </w:r>
+      <w:proofErr w:type="spellStart"/>
+      <w:r>
+        <w:t>avut</w:t>
+      </w:r>
+      <w:proofErr w:type="spellEnd"/>
+      <w:r>
+        <w:t xml:space="preserve"> o idee </w:t>
+      </w:r>
+      <w:proofErr w:type="spellStart"/>
+      <w:r>
+        <w:t>excepțională</w:t>
+      </w:r>
+      <w:proofErr w:type="spellEnd"/>
+      <w:r>
+        <w:t xml:space="preserve">! </w:t>
+      </w:r>
+      <w:proofErr w:type="spellStart"/>
+      <w:r>
+        <w:t>Aceasta</w:t>
+      </w:r>
+      <w:proofErr w:type="spellEnd"/>
+      <w:r>
+        <w:t xml:space="preserve"> </w:t>
+      </w:r>
+      <w:proofErr w:type="spellStart"/>
+      <w:r>
+        <w:t>este</w:t>
+      </w:r>
+      <w:proofErr w:type="spellEnd"/>
+      <w:r>
+        <w:t xml:space="preserve"> </w:t>
+      </w:r>
+      <w:proofErr w:type="spellStart"/>
+      <w:r>
+        <w:t>una</w:t>
+      </w:r>
+      <w:proofErr w:type="spellEnd"/>
+      <w:r>
+        <w:t xml:space="preserve"> </w:t>
+      </w:r>
+      <w:proofErr w:type="spellStart"/>
+      <w:r>
+        <w:t>dintre</w:t>
+      </w:r>
+      <w:proofErr w:type="spellEnd"/>
+      <w:r>
+        <w:t xml:space="preserve"> </w:t>
+      </w:r>
+      <w:proofErr w:type="spellStart"/>
+      <w:r>
+        <w:t>cele</w:t>
+      </w:r>
+      <w:proofErr w:type="spellEnd"/>
+      <w:r>
+        <w:t xml:space="preserve"> </w:t>
+      </w:r>
+      <w:proofErr w:type="spellStart"/>
+      <w:r>
+        <w:t>mai</w:t>
+      </w:r>
+      <w:proofErr w:type="spellEnd"/>
+      <w:r>
+        <w:t xml:space="preserve"> </w:t>
+      </w:r>
+      <w:proofErr w:type="spellStart"/>
+      <w:r>
+        <w:t>bune</w:t>
+      </w:r>
+      <w:proofErr w:type="spellEnd"/>
+      <w:r>
+        <w:t xml:space="preserve"> </w:t>
+      </w:r>
+      <w:proofErr w:type="spellStart"/>
+      <w:r>
+        <w:t>strategii</w:t>
+      </w:r>
+      <w:proofErr w:type="spellEnd"/>
+      <w:r>
+        <w:t xml:space="preserve"> de a </w:t>
+      </w:r>
+      <w:proofErr w:type="spellStart"/>
+      <w:r>
+        <w:t>aduce</w:t>
+      </w:r>
+      <w:proofErr w:type="spellEnd"/>
+      <w:r>
+        <w:t xml:space="preserve"> </w:t>
+      </w:r>
+      <w:proofErr w:type="spellStart"/>
+      <w:r>
+        <w:t>utilizatori</w:t>
+      </w:r>
+      <w:proofErr w:type="spellEnd"/>
+      <w:r>
+        <w:t xml:space="preserve"> </w:t>
+      </w:r>
+      <w:proofErr w:type="spellStart"/>
+      <w:r>
+        <w:t>noi</w:t>
+      </w:r>
+      <w:proofErr w:type="spellEnd"/>
+      <w:r>
+        <w:t xml:space="preserve"> </w:t>
+      </w:r>
+      <w:proofErr w:type="spellStart"/>
+      <w:r>
+        <w:t>și</w:t>
+      </w:r>
+      <w:proofErr w:type="spellEnd"/>
+      <w:r>
+        <w:t xml:space="preserve"> de a-</w:t>
+      </w:r>
+      <w:proofErr w:type="spellStart"/>
+      <w:r>
+        <w:t>i</w:t>
+      </w:r>
+      <w:proofErr w:type="spellEnd"/>
+      <w:r>
+        <w:t xml:space="preserve"> </w:t>
+      </w:r>
+      <w:proofErr w:type="spellStart"/>
+      <w:r>
+        <w:t>forța</w:t>
+      </w:r>
+      <w:proofErr w:type="spellEnd"/>
+      <w:r>
+        <w:t xml:space="preserve"> </w:t>
+      </w:r>
+      <w:proofErr w:type="spellStart"/>
+      <w:r>
+        <w:t>să</w:t>
+      </w:r>
+      <w:proofErr w:type="spellEnd"/>
+      <w:r>
+        <w:t xml:space="preserve"> </w:t>
+      </w:r>
+      <w:proofErr w:type="spellStart"/>
+      <w:r>
+        <w:t>își</w:t>
+      </w:r>
+      <w:proofErr w:type="spellEnd"/>
+      <w:r>
+        <w:t xml:space="preserve"> </w:t>
+      </w:r>
+      <w:proofErr w:type="spellStart"/>
+      <w:r>
+        <w:t>facă</w:t>
+      </w:r>
+      <w:proofErr w:type="spellEnd"/>
+      <w:r>
+        <w:t xml:space="preserve"> cont.</w:t>
+      </w:r>
+    </w:p>
+    <w:p>
+      <w:pPr>
+        <w:rPr>
+          <w:b/>
+          <w:bCs/>
+        </w:rPr>
+      </w:pPr>
+      <w:proofErr w:type="spellStart"/>
+      <w:r>
+        <w:rPr>
+          <w:b/>
+          <w:bCs/>
+        </w:rPr>
+        <w:t>Propunerea</w:t>
+      </w:r>
+      <w:proofErr w:type="spellEnd"/>
+      <w:r>
+        <w:rPr>
+          <w:b/>
+          <w:bCs/>
+        </w:rPr>
+        <w:t xml:space="preserve"> de flux</w:t>
+      </w:r>
+    </w:p>
+    <w:p>
+      <w:pPr>
+        <w:numPr>
+          <w:ilvl w:val="0"/>
+          <w:numId w:val="15"/>
+        </w:numPr>
+      </w:pPr>
+      <w:proofErr w:type="spellStart"/>
+      <w:r>
+        <w:t>Când</w:t>
+      </w:r>
+      <w:proofErr w:type="spellEnd"/>
+      <w:r>
+        <w:t xml:space="preserve"> un </w:t>
+      </w:r>
+      <w:proofErr w:type="spellStart"/>
+      <w:r>
+        <w:t>utilizator</w:t>
+      </w:r>
+      <w:proofErr w:type="spellEnd"/>
+      <w:r>
+        <w:t xml:space="preserve"> </w:t>
+      </w:r>
+      <w:proofErr w:type="spellStart"/>
+      <w:r>
+        <w:t>apasă</w:t>
+      </w:r>
+      <w:proofErr w:type="spellEnd"/>
+      <w:r>
+        <w:t xml:space="preserve"> "</w:t>
+      </w:r>
+      <w:proofErr w:type="spellStart"/>
+      <w:r>
+        <w:t>Descarcă</w:t>
+      </w:r>
+      <w:proofErr w:type="spellEnd"/>
+      <w:r>
+        <w:t xml:space="preserve"> PDF", </w:t>
+      </w:r>
+      <w:proofErr w:type="spellStart"/>
+      <w:r>
+        <w:t>înainte</w:t>
+      </w:r>
+      <w:proofErr w:type="spellEnd"/>
+      <w:r>
+        <w:t xml:space="preserve"> </w:t>
+      </w:r>
+      <w:proofErr w:type="spellStart"/>
+      <w:r>
+        <w:t>să</w:t>
+      </w:r>
+      <w:proofErr w:type="spellEnd"/>
+      <w:r>
+        <w:t xml:space="preserve"> </w:t>
+      </w:r>
+      <w:proofErr w:type="spellStart"/>
+      <w:r>
+        <w:t>generăm</w:t>
+      </w:r>
+      <w:proofErr w:type="spellEnd"/>
+      <w:r>
+        <w:t xml:space="preserve"> </w:t>
+      </w:r>
+      <w:proofErr w:type="spellStart"/>
+      <w:r>
+        <w:t>fișierul</w:t>
+      </w:r>
+      <w:proofErr w:type="spellEnd"/>
+      <w:r>
+        <w:t xml:space="preserve">, </w:t>
+      </w:r>
+      <w:proofErr w:type="spellStart"/>
+      <w:r>
+        <w:t>salvăm</w:t>
+      </w:r>
+      <w:proofErr w:type="spellEnd"/>
+      <w:r>
+        <w:t xml:space="preserve"> </w:t>
+      </w:r>
+      <w:proofErr w:type="spellStart"/>
+      <w:r>
+        <w:t>în</w:t>
+      </w:r>
+      <w:proofErr w:type="spellEnd"/>
+      <w:r>
+        <w:t xml:space="preserve"> mod </w:t>
+      </w:r>
+      <w:proofErr w:type="spellStart"/>
+      <w:r>
+        <w:t>silențios</w:t>
+      </w:r>
+      <w:proofErr w:type="spellEnd"/>
+      <w:r>
+        <w:t xml:space="preserve"> </w:t>
+      </w:r>
+      <w:proofErr w:type="spellStart"/>
+      <w:r>
+        <w:t>planul</w:t>
+      </w:r>
+      <w:proofErr w:type="spellEnd"/>
+      <w:r>
+        <w:t xml:space="preserve"> </w:t>
+      </w:r>
+      <w:proofErr w:type="spellStart"/>
+      <w:r>
+        <w:t>lui</w:t>
+      </w:r>
+      <w:proofErr w:type="spellEnd"/>
+      <w:r>
+        <w:t xml:space="preserve"> </w:t>
+      </w:r>
+      <w:proofErr w:type="spellStart"/>
+      <w:r>
+        <w:t>curent</w:t>
+      </w:r>
+      <w:proofErr w:type="spellEnd"/>
+      <w:r>
+        <w:t xml:space="preserve"> </w:t>
+      </w:r>
+      <w:proofErr w:type="spellStart"/>
+      <w:r>
+        <w:t>într</w:t>
+      </w:r>
+      <w:proofErr w:type="spellEnd"/>
+      <w:r>
+        <w:t xml:space="preserve">-o </w:t>
+      </w:r>
+      <w:proofErr w:type="spellStart"/>
+      <w:r>
+        <w:t>bază</w:t>
+      </w:r>
+      <w:proofErr w:type="spellEnd"/>
+      <w:r>
+        <w:t xml:space="preserve"> de date </w:t>
+      </w:r>
+      <w:proofErr w:type="spellStart"/>
+      <w:r>
+        <w:t>temporară</w:t>
+      </w:r>
+      <w:proofErr w:type="spellEnd"/>
+      <w:r>
+        <w:t xml:space="preserve"> </w:t>
+      </w:r>
+      <w:proofErr w:type="spellStart"/>
+      <w:r>
+        <w:t>în</w:t>
+      </w:r>
+      <w:proofErr w:type="spellEnd"/>
+      <w:r>
+        <w:t xml:space="preserve"> Firebase (sub o </w:t>
+      </w:r>
+      <w:proofErr w:type="spellStart"/>
+      <w:r>
+        <w:t>colecție</w:t>
+      </w:r>
+      <w:proofErr w:type="spellEnd"/>
+      <w:r>
+        <w:t xml:space="preserve"> </w:t>
+      </w:r>
+      <w:proofErr w:type="spellStart"/>
+      <w:r>
+        <w:t>nouă</w:t>
+      </w:r>
+      <w:proofErr w:type="spellEnd"/>
+      <w:r>
+        <w:t xml:space="preserve"> </w:t>
+      </w:r>
+      <w:proofErr w:type="spellStart"/>
+      <w:r>
+        <w:t>numită</w:t>
+      </w:r>
+      <w:proofErr w:type="spellEnd"/>
+      <w:r>
+        <w:t> </w:t>
+      </w:r>
+      <w:proofErr w:type="spellStart"/>
+      <w:r>
+        <w:t>shared_plans</w:t>
+      </w:r>
+      <w:proofErr w:type="spellEnd"/>
+      <w:r>
+        <w:t>).</w:t>
+      </w:r>
+    </w:p>
+    <w:p>
+      <w:pPr>
+        <w:numPr>
+          <w:ilvl w:val="0"/>
+          <w:numId w:val="15"/>
+        </w:numPr>
+      </w:pPr>
+      <w:r>
+        <w:t xml:space="preserve">Firebase ne </w:t>
+      </w:r>
+      <w:proofErr w:type="spellStart"/>
+      <w:r>
+        <w:t>va</w:t>
+      </w:r>
+      <w:proofErr w:type="spellEnd"/>
+      <w:r>
+        <w:t xml:space="preserve"> </w:t>
+      </w:r>
+      <w:proofErr w:type="spellStart"/>
+      <w:r>
+        <w:t>returna</w:t>
+      </w:r>
+      <w:proofErr w:type="spellEnd"/>
+      <w:r>
+        <w:t xml:space="preserve"> un ID </w:t>
+      </w:r>
+      <w:proofErr w:type="spellStart"/>
+      <w:r>
+        <w:t>unic</w:t>
+      </w:r>
+      <w:proofErr w:type="spellEnd"/>
+      <w:r>
+        <w:t xml:space="preserve"> (ex: AbC123XyZ).</w:t>
+      </w:r>
+    </w:p>
+    <w:p>
+      <w:pPr>
+        <w:numPr>
+          <w:ilvl w:val="0"/>
+          <w:numId w:val="15"/>
+        </w:numPr>
+      </w:pPr>
+      <w:proofErr w:type="spellStart"/>
+      <w:r>
+        <w:t>Vom</w:t>
+      </w:r>
+      <w:proofErr w:type="spellEnd"/>
+      <w:r>
+        <w:t xml:space="preserve"> </w:t>
+      </w:r>
+      <w:proofErr w:type="spellStart"/>
+      <w:r>
+        <w:t>injecta</w:t>
+      </w:r>
+      <w:proofErr w:type="spellEnd"/>
+      <w:r>
+        <w:t xml:space="preserve"> </w:t>
+      </w:r>
+      <w:proofErr w:type="spellStart"/>
+      <w:r>
+        <w:t>în</w:t>
+      </w:r>
+      <w:proofErr w:type="spellEnd"/>
+      <w:r>
+        <w:t xml:space="preserve"> PDF un link </w:t>
+      </w:r>
+      <w:proofErr w:type="spellStart"/>
+      <w:r>
+        <w:t>personalizat</w:t>
+      </w:r>
+      <w:proofErr w:type="spellEnd"/>
+      <w:r>
+        <w:t xml:space="preserve"> de forma: https://ideea-ta-ai.vercel.app/shared/AbC123XyZ.</w:t>
+      </w:r>
+    </w:p>
+    <w:p>
+      <w:pPr>
+        <w:numPr>
+          <w:ilvl w:val="0"/>
+          <w:numId w:val="15"/>
+        </w:numPr>
+      </w:pPr>
+      <w:proofErr w:type="spellStart"/>
+      <w:r>
+        <w:t>Vom</w:t>
+      </w:r>
+      <w:proofErr w:type="spellEnd"/>
+      <w:r>
+        <w:t xml:space="preserve"> </w:t>
+      </w:r>
+      <w:proofErr w:type="spellStart"/>
+      <w:r>
+        <w:t>crea</w:t>
+      </w:r>
+      <w:proofErr w:type="spellEnd"/>
+      <w:r>
+        <w:t xml:space="preserve"> o </w:t>
+      </w:r>
+      <w:proofErr w:type="spellStart"/>
+      <w:r>
+        <w:t>pagină</w:t>
+      </w:r>
+      <w:proofErr w:type="spellEnd"/>
+      <w:r>
+        <w:t xml:space="preserve"> </w:t>
+      </w:r>
+      <w:proofErr w:type="spellStart"/>
+      <w:r>
+        <w:t>nouă</w:t>
+      </w:r>
+      <w:proofErr w:type="spellEnd"/>
+      <w:r>
+        <w:t xml:space="preserve"> </w:t>
+      </w:r>
+      <w:proofErr w:type="spellStart"/>
+      <w:r>
+        <w:t>în</w:t>
+      </w:r>
+      <w:proofErr w:type="spellEnd"/>
+      <w:r>
+        <w:t xml:space="preserve"> </w:t>
+      </w:r>
+      <w:proofErr w:type="spellStart"/>
+      <w:r>
+        <w:t>aplicație</w:t>
+      </w:r>
+      <w:proofErr w:type="spellEnd"/>
+      <w:r>
+        <w:t xml:space="preserve"> (/shared/[id]) </w:t>
+      </w:r>
+      <w:proofErr w:type="spellStart"/>
+      <w:r>
+        <w:t>unde</w:t>
+      </w:r>
+      <w:proofErr w:type="spellEnd"/>
+      <w:r>
+        <w:t xml:space="preserve">, </w:t>
+      </w:r>
+      <w:proofErr w:type="spellStart"/>
+      <w:r>
+        <w:t>dacă</w:t>
+      </w:r>
+      <w:proofErr w:type="spellEnd"/>
+      <w:r>
+        <w:t xml:space="preserve"> </w:t>
+      </w:r>
+      <w:proofErr w:type="spellStart"/>
+      <w:r>
+        <w:t>cineva</w:t>
+      </w:r>
+      <w:proofErr w:type="spellEnd"/>
+      <w:r>
+        <w:t xml:space="preserve"> </w:t>
+      </w:r>
+      <w:proofErr w:type="spellStart"/>
+      <w:r>
+        <w:t>intră</w:t>
+      </w:r>
+      <w:proofErr w:type="spellEnd"/>
+      <w:r>
+        <w:t xml:space="preserve"> de pe </w:t>
+      </w:r>
+      <w:proofErr w:type="spellStart"/>
+      <w:r>
+        <w:t>acel</w:t>
+      </w:r>
+      <w:proofErr w:type="spellEnd"/>
+      <w:r>
+        <w:t xml:space="preserve"> link:</w:t>
+      </w:r>
+    </w:p>
+    <w:p>
+      <w:pPr>
+        <w:numPr>
+          <w:ilvl w:val="1"/>
+          <w:numId w:val="15"/>
+        </w:numPr>
+      </w:pPr>
+      <w:proofErr w:type="spellStart"/>
+      <w:r>
+        <w:t>Pagina</w:t>
+      </w:r>
+      <w:proofErr w:type="spellEnd"/>
+      <w:r>
+        <w:t xml:space="preserve"> </w:t>
+      </w:r>
+      <w:proofErr w:type="spellStart"/>
+      <w:r>
+        <w:t>va</w:t>
+      </w:r>
+      <w:proofErr w:type="spellEnd"/>
+      <w:r>
+        <w:t xml:space="preserve"> </w:t>
+      </w:r>
+      <w:proofErr w:type="spellStart"/>
+      <w:r>
+        <w:t>încărca</w:t>
+      </w:r>
+      <w:proofErr w:type="spellEnd"/>
+      <w:r>
+        <w:t xml:space="preserve"> </w:t>
+      </w:r>
+      <w:proofErr w:type="spellStart"/>
+      <w:r>
+        <w:t>planul</w:t>
+      </w:r>
+      <w:proofErr w:type="spellEnd"/>
+      <w:r>
+        <w:t xml:space="preserve"> de </w:t>
+      </w:r>
+      <w:proofErr w:type="spellStart"/>
+      <w:r>
+        <w:t>afaceri</w:t>
+      </w:r>
+      <w:proofErr w:type="spellEnd"/>
+      <w:r>
+        <w:t xml:space="preserve"> </w:t>
+      </w:r>
+      <w:proofErr w:type="spellStart"/>
+      <w:r>
+        <w:t>frumos</w:t>
+      </w:r>
+      <w:proofErr w:type="spellEnd"/>
+      <w:r>
+        <w:t xml:space="preserve"> </w:t>
+      </w:r>
+      <w:proofErr w:type="spellStart"/>
+      <w:r>
+        <w:t>formatat</w:t>
+      </w:r>
+      <w:proofErr w:type="spellEnd"/>
+      <w:r>
+        <w:t xml:space="preserve">, exact cum </w:t>
+      </w:r>
+      <w:proofErr w:type="spellStart"/>
+      <w:r>
+        <w:t>arată</w:t>
+      </w:r>
+      <w:proofErr w:type="spellEnd"/>
+      <w:r>
+        <w:t xml:space="preserve"> </w:t>
+      </w:r>
+      <w:proofErr w:type="spellStart"/>
+      <w:r>
+        <w:t>în</w:t>
+      </w:r>
+      <w:proofErr w:type="spellEnd"/>
+      <w:r>
+        <w:t xml:space="preserve"> Demo.</w:t>
+      </w:r>
+    </w:p>
+    <w:p>
+      <w:pPr>
+        <w:numPr>
+          <w:ilvl w:val="1"/>
+          <w:numId w:val="15"/>
+        </w:numPr>
+      </w:pPr>
+      <w:proofErr w:type="spellStart"/>
+      <w:r>
+        <w:t>Peste</w:t>
+      </w:r>
+      <w:proofErr w:type="spellEnd"/>
+      <w:r>
+        <w:t xml:space="preserve"> plan </w:t>
+      </w:r>
+      <w:proofErr w:type="spellStart"/>
+      <w:r>
+        <w:t>va</w:t>
+      </w:r>
+      <w:proofErr w:type="spellEnd"/>
+      <w:r>
+        <w:t xml:space="preserve"> fi </w:t>
+      </w:r>
+      <w:proofErr w:type="spellStart"/>
+      <w:r>
+        <w:t>afișată</w:t>
+      </w:r>
+      <w:proofErr w:type="spellEnd"/>
+      <w:r>
+        <w:t xml:space="preserve"> o </w:t>
+      </w:r>
+      <w:proofErr w:type="spellStart"/>
+      <w:r>
+        <w:t>fereastră</w:t>
+      </w:r>
+      <w:proofErr w:type="spellEnd"/>
+      <w:r>
+        <w:t xml:space="preserve"> </w:t>
+      </w:r>
+      <w:proofErr w:type="spellStart"/>
+      <w:r>
+        <w:t>peste</w:t>
+      </w:r>
+      <w:proofErr w:type="spellEnd"/>
+      <w:r>
+        <w:t xml:space="preserve"> care </w:t>
+      </w:r>
+      <w:r>
+        <w:rPr>
+          <w:b/>
+          <w:bCs/>
+        </w:rPr>
+        <w:t>NU</w:t>
+      </w:r>
+      <w:r>
+        <w:t xml:space="preserve"> se </w:t>
+      </w:r>
+      <w:proofErr w:type="spellStart"/>
+      <w:r>
+        <w:t>poate</w:t>
+      </w:r>
+      <w:proofErr w:type="spellEnd"/>
+      <w:r>
+        <w:t xml:space="preserve"> </w:t>
+      </w:r>
+      <w:proofErr w:type="spellStart"/>
+      <w:r>
+        <w:t>trece</w:t>
+      </w:r>
+      <w:proofErr w:type="spellEnd"/>
+      <w:r>
+        <w:t xml:space="preserve"> (un Pop-up </w:t>
+      </w:r>
+      <w:proofErr w:type="spellStart"/>
+      <w:r>
+        <w:t>obligatoriu</w:t>
+      </w:r>
+      <w:proofErr w:type="spellEnd"/>
+      <w:r>
+        <w:t xml:space="preserve">) cu </w:t>
+      </w:r>
+      <w:proofErr w:type="spellStart"/>
+      <w:r>
+        <w:t>mesajul</w:t>
+      </w:r>
+      <w:proofErr w:type="spellEnd"/>
+      <w:r>
+        <w:t>: </w:t>
+      </w:r>
+      <w:r>
+        <w:rPr>
+          <w:i/>
+          <w:iCs/>
+        </w:rPr>
+        <w:t>"</w:t>
+      </w:r>
+      <w:proofErr w:type="spellStart"/>
+      <w:r>
+        <w:rPr>
+          <w:i/>
+          <w:iCs/>
+        </w:rPr>
+        <w:t>Continuă</w:t>
+      </w:r>
+      <w:proofErr w:type="spellEnd"/>
+      <w:r>
+        <w:rPr>
+          <w:i/>
+          <w:iCs/>
+        </w:rPr>
+        <w:t xml:space="preserve"> </w:t>
+      </w:r>
+      <w:proofErr w:type="spellStart"/>
+      <w:r>
+        <w:rPr>
+          <w:i/>
+          <w:iCs/>
+        </w:rPr>
+        <w:t>dezvoltarea</w:t>
+      </w:r>
+      <w:proofErr w:type="spellEnd"/>
+      <w:r>
+        <w:rPr>
+          <w:i/>
+          <w:iCs/>
+        </w:rPr>
+        <w:t xml:space="preserve"> </w:t>
+      </w:r>
+      <w:proofErr w:type="spellStart"/>
+      <w:r>
+        <w:rPr>
+          <w:i/>
+          <w:iCs/>
+        </w:rPr>
+        <w:t>planului</w:t>
+      </w:r>
+      <w:proofErr w:type="spellEnd"/>
+      <w:r>
+        <w:rPr>
+          <w:i/>
+          <w:iCs/>
+        </w:rPr>
+        <w:t xml:space="preserve"> </w:t>
+      </w:r>
+      <w:proofErr w:type="spellStart"/>
+      <w:r>
+        <w:rPr>
+          <w:i/>
+          <w:iCs/>
+        </w:rPr>
+        <w:t>pentru</w:t>
+      </w:r>
+      <w:proofErr w:type="spellEnd"/>
+      <w:r>
+        <w:rPr>
+          <w:i/>
+          <w:iCs/>
+        </w:rPr>
+        <w:t xml:space="preserve"> [</w:t>
+      </w:r>
+      <w:proofErr w:type="spellStart"/>
+      <w:r>
+        <w:rPr>
+          <w:i/>
+          <w:iCs/>
+        </w:rPr>
+        <w:t>Nume</w:t>
+      </w:r>
+      <w:proofErr w:type="spellEnd"/>
+      <w:r>
+        <w:rPr>
+          <w:i/>
+          <w:iCs/>
+        </w:rPr>
+        <w:t xml:space="preserve"> </w:t>
+      </w:r>
+      <w:proofErr w:type="spellStart"/>
+      <w:r>
+        <w:rPr>
+          <w:i/>
+          <w:iCs/>
+        </w:rPr>
+        <w:t>Afacere</w:t>
+      </w:r>
+      <w:proofErr w:type="spellEnd"/>
+      <w:r>
+        <w:rPr>
+          <w:i/>
+          <w:iCs/>
+        </w:rPr>
+        <w:t xml:space="preserve">]. </w:t>
+      </w:r>
+      <w:proofErr w:type="spellStart"/>
+      <w:r>
+        <w:rPr>
+          <w:i/>
+          <w:iCs/>
+        </w:rPr>
+        <w:t>Pentru</w:t>
+      </w:r>
+      <w:proofErr w:type="spellEnd"/>
+      <w:r>
+        <w:rPr>
+          <w:i/>
+          <w:iCs/>
+        </w:rPr>
+        <w:t xml:space="preserve"> a </w:t>
+      </w:r>
+      <w:proofErr w:type="spellStart"/>
+      <w:r>
+        <w:rPr>
+          <w:i/>
+          <w:iCs/>
+        </w:rPr>
+        <w:t>folosi</w:t>
+      </w:r>
+      <w:proofErr w:type="spellEnd"/>
+      <w:r>
+        <w:rPr>
+          <w:i/>
+          <w:iCs/>
+        </w:rPr>
+        <w:t xml:space="preserve"> </w:t>
+      </w:r>
+      <w:proofErr w:type="spellStart"/>
+      <w:r>
+        <w:rPr>
+          <w:i/>
+          <w:iCs/>
+        </w:rPr>
+        <w:t>asistentul</w:t>
+      </w:r>
+      <w:proofErr w:type="spellEnd"/>
+      <w:r>
+        <w:rPr>
+          <w:i/>
+          <w:iCs/>
+        </w:rPr>
+        <w:t xml:space="preserve"> </w:t>
+      </w:r>
+      <w:proofErr w:type="spellStart"/>
+      <w:r>
+        <w:rPr>
+          <w:i/>
+          <w:iCs/>
+        </w:rPr>
+        <w:t>inteligent</w:t>
+      </w:r>
+      <w:proofErr w:type="spellEnd"/>
+      <w:r>
+        <w:rPr>
+          <w:i/>
+          <w:iCs/>
+        </w:rPr>
+        <w:t xml:space="preserve"> </w:t>
+      </w:r>
+      <w:proofErr w:type="spellStart"/>
+      <w:r>
+        <w:rPr>
+          <w:i/>
+          <w:iCs/>
+        </w:rPr>
+        <w:t>și</w:t>
+      </w:r>
+      <w:proofErr w:type="spellEnd"/>
+      <w:r>
+        <w:rPr>
+          <w:i/>
+          <w:iCs/>
+        </w:rPr>
+        <w:t xml:space="preserve"> a </w:t>
+      </w:r>
+      <w:proofErr w:type="spellStart"/>
+      <w:r>
+        <w:rPr>
+          <w:i/>
+          <w:iCs/>
+        </w:rPr>
+        <w:t>finaliza</w:t>
+      </w:r>
+      <w:proofErr w:type="spellEnd"/>
+      <w:r>
+        <w:rPr>
+          <w:i/>
+          <w:iCs/>
+        </w:rPr>
+        <w:t xml:space="preserve"> </w:t>
+      </w:r>
+      <w:proofErr w:type="spellStart"/>
+      <w:r>
+        <w:rPr>
+          <w:i/>
+          <w:iCs/>
+        </w:rPr>
+        <w:t>editarea</w:t>
+      </w:r>
+      <w:proofErr w:type="spellEnd"/>
+      <w:r>
+        <w:rPr>
+          <w:i/>
+          <w:iCs/>
+        </w:rPr>
+        <w:t xml:space="preserve">, </w:t>
+      </w:r>
+      <w:proofErr w:type="spellStart"/>
+      <w:r>
+        <w:rPr>
+          <w:i/>
+          <w:iCs/>
+        </w:rPr>
+        <w:t>te</w:t>
+      </w:r>
+      <w:proofErr w:type="spellEnd"/>
+      <w:r>
+        <w:rPr>
+          <w:i/>
+          <w:iCs/>
+        </w:rPr>
+        <w:t xml:space="preserve"> </w:t>
+      </w:r>
+      <w:proofErr w:type="spellStart"/>
+      <w:r>
+        <w:rPr>
+          <w:i/>
+          <w:iCs/>
+        </w:rPr>
+        <w:t>rugăm</w:t>
+      </w:r>
+      <w:proofErr w:type="spellEnd"/>
+      <w:r>
+        <w:rPr>
+          <w:i/>
+          <w:iCs/>
+        </w:rPr>
+        <w:t xml:space="preserve"> </w:t>
+      </w:r>
+      <w:proofErr w:type="spellStart"/>
+      <w:r>
+        <w:rPr>
+          <w:i/>
+          <w:iCs/>
+        </w:rPr>
+        <w:t>să</w:t>
+      </w:r>
+      <w:proofErr w:type="spellEnd"/>
+      <w:r>
+        <w:rPr>
+          <w:i/>
+          <w:iCs/>
+        </w:rPr>
+        <w:t xml:space="preserve"> </w:t>
+      </w:r>
+      <w:proofErr w:type="spellStart"/>
+      <w:r>
+        <w:rPr>
+          <w:i/>
+          <w:iCs/>
+        </w:rPr>
+        <w:t>te</w:t>
+      </w:r>
+      <w:proofErr w:type="spellEnd"/>
+      <w:r>
+        <w:rPr>
+          <w:i/>
+          <w:iCs/>
+        </w:rPr>
+        <w:t xml:space="preserve"> </w:t>
+      </w:r>
+      <w:proofErr w:type="spellStart"/>
+      <w:r>
+        <w:rPr>
+          <w:i/>
+          <w:iCs/>
+        </w:rPr>
+        <w:t>autentifici</w:t>
+      </w:r>
+      <w:proofErr w:type="spellEnd"/>
+      <w:r>
+        <w:rPr>
+          <w:i/>
+          <w:iCs/>
+        </w:rPr>
+        <w:t>!"</w:t>
+      </w:r>
+    </w:p>
+    <w:p>
+      <w:pPr>
+        <w:numPr>
+          <w:ilvl w:val="1"/>
+          <w:numId w:val="15"/>
+        </w:numPr>
+      </w:pPr>
+      <w:r>
+        <w:t xml:space="preserve">Vor </w:t>
+      </w:r>
+      <w:proofErr w:type="spellStart"/>
+      <w:r>
+        <w:t>avea</w:t>
+      </w:r>
+      <w:proofErr w:type="spellEnd"/>
+      <w:r>
+        <w:t xml:space="preserve"> la </w:t>
+      </w:r>
+      <w:proofErr w:type="spellStart"/>
+      <w:r>
+        <w:t>dispoziție</w:t>
+      </w:r>
+      <w:proofErr w:type="spellEnd"/>
+      <w:r>
+        <w:t xml:space="preserve"> </w:t>
+      </w:r>
+      <w:proofErr w:type="spellStart"/>
+      <w:r>
+        <w:t>doar</w:t>
+      </w:r>
+      <w:proofErr w:type="spellEnd"/>
+      <w:r>
+        <w:t xml:space="preserve"> </w:t>
+      </w:r>
+      <w:proofErr w:type="spellStart"/>
+      <w:r>
+        <w:t>opțiunea</w:t>
+      </w:r>
+      <w:proofErr w:type="spellEnd"/>
+      <w:r>
+        <w:t xml:space="preserve"> de "</w:t>
+      </w:r>
+      <w:proofErr w:type="spellStart"/>
+      <w:r>
+        <w:t>Creare</w:t>
+      </w:r>
+      <w:proofErr w:type="spellEnd"/>
+      <w:r>
+        <w:t xml:space="preserve"> </w:t>
+      </w:r>
+      <w:proofErr w:type="spellStart"/>
+      <w:r>
+        <w:t>Cont</w:t>
+      </w:r>
+      <w:proofErr w:type="spellEnd"/>
+      <w:r>
+        <w:t xml:space="preserve"> / </w:t>
+      </w:r>
+      <w:proofErr w:type="spellStart"/>
+      <w:r>
+        <w:t>Logare</w:t>
+      </w:r>
+      <w:proofErr w:type="spellEnd"/>
+      <w:r>
+        <w:t>".</w:t>
+      </w:r>
+    </w:p>
+    <w:p>
+      <w:pPr>
+        <w:numPr>
+          <w:ilvl w:val="0"/>
+          <w:numId w:val="15"/>
+        </w:numPr>
+      </w:pPr>
+      <w:proofErr w:type="spellStart"/>
+      <w:r>
+        <w:t>După</w:t>
+      </w:r>
+      <w:proofErr w:type="spellEnd"/>
+      <w:r>
+        <w:t xml:space="preserve"> </w:t>
+      </w:r>
+      <w:proofErr w:type="spellStart"/>
+      <w:r>
+        <w:t>ce</w:t>
+      </w:r>
+      <w:proofErr w:type="spellEnd"/>
+      <w:r>
+        <w:t xml:space="preserve"> </w:t>
+      </w:r>
+      <w:proofErr w:type="spellStart"/>
+      <w:r>
+        <w:t>își</w:t>
+      </w:r>
+      <w:proofErr w:type="spellEnd"/>
+      <w:r>
+        <w:t xml:space="preserve"> fac </w:t>
+      </w:r>
+      <w:proofErr w:type="spellStart"/>
+      <w:r>
+        <w:t>contul</w:t>
+      </w:r>
+      <w:proofErr w:type="spellEnd"/>
+      <w:r>
+        <w:t xml:space="preserve">, </w:t>
+      </w:r>
+      <w:proofErr w:type="spellStart"/>
+      <w:r>
+        <w:t>planul</w:t>
+      </w:r>
+      <w:proofErr w:type="spellEnd"/>
+      <w:r>
+        <w:t xml:space="preserve"> </w:t>
+      </w:r>
+      <w:proofErr w:type="spellStart"/>
+      <w:r>
+        <w:t>este</w:t>
+      </w:r>
+      <w:proofErr w:type="spellEnd"/>
+      <w:r>
+        <w:t xml:space="preserve"> </w:t>
+      </w:r>
+      <w:proofErr w:type="spellStart"/>
+      <w:r>
+        <w:t>transferat</w:t>
+      </w:r>
+      <w:proofErr w:type="spellEnd"/>
+      <w:r>
+        <w:t xml:space="preserve"> </w:t>
+      </w:r>
+      <w:proofErr w:type="spellStart"/>
+      <w:r>
+        <w:t>oficial</w:t>
+      </w:r>
+      <w:proofErr w:type="spellEnd"/>
+      <w:r>
+        <w:t xml:space="preserve"> pe </w:t>
+      </w:r>
+      <w:proofErr w:type="spellStart"/>
+      <w:r>
+        <w:t>contul</w:t>
+      </w:r>
+      <w:proofErr w:type="spellEnd"/>
+      <w:r>
+        <w:t xml:space="preserve"> lor, </w:t>
+      </w:r>
+      <w:proofErr w:type="spellStart"/>
+      <w:r>
+        <w:t>intră</w:t>
+      </w:r>
+      <w:proofErr w:type="spellEnd"/>
+      <w:r>
+        <w:t xml:space="preserve"> </w:t>
+      </w:r>
+      <w:proofErr w:type="spellStart"/>
+      <w:r>
+        <w:t>în</w:t>
+      </w:r>
+      <w:proofErr w:type="spellEnd"/>
+      <w:r>
+        <w:t xml:space="preserve"> </w:t>
+      </w:r>
+      <w:proofErr w:type="spellStart"/>
+      <w:r>
+        <w:t>modul</w:t>
+      </w:r>
+      <w:proofErr w:type="spellEnd"/>
+      <w:r>
+        <w:t xml:space="preserve"> de </w:t>
+      </w:r>
+      <w:proofErr w:type="spellStart"/>
+      <w:r>
+        <w:t>editare</w:t>
+      </w:r>
+      <w:proofErr w:type="spellEnd"/>
+      <w:r>
+        <w:t xml:space="preserve"> </w:t>
+      </w:r>
+      <w:proofErr w:type="spellStart"/>
+      <w:r>
+        <w:t>complet</w:t>
+      </w:r>
+      <w:proofErr w:type="spellEnd"/>
+      <w:r>
+        <w:t xml:space="preserve"> </w:t>
+      </w:r>
+      <w:proofErr w:type="spellStart"/>
+      <w:r>
+        <w:t>și</w:t>
+      </w:r>
+      <w:proofErr w:type="spellEnd"/>
+      <w:r>
+        <w:t xml:space="preserve">, </w:t>
+      </w:r>
+      <w:proofErr w:type="spellStart"/>
+      <w:r>
+        <w:t>desigur</w:t>
+      </w:r>
+      <w:proofErr w:type="spellEnd"/>
+      <w:r>
+        <w:t xml:space="preserve">, le </w:t>
+      </w:r>
+      <w:proofErr w:type="spellStart"/>
+      <w:r>
+        <w:t>va</w:t>
+      </w:r>
+      <w:proofErr w:type="spellEnd"/>
+      <w:r>
+        <w:t xml:space="preserve"> </w:t>
+      </w:r>
+      <w:proofErr w:type="spellStart"/>
+      <w:r>
+        <w:t>apărea</w:t>
+      </w:r>
+      <w:proofErr w:type="spellEnd"/>
+      <w:r>
+        <w:t xml:space="preserve"> </w:t>
+      </w:r>
+      <w:proofErr w:type="spellStart"/>
+      <w:r>
+        <w:t>pachetul</w:t>
+      </w:r>
+      <w:proofErr w:type="spellEnd"/>
+      <w:r>
+        <w:t xml:space="preserve"> de </w:t>
+      </w:r>
+      <w:proofErr w:type="spellStart"/>
+      <w:r>
+        <w:t>prețuri</w:t>
+      </w:r>
+      <w:proofErr w:type="spellEnd"/>
+      <w:r>
+        <w:t xml:space="preserve"> </w:t>
+      </w:r>
+      <w:proofErr w:type="spellStart"/>
+      <w:r>
+        <w:t>pentru</w:t>
+      </w:r>
+      <w:proofErr w:type="spellEnd"/>
+      <w:r>
+        <w:t xml:space="preserve"> a </w:t>
+      </w:r>
+      <w:proofErr w:type="spellStart"/>
+      <w:r>
+        <w:t>debloca</w:t>
+      </w:r>
+      <w:proofErr w:type="spellEnd"/>
+      <w:r>
+        <w:t xml:space="preserve"> </w:t>
+      </w:r>
+      <w:proofErr w:type="spellStart"/>
+      <w:r>
+        <w:t>exporturile</w:t>
+      </w:r>
+      <w:proofErr w:type="spellEnd"/>
+      <w:r>
+        <w:t xml:space="preserve"> finale.</w:t>
+      </w:r>
+    </w:p>
+    <w:p>
+      <w:pPr>
+        <w:rPr>
+          <w:b/>
+          <w:bCs/>
+        </w:rPr>
+      </w:pPr>
+      <w:proofErr w:type="spellStart"/>
+      <w:r>
+        <w:rPr>
+          <w:b/>
+          <w:bCs/>
+        </w:rPr>
+        <w:t>Modificări</w:t>
+      </w:r>
+      <w:proofErr w:type="spellEnd"/>
+      <w:r>
+        <w:rPr>
+          <w:b/>
+          <w:bCs/>
+        </w:rPr>
+        <w:t xml:space="preserve"> </w:t>
+      </w:r>
+      <w:proofErr w:type="spellStart"/>
+      <w:r>
+        <w:rPr>
+          <w:b/>
+          <w:bCs/>
+        </w:rPr>
+        <w:t>tehnice</w:t>
+      </w:r>
+      <w:proofErr w:type="spellEnd"/>
+      <w:r>
+        <w:rPr>
+          <w:b/>
+          <w:bCs/>
+        </w:rPr>
+        <w:t xml:space="preserve"> </w:t>
+      </w:r>
+      <w:proofErr w:type="spellStart"/>
+      <w:r>
+        <w:rPr>
+          <w:b/>
+          <w:bCs/>
+        </w:rPr>
+        <w:t>necesare</w:t>
+      </w:r>
+      <w:proofErr w:type="spellEnd"/>
+    </w:p>
+    <w:p>
+      <w:r>
+        <w:t>app/start/</w:t>
+      </w:r>
+      <w:proofErr w:type="spellStart"/>
+      <w:r>
+        <w:t>page.tsx</w:t>
+      </w:r>
+      <w:proofErr w:type="spellEnd"/>
+    </w:p>
+    <w:p>
+      <w:pPr>
+        <w:numPr>
+          <w:ilvl w:val="0"/>
+          <w:numId w:val="16"/>
+        </w:numPr>
+      </w:pPr>
+      <w:proofErr w:type="spellStart"/>
+      <w:r>
+        <w:t>Adăugarea</w:t>
+      </w:r>
+      <w:proofErr w:type="spellEnd"/>
+      <w:r>
+        <w:t xml:space="preserve"> </w:t>
+      </w:r>
+      <w:proofErr w:type="spellStart"/>
+      <w:r>
+        <w:t>funcției</w:t>
+      </w:r>
+      <w:proofErr w:type="spellEnd"/>
+      <w:r>
+        <w:t xml:space="preserve"> de </w:t>
+      </w:r>
+      <w:proofErr w:type="spellStart"/>
+      <w:r>
+        <w:t>salvare</w:t>
+      </w:r>
+      <w:proofErr w:type="spellEnd"/>
+      <w:r>
+        <w:t xml:space="preserve"> </w:t>
+      </w:r>
+      <w:proofErr w:type="spellStart"/>
+      <w:r>
+        <w:t>în</w:t>
+      </w:r>
+      <w:proofErr w:type="spellEnd"/>
+      <w:r>
+        <w:t xml:space="preserve"> </w:t>
+      </w:r>
+      <w:proofErr w:type="spellStart"/>
+      <w:r>
+        <w:t>baza</w:t>
+      </w:r>
+      <w:proofErr w:type="spellEnd"/>
+      <w:r>
+        <w:t xml:space="preserve"> de date </w:t>
+      </w:r>
+      <w:proofErr w:type="spellStart"/>
+      <w:r>
+        <w:t>shared_plans</w:t>
+      </w:r>
+      <w:proofErr w:type="spellEnd"/>
+      <w:r>
+        <w:t> </w:t>
+      </w:r>
+      <w:proofErr w:type="spellStart"/>
+      <w:r>
+        <w:t>chiar</w:t>
+      </w:r>
+      <w:proofErr w:type="spellEnd"/>
+      <w:r>
+        <w:t xml:space="preserve"> </w:t>
+      </w:r>
+      <w:proofErr w:type="spellStart"/>
+      <w:r>
+        <w:t>înainte</w:t>
+      </w:r>
+      <w:proofErr w:type="spellEnd"/>
+      <w:r>
+        <w:t xml:space="preserve"> de a </w:t>
+      </w:r>
+      <w:proofErr w:type="spellStart"/>
+      <w:r>
+        <w:t>porni</w:t>
+      </w:r>
+      <w:proofErr w:type="spellEnd"/>
+      <w:r>
+        <w:t xml:space="preserve"> </w:t>
+      </w:r>
+      <w:proofErr w:type="spellStart"/>
+      <w:r>
+        <w:t>generarea</w:t>
+      </w:r>
+      <w:proofErr w:type="spellEnd"/>
+      <w:r>
+        <w:t> html2pdf.</w:t>
+      </w:r>
+    </w:p>
+    <w:p>
+      <w:pPr>
+        <w:numPr>
+          <w:ilvl w:val="0"/>
+          <w:numId w:val="16"/>
+        </w:numPr>
+      </w:pPr>
+      <w:proofErr w:type="spellStart"/>
+      <w:r>
+        <w:t>Obținerea</w:t>
+      </w:r>
+      <w:proofErr w:type="spellEnd"/>
+      <w:r>
+        <w:t xml:space="preserve"> ID-</w:t>
+      </w:r>
+      <w:proofErr w:type="spellStart"/>
+      <w:r>
+        <w:t>ului</w:t>
+      </w:r>
+      <w:proofErr w:type="spellEnd"/>
+      <w:r>
+        <w:t xml:space="preserve"> </w:t>
+      </w:r>
+      <w:proofErr w:type="spellStart"/>
+      <w:r>
+        <w:t>generat</w:t>
+      </w:r>
+      <w:proofErr w:type="spellEnd"/>
+      <w:r>
+        <w:t xml:space="preserve"> </w:t>
+      </w:r>
+      <w:proofErr w:type="spellStart"/>
+      <w:r>
+        <w:t>și</w:t>
+      </w:r>
+      <w:proofErr w:type="spellEnd"/>
+      <w:r>
+        <w:t xml:space="preserve"> </w:t>
+      </w:r>
+      <w:proofErr w:type="spellStart"/>
+      <w:r>
+        <w:t>adăugarea</w:t>
+      </w:r>
+      <w:proofErr w:type="spellEnd"/>
+      <w:r>
+        <w:t xml:space="preserve"> </w:t>
+      </w:r>
+      <w:proofErr w:type="spellStart"/>
+      <w:r>
+        <w:t>lui</w:t>
+      </w:r>
+      <w:proofErr w:type="spellEnd"/>
+      <w:r>
+        <w:t xml:space="preserve"> </w:t>
+      </w:r>
+      <w:proofErr w:type="spellStart"/>
+      <w:r>
+        <w:t>în</w:t>
+      </w:r>
+      <w:proofErr w:type="spellEnd"/>
+      <w:r>
+        <w:t> </w:t>
+      </w:r>
+      <w:proofErr w:type="spellStart"/>
+      <w:r>
+        <w:t>pdf.link</w:t>
+      </w:r>
+      <w:proofErr w:type="spellEnd"/>
+      <w:r>
+        <w:t>(...).</w:t>
+      </w:r>
+    </w:p>
+    <w:p>
+      <w:r>
+        <w:t>app/shared/[id]/</w:t>
+      </w:r>
+      <w:proofErr w:type="spellStart"/>
+      <w:r>
+        <w:t>page.tsx</w:t>
+      </w:r>
+      <w:proofErr w:type="spellEnd"/>
+      <w:r>
+        <w:t> [NEW]</w:t>
+      </w:r>
+    </w:p>
+    <w:p>
+      <w:pPr>
+        <w:numPr>
+          <w:ilvl w:val="0"/>
+          <w:numId w:val="17"/>
+        </w:numPr>
+      </w:pPr>
+      <w:proofErr w:type="spellStart"/>
+      <w:r>
+        <w:t>Crearea</w:t>
+      </w:r>
+      <w:proofErr w:type="spellEnd"/>
+      <w:r>
+        <w:t xml:space="preserve"> </w:t>
+      </w:r>
+      <w:proofErr w:type="spellStart"/>
+      <w:r>
+        <w:t>unei</w:t>
+      </w:r>
+      <w:proofErr w:type="spellEnd"/>
+      <w:r>
+        <w:t xml:space="preserve"> </w:t>
+      </w:r>
+      <w:proofErr w:type="spellStart"/>
+      <w:r>
+        <w:t>pagini</w:t>
+      </w:r>
+      <w:proofErr w:type="spellEnd"/>
+      <w:r>
+        <w:t xml:space="preserve"> </w:t>
+      </w:r>
+      <w:proofErr w:type="spellStart"/>
+      <w:r>
+        <w:t>noi</w:t>
+      </w:r>
+      <w:proofErr w:type="spellEnd"/>
+      <w:r>
+        <w:t xml:space="preserve">, curate, cu </w:t>
+      </w:r>
+      <w:proofErr w:type="spellStart"/>
+      <w:r>
+        <w:t>scopul</w:t>
+      </w:r>
+      <w:proofErr w:type="spellEnd"/>
+      <w:r>
+        <w:t xml:space="preserve"> </w:t>
+      </w:r>
+      <w:proofErr w:type="spellStart"/>
+      <w:r>
+        <w:t>clar</w:t>
+      </w:r>
+      <w:proofErr w:type="spellEnd"/>
+      <w:r>
+        <w:t xml:space="preserve"> de a </w:t>
+      </w:r>
+      <w:proofErr w:type="spellStart"/>
+      <w:r>
+        <w:t>prinde</w:t>
+      </w:r>
+      <w:proofErr w:type="spellEnd"/>
+      <w:r>
+        <w:t xml:space="preserve"> </w:t>
+      </w:r>
+      <w:proofErr w:type="spellStart"/>
+      <w:r>
+        <w:t>potențialii</w:t>
+      </w:r>
+      <w:proofErr w:type="spellEnd"/>
+      <w:r>
+        <w:t xml:space="preserve"> </w:t>
+      </w:r>
+      <w:proofErr w:type="spellStart"/>
+      <w:r>
+        <w:t>clienți</w:t>
+      </w:r>
+      <w:proofErr w:type="spellEnd"/>
+      <w:r>
+        <w:t xml:space="preserve"> (Lead Capture).</w:t>
+      </w:r>
+    </w:p>
+    <w:p>
+      <w:pPr>
+        <w:numPr>
+          <w:ilvl w:val="0"/>
+          <w:numId w:val="17"/>
+        </w:numPr>
+      </w:pPr>
+      <w:r>
+        <w:lastRenderedPageBreak/>
+        <w:t xml:space="preserve">Va </w:t>
+      </w:r>
+      <w:proofErr w:type="spellStart"/>
+      <w:r>
+        <w:t>avea</w:t>
+      </w:r>
+      <w:proofErr w:type="spellEnd"/>
+      <w:r>
+        <w:t xml:space="preserve"> </w:t>
+      </w:r>
+      <w:proofErr w:type="spellStart"/>
+      <w:r>
+        <w:t>același</w:t>
+      </w:r>
+      <w:proofErr w:type="spellEnd"/>
+      <w:r>
+        <w:t xml:space="preserve"> fundal </w:t>
+      </w:r>
+      <w:proofErr w:type="spellStart"/>
+      <w:r>
+        <w:t>și</w:t>
+      </w:r>
+      <w:proofErr w:type="spellEnd"/>
+      <w:r>
+        <w:t xml:space="preserve"> </w:t>
+      </w:r>
+      <w:proofErr w:type="spellStart"/>
+      <w:r>
+        <w:t>stil</w:t>
+      </w:r>
+      <w:proofErr w:type="spellEnd"/>
+      <w:r>
+        <w:t xml:space="preserve"> premium.</w:t>
+      </w:r>
+    </w:p>
+    <w:p>
+      <w:pPr>
+        <w:numPr>
+          <w:ilvl w:val="0"/>
+          <w:numId w:val="17"/>
+        </w:numPr>
+      </w:pPr>
+      <w:r>
+        <w:t xml:space="preserve">Va </w:t>
+      </w:r>
+      <w:proofErr w:type="spellStart"/>
+      <w:r>
+        <w:t>citi</w:t>
+      </w:r>
+      <w:proofErr w:type="spellEnd"/>
+      <w:r>
+        <w:t xml:space="preserve"> ID-ul din link, </w:t>
+      </w:r>
+      <w:proofErr w:type="spellStart"/>
+      <w:r>
+        <w:t>va</w:t>
+      </w:r>
+      <w:proofErr w:type="spellEnd"/>
+      <w:r>
+        <w:t xml:space="preserve"> </w:t>
+      </w:r>
+      <w:proofErr w:type="spellStart"/>
+      <w:r>
+        <w:t>trage</w:t>
+      </w:r>
+      <w:proofErr w:type="spellEnd"/>
+      <w:r>
+        <w:t xml:space="preserve"> </w:t>
+      </w:r>
+      <w:proofErr w:type="spellStart"/>
+      <w:r>
+        <w:t>planul</w:t>
+      </w:r>
+      <w:proofErr w:type="spellEnd"/>
+      <w:r>
+        <w:t xml:space="preserve"> din </w:t>
+      </w:r>
+      <w:proofErr w:type="spellStart"/>
+      <w:r>
+        <w:t>baza</w:t>
+      </w:r>
+      <w:proofErr w:type="spellEnd"/>
+      <w:r>
+        <w:t xml:space="preserve"> de date </w:t>
+      </w:r>
+      <w:proofErr w:type="spellStart"/>
+      <w:r>
+        <w:t>și</w:t>
+      </w:r>
+      <w:proofErr w:type="spellEnd"/>
+      <w:r>
+        <w:t xml:space="preserve"> </w:t>
+      </w:r>
+      <w:proofErr w:type="spellStart"/>
+      <w:r>
+        <w:t>va</w:t>
+      </w:r>
+      <w:proofErr w:type="spellEnd"/>
+      <w:r>
+        <w:t xml:space="preserve"> </w:t>
+      </w:r>
+      <w:proofErr w:type="spellStart"/>
+      <w:r>
+        <w:t>forța</w:t>
+      </w:r>
+      <w:proofErr w:type="spellEnd"/>
+      <w:r>
+        <w:t xml:space="preserve"> </w:t>
+      </w:r>
+      <w:proofErr w:type="spellStart"/>
+      <w:r>
+        <w:t>utilizatorul</w:t>
+      </w:r>
+      <w:proofErr w:type="spellEnd"/>
+      <w:r>
+        <w:t xml:space="preserve"> </w:t>
+      </w:r>
+      <w:proofErr w:type="spellStart"/>
+      <w:r>
+        <w:t>să</w:t>
+      </w:r>
+      <w:proofErr w:type="spellEnd"/>
+      <w:r>
+        <w:t xml:space="preserve"> </w:t>
+      </w:r>
+      <w:proofErr w:type="spellStart"/>
+      <w:r>
+        <w:t>treacă</w:t>
+      </w:r>
+      <w:proofErr w:type="spellEnd"/>
+      <w:r>
+        <w:t xml:space="preserve"> </w:t>
+      </w:r>
+      <w:proofErr w:type="spellStart"/>
+      <w:r>
+        <w:t>prin</w:t>
+      </w:r>
+      <w:proofErr w:type="spellEnd"/>
+      <w:r>
+        <w:t xml:space="preserve"> </w:t>
+      </w:r>
+      <w:proofErr w:type="spellStart"/>
+      <w:r>
+        <w:t>fluxul</w:t>
+      </w:r>
+      <w:proofErr w:type="spellEnd"/>
+      <w:r>
+        <w:t xml:space="preserve"> de Login de la Google/Email.</w:t>
+      </w:r>
+    </w:p>
+    <w:p>
+      <w:pPr>
+        <w:numPr>
+          <w:ilvl w:val="0"/>
+          <w:numId w:val="17"/>
+        </w:numPr>
+      </w:pPr>
+      <w:proofErr w:type="spellStart"/>
+      <w:r>
+        <w:t>După</w:t>
+      </w:r>
+      <w:proofErr w:type="spellEnd"/>
+      <w:r>
+        <w:t xml:space="preserve"> login, </w:t>
+      </w:r>
+      <w:proofErr w:type="spellStart"/>
+      <w:r>
+        <w:t>mută</w:t>
+      </w:r>
+      <w:proofErr w:type="spellEnd"/>
+      <w:r>
+        <w:t xml:space="preserve"> </w:t>
+      </w:r>
+      <w:proofErr w:type="spellStart"/>
+      <w:r>
+        <w:t>datele</w:t>
+      </w:r>
+      <w:proofErr w:type="spellEnd"/>
+      <w:r>
+        <w:t xml:space="preserve"> </w:t>
+      </w:r>
+      <w:proofErr w:type="spellStart"/>
+      <w:r>
+        <w:t>în</w:t>
+      </w:r>
+      <w:proofErr w:type="spellEnd"/>
+      <w:r>
+        <w:t xml:space="preserve"> Local Storage-ul </w:t>
+      </w:r>
+      <w:proofErr w:type="spellStart"/>
+      <w:r>
+        <w:t>vizitatorului</w:t>
+      </w:r>
+      <w:proofErr w:type="spellEnd"/>
+      <w:r>
+        <w:t xml:space="preserve"> </w:t>
+      </w:r>
+      <w:proofErr w:type="spellStart"/>
+      <w:r>
+        <w:t>și</w:t>
+      </w:r>
+      <w:proofErr w:type="spellEnd"/>
+      <w:r>
+        <w:t xml:space="preserve"> </w:t>
+      </w:r>
+      <w:proofErr w:type="spellStart"/>
+      <w:r>
+        <w:t>îl</w:t>
+      </w:r>
+      <w:proofErr w:type="spellEnd"/>
+      <w:r>
+        <w:t xml:space="preserve"> </w:t>
+      </w:r>
+      <w:proofErr w:type="spellStart"/>
+      <w:r>
+        <w:t>trimite</w:t>
+      </w:r>
+      <w:proofErr w:type="spellEnd"/>
+      <w:r>
+        <w:t xml:space="preserve"> pe </w:t>
+      </w:r>
+      <w:proofErr w:type="spellStart"/>
+      <w:r>
+        <w:t>pagina</w:t>
+      </w:r>
+      <w:proofErr w:type="spellEnd"/>
+      <w:r>
+        <w:t xml:space="preserve"> </w:t>
+      </w:r>
+      <w:proofErr w:type="spellStart"/>
+      <w:r>
+        <w:t>principală</w:t>
+      </w:r>
+      <w:proofErr w:type="spellEnd"/>
+      <w:r>
+        <w:t xml:space="preserve"> </w:t>
+      </w:r>
+      <w:proofErr w:type="spellStart"/>
+      <w:r>
+        <w:t>pentru</w:t>
+      </w:r>
+      <w:proofErr w:type="spellEnd"/>
+      <w:r>
+        <w:t xml:space="preserve"> a-l </w:t>
+      </w:r>
+      <w:proofErr w:type="spellStart"/>
+      <w:r>
+        <w:t>converti</w:t>
+      </w:r>
+      <w:proofErr w:type="spellEnd"/>
+      <w:r>
+        <w:t xml:space="preserve"> </w:t>
+      </w:r>
+      <w:proofErr w:type="spellStart"/>
+      <w:r>
+        <w:t>în</w:t>
+      </w:r>
+      <w:proofErr w:type="spellEnd"/>
+      <w:r>
+        <w:t xml:space="preserve"> client </w:t>
+      </w:r>
+      <w:proofErr w:type="spellStart"/>
+      <w:r>
+        <w:t>plătitor</w:t>
+      </w:r>
+      <w:proofErr w:type="spellEnd"/>
+      <w:r>
+        <w:t>.</w:t>
+      </w:r>
+    </w:p>
+    <w:p>
+      <w:pPr>
+        <w:rPr>
+          <w:b/>
+          <w:bCs/>
+        </w:rPr>
+      </w:pPr>
+      <w:proofErr w:type="spellStart"/>
+      <w:r>
+        <w:rPr>
+          <w:b/>
+          <w:bCs/>
+        </w:rPr>
+        <w:t>Aprobare</w:t>
+      </w:r>
+      <w:proofErr w:type="spellEnd"/>
+    </w:p>
+    <w:p>
+      <w:proofErr w:type="spellStart"/>
+      <w:r>
+        <w:t>Dacă</w:t>
+      </w:r>
+      <w:proofErr w:type="spellEnd"/>
+      <w:r>
+        <w:t xml:space="preserve"> </w:t>
+      </w:r>
+      <w:proofErr w:type="spellStart"/>
+      <w:r>
+        <w:t>ești</w:t>
+      </w:r>
+      <w:proofErr w:type="spellEnd"/>
+      <w:r>
+        <w:t xml:space="preserve"> de </w:t>
+      </w:r>
+      <w:proofErr w:type="spellStart"/>
+      <w:r>
+        <w:t>acord</w:t>
+      </w:r>
+      <w:proofErr w:type="spellEnd"/>
+      <w:r>
+        <w:t xml:space="preserve"> cu </w:t>
+      </w:r>
+      <w:proofErr w:type="spellStart"/>
+      <w:r>
+        <w:t>această</w:t>
+      </w:r>
+      <w:proofErr w:type="spellEnd"/>
+      <w:r>
+        <w:t xml:space="preserve"> </w:t>
+      </w:r>
+      <w:proofErr w:type="spellStart"/>
+      <w:r>
+        <w:t>metodă</w:t>
+      </w:r>
+      <w:proofErr w:type="spellEnd"/>
+      <w:r>
+        <w:t xml:space="preserve"> </w:t>
+      </w:r>
+      <w:proofErr w:type="spellStart"/>
+      <w:r>
+        <w:t>și</w:t>
+      </w:r>
+      <w:proofErr w:type="spellEnd"/>
+      <w:r>
+        <w:t xml:space="preserve"> cu </w:t>
+      </w:r>
+      <w:proofErr w:type="spellStart"/>
+      <w:r>
+        <w:t>logica</w:t>
+      </w:r>
+      <w:proofErr w:type="spellEnd"/>
+      <w:r>
+        <w:t xml:space="preserve"> </w:t>
+      </w:r>
+      <w:proofErr w:type="spellStart"/>
+      <w:r>
+        <w:t>descrisă</w:t>
+      </w:r>
+      <w:proofErr w:type="spellEnd"/>
+      <w:r>
+        <w:t xml:space="preserve">, </w:t>
+      </w:r>
+      <w:proofErr w:type="spellStart"/>
+      <w:r>
+        <w:t>apasă</w:t>
+      </w:r>
+      <w:proofErr w:type="spellEnd"/>
+      <w:r>
+        <w:t xml:space="preserve"> pe </w:t>
+      </w:r>
+      <w:r>
+        <w:rPr>
+          <w:b/>
+          <w:bCs/>
+        </w:rPr>
+        <w:t>Proceed</w:t>
+      </w:r>
+      <w:r>
+        <w:t> </w:t>
+      </w:r>
+      <w:proofErr w:type="spellStart"/>
+      <w:r>
+        <w:t>pentru</w:t>
+      </w:r>
+      <w:proofErr w:type="spellEnd"/>
+      <w:r>
+        <w:t xml:space="preserve"> a </w:t>
+      </w:r>
+      <w:proofErr w:type="spellStart"/>
+      <w:r>
+        <w:t>începe</w:t>
+      </w:r>
+      <w:proofErr w:type="spellEnd"/>
+      <w:r>
+        <w:t xml:space="preserve"> </w:t>
+      </w:r>
+      <w:proofErr w:type="spellStart"/>
+      <w:r>
+        <w:t>scrierea</w:t>
+      </w:r>
+      <w:proofErr w:type="spellEnd"/>
+      <w:r>
+        <w:t xml:space="preserve"> </w:t>
+      </w:r>
+      <w:proofErr w:type="spellStart"/>
+      <w:r>
+        <w:t>codului</w:t>
+      </w:r>
+      <w:proofErr w:type="spellEnd"/>
+      <w:r>
+        <w:t>!</w:t>
+      </w:r>
+    </w:p>
+    <w:p>
+      <w:proofErr w:type="spellStart"/>
+      <w:r>
+        <w:t>si</w:t>
+      </w:r>
+      <w:proofErr w:type="spellEnd"/>
+      <w:r>
+        <w:t xml:space="preserve"> ID-ul din link il </w:t>
+      </w:r>
+      <w:proofErr w:type="spellStart"/>
+      <w:r>
+        <w:t>putem</w:t>
+      </w:r>
+      <w:proofErr w:type="spellEnd"/>
+      <w:r>
+        <w:t xml:space="preserve"> </w:t>
+      </w:r>
+      <w:proofErr w:type="spellStart"/>
+      <w:r>
+        <w:t>folosi</w:t>
+      </w:r>
+      <w:proofErr w:type="spellEnd"/>
+      <w:r>
+        <w:t xml:space="preserve"> ulterior </w:t>
+      </w:r>
+      <w:proofErr w:type="spellStart"/>
+      <w:r>
+        <w:t>sa</w:t>
+      </w:r>
+      <w:proofErr w:type="spellEnd"/>
+      <w:r>
+        <w:t xml:space="preserve"> ii </w:t>
+      </w:r>
+      <w:proofErr w:type="spellStart"/>
+      <w:r>
+        <w:t>amintim</w:t>
+      </w:r>
+      <w:proofErr w:type="spellEnd"/>
+      <w:r>
+        <w:t xml:space="preserve"> de IdeeTa.ai</w:t>
+      </w:r>
+    </w:p>
     <w:sectPr>
       <w:pgSz w:w="12240" w:h="15840"/>
       <w:pgMar w:top="1440" w:right="1440" w:bottom="1440" w:left="1440" w:header="720" w:footer="720" w:gutter="0"/>
@@ -20075,6 +23467,155 @@
 <file path=word/numbering.xml><?xml version="1.0" encoding="utf-8"?>
 <w:numbering xmlns:wpc="http://schemas.microsoft.com/office/word/2010/wordprocessingCanvas" xmlns:cx="http://schemas.microsoft.com/office/drawing/2014/chartex" xmlns:cx1="http://schemas.microsoft.com/office/drawing/2015/9/8/chartex" xmlns:cx2="http://schemas.microsoft.com/office/drawing/2015/10/21/chartex" xmlns:cx3="http://schemas.microsoft.com/office/drawing/2016/5/9/chartex" xmlns:cx4="http://schemas.microsoft.com/office/drawing/2016/5/10/chartex" xmlns:cx5="http://schemas.microsoft.com/office/drawing/2016/5/11/chartex" xmlns:cx6="http://schemas.microsoft.com/office/drawing/2016/5/12/chartex" xmlns:cx7="http://schemas.microsoft.com/office/drawing/2016/5/13/chartex" xmlns:cx8="http://schemas.microsoft.com/office/drawing/2016/5/14/chartex" xmlns:mc="http://schemas.openxmlformats.org/markup-compatibility/2006" xmlns:aink="http://schemas.microsoft.com/office/drawing/2016/ink" xmlns:am3d="http://schemas.microsoft.com/office/drawing/2017/model3d" xmlns:o="urn:schemas-microsoft-com:office:office" xmlns:oel="http://schemas.microsoft.com/office/2019/extlst" xmlns:r="http://schemas.openxmlformats.org/officeDocument/2006/relationships" xmlns:m="http://schemas.openxmlformats.org/officeDocument/2006/math" xmlns:v="urn:schemas-microsoft-com:vml" xmlns:wp14="http://schemas.microsoft.com/office/word/2010/wordprocessingDrawing" xmlns:wp="http://schemas.openxmlformats.org/drawingml/2006/wordprocessingDrawing" xmlns:w10="urn:schemas-microsoft-com:office:word" xmlns:w="http://schemas.openxmlformats.org/wordprocessingml/2006/main" xmlns:w14="http://schemas.microsoft.com/office/word/2010/wordml" xmlns:w15="http://schemas.microsoft.com/office/word/2012/wordml" xmlns:w16cex="http://schemas.microsoft.com/office/word/2018/wordml/cex" xmlns:w16cid="http://schemas.microsoft.com/office/word/2016/wordml/cid" xmlns:w16="http://schemas.microsoft.com/office/word/2018/wordml" xmlns:w16du="http://schemas.microsoft.com/office/word/2023/wordml/word16du" xmlns:w16sdtdh="http://schemas.microsoft.com/office/word/2020/wordml/sdtdatahash" xmlns:w16sdtfl="http://schemas.microsoft.com/office/word/2024/wordml/sdtformatlock" xmlns:w16se="http://schemas.microsoft.com/office/word/2015/wordml/symex" xmlns:wpg="http://schemas.microsoft.com/office/word/2010/wordprocessingGroup" xmlns:wpi="http://schemas.microsoft.com/office/word/2010/wordprocessingInk" xmlns:wne="http://schemas.microsoft.com/office/word/2006/wordml" xmlns:wps="http://schemas.microsoft.com/office/word/2010/wordprocessingShape" mc:Ignorable="w14 w15 w16se w16cid w16 w16cex w16sdtdh w16sdtfl w16du wp14">
   <w:abstractNum w:abstractNumId="0" w15:restartNumberingAfterBreak="0">
+    <w:nsid w:val="01FE20EB"/>
+    <w:multiLevelType w:val="multilevel"/>
+    <w:tmpl w:val="3B407054"/>
+    <w:lvl w:ilvl="0">
+      <w:start w:val="1"/>
+      <w:numFmt w:val="bullet"/>
+      <w:lvlText w:val=""/>
+      <w:lvlJc w:val="left"/>
+      <w:pPr>
+        <w:tabs>
+          <w:tab w:val="num" w:pos="720"/>
+        </w:tabs>
+        <w:ind w:left="720" w:hanging="360"/>
+      </w:pPr>
+      <w:rPr>
+        <w:rFonts w:ascii="Symbol" w:hAnsi="Symbol" w:hint="default"/>
+        <w:sz w:val="20"/>
+      </w:rPr>
+    </w:lvl>
+    <w:lvl w:ilvl="1" w:tentative="1">
+      <w:start w:val="1"/>
+      <w:numFmt w:val="bullet"/>
+      <w:lvlText w:val=""/>
+      <w:lvlJc w:val="left"/>
+      <w:pPr>
+        <w:tabs>
+          <w:tab w:val="num" w:pos="1440"/>
+        </w:tabs>
+        <w:ind w:left="1440" w:hanging="360"/>
+      </w:pPr>
+      <w:rPr>
+        <w:rFonts w:ascii="Symbol" w:hAnsi="Symbol" w:hint="default"/>
+        <w:sz w:val="20"/>
+      </w:rPr>
+    </w:lvl>
+    <w:lvl w:ilvl="2" w:tentative="1">
+      <w:start w:val="1"/>
+      <w:numFmt w:val="bullet"/>
+      <w:lvlText w:val=""/>
+      <w:lvlJc w:val="left"/>
+      <w:pPr>
+        <w:tabs>
+          <w:tab w:val="num" w:pos="2160"/>
+        </w:tabs>
+        <w:ind w:left="2160" w:hanging="360"/>
+      </w:pPr>
+      <w:rPr>
+        <w:rFonts w:ascii="Symbol" w:hAnsi="Symbol" w:hint="default"/>
+        <w:sz w:val="20"/>
+      </w:rPr>
+    </w:lvl>
+    <w:lvl w:ilvl="3" w:tentative="1">
+      <w:start w:val="1"/>
+      <w:numFmt w:val="bullet"/>
+      <w:lvlText w:val=""/>
+      <w:lvlJc w:val="left"/>
+      <w:pPr>
+        <w:tabs>
+          <w:tab w:val="num" w:pos="2880"/>
+        </w:tabs>
+        <w:ind w:left="2880" w:hanging="360"/>
+      </w:pPr>
+      <w:rPr>
+        <w:rFonts w:ascii="Symbol" w:hAnsi="Symbol" w:hint="default"/>
+        <w:sz w:val="20"/>
+      </w:rPr>
+    </w:lvl>
+    <w:lvl w:ilvl="4" w:tentative="1">
+      <w:start w:val="1"/>
+      <w:numFmt w:val="bullet"/>
+      <w:lvlText w:val=""/>
+      <w:lvlJc w:val="left"/>
+      <w:pPr>
+        <w:tabs>
+          <w:tab w:val="num" w:pos="3600"/>
+        </w:tabs>
+        <w:ind w:left="3600" w:hanging="360"/>
+      </w:pPr>
+      <w:rPr>
+        <w:rFonts w:ascii="Symbol" w:hAnsi="Symbol" w:hint="default"/>
+        <w:sz w:val="20"/>
+      </w:rPr>
+    </w:lvl>
+    <w:lvl w:ilvl="5" w:tentative="1">
+      <w:start w:val="1"/>
+      <w:numFmt w:val="bullet"/>
+      <w:lvlText w:val=""/>
+      <w:lvlJc w:val="left"/>
+      <w:pPr>
+        <w:tabs>
+          <w:tab w:val="num" w:pos="4320"/>
+        </w:tabs>
+        <w:ind w:left="4320" w:hanging="360"/>
+      </w:pPr>
+      <w:rPr>
+        <w:rFonts w:ascii="Symbol" w:hAnsi="Symbol" w:hint="default"/>
+        <w:sz w:val="20"/>
+      </w:rPr>
+    </w:lvl>
+    <w:lvl w:ilvl="6" w:tentative="1">
+      <w:start w:val="1"/>
+      <w:numFmt w:val="bullet"/>
+      <w:lvlText w:val=""/>
+      <w:lvlJc w:val="left"/>
+      <w:pPr>
+        <w:tabs>
+          <w:tab w:val="num" w:pos="5040"/>
+        </w:tabs>
+        <w:ind w:left="5040" w:hanging="360"/>
+      </w:pPr>
+      <w:rPr>
+        <w:rFonts w:ascii="Symbol" w:hAnsi="Symbol" w:hint="default"/>
+        <w:sz w:val="20"/>
+      </w:rPr>
+    </w:lvl>
+    <w:lvl w:ilvl="7" w:tentative="1">
+      <w:start w:val="1"/>
+      <w:numFmt w:val="bullet"/>
+      <w:lvlText w:val=""/>
+      <w:lvlJc w:val="left"/>
+      <w:pPr>
+        <w:tabs>
+          <w:tab w:val="num" w:pos="5760"/>
+        </w:tabs>
+        <w:ind w:left="5760" w:hanging="360"/>
+      </w:pPr>
+      <w:rPr>
+        <w:rFonts w:ascii="Symbol" w:hAnsi="Symbol" w:hint="default"/>
+        <w:sz w:val="20"/>
+      </w:rPr>
+    </w:lvl>
+    <w:lvl w:ilvl="8" w:tentative="1">
+      <w:start w:val="1"/>
+      <w:numFmt w:val="bullet"/>
+      <w:lvlText w:val=""/>
+      <w:lvlJc w:val="left"/>
+      <w:pPr>
+        <w:tabs>
+          <w:tab w:val="num" w:pos="6480"/>
+        </w:tabs>
+        <w:ind w:left="6480" w:hanging="360"/>
+      </w:pPr>
+      <w:rPr>
+        <w:rFonts w:ascii="Symbol" w:hAnsi="Symbol" w:hint="default"/>
+        <w:sz w:val="20"/>
+      </w:rPr>
+    </w:lvl>
+  </w:abstractNum>
+  <w:abstractNum w:abstractNumId="1" w15:restartNumberingAfterBreak="0">
     <w:nsid w:val="02441651"/>
     <w:multiLevelType w:val="multilevel"/>
     <w:tmpl w:val="C2C45AA8"/>
@@ -20223,7 +23764,7 @@
       </w:rPr>
     </w:lvl>
   </w:abstractNum>
-  <w:abstractNum w:abstractNumId="1" w15:restartNumberingAfterBreak="0">
+  <w:abstractNum w:abstractNumId="2" w15:restartNumberingAfterBreak="0">
     <w:nsid w:val="081C59E3"/>
     <w:multiLevelType w:val="multilevel"/>
     <w:tmpl w:val="5998B342"/>
@@ -20372,7 +23913,7 @@
       </w:rPr>
     </w:lvl>
   </w:abstractNum>
-  <w:abstractNum w:abstractNumId="2" w15:restartNumberingAfterBreak="0">
+  <w:abstractNum w:abstractNumId="3" w15:restartNumberingAfterBreak="0">
     <w:nsid w:val="117155CA"/>
     <w:multiLevelType w:val="multilevel"/>
     <w:tmpl w:val="F86C10F2"/>
@@ -20485,7 +24026,7 @@
       </w:pPr>
     </w:lvl>
   </w:abstractNum>
-  <w:abstractNum w:abstractNumId="3" w15:restartNumberingAfterBreak="0">
+  <w:abstractNum w:abstractNumId="4" w15:restartNumberingAfterBreak="0">
     <w:nsid w:val="118606AF"/>
     <w:multiLevelType w:val="multilevel"/>
     <w:tmpl w:val="29783230"/>
@@ -20598,7 +24139,7 @@
       </w:pPr>
     </w:lvl>
   </w:abstractNum>
-  <w:abstractNum w:abstractNumId="4" w15:restartNumberingAfterBreak="0">
+  <w:abstractNum w:abstractNumId="5" w15:restartNumberingAfterBreak="0">
     <w:nsid w:val="13A969F1"/>
     <w:multiLevelType w:val="multilevel"/>
     <w:tmpl w:val="343082AE"/>
@@ -20747,7 +24288,7 @@
       </w:rPr>
     </w:lvl>
   </w:abstractNum>
-  <w:abstractNum w:abstractNumId="5" w15:restartNumberingAfterBreak="0">
+  <w:abstractNum w:abstractNumId="6" w15:restartNumberingAfterBreak="0">
     <w:nsid w:val="1831498A"/>
     <w:multiLevelType w:val="multilevel"/>
     <w:tmpl w:val="E35A8786"/>
@@ -20896,7 +24437,156 @@
       </w:rPr>
     </w:lvl>
   </w:abstractNum>
-  <w:abstractNum w:abstractNumId="6" w15:restartNumberingAfterBreak="0">
+  <w:abstractNum w:abstractNumId="7" w15:restartNumberingAfterBreak="0">
+    <w:nsid w:val="26746FED"/>
+    <w:multiLevelType w:val="multilevel"/>
+    <w:tmpl w:val="41829B80"/>
+    <w:lvl w:ilvl="0">
+      <w:start w:val="1"/>
+      <w:numFmt w:val="bullet"/>
+      <w:lvlText w:val=""/>
+      <w:lvlJc w:val="left"/>
+      <w:pPr>
+        <w:tabs>
+          <w:tab w:val="num" w:pos="720"/>
+        </w:tabs>
+        <w:ind w:left="720" w:hanging="360"/>
+      </w:pPr>
+      <w:rPr>
+        <w:rFonts w:ascii="Symbol" w:hAnsi="Symbol" w:hint="default"/>
+        <w:sz w:val="20"/>
+      </w:rPr>
+    </w:lvl>
+    <w:lvl w:ilvl="1" w:tentative="1">
+      <w:start w:val="1"/>
+      <w:numFmt w:val="bullet"/>
+      <w:lvlText w:val=""/>
+      <w:lvlJc w:val="left"/>
+      <w:pPr>
+        <w:tabs>
+          <w:tab w:val="num" w:pos="1440"/>
+        </w:tabs>
+        <w:ind w:left="1440" w:hanging="360"/>
+      </w:pPr>
+      <w:rPr>
+        <w:rFonts w:ascii="Symbol" w:hAnsi="Symbol" w:hint="default"/>
+        <w:sz w:val="20"/>
+      </w:rPr>
+    </w:lvl>
+    <w:lvl w:ilvl="2" w:tentative="1">
+      <w:start w:val="1"/>
+      <w:numFmt w:val="bullet"/>
+      <w:lvlText w:val=""/>
+      <w:lvlJc w:val="left"/>
+      <w:pPr>
+        <w:tabs>
+          <w:tab w:val="num" w:pos="2160"/>
+        </w:tabs>
+        <w:ind w:left="2160" w:hanging="360"/>
+      </w:pPr>
+      <w:rPr>
+        <w:rFonts w:ascii="Symbol" w:hAnsi="Symbol" w:hint="default"/>
+        <w:sz w:val="20"/>
+      </w:rPr>
+    </w:lvl>
+    <w:lvl w:ilvl="3" w:tentative="1">
+      <w:start w:val="1"/>
+      <w:numFmt w:val="bullet"/>
+      <w:lvlText w:val=""/>
+      <w:lvlJc w:val="left"/>
+      <w:pPr>
+        <w:tabs>
+          <w:tab w:val="num" w:pos="2880"/>
+        </w:tabs>
+        <w:ind w:left="2880" w:hanging="360"/>
+      </w:pPr>
+      <w:rPr>
+        <w:rFonts w:ascii="Symbol" w:hAnsi="Symbol" w:hint="default"/>
+        <w:sz w:val="20"/>
+      </w:rPr>
+    </w:lvl>
+    <w:lvl w:ilvl="4" w:tentative="1">
+      <w:start w:val="1"/>
+      <w:numFmt w:val="bullet"/>
+      <w:lvlText w:val=""/>
+      <w:lvlJc w:val="left"/>
+      <w:pPr>
+        <w:tabs>
+          <w:tab w:val="num" w:pos="3600"/>
+        </w:tabs>
+        <w:ind w:left="3600" w:hanging="360"/>
+      </w:pPr>
+      <w:rPr>
+        <w:rFonts w:ascii="Symbol" w:hAnsi="Symbol" w:hint="default"/>
+        <w:sz w:val="20"/>
+      </w:rPr>
+    </w:lvl>
+    <w:lvl w:ilvl="5" w:tentative="1">
+      <w:start w:val="1"/>
+      <w:numFmt w:val="bullet"/>
+      <w:lvlText w:val=""/>
+      <w:lvlJc w:val="left"/>
+      <w:pPr>
+        <w:tabs>
+          <w:tab w:val="num" w:pos="4320"/>
+        </w:tabs>
+        <w:ind w:left="4320" w:hanging="360"/>
+      </w:pPr>
+      <w:rPr>
+        <w:rFonts w:ascii="Symbol" w:hAnsi="Symbol" w:hint="default"/>
+        <w:sz w:val="20"/>
+      </w:rPr>
+    </w:lvl>
+    <w:lvl w:ilvl="6" w:tentative="1">
+      <w:start w:val="1"/>
+      <w:numFmt w:val="bullet"/>
+      <w:lvlText w:val=""/>
+      <w:lvlJc w:val="left"/>
+      <w:pPr>
+        <w:tabs>
+          <w:tab w:val="num" w:pos="5040"/>
+        </w:tabs>
+        <w:ind w:left="5040" w:hanging="360"/>
+      </w:pPr>
+      <w:rPr>
+        <w:rFonts w:ascii="Symbol" w:hAnsi="Symbol" w:hint="default"/>
+        <w:sz w:val="20"/>
+      </w:rPr>
+    </w:lvl>
+    <w:lvl w:ilvl="7" w:tentative="1">
+      <w:start w:val="1"/>
+      <w:numFmt w:val="bullet"/>
+      <w:lvlText w:val=""/>
+      <w:lvlJc w:val="left"/>
+      <w:pPr>
+        <w:tabs>
+          <w:tab w:val="num" w:pos="5760"/>
+        </w:tabs>
+        <w:ind w:left="5760" w:hanging="360"/>
+      </w:pPr>
+      <w:rPr>
+        <w:rFonts w:ascii="Symbol" w:hAnsi="Symbol" w:hint="default"/>
+        <w:sz w:val="20"/>
+      </w:rPr>
+    </w:lvl>
+    <w:lvl w:ilvl="8" w:tentative="1">
+      <w:start w:val="1"/>
+      <w:numFmt w:val="bullet"/>
+      <w:lvlText w:val=""/>
+      <w:lvlJc w:val="left"/>
+      <w:pPr>
+        <w:tabs>
+          <w:tab w:val="num" w:pos="6480"/>
+        </w:tabs>
+        <w:ind w:left="6480" w:hanging="360"/>
+      </w:pPr>
+      <w:rPr>
+        <w:rFonts w:ascii="Symbol" w:hAnsi="Symbol" w:hint="default"/>
+        <w:sz w:val="20"/>
+      </w:rPr>
+    </w:lvl>
+  </w:abstractNum>
+  <w:abstractNum w:abstractNumId="8" w15:restartNumberingAfterBreak="0">
     <w:nsid w:val="2F174067"/>
     <w:multiLevelType w:val="multilevel"/>
     <w:tmpl w:val="FCB43A24"/>
@@ -21045,7 +24735,7 @@
       </w:rPr>
     </w:lvl>
   </w:abstractNum>
-  <w:abstractNum w:abstractNumId="7" w15:restartNumberingAfterBreak="0">
+  <w:abstractNum w:abstractNumId="9" w15:restartNumberingAfterBreak="0">
     <w:nsid w:val="35924F00"/>
     <w:multiLevelType w:val="multilevel"/>
     <w:tmpl w:val="E5BAC4B6"/>
@@ -21158,7 +24848,7 @@
       </w:pPr>
     </w:lvl>
   </w:abstractNum>
-  <w:abstractNum w:abstractNumId="8" w15:restartNumberingAfterBreak="0">
+  <w:abstractNum w:abstractNumId="10" w15:restartNumberingAfterBreak="0">
     <w:nsid w:val="3AAD4C3D"/>
     <w:multiLevelType w:val="multilevel"/>
     <w:tmpl w:val="F476E44C"/>
@@ -21307,7 +24997,7 @@
       </w:rPr>
     </w:lvl>
   </w:abstractNum>
-  <w:abstractNum w:abstractNumId="9" w15:restartNumberingAfterBreak="0">
+  <w:abstractNum w:abstractNumId="11" w15:restartNumberingAfterBreak="0">
     <w:nsid w:val="3B5C786A"/>
     <w:multiLevelType w:val="multilevel"/>
     <w:tmpl w:val="75F6EFDE"/>
@@ -21420,7 +25110,7 @@
       </w:pPr>
     </w:lvl>
   </w:abstractNum>
-  <w:abstractNum w:abstractNumId="10" w15:restartNumberingAfterBreak="0">
+  <w:abstractNum w:abstractNumId="12" w15:restartNumberingAfterBreak="0">
     <w:nsid w:val="4E5D1923"/>
     <w:multiLevelType w:val="multilevel"/>
     <w:tmpl w:val="0B564374"/>
@@ -21533,7 +25223,7 @@
       </w:pPr>
     </w:lvl>
   </w:abstractNum>
-  <w:abstractNum w:abstractNumId="11" w15:restartNumberingAfterBreak="0">
+  <w:abstractNum w:abstractNumId="13" w15:restartNumberingAfterBreak="0">
     <w:nsid w:val="5103190A"/>
     <w:multiLevelType w:val="multilevel"/>
     <w:tmpl w:val="A8A09D9E"/>
@@ -21682,7 +25372,7 @@
       </w:rPr>
     </w:lvl>
   </w:abstractNum>
-  <w:abstractNum w:abstractNumId="12" w15:restartNumberingAfterBreak="0">
+  <w:abstractNum w:abstractNumId="14" w15:restartNumberingAfterBreak="0">
     <w:nsid w:val="5D99058F"/>
     <w:multiLevelType w:val="multilevel"/>
     <w:tmpl w:val="D1EE39A2"/>
@@ -21795,7 +25485,124 @@
       </w:pPr>
     </w:lvl>
   </w:abstractNum>
-  <w:abstractNum w:abstractNumId="13" w15:restartNumberingAfterBreak="0">
+  <w:abstractNum w:abstractNumId="15" w15:restartNumberingAfterBreak="0">
+    <w:nsid w:val="60612AEF"/>
+    <w:multiLevelType w:val="multilevel"/>
+    <w:tmpl w:val="86BC5D0C"/>
+    <w:lvl w:ilvl="0">
+      <w:start w:val="1"/>
+      <w:numFmt w:val="decimal"/>
+      <w:lvlText w:val="%1."/>
+      <w:lvlJc w:val="left"/>
+      <w:pPr>
+        <w:tabs>
+          <w:tab w:val="num" w:pos="720"/>
+        </w:tabs>
+        <w:ind w:left="720" w:hanging="360"/>
+      </w:pPr>
+    </w:lvl>
+    <w:lvl w:ilvl="1">
+      <w:start w:val="1"/>
+      <w:numFmt w:val="bullet"/>
+      <w:lvlText w:val=""/>
+      <w:lvlJc w:val="left"/>
+      <w:pPr>
+        <w:tabs>
+          <w:tab w:val="num" w:pos="1440"/>
+        </w:tabs>
+        <w:ind w:left="1440" w:hanging="360"/>
+      </w:pPr>
+      <w:rPr>
+        <w:rFonts w:ascii="Symbol" w:hAnsi="Symbol" w:hint="default"/>
+        <w:sz w:val="20"/>
+      </w:rPr>
+    </w:lvl>
+    <w:lvl w:ilvl="2" w:tentative="1">
+      <w:start w:val="1"/>
+      <w:numFmt w:val="decimal"/>
+      <w:lvlText w:val="%3."/>
+      <w:lvlJc w:val="left"/>
+      <w:pPr>
+        <w:tabs>
+          <w:tab w:val="num" w:pos="2160"/>
+        </w:tabs>
+        <w:ind w:left="2160" w:hanging="360"/>
+      </w:pPr>
+    </w:lvl>
+    <w:lvl w:ilvl="3" w:tentative="1">
+      <w:start w:val="1"/>
+      <w:numFmt w:val="decimal"/>
+      <w:lvlText w:val="%4."/>
+      <w:lvlJc w:val="left"/>
+      <w:pPr>
+        <w:tabs>
+          <w:tab w:val="num" w:pos="2880"/>
+        </w:tabs>
+        <w:ind w:left="2880" w:hanging="360"/>
+      </w:pPr>
+    </w:lvl>
+    <w:lvl w:ilvl="4" w:tentative="1">
+      <w:start w:val="1"/>
+      <w:numFmt w:val="decimal"/>
+      <w:lvlText w:val="%5."/>
+      <w:lvlJc w:val="left"/>
+      <w:pPr>
+        <w:tabs>
+          <w:tab w:val="num" w:pos="3600"/>
+        </w:tabs>
+        <w:ind w:left="3600" w:hanging="360"/>
+      </w:pPr>
+    </w:lvl>
+    <w:lvl w:ilvl="5" w:tentative="1">
+      <w:start w:val="1"/>
+      <w:numFmt w:val="decimal"/>
+      <w:lvlText w:val="%6."/>
+      <w:lvlJc w:val="left"/>
+      <w:pPr>
+        <w:tabs>
+          <w:tab w:val="num" w:pos="4320"/>
+        </w:tabs>
+        <w:ind w:left="4320" w:hanging="360"/>
+      </w:pPr>
+    </w:lvl>
+    <w:lvl w:ilvl="6" w:tentative="1">
+      <w:start w:val="1"/>
+      <w:numFmt w:val="decimal"/>
+      <w:lvlText w:val="%7."/>
+      <w:lvlJc w:val="left"/>
+      <w:pPr>
+        <w:tabs>
+          <w:tab w:val="num" w:pos="5040"/>
+        </w:tabs>
+        <w:ind w:left="5040" w:hanging="360"/>
+      </w:pPr>
+    </w:lvl>
+    <w:lvl w:ilvl="7" w:tentative="1">
+      <w:start w:val="1"/>
+      <w:numFmt w:val="decimal"/>
+      <w:lvlText w:val="%8."/>
+      <w:lvlJc w:val="left"/>
+      <w:pPr>
+        <w:tabs>
+          <w:tab w:val="num" w:pos="5760"/>
+        </w:tabs>
+        <w:ind w:left="5760" w:hanging="360"/>
+      </w:pPr>
+    </w:lvl>
+    <w:lvl w:ilvl="8" w:tentative="1">
+      <w:start w:val="1"/>
+      <w:numFmt w:val="decimal"/>
+      <w:lvlText w:val="%9."/>
+      <w:lvlJc w:val="left"/>
+      <w:pPr>
+        <w:tabs>
+          <w:tab w:val="num" w:pos="6480"/>
+        </w:tabs>
+        <w:ind w:left="6480" w:hanging="360"/>
+      </w:pPr>
+    </w:lvl>
+  </w:abstractNum>
+  <w:abstractNum w:abstractNumId="16" w15:restartNumberingAfterBreak="0">
     <w:nsid w:val="69244E7A"/>
     <w:multiLevelType w:val="multilevel"/>
     <w:tmpl w:val="D820DD34"/>
@@ -21945,45 +25752,54 @@
     </w:lvl>
   </w:abstractNum>
   <w:num w:numId="1" w16cid:durableId="430977924">
+    <w:abstractNumId w:val="13"/>
+  </w:num>
+  <w:num w:numId="2" w16cid:durableId="786898390">
+    <w:abstractNumId w:val="2"/>
+  </w:num>
+  <w:num w:numId="3" w16cid:durableId="1654287537">
+    <w:abstractNumId w:val="5"/>
+  </w:num>
+  <w:num w:numId="4" w16cid:durableId="614140323">
+    <w:abstractNumId w:val="1"/>
+  </w:num>
+  <w:num w:numId="5" w16cid:durableId="1155026178">
+    <w:abstractNumId w:val="14"/>
+  </w:num>
+  <w:num w:numId="6" w16cid:durableId="1097562786">
+    <w:abstractNumId w:val="3"/>
+  </w:num>
+  <w:num w:numId="7" w16cid:durableId="1915428224">
+    <w:abstractNumId w:val="8"/>
+  </w:num>
+  <w:num w:numId="8" w16cid:durableId="1189416595">
+    <w:abstractNumId w:val="16"/>
+  </w:num>
+  <w:num w:numId="9" w16cid:durableId="186061792">
+    <w:abstractNumId w:val="12"/>
+  </w:num>
+  <w:num w:numId="10" w16cid:durableId="1390491691">
     <w:abstractNumId w:val="11"/>
   </w:num>
-  <w:num w:numId="2" w16cid:durableId="786898390">
-    <w:abstractNumId w:val="1"/>
-  </w:num>
-  <w:num w:numId="3" w16cid:durableId="1654287537">
+  <w:num w:numId="11" w16cid:durableId="1642420085">
     <w:abstractNumId w:val="4"/>
   </w:num>
-  <w:num w:numId="4" w16cid:durableId="614140323">
+  <w:num w:numId="12" w16cid:durableId="1273628493">
+    <w:abstractNumId w:val="6"/>
+  </w:num>
+  <w:num w:numId="13" w16cid:durableId="1840264699">
+    <w:abstractNumId w:val="10"/>
+  </w:num>
+  <w:num w:numId="14" w16cid:durableId="294529380">
+    <w:abstractNumId w:val="9"/>
+  </w:num>
+  <w:num w:numId="15" w16cid:durableId="339436240">
+    <w:abstractNumId w:val="15"/>
+  </w:num>
+  <w:num w:numId="16" w16cid:durableId="1705130765">
     <w:abstractNumId w:val="0"/>
   </w:num>
-  <w:num w:numId="5" w16cid:durableId="1155026178">
-    <w:abstractNumId w:val="12"/>
-  </w:num>
-  <w:num w:numId="6" w16cid:durableId="1097562786">
-    <w:abstractNumId w:val="2"/>
-  </w:num>
-  <w:num w:numId="7" w16cid:durableId="1915428224">
-    <w:abstractNumId w:val="6"/>
-  </w:num>
-  <w:num w:numId="8" w16cid:durableId="1189416595">
-    <w:abstractNumId w:val="13"/>
-  </w:num>
-  <w:num w:numId="9" w16cid:durableId="186061792">
-    <w:abstractNumId w:val="10"/>
-  </w:num>
-  <w:num w:numId="10" w16cid:durableId="1390491691">
-    <w:abstractNumId w:val="9"/>
-  </w:num>
-  <w:num w:numId="11" w16cid:durableId="1642420085">
-    <w:abstractNumId w:val="3"/>
-  </w:num>
-  <w:num w:numId="12" w16cid:durableId="1273628493">
-    <w:abstractNumId w:val="5"/>
-  </w:num>
-  <w:num w:numId="13" w16cid:durableId="1840264699">
-    <w:abstractNumId w:val="8"/>
-  </w:num>
-  <w:num w:numId="14" w16cid:durableId="294529380">
+  <w:num w:numId="17" w16cid:durableId="261182642">
     <w:abstractNumId w:val="7"/>
   </w:num>
 </w:numbering>

</xml_diff>

<commit_message>
Fix Next.js 15 params promise type
</commit_message>
<xml_diff>
--- a/google_adsens.docx
+++ b/google_adsens.docx
@@ -28427,6 +28427,807 @@
         <w:t xml:space="preserve"> la scroll?</w:t>
       </w:r>
     </w:p>
+    <w:p>
+      <w:proofErr w:type="spellStart"/>
+      <w:r>
+        <w:t>Dacă</w:t>
+      </w:r>
+      <w:proofErr w:type="spellEnd"/>
+      <w:r>
+        <w:t xml:space="preserve"> </w:t>
+      </w:r>
+      <w:proofErr w:type="spellStart"/>
+      <w:r>
+        <w:t>vrem</w:t>
+      </w:r>
+      <w:proofErr w:type="spellEnd"/>
+      <w:r>
+        <w:t xml:space="preserve"> ca omul </w:t>
+      </w:r>
+      <w:proofErr w:type="spellStart"/>
+      <w:r>
+        <w:t>să</w:t>
+      </w:r>
+      <w:proofErr w:type="spellEnd"/>
+      <w:r>
+        <w:t xml:space="preserve"> fie </w:t>
+      </w:r>
+      <w:proofErr w:type="spellStart"/>
+      <w:r>
+        <w:t>sigur</w:t>
+      </w:r>
+      <w:proofErr w:type="spellEnd"/>
+      <w:r>
+        <w:t xml:space="preserve"> </w:t>
+      </w:r>
+      <w:proofErr w:type="spellStart"/>
+      <w:r>
+        <w:t>că</w:t>
+      </w:r>
+      <w:proofErr w:type="spellEnd"/>
+      <w:r>
+        <w:t xml:space="preserve"> </w:t>
+      </w:r>
+      <w:proofErr w:type="spellStart"/>
+      <w:r>
+        <w:t>vede</w:t>
+      </w:r>
+      <w:proofErr w:type="spellEnd"/>
+      <w:r>
+        <w:t xml:space="preserve"> </w:t>
+      </w:r>
+      <w:proofErr w:type="spellStart"/>
+      <w:r>
+        <w:t>linkul</w:t>
+      </w:r>
+      <w:proofErr w:type="spellEnd"/>
+      <w:r>
+        <w:t xml:space="preserve"> "Vino pe IdeeaTa.ai" de la </w:t>
+      </w:r>
+      <w:proofErr w:type="spellStart"/>
+      <w:r>
+        <w:t>sfârșitul</w:t>
+      </w:r>
+      <w:proofErr w:type="spellEnd"/>
+      <w:r>
+        <w:t xml:space="preserve"> </w:t>
+      </w:r>
+      <w:proofErr w:type="spellStart"/>
+      <w:r>
+        <w:t>documentului</w:t>
+      </w:r>
+      <w:proofErr w:type="spellEnd"/>
+      <w:r>
+        <w:t xml:space="preserve">, </w:t>
+      </w:r>
+      <w:proofErr w:type="spellStart"/>
+      <w:r>
+        <w:t>atunci</w:t>
+      </w:r>
+      <w:proofErr w:type="spellEnd"/>
+      <w:r>
+        <w:t xml:space="preserve"> </w:t>
+      </w:r>
+      <w:proofErr w:type="spellStart"/>
+      <w:r>
+        <w:t>cronometrul</w:t>
+      </w:r>
+      <w:proofErr w:type="spellEnd"/>
+      <w:r>
+        <w:t xml:space="preserve"> nu e bun (</w:t>
+      </w:r>
+      <w:proofErr w:type="spellStart"/>
+      <w:r>
+        <w:t>că</w:t>
+      </w:r>
+      <w:proofErr w:type="spellEnd"/>
+      <w:r>
+        <w:t xml:space="preserve"> </w:t>
+      </w:r>
+      <w:proofErr w:type="spellStart"/>
+      <w:r>
+        <w:t>poate</w:t>
+      </w:r>
+      <w:proofErr w:type="spellEnd"/>
+      <w:r>
+        <w:t xml:space="preserve"> </w:t>
+      </w:r>
+      <w:proofErr w:type="spellStart"/>
+      <w:r>
+        <w:t>citește</w:t>
+      </w:r>
+      <w:proofErr w:type="spellEnd"/>
+      <w:r>
+        <w:t xml:space="preserve"> </w:t>
+      </w:r>
+      <w:proofErr w:type="spellStart"/>
+      <w:r>
+        <w:t>prea</w:t>
+      </w:r>
+      <w:proofErr w:type="spellEnd"/>
+      <w:r>
+        <w:t xml:space="preserve"> </w:t>
+      </w:r>
+      <w:proofErr w:type="spellStart"/>
+      <w:r>
+        <w:t>încet</w:t>
+      </w:r>
+      <w:proofErr w:type="spellEnd"/>
+      <w:r>
+        <w:t xml:space="preserve"> </w:t>
+      </w:r>
+      <w:proofErr w:type="spellStart"/>
+      <w:r>
+        <w:t>și</w:t>
+      </w:r>
+      <w:proofErr w:type="spellEnd"/>
+      <w:r>
+        <w:t xml:space="preserve"> </w:t>
+      </w:r>
+      <w:proofErr w:type="spellStart"/>
+      <w:r>
+        <w:t>îi</w:t>
+      </w:r>
+      <w:proofErr w:type="spellEnd"/>
+      <w:r>
+        <w:t xml:space="preserve"> </w:t>
+      </w:r>
+      <w:proofErr w:type="spellStart"/>
+      <w:r>
+        <w:t>taie</w:t>
+      </w:r>
+      <w:proofErr w:type="spellEnd"/>
+      <w:r>
+        <w:t xml:space="preserve"> </w:t>
+      </w:r>
+      <w:proofErr w:type="spellStart"/>
+      <w:r>
+        <w:t>accesul</w:t>
+      </w:r>
+      <w:proofErr w:type="spellEnd"/>
+      <w:r>
+        <w:t xml:space="preserve"> </w:t>
+      </w:r>
+      <w:proofErr w:type="spellStart"/>
+      <w:r>
+        <w:t>prea</w:t>
+      </w:r>
+      <w:proofErr w:type="spellEnd"/>
+      <w:r>
+        <w:t xml:space="preserve"> </w:t>
+      </w:r>
+      <w:proofErr w:type="spellStart"/>
+      <w:r>
+        <w:t>devreme</w:t>
+      </w:r>
+      <w:proofErr w:type="spellEnd"/>
+      <w:r>
+        <w:t>).</w:t>
+      </w:r>
+    </w:p>
+    <w:p>
+      <w:r>
+        <w:lastRenderedPageBreak/>
+        <w:t xml:space="preserve">Cea </w:t>
+      </w:r>
+      <w:proofErr w:type="spellStart"/>
+      <w:r>
+        <w:t>mai</w:t>
+      </w:r>
+      <w:proofErr w:type="spellEnd"/>
+      <w:r>
+        <w:t xml:space="preserve"> </w:t>
+      </w:r>
+      <w:proofErr w:type="spellStart"/>
+      <w:r>
+        <w:t>elegantă</w:t>
+      </w:r>
+      <w:proofErr w:type="spellEnd"/>
+      <w:r>
+        <w:t xml:space="preserve"> </w:t>
+      </w:r>
+      <w:proofErr w:type="spellStart"/>
+      <w:r>
+        <w:t>soluție</w:t>
+      </w:r>
+      <w:proofErr w:type="spellEnd"/>
+      <w:r>
+        <w:t xml:space="preserve"> </w:t>
+      </w:r>
+      <w:proofErr w:type="spellStart"/>
+      <w:r>
+        <w:t>este</w:t>
+      </w:r>
+      <w:proofErr w:type="spellEnd"/>
+      <w:r>
+        <w:t>: </w:t>
+      </w:r>
+      <w:r>
+        <w:rPr>
+          <w:b/>
+          <w:bCs/>
+        </w:rPr>
+        <w:t xml:space="preserve">Pop-up-ul </w:t>
+      </w:r>
+      <w:proofErr w:type="spellStart"/>
+      <w:r>
+        <w:rPr>
+          <w:b/>
+          <w:bCs/>
+        </w:rPr>
+        <w:t>apare</w:t>
+      </w:r>
+      <w:proofErr w:type="spellEnd"/>
+      <w:r>
+        <w:rPr>
+          <w:b/>
+          <w:bCs/>
+        </w:rPr>
+        <w:t xml:space="preserve"> </w:t>
+      </w:r>
+      <w:proofErr w:type="spellStart"/>
+      <w:r>
+        <w:rPr>
+          <w:b/>
+          <w:bCs/>
+        </w:rPr>
+        <w:t>doar</w:t>
+      </w:r>
+      <w:proofErr w:type="spellEnd"/>
+      <w:r>
+        <w:rPr>
+          <w:b/>
+          <w:bCs/>
+        </w:rPr>
+        <w:t xml:space="preserve"> </w:t>
+      </w:r>
+      <w:proofErr w:type="spellStart"/>
+      <w:r>
+        <w:rPr>
+          <w:b/>
+          <w:bCs/>
+        </w:rPr>
+        <w:t>atunci</w:t>
+      </w:r>
+      <w:proofErr w:type="spellEnd"/>
+      <w:r>
+        <w:rPr>
+          <w:b/>
+          <w:bCs/>
+        </w:rPr>
+        <w:t xml:space="preserve"> </w:t>
+      </w:r>
+      <w:proofErr w:type="spellStart"/>
+      <w:r>
+        <w:rPr>
+          <w:b/>
+          <w:bCs/>
+        </w:rPr>
+        <w:t>când</w:t>
+      </w:r>
+      <w:proofErr w:type="spellEnd"/>
+      <w:r>
+        <w:rPr>
+          <w:b/>
+          <w:bCs/>
+        </w:rPr>
+        <w:t xml:space="preserve"> </w:t>
+      </w:r>
+      <w:proofErr w:type="spellStart"/>
+      <w:r>
+        <w:rPr>
+          <w:b/>
+          <w:bCs/>
+        </w:rPr>
+        <w:t>vizitatorul</w:t>
+      </w:r>
+      <w:proofErr w:type="spellEnd"/>
+      <w:r>
+        <w:rPr>
+          <w:b/>
+          <w:bCs/>
+        </w:rPr>
+        <w:t xml:space="preserve"> a </w:t>
+      </w:r>
+      <w:proofErr w:type="spellStart"/>
+      <w:r>
+        <w:rPr>
+          <w:b/>
+          <w:bCs/>
+        </w:rPr>
+        <w:t>dat</w:t>
+      </w:r>
+      <w:proofErr w:type="spellEnd"/>
+      <w:r>
+        <w:rPr>
+          <w:b/>
+          <w:bCs/>
+        </w:rPr>
+        <w:t xml:space="preserve"> scroll </w:t>
+      </w:r>
+      <w:proofErr w:type="spellStart"/>
+      <w:r>
+        <w:rPr>
+          <w:b/>
+          <w:bCs/>
+        </w:rPr>
+        <w:t>până</w:t>
+      </w:r>
+      <w:proofErr w:type="spellEnd"/>
+      <w:r>
+        <w:rPr>
+          <w:b/>
+          <w:bCs/>
+        </w:rPr>
+        <w:t xml:space="preserve"> </w:t>
+      </w:r>
+      <w:proofErr w:type="spellStart"/>
+      <w:r>
+        <w:rPr>
+          <w:b/>
+          <w:bCs/>
+        </w:rPr>
+        <w:t>aproape</w:t>
+      </w:r>
+      <w:proofErr w:type="spellEnd"/>
+      <w:r>
+        <w:rPr>
+          <w:b/>
+          <w:bCs/>
+        </w:rPr>
+        <w:t xml:space="preserve"> de </w:t>
+      </w:r>
+      <w:proofErr w:type="spellStart"/>
+      <w:r>
+        <w:rPr>
+          <w:b/>
+          <w:bCs/>
+        </w:rPr>
+        <w:t>finalul</w:t>
+      </w:r>
+      <w:proofErr w:type="spellEnd"/>
+      <w:r>
+        <w:rPr>
+          <w:b/>
+          <w:bCs/>
+        </w:rPr>
+        <w:t xml:space="preserve"> </w:t>
+      </w:r>
+      <w:proofErr w:type="spellStart"/>
+      <w:r>
+        <w:rPr>
+          <w:b/>
+          <w:bCs/>
+        </w:rPr>
+        <w:t>paginii</w:t>
+      </w:r>
+      <w:proofErr w:type="spellEnd"/>
+      <w:r>
+        <w:t xml:space="preserve">. </w:t>
+      </w:r>
+      <w:proofErr w:type="spellStart"/>
+      <w:r>
+        <w:t>În</w:t>
+      </w:r>
+      <w:proofErr w:type="spellEnd"/>
+      <w:r>
+        <w:t xml:space="preserve"> secunda </w:t>
+      </w:r>
+      <w:proofErr w:type="spellStart"/>
+      <w:r>
+        <w:t>în</w:t>
+      </w:r>
+      <w:proofErr w:type="spellEnd"/>
+      <w:r>
+        <w:t xml:space="preserve"> care </w:t>
+      </w:r>
+      <w:proofErr w:type="spellStart"/>
+      <w:r>
+        <w:t>vede</w:t>
+      </w:r>
+      <w:proofErr w:type="spellEnd"/>
+      <w:r>
+        <w:t xml:space="preserve"> </w:t>
+      </w:r>
+      <w:proofErr w:type="spellStart"/>
+      <w:r>
+        <w:t>linkul</w:t>
+      </w:r>
+      <w:proofErr w:type="spellEnd"/>
+      <w:r>
+        <w:t xml:space="preserve"> de la final cu IdeeaTa.ai, BAM, </w:t>
+      </w:r>
+      <w:proofErr w:type="spellStart"/>
+      <w:r>
+        <w:t>îi</w:t>
+      </w:r>
+      <w:proofErr w:type="spellEnd"/>
+      <w:r>
+        <w:t xml:space="preserve"> </w:t>
+      </w:r>
+      <w:proofErr w:type="spellStart"/>
+      <w:r>
+        <w:t>sare</w:t>
+      </w:r>
+      <w:proofErr w:type="spellEnd"/>
+      <w:r>
+        <w:t xml:space="preserve"> pop-up-ul cu „</w:t>
+      </w:r>
+      <w:proofErr w:type="spellStart"/>
+      <w:r>
+        <w:t>Creează</w:t>
+      </w:r>
+      <w:proofErr w:type="spellEnd"/>
+      <w:r>
+        <w:t xml:space="preserve"> </w:t>
+      </w:r>
+      <w:proofErr w:type="spellStart"/>
+      <w:r>
+        <w:t>Cont</w:t>
+      </w:r>
+      <w:proofErr w:type="spellEnd"/>
+      <w:r>
+        <w:t>”.</w:t>
+      </w:r>
+    </w:p>
+    <w:p>
+      <w:r>
+        <w:t xml:space="preserve">Ce </w:t>
+      </w:r>
+      <w:proofErr w:type="spellStart"/>
+      <w:r>
+        <w:t>zici</w:t>
+      </w:r>
+      <w:proofErr w:type="spellEnd"/>
+      <w:r>
+        <w:t xml:space="preserve">, </w:t>
+      </w:r>
+      <w:proofErr w:type="spellStart"/>
+      <w:r>
+        <w:t>mergem</w:t>
+      </w:r>
+      <w:proofErr w:type="spellEnd"/>
+      <w:r>
+        <w:t xml:space="preserve"> pe </w:t>
+      </w:r>
+      <w:proofErr w:type="spellStart"/>
+      <w:r>
+        <w:t>soluția</w:t>
+      </w:r>
+      <w:proofErr w:type="spellEnd"/>
+      <w:r>
+        <w:t xml:space="preserve"> cu </w:t>
+      </w:r>
+      <w:proofErr w:type="spellStart"/>
+      <w:r>
+        <w:rPr>
+          <w:b/>
+          <w:bCs/>
+        </w:rPr>
+        <w:t>declanșarea</w:t>
+      </w:r>
+      <w:proofErr w:type="spellEnd"/>
+      <w:r>
+        <w:rPr>
+          <w:b/>
+          <w:bCs/>
+        </w:rPr>
+        <w:t xml:space="preserve"> la Scroll </w:t>
+      </w:r>
+      <w:proofErr w:type="spellStart"/>
+      <w:r>
+        <w:rPr>
+          <w:b/>
+          <w:bCs/>
+        </w:rPr>
+        <w:t>spre</w:t>
+      </w:r>
+      <w:proofErr w:type="spellEnd"/>
+      <w:r>
+        <w:rPr>
+          <w:b/>
+          <w:bCs/>
+        </w:rPr>
+        <w:t xml:space="preserve"> </w:t>
+      </w:r>
+      <w:proofErr w:type="spellStart"/>
+      <w:r>
+        <w:rPr>
+          <w:b/>
+          <w:bCs/>
+        </w:rPr>
+        <w:t>finalul</w:t>
+      </w:r>
+      <w:proofErr w:type="spellEnd"/>
+      <w:r>
+        <w:rPr>
+          <w:b/>
+          <w:bCs/>
+        </w:rPr>
+        <w:t xml:space="preserve"> </w:t>
+      </w:r>
+      <w:proofErr w:type="spellStart"/>
+      <w:r>
+        <w:rPr>
+          <w:b/>
+          <w:bCs/>
+        </w:rPr>
+        <w:t>paginii</w:t>
+      </w:r>
+      <w:proofErr w:type="spellEnd"/>
+      <w:r>
+        <w:t xml:space="preserve">? </w:t>
+      </w:r>
+      <w:proofErr w:type="spellStart"/>
+      <w:r>
+        <w:t>Dacă</w:t>
+      </w:r>
+      <w:proofErr w:type="spellEnd"/>
+      <w:r>
+        <w:t xml:space="preserve"> </w:t>
+      </w:r>
+      <w:proofErr w:type="spellStart"/>
+      <w:r>
+        <w:t>ești</w:t>
+      </w:r>
+      <w:proofErr w:type="spellEnd"/>
+      <w:r>
+        <w:t xml:space="preserve"> de </w:t>
+      </w:r>
+      <w:proofErr w:type="spellStart"/>
+      <w:r>
+        <w:t>acord</w:t>
+      </w:r>
+      <w:proofErr w:type="spellEnd"/>
+      <w:r>
+        <w:t xml:space="preserve">, </w:t>
+      </w:r>
+      <w:proofErr w:type="spellStart"/>
+      <w:r>
+        <w:t>apăs</w:t>
+      </w:r>
+      <w:proofErr w:type="spellEnd"/>
+      <w:r>
+        <w:t xml:space="preserve"> un </w:t>
+      </w:r>
+      <w:proofErr w:type="spellStart"/>
+      <w:r>
+        <w:t>buton</w:t>
+      </w:r>
+      <w:proofErr w:type="spellEnd"/>
+      <w:r>
+        <w:t xml:space="preserve"> </w:t>
+      </w:r>
+      <w:proofErr w:type="spellStart"/>
+      <w:r>
+        <w:t>și</w:t>
+      </w:r>
+      <w:proofErr w:type="spellEnd"/>
+      <w:r>
+        <w:t xml:space="preserve"> </w:t>
+      </w:r>
+      <w:proofErr w:type="spellStart"/>
+      <w:r>
+        <w:t>urc</w:t>
+      </w:r>
+      <w:proofErr w:type="spellEnd"/>
+      <w:r>
+        <w:t xml:space="preserve"> </w:t>
+      </w:r>
+      <w:proofErr w:type="spellStart"/>
+      <w:r>
+        <w:t>modificarea</w:t>
+      </w:r>
+      <w:proofErr w:type="spellEnd"/>
+      <w:r>
+        <w:t xml:space="preserve"> pe server!</w:t>
+      </w:r>
+    </w:p>
+    <w:p>
+      <w:r>
+        <w:t>10:42 AM</w:t>
+      </w:r>
+    </w:p>
+    <w:p>
+      <w:proofErr w:type="spellStart"/>
+      <w:r>
+        <w:t>asta</w:t>
+      </w:r>
+      <w:proofErr w:type="spellEnd"/>
+      <w:r>
+        <w:t xml:space="preserve"> e </w:t>
+      </w:r>
+      <w:proofErr w:type="spellStart"/>
+      <w:proofErr w:type="gramStart"/>
+      <w:r>
+        <w:t>varianta</w:t>
+      </w:r>
+      <w:proofErr w:type="spellEnd"/>
+      <w:r>
+        <w:t xml:space="preserve"> :Cea</w:t>
+      </w:r>
+      <w:proofErr w:type="gramEnd"/>
+      <w:r>
+        <w:t xml:space="preserve"> </w:t>
+      </w:r>
+      <w:proofErr w:type="spellStart"/>
+      <w:r>
+        <w:t>mai</w:t>
+      </w:r>
+      <w:proofErr w:type="spellEnd"/>
+      <w:r>
+        <w:t xml:space="preserve"> </w:t>
+      </w:r>
+      <w:proofErr w:type="spellStart"/>
+      <w:r>
+        <w:t>elegantă</w:t>
+      </w:r>
+      <w:proofErr w:type="spellEnd"/>
+      <w:r>
+        <w:t xml:space="preserve"> </w:t>
+      </w:r>
+      <w:proofErr w:type="spellStart"/>
+      <w:r>
+        <w:t>soluție</w:t>
+      </w:r>
+      <w:proofErr w:type="spellEnd"/>
+      <w:r>
+        <w:t xml:space="preserve"> </w:t>
+      </w:r>
+      <w:proofErr w:type="spellStart"/>
+      <w:r>
+        <w:t>este</w:t>
+      </w:r>
+      <w:proofErr w:type="spellEnd"/>
+      <w:r>
+        <w:t xml:space="preserve">: Pop-up-ul </w:t>
+      </w:r>
+      <w:proofErr w:type="spellStart"/>
+      <w:r>
+        <w:t>apare</w:t>
+      </w:r>
+      <w:proofErr w:type="spellEnd"/>
+      <w:r>
+        <w:t xml:space="preserve"> </w:t>
+      </w:r>
+      <w:proofErr w:type="spellStart"/>
+      <w:r>
+        <w:t>doar</w:t>
+      </w:r>
+      <w:proofErr w:type="spellEnd"/>
+      <w:r>
+        <w:t xml:space="preserve"> </w:t>
+      </w:r>
+      <w:proofErr w:type="spellStart"/>
+      <w:r>
+        <w:t>atunci</w:t>
+      </w:r>
+      <w:proofErr w:type="spellEnd"/>
+      <w:r>
+        <w:t xml:space="preserve"> </w:t>
+      </w:r>
+      <w:proofErr w:type="spellStart"/>
+      <w:r>
+        <w:t>când</w:t>
+      </w:r>
+      <w:proofErr w:type="spellEnd"/>
+      <w:r>
+        <w:t xml:space="preserve"> </w:t>
+      </w:r>
+      <w:proofErr w:type="spellStart"/>
+      <w:r>
+        <w:t>vizitatorul</w:t>
+      </w:r>
+      <w:proofErr w:type="spellEnd"/>
+      <w:r>
+        <w:t xml:space="preserve"> a </w:t>
+      </w:r>
+      <w:proofErr w:type="spellStart"/>
+      <w:r>
+        <w:t>dat</w:t>
+      </w:r>
+      <w:proofErr w:type="spellEnd"/>
+      <w:r>
+        <w:t xml:space="preserve"> scroll </w:t>
+      </w:r>
+      <w:proofErr w:type="spellStart"/>
+      <w:r>
+        <w:t>până</w:t>
+      </w:r>
+      <w:proofErr w:type="spellEnd"/>
+      <w:r>
+        <w:t xml:space="preserve"> </w:t>
+      </w:r>
+      <w:proofErr w:type="spellStart"/>
+      <w:r>
+        <w:t>aproape</w:t>
+      </w:r>
+      <w:proofErr w:type="spellEnd"/>
+      <w:r>
+        <w:t xml:space="preserve"> de </w:t>
+      </w:r>
+      <w:proofErr w:type="spellStart"/>
+      <w:r>
+        <w:t>finalul</w:t>
+      </w:r>
+      <w:proofErr w:type="spellEnd"/>
+      <w:r>
+        <w:t xml:space="preserve"> </w:t>
+      </w:r>
+      <w:proofErr w:type="spellStart"/>
+      <w:r>
+        <w:t>paginii</w:t>
+      </w:r>
+      <w:proofErr w:type="spellEnd"/>
+      <w:r>
+        <w:t xml:space="preserve">. </w:t>
+      </w:r>
+      <w:proofErr w:type="spellStart"/>
+      <w:r>
+        <w:t>În</w:t>
+      </w:r>
+      <w:proofErr w:type="spellEnd"/>
+      <w:r>
+        <w:t xml:space="preserve"> secunda </w:t>
+      </w:r>
+      <w:proofErr w:type="spellStart"/>
+      <w:r>
+        <w:t>în</w:t>
+      </w:r>
+      <w:proofErr w:type="spellEnd"/>
+      <w:r>
+        <w:t xml:space="preserve"> care </w:t>
+      </w:r>
+      <w:proofErr w:type="spellStart"/>
+      <w:r>
+        <w:t>vede</w:t>
+      </w:r>
+      <w:proofErr w:type="spellEnd"/>
+      <w:r>
+        <w:t xml:space="preserve"> </w:t>
+      </w:r>
+      <w:proofErr w:type="spellStart"/>
+      <w:r>
+        <w:t>linkul</w:t>
+      </w:r>
+      <w:proofErr w:type="spellEnd"/>
+      <w:r>
+        <w:t xml:space="preserve"> de la final cu IdeeaTa.ai, BAM, </w:t>
+      </w:r>
+      <w:proofErr w:type="spellStart"/>
+      <w:r>
+        <w:t>îi</w:t>
+      </w:r>
+      <w:proofErr w:type="spellEnd"/>
+      <w:r>
+        <w:t xml:space="preserve"> </w:t>
+      </w:r>
+      <w:proofErr w:type="spellStart"/>
+      <w:r>
+        <w:t>sare</w:t>
+      </w:r>
+      <w:proofErr w:type="spellEnd"/>
+      <w:r>
+        <w:t xml:space="preserve"> pop-up-ul cu „</w:t>
+      </w:r>
+      <w:proofErr w:type="spellStart"/>
+      <w:r>
+        <w:t>Creează</w:t>
+      </w:r>
+      <w:proofErr w:type="spellEnd"/>
+      <w:r>
+        <w:t xml:space="preserve"> </w:t>
+      </w:r>
+      <w:proofErr w:type="spellStart"/>
+      <w:r>
+        <w:t>Cont</w:t>
+      </w:r>
+      <w:proofErr w:type="spellEnd"/>
+      <w:r>
+        <w:t>”.</w:t>
+      </w:r>
+    </w:p>
+    <w:p/>
     <w:p/>
     <w:sectPr>
       <w:pgSz w:w="12240" w:h="15840"/>

</xml_diff>

<commit_message>
Fix: Revert model back to 1.5-flash as 2.0-flash seems heavily throttled even on paid accounts
</commit_message>
<xml_diff>
--- a/google_adsens.docx
+++ b/google_adsens.docx
@@ -331,6 +331,9 @@
     <w:p/>
     <w:p>
       <w:r>
+        <w:rPr>
+          <w:noProof/>
+        </w:rPr>
         <w:lastRenderedPageBreak/>
         <w:drawing>
           <wp:inline distT="0" distB="0" distL="0" distR="0" wp14:anchorId="5834C939" wp14:editId="1466D2CD">
@@ -1083,7 +1086,7 @@
     <w:p>
       <w:r>
         <w:pict w14:anchorId="760B0CB2">
-          <v:rect id="_x0000_i1038" style="width:360.85pt;height:.75pt" o:hrpct="0" o:hralign="center" o:hrstd="t" o:hr="t" fillcolor="#a0a0a0" stroked="f"/>
+          <v:rect id="_x0000_i1025" style="width:360.85pt;height:.75pt" o:hrpct="0" o:hralign="center" o:hrstd="t" o:hr="t" fillcolor="#a0a0a0" stroked="f"/>
         </w:pict>
       </w:r>
     </w:p>
@@ -14264,15 +14267,7 @@
       </w:r>
       <w:proofErr w:type="spellEnd"/>
       <w:r>
-        <w:t xml:space="preserve"> </w:t>
-      </w:r>
-      <w:proofErr w:type="spellStart"/>
-      <w:r>
-        <w:t>va</w:t>
-      </w:r>
-      <w:proofErr w:type="spellEnd"/>
-      <w:r>
-        <w:t xml:space="preserve"> </w:t>
+        <w:t xml:space="preserve"> va </w:t>
       </w:r>
       <w:proofErr w:type="spellStart"/>
       <w:r>
@@ -29228,6 +29223,2198 @@
       </w:r>
     </w:p>
     <w:p/>
+    <w:p>
+      <w:proofErr w:type="spellStart"/>
+      <w:r>
+        <w:t>Cât</w:t>
+      </w:r>
+      <w:proofErr w:type="spellEnd"/>
+      <w:r>
+        <w:t xml:space="preserve"> </w:t>
+      </w:r>
+      <w:proofErr w:type="spellStart"/>
+      <w:r>
+        <w:t>timp</w:t>
+      </w:r>
+      <w:proofErr w:type="spellEnd"/>
+      <w:r>
+        <w:t xml:space="preserve"> </w:t>
+      </w:r>
+      <w:proofErr w:type="spellStart"/>
+      <w:r>
+        <w:t>contul</w:t>
+      </w:r>
+      <w:proofErr w:type="spellEnd"/>
+      <w:r>
+        <w:t xml:space="preserve"> </w:t>
+      </w:r>
+      <w:proofErr w:type="spellStart"/>
+      <w:r>
+        <w:t>tău</w:t>
+      </w:r>
+      <w:proofErr w:type="spellEnd"/>
+      <w:r>
+        <w:t xml:space="preserve"> </w:t>
+      </w:r>
+      <w:proofErr w:type="spellStart"/>
+      <w:r>
+        <w:t>este</w:t>
+      </w:r>
+      <w:proofErr w:type="spellEnd"/>
+      <w:r>
+        <w:t xml:space="preserve"> pe </w:t>
+      </w:r>
+      <w:r>
+        <w:rPr>
+          <w:b/>
+          <w:bCs/>
+        </w:rPr>
+        <w:t>Free Tier</w:t>
+      </w:r>
+      <w:r>
+        <w:t> (</w:t>
+      </w:r>
+      <w:proofErr w:type="spellStart"/>
+      <w:r>
+        <w:t>fără</w:t>
+      </w:r>
+      <w:proofErr w:type="spellEnd"/>
+      <w:r>
+        <w:t xml:space="preserve"> card </w:t>
+      </w:r>
+      <w:proofErr w:type="spellStart"/>
+      <w:r>
+        <w:t>introdus</w:t>
+      </w:r>
+      <w:proofErr w:type="spellEnd"/>
+      <w:r>
+        <w:t>), </w:t>
+      </w:r>
+      <w:proofErr w:type="spellStart"/>
+      <w:r>
+        <w:rPr>
+          <w:b/>
+          <w:bCs/>
+        </w:rPr>
+        <w:t>costurile</w:t>
+      </w:r>
+      <w:proofErr w:type="spellEnd"/>
+      <w:r>
+        <w:rPr>
+          <w:b/>
+          <w:bCs/>
+        </w:rPr>
+        <w:t xml:space="preserve"> tale </w:t>
+      </w:r>
+      <w:proofErr w:type="spellStart"/>
+      <w:r>
+        <w:rPr>
+          <w:b/>
+          <w:bCs/>
+        </w:rPr>
+        <w:t>vor</w:t>
+      </w:r>
+      <w:proofErr w:type="spellEnd"/>
+      <w:r>
+        <w:rPr>
+          <w:b/>
+          <w:bCs/>
+        </w:rPr>
+        <w:t xml:space="preserve"> fi </w:t>
+      </w:r>
+      <w:proofErr w:type="spellStart"/>
+      <w:r>
+        <w:rPr>
+          <w:b/>
+          <w:bCs/>
+        </w:rPr>
+        <w:t>mereu</w:t>
+      </w:r>
+      <w:proofErr w:type="spellEnd"/>
+      <w:r>
+        <w:rPr>
+          <w:b/>
+          <w:bCs/>
+        </w:rPr>
+        <w:t xml:space="preserve"> ZERO ABSOLUT</w:t>
+      </w:r>
+      <w:r>
+        <w:t xml:space="preserve">, </w:t>
+      </w:r>
+      <w:proofErr w:type="spellStart"/>
+      <w:r>
+        <w:t>indiferent</w:t>
+      </w:r>
+      <w:proofErr w:type="spellEnd"/>
+      <w:r>
+        <w:t xml:space="preserve"> </w:t>
+      </w:r>
+      <w:proofErr w:type="spellStart"/>
+      <w:r>
+        <w:t>câte</w:t>
+      </w:r>
+      <w:proofErr w:type="spellEnd"/>
+      <w:r>
+        <w:t xml:space="preserve"> </w:t>
+      </w:r>
+      <w:proofErr w:type="spellStart"/>
+      <w:r>
+        <w:t>aplicații</w:t>
+      </w:r>
+      <w:proofErr w:type="spellEnd"/>
+      <w:r>
+        <w:t xml:space="preserve"> </w:t>
+      </w:r>
+      <w:proofErr w:type="spellStart"/>
+      <w:r>
+        <w:t>faci</w:t>
+      </w:r>
+      <w:proofErr w:type="spellEnd"/>
+      <w:r>
+        <w:t xml:space="preserve">, </w:t>
+      </w:r>
+      <w:proofErr w:type="spellStart"/>
+      <w:r>
+        <w:t>câte</w:t>
+      </w:r>
+      <w:proofErr w:type="spellEnd"/>
+      <w:r>
+        <w:t xml:space="preserve"> demo-</w:t>
+      </w:r>
+      <w:proofErr w:type="spellStart"/>
+      <w:r>
+        <w:t>uri</w:t>
+      </w:r>
+      <w:proofErr w:type="spellEnd"/>
+      <w:r>
+        <w:t xml:space="preserve"> </w:t>
+      </w:r>
+      <w:proofErr w:type="spellStart"/>
+      <w:r>
+        <w:t>testezi</w:t>
+      </w:r>
+      <w:proofErr w:type="spellEnd"/>
+      <w:r>
+        <w:t xml:space="preserve"> </w:t>
+      </w:r>
+      <w:proofErr w:type="spellStart"/>
+      <w:r>
+        <w:t>tu</w:t>
+      </w:r>
+      <w:proofErr w:type="spellEnd"/>
+      <w:r>
+        <w:t xml:space="preserve"> </w:t>
+      </w:r>
+      <w:proofErr w:type="spellStart"/>
+      <w:r>
+        <w:t>sau</w:t>
+      </w:r>
+      <w:proofErr w:type="spellEnd"/>
+      <w:r>
+        <w:t xml:space="preserve"> </w:t>
+      </w:r>
+      <w:proofErr w:type="spellStart"/>
+      <w:r>
+        <w:t>câți</w:t>
+      </w:r>
+      <w:proofErr w:type="spellEnd"/>
+      <w:r>
+        <w:t xml:space="preserve"> </w:t>
+      </w:r>
+      <w:proofErr w:type="spellStart"/>
+      <w:r>
+        <w:t>utilizatori</w:t>
+      </w:r>
+      <w:proofErr w:type="spellEnd"/>
+      <w:r>
+        <w:t xml:space="preserve"> </w:t>
+      </w:r>
+      <w:proofErr w:type="spellStart"/>
+      <w:r>
+        <w:t>intră</w:t>
+      </w:r>
+      <w:proofErr w:type="spellEnd"/>
+      <w:r>
+        <w:t xml:space="preserve">. Google nu </w:t>
+      </w:r>
+      <w:proofErr w:type="spellStart"/>
+      <w:r>
+        <w:t>îți</w:t>
+      </w:r>
+      <w:proofErr w:type="spellEnd"/>
+      <w:r>
+        <w:t xml:space="preserve"> </w:t>
+      </w:r>
+      <w:proofErr w:type="spellStart"/>
+      <w:r>
+        <w:t>va</w:t>
+      </w:r>
+      <w:proofErr w:type="spellEnd"/>
+      <w:r>
+        <w:t xml:space="preserve"> cere </w:t>
+      </w:r>
+      <w:proofErr w:type="spellStart"/>
+      <w:r>
+        <w:t>niciun</w:t>
+      </w:r>
+      <w:proofErr w:type="spellEnd"/>
+      <w:r>
+        <w:t xml:space="preserve"> ban. </w:t>
+      </w:r>
+      <w:proofErr w:type="spellStart"/>
+      <w:r>
+        <w:t>Singurul</w:t>
+      </w:r>
+      <w:proofErr w:type="spellEnd"/>
+      <w:r>
+        <w:t xml:space="preserve"> </w:t>
+      </w:r>
+      <w:proofErr w:type="spellStart"/>
+      <w:r>
+        <w:t>dezavantaj</w:t>
+      </w:r>
+      <w:proofErr w:type="spellEnd"/>
+      <w:r>
+        <w:t xml:space="preserve"> pe Free Tier </w:t>
+      </w:r>
+      <w:proofErr w:type="spellStart"/>
+      <w:r>
+        <w:t>este</w:t>
+      </w:r>
+      <w:proofErr w:type="spellEnd"/>
+      <w:r>
+        <w:t xml:space="preserve"> </w:t>
+      </w:r>
+      <w:proofErr w:type="spellStart"/>
+      <w:r>
+        <w:t>că</w:t>
+      </w:r>
+      <w:proofErr w:type="spellEnd"/>
+      <w:r>
+        <w:t xml:space="preserve">, </w:t>
+      </w:r>
+      <w:proofErr w:type="spellStart"/>
+      <w:r>
+        <w:t>dacă</w:t>
+      </w:r>
+      <w:proofErr w:type="spellEnd"/>
+      <w:r>
+        <w:t xml:space="preserve"> 16 </w:t>
+      </w:r>
+      <w:proofErr w:type="spellStart"/>
+      <w:r>
+        <w:t>oameni</w:t>
+      </w:r>
+      <w:proofErr w:type="spellEnd"/>
+      <w:r>
+        <w:t xml:space="preserve"> </w:t>
+      </w:r>
+      <w:proofErr w:type="spellStart"/>
+      <w:r>
+        <w:t>dau</w:t>
+      </w:r>
+      <w:proofErr w:type="spellEnd"/>
+      <w:r>
+        <w:t xml:space="preserve"> click pe </w:t>
+      </w:r>
+      <w:proofErr w:type="spellStart"/>
+      <w:r>
+        <w:t>butonul</w:t>
+      </w:r>
+      <w:proofErr w:type="spellEnd"/>
+      <w:r>
+        <w:t xml:space="preserve"> "</w:t>
+      </w:r>
+      <w:proofErr w:type="spellStart"/>
+      <w:r>
+        <w:t>Generează</w:t>
+      </w:r>
+      <w:proofErr w:type="spellEnd"/>
+      <w:r>
+        <w:t>" </w:t>
+      </w:r>
+      <w:proofErr w:type="spellStart"/>
+      <w:r>
+        <w:rPr>
+          <w:i/>
+          <w:iCs/>
+        </w:rPr>
+        <w:t>în</w:t>
+      </w:r>
+      <w:proofErr w:type="spellEnd"/>
+      <w:r>
+        <w:rPr>
+          <w:i/>
+          <w:iCs/>
+        </w:rPr>
+        <w:t xml:space="preserve"> exact </w:t>
+      </w:r>
+      <w:proofErr w:type="spellStart"/>
+      <w:r>
+        <w:rPr>
+          <w:i/>
+          <w:iCs/>
+        </w:rPr>
+        <w:t>același</w:t>
+      </w:r>
+      <w:proofErr w:type="spellEnd"/>
+      <w:r>
+        <w:rPr>
+          <w:i/>
+          <w:iCs/>
+        </w:rPr>
+        <w:t xml:space="preserve"> </w:t>
+      </w:r>
+      <w:proofErr w:type="spellStart"/>
+      <w:r>
+        <w:rPr>
+          <w:i/>
+          <w:iCs/>
+        </w:rPr>
+        <w:t>minut</w:t>
+      </w:r>
+      <w:proofErr w:type="spellEnd"/>
+      <w:r>
+        <w:t xml:space="preserve">, al 16-lea </w:t>
+      </w:r>
+      <w:proofErr w:type="spellStart"/>
+      <w:r>
+        <w:t>va</w:t>
+      </w:r>
+      <w:proofErr w:type="spellEnd"/>
+      <w:r>
+        <w:t xml:space="preserve"> </w:t>
+      </w:r>
+      <w:proofErr w:type="spellStart"/>
+      <w:r>
+        <w:t>primi</w:t>
+      </w:r>
+      <w:proofErr w:type="spellEnd"/>
+      <w:r>
+        <w:t xml:space="preserve"> </w:t>
+      </w:r>
+      <w:proofErr w:type="spellStart"/>
+      <w:r>
+        <w:t>acea</w:t>
+      </w:r>
+      <w:proofErr w:type="spellEnd"/>
+      <w:r>
+        <w:t xml:space="preserve"> </w:t>
+      </w:r>
+      <w:proofErr w:type="spellStart"/>
+      <w:r>
+        <w:t>eroare</w:t>
+      </w:r>
+      <w:proofErr w:type="spellEnd"/>
+      <w:r>
+        <w:t xml:space="preserve"> cu "</w:t>
+      </w:r>
+      <w:proofErr w:type="spellStart"/>
+      <w:r>
+        <w:t>Așteaptă</w:t>
+      </w:r>
+      <w:proofErr w:type="spellEnd"/>
+      <w:r>
+        <w:t xml:space="preserve"> un </w:t>
+      </w:r>
+      <w:proofErr w:type="spellStart"/>
+      <w:r>
+        <w:t>minut</w:t>
+      </w:r>
+      <w:proofErr w:type="spellEnd"/>
+      <w:r>
+        <w:t xml:space="preserve">". </w:t>
+      </w:r>
+      <w:proofErr w:type="spellStart"/>
+      <w:r>
+        <w:t>Cheia</w:t>
+      </w:r>
+      <w:proofErr w:type="spellEnd"/>
+      <w:r>
+        <w:t xml:space="preserve"> API </w:t>
+      </w:r>
+      <w:proofErr w:type="spellStart"/>
+      <w:r>
+        <w:t>suportă</w:t>
+      </w:r>
+      <w:proofErr w:type="spellEnd"/>
+      <w:r>
+        <w:t xml:space="preserve"> maxim 15 </w:t>
+      </w:r>
+      <w:proofErr w:type="spellStart"/>
+      <w:r>
+        <w:t>apelări</w:t>
+      </w:r>
+      <w:proofErr w:type="spellEnd"/>
+      <w:r>
+        <w:t xml:space="preserve"> pe </w:t>
+      </w:r>
+      <w:proofErr w:type="spellStart"/>
+      <w:r>
+        <w:t>minut</w:t>
+      </w:r>
+      <w:proofErr w:type="spellEnd"/>
+      <w:r>
+        <w:t xml:space="preserve"> (cumulate de pe </w:t>
+      </w:r>
+      <w:proofErr w:type="spellStart"/>
+      <w:r>
+        <w:t>toate</w:t>
+      </w:r>
+      <w:proofErr w:type="spellEnd"/>
+      <w:r>
+        <w:t xml:space="preserve"> </w:t>
+      </w:r>
+      <w:proofErr w:type="spellStart"/>
+      <w:r>
+        <w:t>aplicațiile</w:t>
+      </w:r>
+      <w:proofErr w:type="spellEnd"/>
+      <w:r>
+        <w:t xml:space="preserve"> care </w:t>
+      </w:r>
+      <w:proofErr w:type="spellStart"/>
+      <w:r>
+        <w:t>folosesc</w:t>
+      </w:r>
+      <w:proofErr w:type="spellEnd"/>
+      <w:r>
+        <w:t xml:space="preserve"> </w:t>
+      </w:r>
+      <w:proofErr w:type="spellStart"/>
+      <w:r>
+        <w:t>aceeași</w:t>
+      </w:r>
+      <w:proofErr w:type="spellEnd"/>
+      <w:r>
+        <w:t xml:space="preserve"> </w:t>
+      </w:r>
+      <w:proofErr w:type="spellStart"/>
+      <w:r>
+        <w:t>cheie</w:t>
+      </w:r>
+      <w:proofErr w:type="spellEnd"/>
+      <w:r>
+        <w:t>).</w:t>
+      </w:r>
+    </w:p>
+    <w:p>
+      <w:proofErr w:type="spellStart"/>
+      <w:r>
+        <w:t>Dacă</w:t>
+      </w:r>
+      <w:proofErr w:type="spellEnd"/>
+      <w:r>
+        <w:t xml:space="preserve"> </w:t>
+      </w:r>
+      <w:proofErr w:type="spellStart"/>
+      <w:r>
+        <w:t>decizi</w:t>
+      </w:r>
+      <w:proofErr w:type="spellEnd"/>
+      <w:r>
+        <w:t xml:space="preserve"> </w:t>
+      </w:r>
+      <w:proofErr w:type="spellStart"/>
+      <w:r>
+        <w:t>să</w:t>
+      </w:r>
+      <w:proofErr w:type="spellEnd"/>
+      <w:r>
+        <w:t> </w:t>
+      </w:r>
+      <w:proofErr w:type="spellStart"/>
+      <w:r>
+        <w:rPr>
+          <w:b/>
+          <w:bCs/>
+        </w:rPr>
+        <w:t>introduci</w:t>
+      </w:r>
+      <w:proofErr w:type="spellEnd"/>
+      <w:r>
+        <w:rPr>
+          <w:b/>
+          <w:bCs/>
+        </w:rPr>
+        <w:t xml:space="preserve"> </w:t>
+      </w:r>
+      <w:proofErr w:type="spellStart"/>
+      <w:r>
+        <w:rPr>
+          <w:b/>
+          <w:bCs/>
+        </w:rPr>
+        <w:t>cardul</w:t>
+      </w:r>
+      <w:proofErr w:type="spellEnd"/>
+      <w:r>
+        <w:rPr>
+          <w:b/>
+          <w:bCs/>
+        </w:rPr>
+        <w:t xml:space="preserve"> (Pay-as-you-go)</w:t>
+      </w:r>
+      <w:r>
+        <w:t xml:space="preserve"> ca </w:t>
+      </w:r>
+      <w:proofErr w:type="spellStart"/>
+      <w:r>
+        <w:t>să</w:t>
+      </w:r>
+      <w:proofErr w:type="spellEnd"/>
+      <w:r>
+        <w:t xml:space="preserve"> nu </w:t>
+      </w:r>
+      <w:proofErr w:type="spellStart"/>
+      <w:r>
+        <w:t>mai</w:t>
+      </w:r>
+      <w:proofErr w:type="spellEnd"/>
+      <w:r>
+        <w:t xml:space="preserve"> </w:t>
+      </w:r>
+      <w:proofErr w:type="spellStart"/>
+      <w:r>
+        <w:t>existe</w:t>
+      </w:r>
+      <w:proofErr w:type="spellEnd"/>
+      <w:r>
+        <w:t xml:space="preserve"> </w:t>
+      </w:r>
+      <w:proofErr w:type="spellStart"/>
+      <w:r>
+        <w:t>acea</w:t>
+      </w:r>
+      <w:proofErr w:type="spellEnd"/>
+      <w:r>
+        <w:t xml:space="preserve"> </w:t>
+      </w:r>
+      <w:proofErr w:type="spellStart"/>
+      <w:r>
+        <w:t>limită</w:t>
+      </w:r>
+      <w:proofErr w:type="spellEnd"/>
+      <w:r>
+        <w:t xml:space="preserve"> de 15 pe </w:t>
+      </w:r>
+      <w:proofErr w:type="spellStart"/>
+      <w:r>
+        <w:t>minut</w:t>
+      </w:r>
+      <w:proofErr w:type="spellEnd"/>
+      <w:r>
+        <w:t xml:space="preserve"> </w:t>
+      </w:r>
+      <w:proofErr w:type="spellStart"/>
+      <w:r>
+        <w:t>pentru</w:t>
+      </w:r>
+      <w:proofErr w:type="spellEnd"/>
+      <w:r>
+        <w:t xml:space="preserve"> </w:t>
+      </w:r>
+      <w:proofErr w:type="spellStart"/>
+      <w:r>
+        <w:t>utilizatori</w:t>
+      </w:r>
+      <w:proofErr w:type="spellEnd"/>
+      <w:r>
+        <w:t xml:space="preserve">, </w:t>
+      </w:r>
+      <w:proofErr w:type="spellStart"/>
+      <w:r>
+        <w:t>iată</w:t>
+      </w:r>
+      <w:proofErr w:type="spellEnd"/>
+      <w:r>
+        <w:t xml:space="preserve"> cum </w:t>
+      </w:r>
+      <w:proofErr w:type="spellStart"/>
+      <w:r>
+        <w:t>arată</w:t>
+      </w:r>
+      <w:proofErr w:type="spellEnd"/>
+      <w:r>
+        <w:t xml:space="preserve"> </w:t>
+      </w:r>
+      <w:proofErr w:type="spellStart"/>
+      <w:r>
+        <w:t>costurile</w:t>
+      </w:r>
+      <w:proofErr w:type="spellEnd"/>
+      <w:r>
+        <w:t xml:space="preserve"> </w:t>
+      </w:r>
+      <w:proofErr w:type="spellStart"/>
+      <w:r>
+        <w:t>reale</w:t>
+      </w:r>
+      <w:proofErr w:type="spellEnd"/>
+      <w:r>
+        <w:t xml:space="preserve"> (cu </w:t>
+      </w:r>
+      <w:proofErr w:type="spellStart"/>
+      <w:r>
+        <w:t>aproximări</w:t>
+      </w:r>
+      <w:proofErr w:type="spellEnd"/>
+      <w:r>
+        <w:t xml:space="preserve"> </w:t>
+      </w:r>
+      <w:proofErr w:type="spellStart"/>
+      <w:r>
+        <w:t>foarte</w:t>
+      </w:r>
+      <w:proofErr w:type="spellEnd"/>
+      <w:r>
+        <w:t xml:space="preserve"> </w:t>
+      </w:r>
+      <w:proofErr w:type="spellStart"/>
+      <w:r>
+        <w:t>exacte</w:t>
+      </w:r>
+      <w:proofErr w:type="spellEnd"/>
+      <w:r>
+        <w:t xml:space="preserve"> </w:t>
+      </w:r>
+      <w:proofErr w:type="spellStart"/>
+      <w:r>
+        <w:t>pentru</w:t>
+      </w:r>
+      <w:proofErr w:type="spellEnd"/>
+      <w:r>
+        <w:t xml:space="preserve"> </w:t>
+      </w:r>
+      <w:proofErr w:type="spellStart"/>
+      <w:r>
+        <w:t>aplicația</w:t>
+      </w:r>
+      <w:proofErr w:type="spellEnd"/>
+      <w:r>
+        <w:t> IdeeaTa.ai):</w:t>
+      </w:r>
+    </w:p>
+    <w:p>
+      <w:r>
+        <w:t xml:space="preserve">1. </w:t>
+      </w:r>
+      <w:proofErr w:type="spellStart"/>
+      <w:r>
+        <w:t>Costul</w:t>
+      </w:r>
+      <w:proofErr w:type="spellEnd"/>
+      <w:r>
+        <w:t xml:space="preserve"> pe un </w:t>
+      </w:r>
+      <w:proofErr w:type="spellStart"/>
+      <w:r>
+        <w:t>singur</w:t>
+      </w:r>
+      <w:proofErr w:type="spellEnd"/>
+      <w:r>
+        <w:t xml:space="preserve"> </w:t>
+      </w:r>
+      <w:proofErr w:type="spellStart"/>
+      <w:r>
+        <w:t>vizitator</w:t>
+      </w:r>
+      <w:proofErr w:type="spellEnd"/>
+      <w:r>
+        <w:t xml:space="preserve"> (Demo / </w:t>
+      </w:r>
+      <w:proofErr w:type="spellStart"/>
+      <w:r>
+        <w:t>Generare</w:t>
+      </w:r>
+      <w:proofErr w:type="spellEnd"/>
+      <w:r>
+        <w:t xml:space="preserve"> Plan)</w:t>
+      </w:r>
+    </w:p>
+    <w:p>
+      <w:proofErr w:type="spellStart"/>
+      <w:r>
+        <w:t>Când</w:t>
+      </w:r>
+      <w:proofErr w:type="spellEnd"/>
+      <w:r>
+        <w:t xml:space="preserve"> un </w:t>
+      </w:r>
+      <w:proofErr w:type="spellStart"/>
+      <w:r>
+        <w:t>vizitator</w:t>
+      </w:r>
+      <w:proofErr w:type="spellEnd"/>
+      <w:r>
+        <w:t xml:space="preserve"> (</w:t>
+      </w:r>
+      <w:proofErr w:type="spellStart"/>
+      <w:r>
+        <w:t>sau</w:t>
+      </w:r>
+      <w:proofErr w:type="spellEnd"/>
+      <w:r>
+        <w:t xml:space="preserve"> </w:t>
+      </w:r>
+      <w:proofErr w:type="spellStart"/>
+      <w:r>
+        <w:t>tu</w:t>
+      </w:r>
+      <w:proofErr w:type="spellEnd"/>
+      <w:r>
+        <w:t xml:space="preserve">, </w:t>
+      </w:r>
+      <w:proofErr w:type="spellStart"/>
+      <w:r>
+        <w:t>când</w:t>
+      </w:r>
+      <w:proofErr w:type="spellEnd"/>
+      <w:r>
+        <w:t xml:space="preserve"> </w:t>
+      </w:r>
+      <w:proofErr w:type="spellStart"/>
+      <w:r>
+        <w:t>testezi</w:t>
+      </w:r>
+      <w:proofErr w:type="spellEnd"/>
+      <w:r>
+        <w:t xml:space="preserve">) </w:t>
+      </w:r>
+      <w:proofErr w:type="spellStart"/>
+      <w:r>
+        <w:t>dă</w:t>
+      </w:r>
+      <w:proofErr w:type="spellEnd"/>
+      <w:r>
+        <w:t xml:space="preserve"> click pe "</w:t>
+      </w:r>
+      <w:proofErr w:type="spellStart"/>
+      <w:r>
+        <w:t>Generează</w:t>
+      </w:r>
+      <w:proofErr w:type="spellEnd"/>
+      <w:r>
+        <w:t xml:space="preserve"> Plan":</w:t>
+      </w:r>
+    </w:p>
+    <w:p>
+      <w:pPr>
+        <w:numPr>
+          <w:ilvl w:val="0"/>
+          <w:numId w:val="22"/>
+        </w:numPr>
+      </w:pPr>
+      <w:proofErr w:type="spellStart"/>
+      <w:r>
+        <w:t>Trimitem</w:t>
+      </w:r>
+      <w:proofErr w:type="spellEnd"/>
+      <w:r>
+        <w:t xml:space="preserve"> un input mic </w:t>
+      </w:r>
+      <w:proofErr w:type="spellStart"/>
+      <w:r>
+        <w:t>către</w:t>
+      </w:r>
+      <w:proofErr w:type="spellEnd"/>
+      <w:r>
+        <w:t xml:space="preserve"> AI (</w:t>
+      </w:r>
+      <w:proofErr w:type="spellStart"/>
+      <w:r>
+        <w:t>promptul</w:t>
+      </w:r>
+      <w:proofErr w:type="spellEnd"/>
+      <w:r>
+        <w:t xml:space="preserve"> meu).</w:t>
+      </w:r>
+    </w:p>
+    <w:p>
+      <w:pPr>
+        <w:numPr>
+          <w:ilvl w:val="0"/>
+          <w:numId w:val="22"/>
+        </w:numPr>
+      </w:pPr>
+      <w:r>
+        <w:t xml:space="preserve">AI-ul </w:t>
+      </w:r>
+      <w:proofErr w:type="spellStart"/>
+      <w:r>
+        <w:t>generează</w:t>
+      </w:r>
+      <w:proofErr w:type="spellEnd"/>
+      <w:r>
+        <w:t xml:space="preserve"> </w:t>
+      </w:r>
+      <w:proofErr w:type="spellStart"/>
+      <w:r>
+        <w:t>în</w:t>
+      </w:r>
+      <w:proofErr w:type="spellEnd"/>
+      <w:r>
+        <w:t xml:space="preserve"> </w:t>
+      </w:r>
+      <w:proofErr w:type="spellStart"/>
+      <w:r>
+        <w:t>jur</w:t>
+      </w:r>
+      <w:proofErr w:type="spellEnd"/>
+      <w:r>
+        <w:t xml:space="preserve"> de 1.500 - 2.000 de </w:t>
+      </w:r>
+      <w:proofErr w:type="spellStart"/>
+      <w:r>
+        <w:t>cuvinte</w:t>
+      </w:r>
+      <w:proofErr w:type="spellEnd"/>
+      <w:r>
+        <w:t xml:space="preserve"> (</w:t>
+      </w:r>
+      <w:proofErr w:type="spellStart"/>
+      <w:r>
+        <w:t>planul</w:t>
+      </w:r>
+      <w:proofErr w:type="spellEnd"/>
+      <w:r>
+        <w:t xml:space="preserve"> de </w:t>
+      </w:r>
+      <w:proofErr w:type="spellStart"/>
+      <w:r>
+        <w:t>afaceri</w:t>
+      </w:r>
+      <w:proofErr w:type="spellEnd"/>
+      <w:r>
+        <w:t>). </w:t>
+      </w:r>
+      <w:r>
+        <w:rPr>
+          <w:b/>
+          <w:bCs/>
+        </w:rPr>
+        <w:t xml:space="preserve">Cost total per plan </w:t>
+      </w:r>
+      <w:proofErr w:type="spellStart"/>
+      <w:r>
+        <w:rPr>
+          <w:b/>
+          <w:bCs/>
+        </w:rPr>
+        <w:t>generat</w:t>
+      </w:r>
+      <w:proofErr w:type="spellEnd"/>
+      <w:r>
+        <w:rPr>
+          <w:b/>
+          <w:bCs/>
+        </w:rPr>
+        <w:t>: ~0.0005$</w:t>
+      </w:r>
+      <w:r>
+        <w:t> (</w:t>
+      </w:r>
+      <w:proofErr w:type="spellStart"/>
+      <w:r>
+        <w:t>adică</w:t>
+      </w:r>
+      <w:proofErr w:type="spellEnd"/>
+      <w:r>
+        <w:t xml:space="preserve"> </w:t>
+      </w:r>
+      <w:proofErr w:type="spellStart"/>
+      <w:r>
+        <w:t>jumătate</w:t>
+      </w:r>
+      <w:proofErr w:type="spellEnd"/>
+      <w:r>
+        <w:t xml:space="preserve"> de </w:t>
+      </w:r>
+      <w:r>
+        <w:rPr>
+          <w:b/>
+          <w:bCs/>
+        </w:rPr>
+        <w:t>cent</w:t>
+      </w:r>
+      <w:r>
+        <w:t xml:space="preserve"> la </w:t>
+      </w:r>
+      <w:proofErr w:type="spellStart"/>
+      <w:r>
+        <w:t>suta</w:t>
+      </w:r>
+      <w:proofErr w:type="spellEnd"/>
+      <w:r>
+        <w:t xml:space="preserve"> de </w:t>
+      </w:r>
+      <w:proofErr w:type="spellStart"/>
+      <w:r>
+        <w:t>generări</w:t>
+      </w:r>
+      <w:proofErr w:type="spellEnd"/>
+      <w:r>
+        <w:t>).</w:t>
+      </w:r>
+    </w:p>
+    <w:p>
+      <w:r>
+        <w:t xml:space="preserve">2. </w:t>
+      </w:r>
+      <w:proofErr w:type="spellStart"/>
+      <w:r>
+        <w:t>Costul</w:t>
+      </w:r>
+      <w:proofErr w:type="spellEnd"/>
+      <w:r>
+        <w:t xml:space="preserve"> pe un </w:t>
+      </w:r>
+      <w:proofErr w:type="spellStart"/>
+      <w:r>
+        <w:t>utilizator</w:t>
+      </w:r>
+      <w:proofErr w:type="spellEnd"/>
+      <w:r>
+        <w:t xml:space="preserve"> </w:t>
+      </w:r>
+      <w:proofErr w:type="spellStart"/>
+      <w:r>
+        <w:t>în</w:t>
+      </w:r>
+      <w:proofErr w:type="spellEnd"/>
+      <w:r>
+        <w:t xml:space="preserve"> "Studio </w:t>
+      </w:r>
+      <w:proofErr w:type="spellStart"/>
+      <w:r>
+        <w:t>Editare</w:t>
+      </w:r>
+      <w:proofErr w:type="spellEnd"/>
+      <w:r>
+        <w:t>"</w:t>
+      </w:r>
+    </w:p>
+    <w:p>
+      <w:proofErr w:type="spellStart"/>
+      <w:r>
+        <w:t>Dacă</w:t>
+      </w:r>
+      <w:proofErr w:type="spellEnd"/>
+      <w:r>
+        <w:t xml:space="preserve"> </w:t>
+      </w:r>
+      <w:proofErr w:type="spellStart"/>
+      <w:r>
+        <w:t>utilizatorul</w:t>
+      </w:r>
+      <w:proofErr w:type="spellEnd"/>
+      <w:r>
+        <w:t xml:space="preserve"> </w:t>
+      </w:r>
+      <w:proofErr w:type="spellStart"/>
+      <w:r>
+        <w:t>folosește</w:t>
+      </w:r>
+      <w:proofErr w:type="spellEnd"/>
+      <w:r>
+        <w:t xml:space="preserve"> </w:t>
+      </w:r>
+      <w:proofErr w:type="spellStart"/>
+      <w:r>
+        <w:t>instrumentele</w:t>
+      </w:r>
+      <w:proofErr w:type="spellEnd"/>
+      <w:r>
+        <w:t xml:space="preserve"> (</w:t>
+      </w:r>
+      <w:proofErr w:type="spellStart"/>
+      <w:r>
+        <w:t>Schimbă</w:t>
+      </w:r>
+      <w:proofErr w:type="spellEnd"/>
+      <w:r>
+        <w:t xml:space="preserve"> </w:t>
+      </w:r>
+      <w:proofErr w:type="spellStart"/>
+      <w:r>
+        <w:t>tonul</w:t>
+      </w:r>
+      <w:proofErr w:type="spellEnd"/>
+      <w:r>
+        <w:t xml:space="preserve">, </w:t>
+      </w:r>
+      <w:proofErr w:type="spellStart"/>
+      <w:r>
+        <w:t>Optimizează</w:t>
+      </w:r>
+      <w:proofErr w:type="spellEnd"/>
+      <w:r>
+        <w:t xml:space="preserve"> </w:t>
+      </w:r>
+      <w:proofErr w:type="spellStart"/>
+      <w:r>
+        <w:t>bugetul</w:t>
+      </w:r>
+      <w:proofErr w:type="spellEnd"/>
+      <w:r>
+        <w:t>, etc.):</w:t>
+      </w:r>
+    </w:p>
+    <w:p>
+      <w:pPr>
+        <w:numPr>
+          <w:ilvl w:val="0"/>
+          <w:numId w:val="23"/>
+        </w:numPr>
+      </w:pPr>
+      <w:proofErr w:type="spellStart"/>
+      <w:r>
+        <w:t>Fiecare</w:t>
+      </w:r>
+      <w:proofErr w:type="spellEnd"/>
+      <w:r>
+        <w:t xml:space="preserve"> </w:t>
+      </w:r>
+      <w:proofErr w:type="spellStart"/>
+      <w:r>
+        <w:t>modificare</w:t>
+      </w:r>
+      <w:proofErr w:type="spellEnd"/>
+      <w:r>
+        <w:t xml:space="preserve"> cu AI </w:t>
+      </w:r>
+      <w:proofErr w:type="spellStart"/>
+      <w:r>
+        <w:t>mai</w:t>
+      </w:r>
+      <w:proofErr w:type="spellEnd"/>
+      <w:r>
+        <w:t xml:space="preserve"> </w:t>
+      </w:r>
+      <w:proofErr w:type="spellStart"/>
+      <w:r>
+        <w:t>consumă</w:t>
+      </w:r>
+      <w:proofErr w:type="spellEnd"/>
+      <w:r>
+        <w:t xml:space="preserve"> </w:t>
+      </w:r>
+      <w:proofErr w:type="spellStart"/>
+      <w:r>
+        <w:t>extrem</w:t>
+      </w:r>
+      <w:proofErr w:type="spellEnd"/>
+      <w:r>
+        <w:t xml:space="preserve"> de </w:t>
+      </w:r>
+      <w:proofErr w:type="spellStart"/>
+      <w:r>
+        <w:t>puțin</w:t>
+      </w:r>
+      <w:proofErr w:type="spellEnd"/>
+      <w:r>
+        <w:t xml:space="preserve"> (</w:t>
+      </w:r>
+      <w:proofErr w:type="spellStart"/>
+      <w:r>
+        <w:t>fiindcă</w:t>
+      </w:r>
+      <w:proofErr w:type="spellEnd"/>
+      <w:r>
+        <w:t xml:space="preserve"> am </w:t>
+      </w:r>
+      <w:proofErr w:type="spellStart"/>
+      <w:r>
+        <w:t>optimizat</w:t>
+      </w:r>
+      <w:proofErr w:type="spellEnd"/>
+      <w:r>
+        <w:t xml:space="preserve"> </w:t>
+      </w:r>
+      <w:proofErr w:type="spellStart"/>
+      <w:r>
+        <w:t>să</w:t>
+      </w:r>
+      <w:proofErr w:type="spellEnd"/>
+      <w:r>
+        <w:t xml:space="preserve"> </w:t>
+      </w:r>
+      <w:proofErr w:type="spellStart"/>
+      <w:r>
+        <w:t>trimită</w:t>
+      </w:r>
+      <w:proofErr w:type="spellEnd"/>
+      <w:r>
+        <w:t xml:space="preserve"> </w:t>
+      </w:r>
+      <w:proofErr w:type="spellStart"/>
+      <w:r>
+        <w:t>doar</w:t>
+      </w:r>
+      <w:proofErr w:type="spellEnd"/>
+      <w:r>
+        <w:t xml:space="preserve"> </w:t>
+      </w:r>
+      <w:proofErr w:type="spellStart"/>
+      <w:r>
+        <w:t>paragraful</w:t>
+      </w:r>
+      <w:proofErr w:type="spellEnd"/>
+      <w:r>
+        <w:t xml:space="preserve"> </w:t>
+      </w:r>
+      <w:proofErr w:type="spellStart"/>
+      <w:r>
+        <w:t>necesar</w:t>
+      </w:r>
+      <w:proofErr w:type="spellEnd"/>
+      <w:r>
+        <w:t>). </w:t>
+      </w:r>
+      <w:r>
+        <w:rPr>
+          <w:b/>
+          <w:bCs/>
+        </w:rPr>
+        <w:t xml:space="preserve">Cost total per 10 </w:t>
+      </w:r>
+      <w:proofErr w:type="spellStart"/>
+      <w:r>
+        <w:rPr>
+          <w:b/>
+          <w:bCs/>
+        </w:rPr>
+        <w:t>editări</w:t>
+      </w:r>
+      <w:proofErr w:type="spellEnd"/>
+      <w:r>
+        <w:rPr>
+          <w:b/>
+          <w:bCs/>
+        </w:rPr>
+        <w:t>: ~0.002$</w:t>
+      </w:r>
+    </w:p>
+    <w:p>
+      <w:r>
+        <w:pict w14:anchorId="6FE59F93">
+          <v:rect id="_x0000_i1032" style="width:444pt;height:.75pt" o:hrpct="0" o:hralign="center" o:hrstd="t" o:hr="t" fillcolor="#a0a0a0" stroked="f"/>
+        </w:pict>
+      </w:r>
+    </w:p>
+    <w:p>
+      <w:r>
+        <w:t xml:space="preserve">Un </w:t>
+      </w:r>
+      <w:proofErr w:type="spellStart"/>
+      <w:r>
+        <w:t>scenariu</w:t>
+      </w:r>
+      <w:proofErr w:type="spellEnd"/>
+      <w:r>
+        <w:t xml:space="preserve"> realist pe o </w:t>
+      </w:r>
+      <w:proofErr w:type="spellStart"/>
+      <w:r>
+        <w:t>lună</w:t>
+      </w:r>
+      <w:proofErr w:type="spellEnd"/>
+      <w:r>
+        <w:t>:</w:t>
+      </w:r>
+    </w:p>
+    <w:p>
+      <w:proofErr w:type="spellStart"/>
+      <w:r>
+        <w:lastRenderedPageBreak/>
+        <w:t>Să</w:t>
+      </w:r>
+      <w:proofErr w:type="spellEnd"/>
+      <w:r>
+        <w:t xml:space="preserve"> </w:t>
+      </w:r>
+      <w:proofErr w:type="spellStart"/>
+      <w:r>
+        <w:t>spunem</w:t>
+      </w:r>
+      <w:proofErr w:type="spellEnd"/>
+      <w:r>
+        <w:t xml:space="preserve"> </w:t>
+      </w:r>
+      <w:proofErr w:type="spellStart"/>
+      <w:r>
+        <w:t>că</w:t>
+      </w:r>
+      <w:proofErr w:type="spellEnd"/>
+      <w:r>
+        <w:t xml:space="preserve"> </w:t>
+      </w:r>
+      <w:proofErr w:type="spellStart"/>
+      <w:r>
+        <w:t>aplicația</w:t>
+      </w:r>
+      <w:proofErr w:type="spellEnd"/>
+      <w:r>
+        <w:t xml:space="preserve"> ta are </w:t>
+      </w:r>
+      <w:proofErr w:type="spellStart"/>
+      <w:r>
+        <w:t>succes</w:t>
+      </w:r>
+      <w:proofErr w:type="spellEnd"/>
+      <w:r>
+        <w:t xml:space="preserve"> </w:t>
+      </w:r>
+      <w:proofErr w:type="spellStart"/>
+      <w:r>
+        <w:t>și</w:t>
+      </w:r>
+      <w:proofErr w:type="spellEnd"/>
+      <w:r>
+        <w:t xml:space="preserve"> luna </w:t>
+      </w:r>
+      <w:proofErr w:type="spellStart"/>
+      <w:r>
+        <w:t>aceasta</w:t>
+      </w:r>
+      <w:proofErr w:type="spellEnd"/>
+      <w:r>
+        <w:t xml:space="preserve"> </w:t>
+      </w:r>
+      <w:proofErr w:type="spellStart"/>
+      <w:r>
+        <w:t>atrage</w:t>
+      </w:r>
+      <w:proofErr w:type="spellEnd"/>
+      <w:r>
+        <w:t> </w:t>
+      </w:r>
+      <w:r>
+        <w:rPr>
+          <w:b/>
+          <w:bCs/>
+        </w:rPr>
+        <w:t xml:space="preserve">5.000 de </w:t>
+      </w:r>
+      <w:proofErr w:type="spellStart"/>
+      <w:r>
+        <w:rPr>
+          <w:b/>
+          <w:bCs/>
+        </w:rPr>
+        <w:t>vizitatori</w:t>
+      </w:r>
+      <w:proofErr w:type="spellEnd"/>
+      <w:r>
+        <w:t> (</w:t>
+      </w:r>
+      <w:proofErr w:type="spellStart"/>
+      <w:r>
+        <w:t>utilizatori</w:t>
+      </w:r>
+      <w:proofErr w:type="spellEnd"/>
+      <w:r>
+        <w:t xml:space="preserve"> din </w:t>
+      </w:r>
+      <w:proofErr w:type="spellStart"/>
+      <w:r>
+        <w:t>reclame</w:t>
+      </w:r>
+      <w:proofErr w:type="spellEnd"/>
+      <w:r>
+        <w:t xml:space="preserve"> </w:t>
+      </w:r>
+      <w:proofErr w:type="spellStart"/>
+      <w:r>
+        <w:t>sau</w:t>
+      </w:r>
+      <w:proofErr w:type="spellEnd"/>
+      <w:r>
+        <w:t xml:space="preserve"> </w:t>
+      </w:r>
+      <w:proofErr w:type="spellStart"/>
+      <w:r>
+        <w:t>trafic</w:t>
+      </w:r>
+      <w:proofErr w:type="spellEnd"/>
+      <w:r>
+        <w:t xml:space="preserve"> organic). </w:t>
+      </w:r>
+      <w:proofErr w:type="spellStart"/>
+      <w:r>
+        <w:t>Dintre</w:t>
+      </w:r>
+      <w:proofErr w:type="spellEnd"/>
+      <w:r>
+        <w:t xml:space="preserve"> </w:t>
+      </w:r>
+      <w:proofErr w:type="spellStart"/>
+      <w:r>
+        <w:t>aceștia</w:t>
+      </w:r>
+      <w:proofErr w:type="spellEnd"/>
+      <w:r>
+        <w:t>:</w:t>
+      </w:r>
+    </w:p>
+    <w:p>
+      <w:pPr>
+        <w:numPr>
+          <w:ilvl w:val="0"/>
+          <w:numId w:val="24"/>
+        </w:numPr>
+      </w:pPr>
+      <w:proofErr w:type="spellStart"/>
+      <w:r>
+        <w:t>Toți</w:t>
+      </w:r>
+      <w:proofErr w:type="spellEnd"/>
+      <w:r>
+        <w:t xml:space="preserve"> 5.000 </w:t>
+      </w:r>
+      <w:proofErr w:type="spellStart"/>
+      <w:r>
+        <w:t>apasă</w:t>
+      </w:r>
+      <w:proofErr w:type="spellEnd"/>
+      <w:r>
+        <w:t xml:space="preserve"> „</w:t>
+      </w:r>
+      <w:proofErr w:type="spellStart"/>
+      <w:r>
+        <w:t>Generează</w:t>
+      </w:r>
+      <w:proofErr w:type="spellEnd"/>
+      <w:r>
+        <w:t xml:space="preserve">” (1 plan </w:t>
+      </w:r>
+      <w:proofErr w:type="spellStart"/>
+      <w:r>
+        <w:t>fiecare</w:t>
+      </w:r>
+      <w:proofErr w:type="spellEnd"/>
+      <w:r>
+        <w:t>) = </w:t>
+      </w:r>
+      <w:r>
+        <w:rPr>
+          <w:b/>
+          <w:bCs/>
+        </w:rPr>
+        <w:t>2.50$</w:t>
+      </w:r>
+      <w:r>
+        <w:t> cost la Google.</w:t>
+      </w:r>
+    </w:p>
+    <w:p>
+      <w:pPr>
+        <w:numPr>
+          <w:ilvl w:val="0"/>
+          <w:numId w:val="24"/>
+        </w:numPr>
+      </w:pPr>
+      <w:r>
+        <w:t xml:space="preserve">1.000 </w:t>
+      </w:r>
+      <w:proofErr w:type="spellStart"/>
+      <w:r>
+        <w:t>dintre</w:t>
+      </w:r>
+      <w:proofErr w:type="spellEnd"/>
+      <w:r>
+        <w:t xml:space="preserve"> </w:t>
+      </w:r>
+      <w:proofErr w:type="spellStart"/>
+      <w:r>
+        <w:t>ei</w:t>
+      </w:r>
+      <w:proofErr w:type="spellEnd"/>
+      <w:r>
+        <w:t xml:space="preserve"> se </w:t>
+      </w:r>
+      <w:proofErr w:type="spellStart"/>
+      <w:r>
+        <w:t>și</w:t>
+      </w:r>
+      <w:proofErr w:type="spellEnd"/>
+      <w:r>
+        <w:t xml:space="preserve"> </w:t>
+      </w:r>
+      <w:proofErr w:type="spellStart"/>
+      <w:r>
+        <w:t>joacă</w:t>
+      </w:r>
+      <w:proofErr w:type="spellEnd"/>
+      <w:r>
+        <w:t xml:space="preserve"> </w:t>
+      </w:r>
+      <w:proofErr w:type="spellStart"/>
+      <w:r>
+        <w:t>în</w:t>
+      </w:r>
+      <w:proofErr w:type="spellEnd"/>
+      <w:r>
+        <w:t xml:space="preserve"> Studio </w:t>
+      </w:r>
+      <w:proofErr w:type="spellStart"/>
+      <w:r>
+        <w:t>Editare</w:t>
+      </w:r>
+      <w:proofErr w:type="spellEnd"/>
+      <w:r>
+        <w:t xml:space="preserve">, </w:t>
+      </w:r>
+      <w:proofErr w:type="spellStart"/>
+      <w:r>
+        <w:t>dând</w:t>
+      </w:r>
+      <w:proofErr w:type="spellEnd"/>
+      <w:r>
+        <w:t xml:space="preserve"> </w:t>
+      </w:r>
+      <w:proofErr w:type="spellStart"/>
+      <w:r>
+        <w:t>fiecare</w:t>
+      </w:r>
+      <w:proofErr w:type="spellEnd"/>
+      <w:r>
+        <w:t xml:space="preserve"> </w:t>
+      </w:r>
+      <w:proofErr w:type="spellStart"/>
+      <w:r>
+        <w:t>câte</w:t>
+      </w:r>
+      <w:proofErr w:type="spellEnd"/>
+      <w:r>
+        <w:t xml:space="preserve"> 10 click-</w:t>
+      </w:r>
+      <w:proofErr w:type="spellStart"/>
+      <w:r>
+        <w:t>uri</w:t>
+      </w:r>
+      <w:proofErr w:type="spellEnd"/>
+      <w:r>
+        <w:t xml:space="preserve"> pe AI = </w:t>
+      </w:r>
+      <w:r>
+        <w:rPr>
+          <w:b/>
+          <w:bCs/>
+        </w:rPr>
+        <w:t>2.00$</w:t>
+      </w:r>
+      <w:r>
+        <w:t> cost la Google.</w:t>
+      </w:r>
+    </w:p>
+    <w:p>
+      <w:r>
+        <w:rPr>
+          <w:b/>
+          <w:bCs/>
+        </w:rPr>
+        <w:t xml:space="preserve">Factura ta </w:t>
+      </w:r>
+      <w:proofErr w:type="spellStart"/>
+      <w:r>
+        <w:rPr>
+          <w:b/>
+          <w:bCs/>
+        </w:rPr>
+        <w:t>totală</w:t>
+      </w:r>
+      <w:proofErr w:type="spellEnd"/>
+      <w:r>
+        <w:rPr>
+          <w:b/>
+          <w:bCs/>
+        </w:rPr>
+        <w:t xml:space="preserve"> de la Google la </w:t>
+      </w:r>
+      <w:proofErr w:type="spellStart"/>
+      <w:r>
+        <w:rPr>
+          <w:b/>
+          <w:bCs/>
+        </w:rPr>
+        <w:t>finalul</w:t>
+      </w:r>
+      <w:proofErr w:type="spellEnd"/>
+      <w:r>
+        <w:rPr>
+          <w:b/>
+          <w:bCs/>
+        </w:rPr>
+        <w:t xml:space="preserve"> </w:t>
+      </w:r>
+      <w:proofErr w:type="spellStart"/>
+      <w:r>
+        <w:rPr>
+          <w:b/>
+          <w:bCs/>
+        </w:rPr>
+        <w:t>lunii</w:t>
+      </w:r>
+      <w:proofErr w:type="spellEnd"/>
+      <w:r>
+        <w:rPr>
+          <w:b/>
+          <w:bCs/>
+        </w:rPr>
+        <w:t xml:space="preserve"> </w:t>
+      </w:r>
+      <w:proofErr w:type="spellStart"/>
+      <w:r>
+        <w:rPr>
+          <w:b/>
+          <w:bCs/>
+        </w:rPr>
+        <w:t>va</w:t>
+      </w:r>
+      <w:proofErr w:type="spellEnd"/>
+      <w:r>
+        <w:rPr>
+          <w:b/>
+          <w:bCs/>
+        </w:rPr>
+        <w:t xml:space="preserve"> </w:t>
+      </w:r>
+      <w:proofErr w:type="spellStart"/>
+      <w:r>
+        <w:rPr>
+          <w:b/>
+          <w:bCs/>
+        </w:rPr>
+        <w:t>fi</w:t>
+      </w:r>
+      <w:proofErr w:type="spellEnd"/>
+      <w:r>
+        <w:rPr>
+          <w:b/>
+          <w:bCs/>
+        </w:rPr>
+        <w:t xml:space="preserve"> de </w:t>
+      </w:r>
+      <w:proofErr w:type="spellStart"/>
+      <w:r>
+        <w:rPr>
+          <w:b/>
+          <w:bCs/>
+        </w:rPr>
+        <w:t>aproximativ</w:t>
+      </w:r>
+      <w:proofErr w:type="spellEnd"/>
+      <w:r>
+        <w:rPr>
+          <w:b/>
+          <w:bCs/>
+        </w:rPr>
+        <w:t xml:space="preserve"> 4.50$ (23 Lei) </w:t>
+      </w:r>
+      <w:proofErr w:type="spellStart"/>
+      <w:r>
+        <w:rPr>
+          <w:b/>
+          <w:bCs/>
+        </w:rPr>
+        <w:t>pentru</w:t>
+      </w:r>
+      <w:proofErr w:type="spellEnd"/>
+      <w:r>
+        <w:rPr>
+          <w:b/>
+          <w:bCs/>
+        </w:rPr>
+        <w:t xml:space="preserve"> 5.000 de </w:t>
+      </w:r>
+      <w:proofErr w:type="spellStart"/>
+      <w:r>
+        <w:rPr>
+          <w:b/>
+          <w:bCs/>
+        </w:rPr>
+        <w:t>oameni</w:t>
+      </w:r>
+      <w:proofErr w:type="spellEnd"/>
+      <w:r>
+        <w:rPr>
+          <w:b/>
+          <w:bCs/>
+        </w:rPr>
+        <w:t xml:space="preserve"> </w:t>
+      </w:r>
+      <w:proofErr w:type="spellStart"/>
+      <w:r>
+        <w:rPr>
+          <w:b/>
+          <w:bCs/>
+        </w:rPr>
+        <w:t>deserviți</w:t>
+      </w:r>
+      <w:proofErr w:type="spellEnd"/>
+      <w:r>
+        <w:rPr>
+          <w:b/>
+          <w:bCs/>
+        </w:rPr>
+        <w:t>.</w:t>
+      </w:r>
+    </w:p>
+    <w:p>
+      <w:proofErr w:type="spellStart"/>
+      <w:r>
+        <w:t>În</w:t>
+      </w:r>
+      <w:proofErr w:type="spellEnd"/>
+      <w:r>
+        <w:t xml:space="preserve"> </w:t>
+      </w:r>
+      <w:proofErr w:type="spellStart"/>
+      <w:r>
+        <w:t>același</w:t>
+      </w:r>
+      <w:proofErr w:type="spellEnd"/>
+      <w:r>
+        <w:t xml:space="preserve"> </w:t>
+      </w:r>
+      <w:proofErr w:type="spellStart"/>
+      <w:r>
+        <w:t>scenariu</w:t>
+      </w:r>
+      <w:proofErr w:type="spellEnd"/>
+      <w:r>
+        <w:t>:</w:t>
+      </w:r>
+    </w:p>
+    <w:p>
+      <w:pPr>
+        <w:numPr>
+          <w:ilvl w:val="0"/>
+          <w:numId w:val="25"/>
+        </w:numPr>
+      </w:pPr>
+      <w:proofErr w:type="spellStart"/>
+      <w:r>
+        <w:t>Acei</w:t>
+      </w:r>
+      <w:proofErr w:type="spellEnd"/>
+      <w:r>
+        <w:t xml:space="preserve"> 5.000 de </w:t>
+      </w:r>
+      <w:proofErr w:type="spellStart"/>
+      <w:r>
+        <w:t>vizitatori</w:t>
+      </w:r>
+      <w:proofErr w:type="spellEnd"/>
+      <w:r>
+        <w:t xml:space="preserve"> </w:t>
+      </w:r>
+      <w:proofErr w:type="spellStart"/>
+      <w:r>
+        <w:t>îți</w:t>
+      </w:r>
+      <w:proofErr w:type="spellEnd"/>
+      <w:r>
+        <w:t xml:space="preserve"> pot </w:t>
+      </w:r>
+      <w:proofErr w:type="spellStart"/>
+      <w:r>
+        <w:t>aduce</w:t>
+      </w:r>
+      <w:proofErr w:type="spellEnd"/>
+      <w:r>
+        <w:t xml:space="preserve"> </w:t>
+      </w:r>
+      <w:proofErr w:type="spellStart"/>
+      <w:r>
+        <w:t>lejer</w:t>
+      </w:r>
+      <w:proofErr w:type="spellEnd"/>
+      <w:r>
+        <w:t> </w:t>
+      </w:r>
+      <w:r>
+        <w:rPr>
+          <w:b/>
+          <w:bCs/>
+        </w:rPr>
+        <w:t>20</w:t>
+      </w:r>
+      <m:oMath>
+        <m:r>
+          <w:rPr>
+            <w:rFonts w:ascii="Cambria Math" w:hAnsi="Cambria Math"/>
+          </w:rPr>
+          <m:t>-30</m:t>
+        </m:r>
+      </m:oMath>
+      <w:r>
+        <w:t> doar din reclamele AdSense de pe pagină și din AdModal-ul de la descărcare.</w:t>
+      </w:r>
+    </w:p>
+    <w:p>
+      <w:pPr>
+        <w:numPr>
+          <w:ilvl w:val="0"/>
+          <w:numId w:val="25"/>
+        </w:numPr>
+      </w:pPr>
+      <w:r>
+        <w:t xml:space="preserve">Din </w:t>
+      </w:r>
+      <w:proofErr w:type="spellStart"/>
+      <w:r>
+        <w:t>cei</w:t>
+      </w:r>
+      <w:proofErr w:type="spellEnd"/>
+      <w:r>
+        <w:t xml:space="preserve"> 5.000, </w:t>
+      </w:r>
+      <w:proofErr w:type="spellStart"/>
+      <w:r>
+        <w:t>dacă</w:t>
+      </w:r>
+      <w:proofErr w:type="spellEnd"/>
+      <w:r>
+        <w:t xml:space="preserve"> </w:t>
+      </w:r>
+      <w:proofErr w:type="spellStart"/>
+      <w:r>
+        <w:t>doar</w:t>
+      </w:r>
+      <w:proofErr w:type="spellEnd"/>
+      <w:r>
+        <w:t> </w:t>
+      </w:r>
+      <w:r>
+        <w:rPr>
+          <w:b/>
+          <w:bCs/>
+        </w:rPr>
+        <w:t>1%</w:t>
+      </w:r>
+      <w:r>
+        <w:t> </w:t>
+      </w:r>
+      <w:proofErr w:type="spellStart"/>
+      <w:r>
+        <w:t>decid</w:t>
+      </w:r>
+      <w:proofErr w:type="spellEnd"/>
+      <w:r>
+        <w:t xml:space="preserve"> </w:t>
+      </w:r>
+      <w:proofErr w:type="spellStart"/>
+      <w:r>
+        <w:t>să</w:t>
+      </w:r>
+      <w:proofErr w:type="spellEnd"/>
+      <w:r>
+        <w:t xml:space="preserve"> </w:t>
+      </w:r>
+      <w:proofErr w:type="spellStart"/>
+      <w:r>
+        <w:t>își</w:t>
+      </w:r>
+      <w:proofErr w:type="spellEnd"/>
+      <w:r>
+        <w:t xml:space="preserve"> </w:t>
+      </w:r>
+      <w:proofErr w:type="spellStart"/>
+      <w:r>
+        <w:t>cumpere</w:t>
+      </w:r>
+      <w:proofErr w:type="spellEnd"/>
+      <w:r>
+        <w:t xml:space="preserve"> </w:t>
+      </w:r>
+      <w:proofErr w:type="spellStart"/>
+      <w:r>
+        <w:t>accesul</w:t>
+      </w:r>
+      <w:proofErr w:type="spellEnd"/>
+      <w:r>
+        <w:t xml:space="preserve"> "Premium" ca </w:t>
+      </w:r>
+      <w:proofErr w:type="spellStart"/>
+      <w:r>
+        <w:t>să</w:t>
+      </w:r>
+      <w:proofErr w:type="spellEnd"/>
+      <w:r>
+        <w:t xml:space="preserve"> </w:t>
+      </w:r>
+      <w:proofErr w:type="spellStart"/>
+      <w:r>
+        <w:t>deblocheze</w:t>
+      </w:r>
+      <w:proofErr w:type="spellEnd"/>
+      <w:r>
+        <w:t xml:space="preserve"> Studio </w:t>
+      </w:r>
+      <w:proofErr w:type="spellStart"/>
+      <w:r>
+        <w:t>Editare</w:t>
+      </w:r>
+      <w:proofErr w:type="spellEnd"/>
+      <w:r>
+        <w:t xml:space="preserve"> (50 de </w:t>
+      </w:r>
+      <w:proofErr w:type="spellStart"/>
+      <w:r>
+        <w:t>oameni</w:t>
+      </w:r>
+      <w:proofErr w:type="spellEnd"/>
+      <w:r>
+        <w:t xml:space="preserve"> x </w:t>
+      </w:r>
+      <w:proofErr w:type="spellStart"/>
+      <w:r>
+        <w:t>abonamentul</w:t>
+      </w:r>
+      <w:proofErr w:type="spellEnd"/>
+      <w:r>
+        <w:t xml:space="preserve"> </w:t>
+      </w:r>
+      <w:proofErr w:type="spellStart"/>
+      <w:r>
+        <w:t>tău</w:t>
+      </w:r>
+      <w:proofErr w:type="spellEnd"/>
+      <w:r>
+        <w:t xml:space="preserve">), </w:t>
+      </w:r>
+      <w:proofErr w:type="spellStart"/>
+      <w:r>
+        <w:t>asta</w:t>
+      </w:r>
+      <w:proofErr w:type="spellEnd"/>
+      <w:r>
+        <w:t xml:space="preserve"> </w:t>
+      </w:r>
+      <w:proofErr w:type="spellStart"/>
+      <w:r>
+        <w:t>înseamnă</w:t>
+      </w:r>
+      <w:proofErr w:type="spellEnd"/>
+      <w:r>
+        <w:t xml:space="preserve"> </w:t>
+      </w:r>
+      <w:proofErr w:type="spellStart"/>
+      <w:r>
+        <w:t>venituri</w:t>
+      </w:r>
+      <w:proofErr w:type="spellEnd"/>
+      <w:r>
+        <w:t xml:space="preserve"> </w:t>
+      </w:r>
+      <w:proofErr w:type="spellStart"/>
+      <w:r>
+        <w:t>substanțiale</w:t>
+      </w:r>
+      <w:proofErr w:type="spellEnd"/>
+      <w:r>
+        <w:t>.</w:t>
+      </w:r>
+    </w:p>
+    <w:p>
+      <w:proofErr w:type="spellStart"/>
+      <w:r>
+        <w:rPr>
+          <w:b/>
+          <w:bCs/>
+        </w:rPr>
+        <w:t>Concluzie</w:t>
+      </w:r>
+      <w:proofErr w:type="spellEnd"/>
+      <w:r>
+        <w:rPr>
+          <w:b/>
+          <w:bCs/>
+        </w:rPr>
+        <w:t>:</w:t>
+      </w:r>
+      <w:r>
+        <w:t> AI-ul de tip </w:t>
+      </w:r>
+      <w:r>
+        <w:rPr>
+          <w:i/>
+          <w:iCs/>
+        </w:rPr>
+        <w:t>Gemini Flash</w:t>
+      </w:r>
+      <w:r>
+        <w:t xml:space="preserve"> a spart </w:t>
+      </w:r>
+      <w:proofErr w:type="spellStart"/>
+      <w:r>
+        <w:t>piața</w:t>
+      </w:r>
+      <w:proofErr w:type="spellEnd"/>
+      <w:r>
+        <w:t xml:space="preserve"> </w:t>
+      </w:r>
+      <w:proofErr w:type="spellStart"/>
+      <w:r>
+        <w:t>prețurilor</w:t>
+      </w:r>
+      <w:proofErr w:type="spellEnd"/>
+      <w:r>
+        <w:t xml:space="preserve"> </w:t>
+      </w:r>
+      <w:proofErr w:type="spellStart"/>
+      <w:r>
+        <w:t>și</w:t>
+      </w:r>
+      <w:proofErr w:type="spellEnd"/>
+      <w:r>
+        <w:t xml:space="preserve"> </w:t>
+      </w:r>
+      <w:proofErr w:type="spellStart"/>
+      <w:r>
+        <w:t>este</w:t>
+      </w:r>
+      <w:proofErr w:type="spellEnd"/>
+      <w:r>
+        <w:t xml:space="preserve"> </w:t>
+      </w:r>
+      <w:proofErr w:type="spellStart"/>
+      <w:r>
+        <w:t>incredibil</w:t>
+      </w:r>
+      <w:proofErr w:type="spellEnd"/>
+      <w:r>
+        <w:t xml:space="preserve"> de </w:t>
+      </w:r>
+      <w:proofErr w:type="spellStart"/>
+      <w:r>
+        <w:t>ieftin</w:t>
+      </w:r>
+      <w:proofErr w:type="spellEnd"/>
+      <w:r>
+        <w:t xml:space="preserve">. </w:t>
+      </w:r>
+      <w:proofErr w:type="spellStart"/>
+      <w:r>
+        <w:t>Practic</w:t>
+      </w:r>
+      <w:proofErr w:type="spellEnd"/>
+      <w:r>
+        <w:t xml:space="preserve">, la </w:t>
+      </w:r>
+      <w:proofErr w:type="spellStart"/>
+      <w:r>
+        <w:t>orice</w:t>
+      </w:r>
+      <w:proofErr w:type="spellEnd"/>
+      <w:r>
+        <w:t xml:space="preserve"> </w:t>
+      </w:r>
+      <w:proofErr w:type="spellStart"/>
+      <w:r>
+        <w:t>scală</w:t>
+      </w:r>
+      <w:proofErr w:type="spellEnd"/>
+      <w:r>
+        <w:t xml:space="preserve"> ai </w:t>
+      </w:r>
+      <w:proofErr w:type="spellStart"/>
+      <w:r>
+        <w:t>ajunge</w:t>
+      </w:r>
+      <w:proofErr w:type="spellEnd"/>
+      <w:r>
+        <w:t xml:space="preserve">, </w:t>
+      </w:r>
+      <w:proofErr w:type="spellStart"/>
+      <w:r>
+        <w:t>reclamele</w:t>
+      </w:r>
+      <w:proofErr w:type="spellEnd"/>
+      <w:r>
+        <w:t xml:space="preserve"> </w:t>
+      </w:r>
+      <w:proofErr w:type="spellStart"/>
+      <w:r>
+        <w:t>și</w:t>
+      </w:r>
+      <w:proofErr w:type="spellEnd"/>
+      <w:r>
+        <w:t xml:space="preserve"> </w:t>
+      </w:r>
+      <w:proofErr w:type="spellStart"/>
+      <w:r>
+        <w:t>abonamentele</w:t>
+      </w:r>
+      <w:proofErr w:type="spellEnd"/>
+      <w:r>
+        <w:t xml:space="preserve"> </w:t>
+      </w:r>
+      <w:proofErr w:type="spellStart"/>
+      <w:r>
+        <w:t>îți</w:t>
+      </w:r>
+      <w:proofErr w:type="spellEnd"/>
+      <w:r>
+        <w:t xml:space="preserve"> </w:t>
+      </w:r>
+      <w:proofErr w:type="spellStart"/>
+      <w:r>
+        <w:t>vor</w:t>
+      </w:r>
+      <w:proofErr w:type="spellEnd"/>
+      <w:r>
+        <w:t xml:space="preserve"> </w:t>
+      </w:r>
+      <w:proofErr w:type="spellStart"/>
+      <w:r>
+        <w:t>acoperi</w:t>
+      </w:r>
+      <w:proofErr w:type="spellEnd"/>
+      <w:r>
+        <w:t xml:space="preserve"> </w:t>
+      </w:r>
+      <w:proofErr w:type="spellStart"/>
+      <w:r>
+        <w:t>cheltuielile</w:t>
+      </w:r>
+      <w:proofErr w:type="spellEnd"/>
+      <w:r>
+        <w:t xml:space="preserve"> cu </w:t>
+      </w:r>
+      <w:proofErr w:type="spellStart"/>
+      <w:r>
+        <w:t>serverul</w:t>
+      </w:r>
+      <w:proofErr w:type="spellEnd"/>
+      <w:r>
+        <w:t xml:space="preserve">/AI-ul de </w:t>
+      </w:r>
+      <w:proofErr w:type="spellStart"/>
+      <w:r>
+        <w:t>zeci</w:t>
+      </w:r>
+      <w:proofErr w:type="spellEnd"/>
+      <w:r>
+        <w:t xml:space="preserve"> </w:t>
+      </w:r>
+      <w:proofErr w:type="spellStart"/>
+      <w:r>
+        <w:t>sau</w:t>
+      </w:r>
+      <w:proofErr w:type="spellEnd"/>
+      <w:r>
+        <w:t xml:space="preserve"> </w:t>
+      </w:r>
+      <w:proofErr w:type="spellStart"/>
+      <w:r>
+        <w:t>sute</w:t>
+      </w:r>
+      <w:proofErr w:type="spellEnd"/>
+      <w:r>
+        <w:t xml:space="preserve"> de </w:t>
+      </w:r>
+      <w:proofErr w:type="spellStart"/>
+      <w:r>
+        <w:t>ori</w:t>
+      </w:r>
+      <w:proofErr w:type="spellEnd"/>
+      <w:r>
+        <w:t xml:space="preserve"> </w:t>
+      </w:r>
+      <w:proofErr w:type="spellStart"/>
+      <w:r>
+        <w:t>peste</w:t>
+      </w:r>
+      <w:proofErr w:type="spellEnd"/>
+      <w:r>
+        <w:t>.</w:t>
+      </w:r>
+    </w:p>
+    <w:p>
+      <w:proofErr w:type="spellStart"/>
+      <w:r>
+        <w:t>Poți</w:t>
+      </w:r>
+      <w:proofErr w:type="spellEnd"/>
+      <w:r>
+        <w:t xml:space="preserve"> </w:t>
+      </w:r>
+      <w:proofErr w:type="spellStart"/>
+      <w:r>
+        <w:t>testa</w:t>
+      </w:r>
+      <w:proofErr w:type="spellEnd"/>
+      <w:r>
+        <w:t xml:space="preserve"> </w:t>
+      </w:r>
+      <w:proofErr w:type="spellStart"/>
+      <w:r>
+        <w:t>liniștit</w:t>
+      </w:r>
+      <w:proofErr w:type="spellEnd"/>
+      <w:r>
+        <w:t xml:space="preserve"> </w:t>
+      </w:r>
+      <w:proofErr w:type="spellStart"/>
+      <w:r>
+        <w:t>aplicația</w:t>
+      </w:r>
+      <w:proofErr w:type="spellEnd"/>
+      <w:r>
+        <w:t xml:space="preserve"> </w:t>
+      </w:r>
+      <w:proofErr w:type="spellStart"/>
+      <w:r>
+        <w:t>acum</w:t>
+      </w:r>
+      <w:proofErr w:type="spellEnd"/>
+      <w:r>
+        <w:t xml:space="preserve"> </w:t>
+      </w:r>
+      <w:proofErr w:type="spellStart"/>
+      <w:r>
+        <w:t>în</w:t>
+      </w:r>
+      <w:proofErr w:type="spellEnd"/>
+      <w:r>
+        <w:t xml:space="preserve"> </w:t>
+      </w:r>
+      <w:proofErr w:type="spellStart"/>
+      <w:r>
+        <w:t>varianta</w:t>
+      </w:r>
+      <w:proofErr w:type="spellEnd"/>
+      <w:r>
+        <w:t xml:space="preserve"> Free Tier (am </w:t>
+      </w:r>
+      <w:proofErr w:type="spellStart"/>
+      <w:r>
+        <w:t>făcut</w:t>
+      </w:r>
+      <w:proofErr w:type="spellEnd"/>
+      <w:r>
+        <w:t xml:space="preserve"> downgrade-ul la loc </w:t>
+      </w:r>
+      <w:proofErr w:type="spellStart"/>
+      <w:r>
+        <w:t>și</w:t>
+      </w:r>
+      <w:proofErr w:type="spellEnd"/>
+      <w:r>
+        <w:t xml:space="preserve"> merge </w:t>
+      </w:r>
+      <w:proofErr w:type="spellStart"/>
+      <w:r>
+        <w:t>strună</w:t>
+      </w:r>
+      <w:proofErr w:type="spellEnd"/>
+      <w:r>
+        <w:t>)!</w:t>
+      </w:r>
+    </w:p>
     <w:p/>
     <w:sectPr>
       <w:pgSz w:w="12240" w:h="15840"/>
@@ -30592,6 +32779,453 @@
     </w:lvl>
   </w:abstractNum>
   <w:abstractNum w:abstractNumId="10" w15:restartNumberingAfterBreak="0">
+    <w:nsid w:val="291A0651"/>
+    <w:multiLevelType w:val="multilevel"/>
+    <w:tmpl w:val="25963AA0"/>
+    <w:lvl w:ilvl="0">
+      <w:start w:val="1"/>
+      <w:numFmt w:val="bullet"/>
+      <w:lvlText w:val=""/>
+      <w:lvlJc w:val="left"/>
+      <w:pPr>
+        <w:tabs>
+          <w:tab w:val="num" w:pos="720"/>
+        </w:tabs>
+        <w:ind w:left="720" w:hanging="360"/>
+      </w:pPr>
+      <w:rPr>
+        <w:rFonts w:ascii="Symbol" w:hAnsi="Symbol" w:hint="default"/>
+        <w:sz w:val="20"/>
+      </w:rPr>
+    </w:lvl>
+    <w:lvl w:ilvl="1" w:tentative="1">
+      <w:start w:val="1"/>
+      <w:numFmt w:val="bullet"/>
+      <w:lvlText w:val=""/>
+      <w:lvlJc w:val="left"/>
+      <w:pPr>
+        <w:tabs>
+          <w:tab w:val="num" w:pos="1440"/>
+        </w:tabs>
+        <w:ind w:left="1440" w:hanging="360"/>
+      </w:pPr>
+      <w:rPr>
+        <w:rFonts w:ascii="Symbol" w:hAnsi="Symbol" w:hint="default"/>
+        <w:sz w:val="20"/>
+      </w:rPr>
+    </w:lvl>
+    <w:lvl w:ilvl="2" w:tentative="1">
+      <w:start w:val="1"/>
+      <w:numFmt w:val="bullet"/>
+      <w:lvlText w:val=""/>
+      <w:lvlJc w:val="left"/>
+      <w:pPr>
+        <w:tabs>
+          <w:tab w:val="num" w:pos="2160"/>
+        </w:tabs>
+        <w:ind w:left="2160" w:hanging="360"/>
+      </w:pPr>
+      <w:rPr>
+        <w:rFonts w:ascii="Symbol" w:hAnsi="Symbol" w:hint="default"/>
+        <w:sz w:val="20"/>
+      </w:rPr>
+    </w:lvl>
+    <w:lvl w:ilvl="3" w:tentative="1">
+      <w:start w:val="1"/>
+      <w:numFmt w:val="bullet"/>
+      <w:lvlText w:val=""/>
+      <w:lvlJc w:val="left"/>
+      <w:pPr>
+        <w:tabs>
+          <w:tab w:val="num" w:pos="2880"/>
+        </w:tabs>
+        <w:ind w:left="2880" w:hanging="360"/>
+      </w:pPr>
+      <w:rPr>
+        <w:rFonts w:ascii="Symbol" w:hAnsi="Symbol" w:hint="default"/>
+        <w:sz w:val="20"/>
+      </w:rPr>
+    </w:lvl>
+    <w:lvl w:ilvl="4" w:tentative="1">
+      <w:start w:val="1"/>
+      <w:numFmt w:val="bullet"/>
+      <w:lvlText w:val=""/>
+      <w:lvlJc w:val="left"/>
+      <w:pPr>
+        <w:tabs>
+          <w:tab w:val="num" w:pos="3600"/>
+        </w:tabs>
+        <w:ind w:left="3600" w:hanging="360"/>
+      </w:pPr>
+      <w:rPr>
+        <w:rFonts w:ascii="Symbol" w:hAnsi="Symbol" w:hint="default"/>
+        <w:sz w:val="20"/>
+      </w:rPr>
+    </w:lvl>
+    <w:lvl w:ilvl="5" w:tentative="1">
+      <w:start w:val="1"/>
+      <w:numFmt w:val="bullet"/>
+      <w:lvlText w:val=""/>
+      <w:lvlJc w:val="left"/>
+      <w:pPr>
+        <w:tabs>
+          <w:tab w:val="num" w:pos="4320"/>
+        </w:tabs>
+        <w:ind w:left="4320" w:hanging="360"/>
+      </w:pPr>
+      <w:rPr>
+        <w:rFonts w:ascii="Symbol" w:hAnsi="Symbol" w:hint="default"/>
+        <w:sz w:val="20"/>
+      </w:rPr>
+    </w:lvl>
+    <w:lvl w:ilvl="6" w:tentative="1">
+      <w:start w:val="1"/>
+      <w:numFmt w:val="bullet"/>
+      <w:lvlText w:val=""/>
+      <w:lvlJc w:val="left"/>
+      <w:pPr>
+        <w:tabs>
+          <w:tab w:val="num" w:pos="5040"/>
+        </w:tabs>
+        <w:ind w:left="5040" w:hanging="360"/>
+      </w:pPr>
+      <w:rPr>
+        <w:rFonts w:ascii="Symbol" w:hAnsi="Symbol" w:hint="default"/>
+        <w:sz w:val="20"/>
+      </w:rPr>
+    </w:lvl>
+    <w:lvl w:ilvl="7" w:tentative="1">
+      <w:start w:val="1"/>
+      <w:numFmt w:val="bullet"/>
+      <w:lvlText w:val=""/>
+      <w:lvlJc w:val="left"/>
+      <w:pPr>
+        <w:tabs>
+          <w:tab w:val="num" w:pos="5760"/>
+        </w:tabs>
+        <w:ind w:left="5760" w:hanging="360"/>
+      </w:pPr>
+      <w:rPr>
+        <w:rFonts w:ascii="Symbol" w:hAnsi="Symbol" w:hint="default"/>
+        <w:sz w:val="20"/>
+      </w:rPr>
+    </w:lvl>
+    <w:lvl w:ilvl="8" w:tentative="1">
+      <w:start w:val="1"/>
+      <w:numFmt w:val="bullet"/>
+      <w:lvlText w:val=""/>
+      <w:lvlJc w:val="left"/>
+      <w:pPr>
+        <w:tabs>
+          <w:tab w:val="num" w:pos="6480"/>
+        </w:tabs>
+        <w:ind w:left="6480" w:hanging="360"/>
+      </w:pPr>
+      <w:rPr>
+        <w:rFonts w:ascii="Symbol" w:hAnsi="Symbol" w:hint="default"/>
+        <w:sz w:val="20"/>
+      </w:rPr>
+    </w:lvl>
+  </w:abstractNum>
+  <w:abstractNum w:abstractNumId="11" w15:restartNumberingAfterBreak="0">
+    <w:nsid w:val="299030FA"/>
+    <w:multiLevelType w:val="multilevel"/>
+    <w:tmpl w:val="3C5AC5A6"/>
+    <w:lvl w:ilvl="0">
+      <w:start w:val="1"/>
+      <w:numFmt w:val="bullet"/>
+      <w:lvlText w:val=""/>
+      <w:lvlJc w:val="left"/>
+      <w:pPr>
+        <w:tabs>
+          <w:tab w:val="num" w:pos="720"/>
+        </w:tabs>
+        <w:ind w:left="720" w:hanging="360"/>
+      </w:pPr>
+      <w:rPr>
+        <w:rFonts w:ascii="Symbol" w:hAnsi="Symbol" w:hint="default"/>
+        <w:sz w:val="20"/>
+      </w:rPr>
+    </w:lvl>
+    <w:lvl w:ilvl="1" w:tentative="1">
+      <w:start w:val="1"/>
+      <w:numFmt w:val="bullet"/>
+      <w:lvlText w:val=""/>
+      <w:lvlJc w:val="left"/>
+      <w:pPr>
+        <w:tabs>
+          <w:tab w:val="num" w:pos="1440"/>
+        </w:tabs>
+        <w:ind w:left="1440" w:hanging="360"/>
+      </w:pPr>
+      <w:rPr>
+        <w:rFonts w:ascii="Symbol" w:hAnsi="Symbol" w:hint="default"/>
+        <w:sz w:val="20"/>
+      </w:rPr>
+    </w:lvl>
+    <w:lvl w:ilvl="2" w:tentative="1">
+      <w:start w:val="1"/>
+      <w:numFmt w:val="bullet"/>
+      <w:lvlText w:val=""/>
+      <w:lvlJc w:val="left"/>
+      <w:pPr>
+        <w:tabs>
+          <w:tab w:val="num" w:pos="2160"/>
+        </w:tabs>
+        <w:ind w:left="2160" w:hanging="360"/>
+      </w:pPr>
+      <w:rPr>
+        <w:rFonts w:ascii="Symbol" w:hAnsi="Symbol" w:hint="default"/>
+        <w:sz w:val="20"/>
+      </w:rPr>
+    </w:lvl>
+    <w:lvl w:ilvl="3" w:tentative="1">
+      <w:start w:val="1"/>
+      <w:numFmt w:val="bullet"/>
+      <w:lvlText w:val=""/>
+      <w:lvlJc w:val="left"/>
+      <w:pPr>
+        <w:tabs>
+          <w:tab w:val="num" w:pos="2880"/>
+        </w:tabs>
+        <w:ind w:left="2880" w:hanging="360"/>
+      </w:pPr>
+      <w:rPr>
+        <w:rFonts w:ascii="Symbol" w:hAnsi="Symbol" w:hint="default"/>
+        <w:sz w:val="20"/>
+      </w:rPr>
+    </w:lvl>
+    <w:lvl w:ilvl="4" w:tentative="1">
+      <w:start w:val="1"/>
+      <w:numFmt w:val="bullet"/>
+      <w:lvlText w:val=""/>
+      <w:lvlJc w:val="left"/>
+      <w:pPr>
+        <w:tabs>
+          <w:tab w:val="num" w:pos="3600"/>
+        </w:tabs>
+        <w:ind w:left="3600" w:hanging="360"/>
+      </w:pPr>
+      <w:rPr>
+        <w:rFonts w:ascii="Symbol" w:hAnsi="Symbol" w:hint="default"/>
+        <w:sz w:val="20"/>
+      </w:rPr>
+    </w:lvl>
+    <w:lvl w:ilvl="5" w:tentative="1">
+      <w:start w:val="1"/>
+      <w:numFmt w:val="bullet"/>
+      <w:lvlText w:val=""/>
+      <w:lvlJc w:val="left"/>
+      <w:pPr>
+        <w:tabs>
+          <w:tab w:val="num" w:pos="4320"/>
+        </w:tabs>
+        <w:ind w:left="4320" w:hanging="360"/>
+      </w:pPr>
+      <w:rPr>
+        <w:rFonts w:ascii="Symbol" w:hAnsi="Symbol" w:hint="default"/>
+        <w:sz w:val="20"/>
+      </w:rPr>
+    </w:lvl>
+    <w:lvl w:ilvl="6" w:tentative="1">
+      <w:start w:val="1"/>
+      <w:numFmt w:val="bullet"/>
+      <w:lvlText w:val=""/>
+      <w:lvlJc w:val="left"/>
+      <w:pPr>
+        <w:tabs>
+          <w:tab w:val="num" w:pos="5040"/>
+        </w:tabs>
+        <w:ind w:left="5040" w:hanging="360"/>
+      </w:pPr>
+      <w:rPr>
+        <w:rFonts w:ascii="Symbol" w:hAnsi="Symbol" w:hint="default"/>
+        <w:sz w:val="20"/>
+      </w:rPr>
+    </w:lvl>
+    <w:lvl w:ilvl="7" w:tentative="1">
+      <w:start w:val="1"/>
+      <w:numFmt w:val="bullet"/>
+      <w:lvlText w:val=""/>
+      <w:lvlJc w:val="left"/>
+      <w:pPr>
+        <w:tabs>
+          <w:tab w:val="num" w:pos="5760"/>
+        </w:tabs>
+        <w:ind w:left="5760" w:hanging="360"/>
+      </w:pPr>
+      <w:rPr>
+        <w:rFonts w:ascii="Symbol" w:hAnsi="Symbol" w:hint="default"/>
+        <w:sz w:val="20"/>
+      </w:rPr>
+    </w:lvl>
+    <w:lvl w:ilvl="8" w:tentative="1">
+      <w:start w:val="1"/>
+      <w:numFmt w:val="bullet"/>
+      <w:lvlText w:val=""/>
+      <w:lvlJc w:val="left"/>
+      <w:pPr>
+        <w:tabs>
+          <w:tab w:val="num" w:pos="6480"/>
+        </w:tabs>
+        <w:ind w:left="6480" w:hanging="360"/>
+      </w:pPr>
+      <w:rPr>
+        <w:rFonts w:ascii="Symbol" w:hAnsi="Symbol" w:hint="default"/>
+        <w:sz w:val="20"/>
+      </w:rPr>
+    </w:lvl>
+  </w:abstractNum>
+  <w:abstractNum w:abstractNumId="12" w15:restartNumberingAfterBreak="0">
+    <w:nsid w:val="2D7A5B91"/>
+    <w:multiLevelType w:val="multilevel"/>
+    <w:tmpl w:val="05B07716"/>
+    <w:lvl w:ilvl="0">
+      <w:start w:val="1"/>
+      <w:numFmt w:val="bullet"/>
+      <w:lvlText w:val=""/>
+      <w:lvlJc w:val="left"/>
+      <w:pPr>
+        <w:tabs>
+          <w:tab w:val="num" w:pos="720"/>
+        </w:tabs>
+        <w:ind w:left="720" w:hanging="360"/>
+      </w:pPr>
+      <w:rPr>
+        <w:rFonts w:ascii="Symbol" w:hAnsi="Symbol" w:hint="default"/>
+        <w:sz w:val="20"/>
+      </w:rPr>
+    </w:lvl>
+    <w:lvl w:ilvl="1" w:tentative="1">
+      <w:start w:val="1"/>
+      <w:numFmt w:val="bullet"/>
+      <w:lvlText w:val=""/>
+      <w:lvlJc w:val="left"/>
+      <w:pPr>
+        <w:tabs>
+          <w:tab w:val="num" w:pos="1440"/>
+        </w:tabs>
+        <w:ind w:left="1440" w:hanging="360"/>
+      </w:pPr>
+      <w:rPr>
+        <w:rFonts w:ascii="Symbol" w:hAnsi="Symbol" w:hint="default"/>
+        <w:sz w:val="20"/>
+      </w:rPr>
+    </w:lvl>
+    <w:lvl w:ilvl="2" w:tentative="1">
+      <w:start w:val="1"/>
+      <w:numFmt w:val="bullet"/>
+      <w:lvlText w:val=""/>
+      <w:lvlJc w:val="left"/>
+      <w:pPr>
+        <w:tabs>
+          <w:tab w:val="num" w:pos="2160"/>
+        </w:tabs>
+        <w:ind w:left="2160" w:hanging="360"/>
+      </w:pPr>
+      <w:rPr>
+        <w:rFonts w:ascii="Symbol" w:hAnsi="Symbol" w:hint="default"/>
+        <w:sz w:val="20"/>
+      </w:rPr>
+    </w:lvl>
+    <w:lvl w:ilvl="3" w:tentative="1">
+      <w:start w:val="1"/>
+      <w:numFmt w:val="bullet"/>
+      <w:lvlText w:val=""/>
+      <w:lvlJc w:val="left"/>
+      <w:pPr>
+        <w:tabs>
+          <w:tab w:val="num" w:pos="2880"/>
+        </w:tabs>
+        <w:ind w:left="2880" w:hanging="360"/>
+      </w:pPr>
+      <w:rPr>
+        <w:rFonts w:ascii="Symbol" w:hAnsi="Symbol" w:hint="default"/>
+        <w:sz w:val="20"/>
+      </w:rPr>
+    </w:lvl>
+    <w:lvl w:ilvl="4" w:tentative="1">
+      <w:start w:val="1"/>
+      <w:numFmt w:val="bullet"/>
+      <w:lvlText w:val=""/>
+      <w:lvlJc w:val="left"/>
+      <w:pPr>
+        <w:tabs>
+          <w:tab w:val="num" w:pos="3600"/>
+        </w:tabs>
+        <w:ind w:left="3600" w:hanging="360"/>
+      </w:pPr>
+      <w:rPr>
+        <w:rFonts w:ascii="Symbol" w:hAnsi="Symbol" w:hint="default"/>
+        <w:sz w:val="20"/>
+      </w:rPr>
+    </w:lvl>
+    <w:lvl w:ilvl="5" w:tentative="1">
+      <w:start w:val="1"/>
+      <w:numFmt w:val="bullet"/>
+      <w:lvlText w:val=""/>
+      <w:lvlJc w:val="left"/>
+      <w:pPr>
+        <w:tabs>
+          <w:tab w:val="num" w:pos="4320"/>
+        </w:tabs>
+        <w:ind w:left="4320" w:hanging="360"/>
+      </w:pPr>
+      <w:rPr>
+        <w:rFonts w:ascii="Symbol" w:hAnsi="Symbol" w:hint="default"/>
+        <w:sz w:val="20"/>
+      </w:rPr>
+    </w:lvl>
+    <w:lvl w:ilvl="6" w:tentative="1">
+      <w:start w:val="1"/>
+      <w:numFmt w:val="bullet"/>
+      <w:lvlText w:val=""/>
+      <w:lvlJc w:val="left"/>
+      <w:pPr>
+        <w:tabs>
+          <w:tab w:val="num" w:pos="5040"/>
+        </w:tabs>
+        <w:ind w:left="5040" w:hanging="360"/>
+      </w:pPr>
+      <w:rPr>
+        <w:rFonts w:ascii="Symbol" w:hAnsi="Symbol" w:hint="default"/>
+        <w:sz w:val="20"/>
+      </w:rPr>
+    </w:lvl>
+    <w:lvl w:ilvl="7" w:tentative="1">
+      <w:start w:val="1"/>
+      <w:numFmt w:val="bullet"/>
+      <w:lvlText w:val=""/>
+      <w:lvlJc w:val="left"/>
+      <w:pPr>
+        <w:tabs>
+          <w:tab w:val="num" w:pos="5760"/>
+        </w:tabs>
+        <w:ind w:left="5760" w:hanging="360"/>
+      </w:pPr>
+      <w:rPr>
+        <w:rFonts w:ascii="Symbol" w:hAnsi="Symbol" w:hint="default"/>
+        <w:sz w:val="20"/>
+      </w:rPr>
+    </w:lvl>
+    <w:lvl w:ilvl="8" w:tentative="1">
+      <w:start w:val="1"/>
+      <w:numFmt w:val="bullet"/>
+      <w:lvlText w:val=""/>
+      <w:lvlJc w:val="left"/>
+      <w:pPr>
+        <w:tabs>
+          <w:tab w:val="num" w:pos="6480"/>
+        </w:tabs>
+        <w:ind w:left="6480" w:hanging="360"/>
+      </w:pPr>
+      <w:rPr>
+        <w:rFonts w:ascii="Symbol" w:hAnsi="Symbol" w:hint="default"/>
+        <w:sz w:val="20"/>
+      </w:rPr>
+    </w:lvl>
+  </w:abstractNum>
+  <w:abstractNum w:abstractNumId="13" w15:restartNumberingAfterBreak="0">
     <w:nsid w:val="2F174067"/>
     <w:multiLevelType w:val="multilevel"/>
     <w:tmpl w:val="FCB43A24"/>
@@ -30740,7 +33374,7 @@
       </w:rPr>
     </w:lvl>
   </w:abstractNum>
-  <w:abstractNum w:abstractNumId="11" w15:restartNumberingAfterBreak="0">
+  <w:abstractNum w:abstractNumId="14" w15:restartNumberingAfterBreak="0">
     <w:nsid w:val="35924F00"/>
     <w:multiLevelType w:val="multilevel"/>
     <w:tmpl w:val="E5BAC4B6"/>
@@ -30853,7 +33487,7 @@
       </w:pPr>
     </w:lvl>
   </w:abstractNum>
-  <w:abstractNum w:abstractNumId="12" w15:restartNumberingAfterBreak="0">
+  <w:abstractNum w:abstractNumId="15" w15:restartNumberingAfterBreak="0">
     <w:nsid w:val="3AAD4C3D"/>
     <w:multiLevelType w:val="multilevel"/>
     <w:tmpl w:val="F476E44C"/>
@@ -31002,7 +33636,7 @@
       </w:rPr>
     </w:lvl>
   </w:abstractNum>
-  <w:abstractNum w:abstractNumId="13" w15:restartNumberingAfterBreak="0">
+  <w:abstractNum w:abstractNumId="16" w15:restartNumberingAfterBreak="0">
     <w:nsid w:val="3B5C786A"/>
     <w:multiLevelType w:val="multilevel"/>
     <w:tmpl w:val="75F6EFDE"/>
@@ -31115,7 +33749,156 @@
       </w:pPr>
     </w:lvl>
   </w:abstractNum>
-  <w:abstractNum w:abstractNumId="14" w15:restartNumberingAfterBreak="0">
+  <w:abstractNum w:abstractNumId="17" w15:restartNumberingAfterBreak="0">
+    <w:nsid w:val="44FB14B2"/>
+    <w:multiLevelType w:val="multilevel"/>
+    <w:tmpl w:val="4FC0FA84"/>
+    <w:lvl w:ilvl="0">
+      <w:start w:val="1"/>
+      <w:numFmt w:val="bullet"/>
+      <w:lvlText w:val=""/>
+      <w:lvlJc w:val="left"/>
+      <w:pPr>
+        <w:tabs>
+          <w:tab w:val="num" w:pos="720"/>
+        </w:tabs>
+        <w:ind w:left="720" w:hanging="360"/>
+      </w:pPr>
+      <w:rPr>
+        <w:rFonts w:ascii="Symbol" w:hAnsi="Symbol" w:hint="default"/>
+        <w:sz w:val="20"/>
+      </w:rPr>
+    </w:lvl>
+    <w:lvl w:ilvl="1" w:tentative="1">
+      <w:start w:val="1"/>
+      <w:numFmt w:val="bullet"/>
+      <w:lvlText w:val=""/>
+      <w:lvlJc w:val="left"/>
+      <w:pPr>
+        <w:tabs>
+          <w:tab w:val="num" w:pos="1440"/>
+        </w:tabs>
+        <w:ind w:left="1440" w:hanging="360"/>
+      </w:pPr>
+      <w:rPr>
+        <w:rFonts w:ascii="Symbol" w:hAnsi="Symbol" w:hint="default"/>
+        <w:sz w:val="20"/>
+      </w:rPr>
+    </w:lvl>
+    <w:lvl w:ilvl="2" w:tentative="1">
+      <w:start w:val="1"/>
+      <w:numFmt w:val="bullet"/>
+      <w:lvlText w:val=""/>
+      <w:lvlJc w:val="left"/>
+      <w:pPr>
+        <w:tabs>
+          <w:tab w:val="num" w:pos="2160"/>
+        </w:tabs>
+        <w:ind w:left="2160" w:hanging="360"/>
+      </w:pPr>
+      <w:rPr>
+        <w:rFonts w:ascii="Symbol" w:hAnsi="Symbol" w:hint="default"/>
+        <w:sz w:val="20"/>
+      </w:rPr>
+    </w:lvl>
+    <w:lvl w:ilvl="3" w:tentative="1">
+      <w:start w:val="1"/>
+      <w:numFmt w:val="bullet"/>
+      <w:lvlText w:val=""/>
+      <w:lvlJc w:val="left"/>
+      <w:pPr>
+        <w:tabs>
+          <w:tab w:val="num" w:pos="2880"/>
+        </w:tabs>
+        <w:ind w:left="2880" w:hanging="360"/>
+      </w:pPr>
+      <w:rPr>
+        <w:rFonts w:ascii="Symbol" w:hAnsi="Symbol" w:hint="default"/>
+        <w:sz w:val="20"/>
+      </w:rPr>
+    </w:lvl>
+    <w:lvl w:ilvl="4" w:tentative="1">
+      <w:start w:val="1"/>
+      <w:numFmt w:val="bullet"/>
+      <w:lvlText w:val=""/>
+      <w:lvlJc w:val="left"/>
+      <w:pPr>
+        <w:tabs>
+          <w:tab w:val="num" w:pos="3600"/>
+        </w:tabs>
+        <w:ind w:left="3600" w:hanging="360"/>
+      </w:pPr>
+      <w:rPr>
+        <w:rFonts w:ascii="Symbol" w:hAnsi="Symbol" w:hint="default"/>
+        <w:sz w:val="20"/>
+      </w:rPr>
+    </w:lvl>
+    <w:lvl w:ilvl="5" w:tentative="1">
+      <w:start w:val="1"/>
+      <w:numFmt w:val="bullet"/>
+      <w:lvlText w:val=""/>
+      <w:lvlJc w:val="left"/>
+      <w:pPr>
+        <w:tabs>
+          <w:tab w:val="num" w:pos="4320"/>
+        </w:tabs>
+        <w:ind w:left="4320" w:hanging="360"/>
+      </w:pPr>
+      <w:rPr>
+        <w:rFonts w:ascii="Symbol" w:hAnsi="Symbol" w:hint="default"/>
+        <w:sz w:val="20"/>
+      </w:rPr>
+    </w:lvl>
+    <w:lvl w:ilvl="6" w:tentative="1">
+      <w:start w:val="1"/>
+      <w:numFmt w:val="bullet"/>
+      <w:lvlText w:val=""/>
+      <w:lvlJc w:val="left"/>
+      <w:pPr>
+        <w:tabs>
+          <w:tab w:val="num" w:pos="5040"/>
+        </w:tabs>
+        <w:ind w:left="5040" w:hanging="360"/>
+      </w:pPr>
+      <w:rPr>
+        <w:rFonts w:ascii="Symbol" w:hAnsi="Symbol" w:hint="default"/>
+        <w:sz w:val="20"/>
+      </w:rPr>
+    </w:lvl>
+    <w:lvl w:ilvl="7" w:tentative="1">
+      <w:start w:val="1"/>
+      <w:numFmt w:val="bullet"/>
+      <w:lvlText w:val=""/>
+      <w:lvlJc w:val="left"/>
+      <w:pPr>
+        <w:tabs>
+          <w:tab w:val="num" w:pos="5760"/>
+        </w:tabs>
+        <w:ind w:left="5760" w:hanging="360"/>
+      </w:pPr>
+      <w:rPr>
+        <w:rFonts w:ascii="Symbol" w:hAnsi="Symbol" w:hint="default"/>
+        <w:sz w:val="20"/>
+      </w:rPr>
+    </w:lvl>
+    <w:lvl w:ilvl="8" w:tentative="1">
+      <w:start w:val="1"/>
+      <w:numFmt w:val="bullet"/>
+      <w:lvlText w:val=""/>
+      <w:lvlJc w:val="left"/>
+      <w:pPr>
+        <w:tabs>
+          <w:tab w:val="num" w:pos="6480"/>
+        </w:tabs>
+        <w:ind w:left="6480" w:hanging="360"/>
+      </w:pPr>
+      <w:rPr>
+        <w:rFonts w:ascii="Symbol" w:hAnsi="Symbol" w:hint="default"/>
+        <w:sz w:val="20"/>
+      </w:rPr>
+    </w:lvl>
+  </w:abstractNum>
+  <w:abstractNum w:abstractNumId="18" w15:restartNumberingAfterBreak="0">
     <w:nsid w:val="4E5D1923"/>
     <w:multiLevelType w:val="multilevel"/>
     <w:tmpl w:val="0B564374"/>
@@ -31228,7 +34011,7 @@
       </w:pPr>
     </w:lvl>
   </w:abstractNum>
-  <w:abstractNum w:abstractNumId="15" w15:restartNumberingAfterBreak="0">
+  <w:abstractNum w:abstractNumId="19" w15:restartNumberingAfterBreak="0">
     <w:nsid w:val="5103190A"/>
     <w:multiLevelType w:val="multilevel"/>
     <w:tmpl w:val="A8A09D9E"/>
@@ -31377,7 +34160,7 @@
       </w:rPr>
     </w:lvl>
   </w:abstractNum>
-  <w:abstractNum w:abstractNumId="16" w15:restartNumberingAfterBreak="0">
+  <w:abstractNum w:abstractNumId="20" w15:restartNumberingAfterBreak="0">
     <w:nsid w:val="5D99058F"/>
     <w:multiLevelType w:val="multilevel"/>
     <w:tmpl w:val="D1EE39A2"/>
@@ -31490,7 +34273,7 @@
       </w:pPr>
     </w:lvl>
   </w:abstractNum>
-  <w:abstractNum w:abstractNumId="17" w15:restartNumberingAfterBreak="0">
+  <w:abstractNum w:abstractNumId="21" w15:restartNumberingAfterBreak="0">
     <w:nsid w:val="60612AEF"/>
     <w:multiLevelType w:val="multilevel"/>
     <w:tmpl w:val="86BC5D0C"/>
@@ -31607,7 +34390,7 @@
       </w:pPr>
     </w:lvl>
   </w:abstractNum>
-  <w:abstractNum w:abstractNumId="18" w15:restartNumberingAfterBreak="0">
+  <w:abstractNum w:abstractNumId="22" w15:restartNumberingAfterBreak="0">
     <w:nsid w:val="606134DD"/>
     <w:multiLevelType w:val="multilevel"/>
     <w:tmpl w:val="93AC924C"/>
@@ -31720,7 +34503,7 @@
       </w:pPr>
     </w:lvl>
   </w:abstractNum>
-  <w:abstractNum w:abstractNumId="19" w15:restartNumberingAfterBreak="0">
+  <w:abstractNum w:abstractNumId="23" w15:restartNumberingAfterBreak="0">
     <w:nsid w:val="69244E7A"/>
     <w:multiLevelType w:val="multilevel"/>
     <w:tmpl w:val="D820DD34"/>
@@ -31869,7 +34652,7 @@
       </w:rPr>
     </w:lvl>
   </w:abstractNum>
-  <w:abstractNum w:abstractNumId="20" w15:restartNumberingAfterBreak="0">
+  <w:abstractNum w:abstractNumId="24" w15:restartNumberingAfterBreak="0">
     <w:nsid w:val="78966E5B"/>
     <w:multiLevelType w:val="multilevel"/>
     <w:tmpl w:val="ED36EF66"/>
@@ -31983,7 +34766,7 @@
     </w:lvl>
   </w:abstractNum>
   <w:num w:numId="1" w16cid:durableId="430977924">
-    <w:abstractNumId w:val="15"/>
+    <w:abstractNumId w:val="19"/>
   </w:num>
   <w:num w:numId="2" w16cid:durableId="786898390">
     <w:abstractNumId w:val="2"/>
@@ -31995,22 +34778,22 @@
     <w:abstractNumId w:val="1"/>
   </w:num>
   <w:num w:numId="5" w16cid:durableId="1155026178">
-    <w:abstractNumId w:val="16"/>
+    <w:abstractNumId w:val="20"/>
   </w:num>
   <w:num w:numId="6" w16cid:durableId="1097562786">
     <w:abstractNumId w:val="3"/>
   </w:num>
   <w:num w:numId="7" w16cid:durableId="1915428224">
-    <w:abstractNumId w:val="10"/>
+    <w:abstractNumId w:val="13"/>
   </w:num>
   <w:num w:numId="8" w16cid:durableId="1189416595">
-    <w:abstractNumId w:val="19"/>
+    <w:abstractNumId w:val="23"/>
   </w:num>
   <w:num w:numId="9" w16cid:durableId="186061792">
-    <w:abstractNumId w:val="14"/>
+    <w:abstractNumId w:val="18"/>
   </w:num>
   <w:num w:numId="10" w16cid:durableId="1390491691">
-    <w:abstractNumId w:val="13"/>
+    <w:abstractNumId w:val="16"/>
   </w:num>
   <w:num w:numId="11" w16cid:durableId="1642420085">
     <w:abstractNumId w:val="4"/>
@@ -32019,13 +34802,13 @@
     <w:abstractNumId w:val="6"/>
   </w:num>
   <w:num w:numId="13" w16cid:durableId="1840264699">
-    <w:abstractNumId w:val="12"/>
+    <w:abstractNumId w:val="15"/>
   </w:num>
   <w:num w:numId="14" w16cid:durableId="294529380">
-    <w:abstractNumId w:val="11"/>
+    <w:abstractNumId w:val="14"/>
   </w:num>
   <w:num w:numId="15" w16cid:durableId="339436240">
-    <w:abstractNumId w:val="17"/>
+    <w:abstractNumId w:val="21"/>
   </w:num>
   <w:num w:numId="16" w16cid:durableId="1705130765">
     <w:abstractNumId w:val="0"/>
@@ -32037,13 +34820,25 @@
     <w:abstractNumId w:val="8"/>
   </w:num>
   <w:num w:numId="19" w16cid:durableId="1924800153">
-    <w:abstractNumId w:val="20"/>
+    <w:abstractNumId w:val="24"/>
   </w:num>
   <w:num w:numId="20" w16cid:durableId="1696881846">
     <w:abstractNumId w:val="7"/>
   </w:num>
   <w:num w:numId="21" w16cid:durableId="125709612">
-    <w:abstractNumId w:val="18"/>
+    <w:abstractNumId w:val="22"/>
+  </w:num>
+  <w:num w:numId="22" w16cid:durableId="965240863">
+    <w:abstractNumId w:val="10"/>
+  </w:num>
+  <w:num w:numId="23" w16cid:durableId="457257707">
+    <w:abstractNumId w:val="17"/>
+  </w:num>
+  <w:num w:numId="24" w16cid:durableId="212891469">
+    <w:abstractNumId w:val="12"/>
+  </w:num>
+  <w:num w:numId="25" w16cid:durableId="274800069">
+    <w:abstractNumId w:val="11"/>
   </w:num>
 </w:numbering>
 </file>

</xml_diff>

<commit_message>
UX: Fix scroll trigger logic and route start logic
</commit_message>
<xml_diff>
--- a/google_adsens.docx
+++ b/google_adsens.docx
@@ -40001,6 +40001,2193 @@
           <w:rFonts w:ascii="Segoe UI Emoji" w:hAnsi="Segoe UI Emoji" w:cs="Segoe UI Emoji"/>
         </w:rPr>
         <w:t>😊</w:t>
+      </w:r>
+    </w:p>
+    <w:p/>
+    <w:p>
+      <w:r>
+        <w:rPr>
+          <w:b/>
+          <w:bCs/>
+        </w:rPr>
+        <w:t xml:space="preserve">Hai </w:t>
+      </w:r>
+      <w:proofErr w:type="spellStart"/>
+      <w:r>
+        <w:rPr>
+          <w:b/>
+          <w:bCs/>
+        </w:rPr>
+        <w:t>să</w:t>
+      </w:r>
+      <w:proofErr w:type="spellEnd"/>
+      <w:r>
+        <w:rPr>
+          <w:b/>
+          <w:bCs/>
+        </w:rPr>
+        <w:t xml:space="preserve"> </w:t>
+      </w:r>
+      <w:proofErr w:type="spellStart"/>
+      <w:r>
+        <w:rPr>
+          <w:b/>
+          <w:bCs/>
+        </w:rPr>
+        <w:t>facem</w:t>
+      </w:r>
+      <w:proofErr w:type="spellEnd"/>
+      <w:r>
+        <w:rPr>
+          <w:b/>
+          <w:bCs/>
+        </w:rPr>
+        <w:t xml:space="preserve"> o </w:t>
+      </w:r>
+      <w:proofErr w:type="spellStart"/>
+      <w:r>
+        <w:rPr>
+          <w:b/>
+          <w:bCs/>
+        </w:rPr>
+        <w:t>recapitulare</w:t>
+      </w:r>
+      <w:proofErr w:type="spellEnd"/>
+      <w:r>
+        <w:rPr>
+          <w:b/>
+          <w:bCs/>
+        </w:rPr>
+        <w:t xml:space="preserve"> a </w:t>
+      </w:r>
+      <w:proofErr w:type="spellStart"/>
+      <w:r>
+        <w:rPr>
+          <w:b/>
+          <w:bCs/>
+        </w:rPr>
+        <w:t>întregului</w:t>
+      </w:r>
+      <w:proofErr w:type="spellEnd"/>
+      <w:r>
+        <w:rPr>
+          <w:b/>
+          <w:bCs/>
+        </w:rPr>
+        <w:t xml:space="preserve"> </w:t>
+      </w:r>
+      <w:proofErr w:type="spellStart"/>
+      <w:r>
+        <w:rPr>
+          <w:b/>
+          <w:bCs/>
+        </w:rPr>
+        <w:t>traseu</w:t>
+      </w:r>
+      <w:proofErr w:type="spellEnd"/>
+      <w:r>
+        <w:rPr>
+          <w:b/>
+          <w:bCs/>
+        </w:rPr>
+        <w:t xml:space="preserve"> (</w:t>
+      </w:r>
+      <w:proofErr w:type="spellStart"/>
+      <w:r>
+        <w:rPr>
+          <w:b/>
+          <w:bCs/>
+        </w:rPr>
+        <w:t>Pâlnia</w:t>
+      </w:r>
+      <w:proofErr w:type="spellEnd"/>
+      <w:r>
+        <w:rPr>
+          <w:b/>
+          <w:bCs/>
+        </w:rPr>
+        <w:t xml:space="preserve"> de </w:t>
+      </w:r>
+      <w:proofErr w:type="spellStart"/>
+      <w:r>
+        <w:rPr>
+          <w:b/>
+          <w:bCs/>
+        </w:rPr>
+        <w:t>Vânzare</w:t>
+      </w:r>
+      <w:proofErr w:type="spellEnd"/>
+      <w:r>
+        <w:rPr>
+          <w:b/>
+          <w:bCs/>
+        </w:rPr>
+        <w:t xml:space="preserve">) pe care l-am </w:t>
+      </w:r>
+      <w:proofErr w:type="spellStart"/>
+      <w:r>
+        <w:rPr>
+          <w:b/>
+          <w:bCs/>
+        </w:rPr>
+        <w:t>construit</w:t>
+      </w:r>
+      <w:proofErr w:type="spellEnd"/>
+      <w:r>
+        <w:rPr>
+          <w:b/>
+          <w:bCs/>
+        </w:rPr>
+        <w:t xml:space="preserve"> </w:t>
+      </w:r>
+      <w:proofErr w:type="spellStart"/>
+      <w:r>
+        <w:rPr>
+          <w:b/>
+          <w:bCs/>
+        </w:rPr>
+        <w:t>pentru</w:t>
+      </w:r>
+      <w:proofErr w:type="spellEnd"/>
+      <w:r>
+        <w:rPr>
+          <w:b/>
+          <w:bCs/>
+        </w:rPr>
+        <w:t xml:space="preserve"> </w:t>
+      </w:r>
+      <w:proofErr w:type="gramStart"/>
+      <w:r>
+        <w:rPr>
+          <w:b/>
+          <w:bCs/>
+        </w:rPr>
+        <w:t>un Client</w:t>
+      </w:r>
+      <w:proofErr w:type="gramEnd"/>
+      <w:r>
+        <w:rPr>
+          <w:b/>
+          <w:bCs/>
+        </w:rPr>
+        <w:t xml:space="preserve"> nou (Demo):</w:t>
+      </w:r>
+    </w:p>
+    <w:p>
+      <w:r>
+        <w:rPr>
+          <w:b/>
+          <w:bCs/>
+        </w:rPr>
+        <w:t xml:space="preserve">Pasul 1: </w:t>
+      </w:r>
+      <w:proofErr w:type="spellStart"/>
+      <w:r>
+        <w:rPr>
+          <w:b/>
+          <w:bCs/>
+        </w:rPr>
+        <w:t>Atracția</w:t>
+      </w:r>
+      <w:proofErr w:type="spellEnd"/>
+      <w:r>
+        <w:rPr>
+          <w:b/>
+          <w:bCs/>
+        </w:rPr>
+        <w:t xml:space="preserve"> (Hook-ul)</w:t>
+      </w:r>
+    </w:p>
+    <w:p>
+      <w:pPr>
+        <w:numPr>
+          <w:ilvl w:val="0"/>
+          <w:numId w:val="31"/>
+        </w:numPr>
+      </w:pPr>
+      <w:proofErr w:type="spellStart"/>
+      <w:r>
+        <w:t>Intră</w:t>
+      </w:r>
+      <w:proofErr w:type="spellEnd"/>
+      <w:r>
+        <w:t xml:space="preserve"> pe site </w:t>
+      </w:r>
+      <w:proofErr w:type="spellStart"/>
+      <w:r>
+        <w:t>și</w:t>
+      </w:r>
+      <w:proofErr w:type="spellEnd"/>
+      <w:r>
+        <w:t xml:space="preserve"> </w:t>
+      </w:r>
+      <w:proofErr w:type="spellStart"/>
+      <w:r>
+        <w:t>vede</w:t>
+      </w:r>
+      <w:proofErr w:type="spellEnd"/>
+      <w:r>
+        <w:t xml:space="preserve"> </w:t>
+      </w:r>
+      <w:proofErr w:type="spellStart"/>
+      <w:r>
+        <w:t>interfața</w:t>
+      </w:r>
+      <w:proofErr w:type="spellEnd"/>
+      <w:r>
+        <w:t xml:space="preserve"> </w:t>
+      </w:r>
+      <w:proofErr w:type="spellStart"/>
+      <w:r>
+        <w:t>neagră</w:t>
+      </w:r>
+      <w:proofErr w:type="spellEnd"/>
+      <w:r>
+        <w:t>, premium.</w:t>
+      </w:r>
+    </w:p>
+    <w:p>
+      <w:pPr>
+        <w:numPr>
+          <w:ilvl w:val="0"/>
+          <w:numId w:val="31"/>
+        </w:numPr>
+      </w:pPr>
+      <w:proofErr w:type="spellStart"/>
+      <w:r>
+        <w:t>Scrie</w:t>
+      </w:r>
+      <w:proofErr w:type="spellEnd"/>
+      <w:r>
+        <w:t xml:space="preserve"> o idee </w:t>
+      </w:r>
+      <w:proofErr w:type="spellStart"/>
+      <w:r>
+        <w:t>și</w:t>
+      </w:r>
+      <w:proofErr w:type="spellEnd"/>
+      <w:r>
+        <w:t xml:space="preserve"> </w:t>
+      </w:r>
+      <w:proofErr w:type="spellStart"/>
+      <w:r>
+        <w:t>apasă</w:t>
+      </w:r>
+      <w:proofErr w:type="spellEnd"/>
+      <w:r>
+        <w:t> </w:t>
+      </w:r>
+      <w:proofErr w:type="spellStart"/>
+      <w:r>
+        <w:rPr>
+          <w:b/>
+          <w:bCs/>
+        </w:rPr>
+        <w:t>Generează</w:t>
+      </w:r>
+      <w:proofErr w:type="spellEnd"/>
+      <w:r>
+        <w:rPr>
+          <w:b/>
+          <w:bCs/>
+        </w:rPr>
+        <w:t xml:space="preserve"> </w:t>
+      </w:r>
+      <w:proofErr w:type="spellStart"/>
+      <w:r>
+        <w:rPr>
+          <w:b/>
+          <w:bCs/>
+        </w:rPr>
+        <w:t>Planul</w:t>
+      </w:r>
+      <w:proofErr w:type="spellEnd"/>
+      <w:r>
+        <w:t>.</w:t>
+      </w:r>
+    </w:p>
+    <w:p>
+      <w:pPr>
+        <w:numPr>
+          <w:ilvl w:val="0"/>
+          <w:numId w:val="31"/>
+        </w:numPr>
+      </w:pPr>
+      <w:r>
+        <w:t xml:space="preserve">Vede </w:t>
+      </w:r>
+      <w:proofErr w:type="spellStart"/>
+      <w:r>
+        <w:t>animația</w:t>
+      </w:r>
+      <w:proofErr w:type="spellEnd"/>
+      <w:r>
+        <w:t xml:space="preserve"> de </w:t>
+      </w:r>
+      <w:proofErr w:type="spellStart"/>
+      <w:r>
+        <w:t>încărcare</w:t>
+      </w:r>
+      <w:proofErr w:type="spellEnd"/>
+      <w:r>
+        <w:t xml:space="preserve"> (~25 </w:t>
+      </w:r>
+      <w:proofErr w:type="spellStart"/>
+      <w:r>
+        <w:t>secunde</w:t>
+      </w:r>
+      <w:proofErr w:type="spellEnd"/>
+      <w:r>
+        <w:t xml:space="preserve">) cu </w:t>
+      </w:r>
+      <w:proofErr w:type="spellStart"/>
+      <w:r>
+        <w:t>textele</w:t>
+      </w:r>
+      <w:proofErr w:type="spellEnd"/>
+      <w:r>
+        <w:t xml:space="preserve"> </w:t>
+      </w:r>
+      <w:proofErr w:type="spellStart"/>
+      <w:r>
+        <w:t>dinamice</w:t>
+      </w:r>
+      <w:proofErr w:type="spellEnd"/>
+      <w:r>
+        <w:t xml:space="preserve"> care </w:t>
+      </w:r>
+      <w:proofErr w:type="spellStart"/>
+      <w:r>
+        <w:t>îl</w:t>
+      </w:r>
+      <w:proofErr w:type="spellEnd"/>
+      <w:r>
+        <w:t xml:space="preserve"> </w:t>
+      </w:r>
+      <w:proofErr w:type="spellStart"/>
+      <w:r>
+        <w:t>țin</w:t>
+      </w:r>
+      <w:proofErr w:type="spellEnd"/>
+      <w:r>
+        <w:t xml:space="preserve"> </w:t>
+      </w:r>
+      <w:proofErr w:type="spellStart"/>
+      <w:r>
+        <w:t>în</w:t>
+      </w:r>
+      <w:proofErr w:type="spellEnd"/>
+      <w:r>
+        <w:t xml:space="preserve"> </w:t>
+      </w:r>
+      <w:proofErr w:type="spellStart"/>
+      <w:r>
+        <w:t>priză</w:t>
+      </w:r>
+      <w:proofErr w:type="spellEnd"/>
+      <w:r>
+        <w:t xml:space="preserve"> ("Se </w:t>
+      </w:r>
+      <w:proofErr w:type="spellStart"/>
+      <w:r>
+        <w:t>analizează</w:t>
+      </w:r>
+      <w:proofErr w:type="spellEnd"/>
+      <w:r>
+        <w:t xml:space="preserve"> </w:t>
+      </w:r>
+      <w:proofErr w:type="spellStart"/>
+      <w:r>
+        <w:t>piața</w:t>
+      </w:r>
+      <w:proofErr w:type="spellEnd"/>
+      <w:r>
+        <w:t xml:space="preserve">...", "Se </w:t>
+      </w:r>
+      <w:proofErr w:type="spellStart"/>
+      <w:r>
+        <w:t>calculează</w:t>
+      </w:r>
+      <w:proofErr w:type="spellEnd"/>
+      <w:r>
+        <w:t xml:space="preserve"> </w:t>
+      </w:r>
+      <w:proofErr w:type="spellStart"/>
+      <w:r>
+        <w:t>bugetul</w:t>
+      </w:r>
+      <w:proofErr w:type="spellEnd"/>
+      <w:r>
+        <w:t>...").</w:t>
+      </w:r>
+    </w:p>
+    <w:p>
+      <w:r>
+        <w:rPr>
+          <w:b/>
+          <w:bCs/>
+        </w:rPr>
+        <w:t>Pasul 2: Wow Factor (</w:t>
+      </w:r>
+      <w:proofErr w:type="spellStart"/>
+      <w:r>
+        <w:rPr>
+          <w:b/>
+          <w:bCs/>
+        </w:rPr>
+        <w:t>Demonstrația</w:t>
+      </w:r>
+      <w:proofErr w:type="spellEnd"/>
+      <w:r>
+        <w:rPr>
+          <w:b/>
+          <w:bCs/>
+        </w:rPr>
+        <w:t xml:space="preserve"> </w:t>
+      </w:r>
+      <w:proofErr w:type="spellStart"/>
+      <w:r>
+        <w:rPr>
+          <w:b/>
+          <w:bCs/>
+        </w:rPr>
+        <w:t>valorii</w:t>
+      </w:r>
+      <w:proofErr w:type="spellEnd"/>
+      <w:r>
+        <w:rPr>
+          <w:b/>
+          <w:bCs/>
+        </w:rPr>
+        <w:t>)</w:t>
+      </w:r>
+    </w:p>
+    <w:p>
+      <w:pPr>
+        <w:numPr>
+          <w:ilvl w:val="0"/>
+          <w:numId w:val="32"/>
+        </w:numPr>
+      </w:pPr>
+      <w:proofErr w:type="spellStart"/>
+      <w:r>
+        <w:t>Planul</w:t>
+      </w:r>
+      <w:proofErr w:type="spellEnd"/>
+      <w:r>
+        <w:t xml:space="preserve"> </w:t>
+      </w:r>
+      <w:proofErr w:type="spellStart"/>
+      <w:r>
+        <w:t>este</w:t>
+      </w:r>
+      <w:proofErr w:type="spellEnd"/>
+      <w:r>
+        <w:t xml:space="preserve"> gata. Vede direct </w:t>
+      </w:r>
+      <w:proofErr w:type="spellStart"/>
+      <w:r>
+        <w:t>în</w:t>
+      </w:r>
+      <w:proofErr w:type="spellEnd"/>
+      <w:r>
+        <w:t xml:space="preserve"> browser un document </w:t>
+      </w:r>
+      <w:proofErr w:type="spellStart"/>
+      <w:r>
+        <w:t>structurat</w:t>
+      </w:r>
+      <w:proofErr w:type="spellEnd"/>
+      <w:r>
+        <w:t xml:space="preserve"> </w:t>
+      </w:r>
+      <w:proofErr w:type="spellStart"/>
+      <w:r>
+        <w:t>profesional</w:t>
+      </w:r>
+      <w:proofErr w:type="spellEnd"/>
+      <w:r>
+        <w:t xml:space="preserve">, cu </w:t>
+      </w:r>
+      <w:proofErr w:type="spellStart"/>
+      <w:r>
+        <w:t>texte</w:t>
+      </w:r>
+      <w:proofErr w:type="spellEnd"/>
+      <w:r>
+        <w:t xml:space="preserve"> </w:t>
+      </w:r>
+      <w:proofErr w:type="spellStart"/>
+      <w:r>
+        <w:t>coerente</w:t>
+      </w:r>
+      <w:proofErr w:type="spellEnd"/>
+      <w:r>
+        <w:t xml:space="preserve">, </w:t>
+      </w:r>
+      <w:proofErr w:type="spellStart"/>
+      <w:r>
+        <w:t>grafice</w:t>
+      </w:r>
+      <w:proofErr w:type="spellEnd"/>
+      <w:r>
+        <w:t xml:space="preserve"> </w:t>
+      </w:r>
+      <w:proofErr w:type="spellStart"/>
+      <w:r>
+        <w:t>financiare</w:t>
+      </w:r>
+      <w:proofErr w:type="spellEnd"/>
+      <w:r>
+        <w:t xml:space="preserve"> interactive </w:t>
+      </w:r>
+      <w:proofErr w:type="spellStart"/>
+      <w:r>
+        <w:t>și</w:t>
+      </w:r>
+      <w:proofErr w:type="spellEnd"/>
+      <w:r>
+        <w:t xml:space="preserve"> o </w:t>
+      </w:r>
+      <w:proofErr w:type="spellStart"/>
+      <w:r>
+        <w:t>analiză</w:t>
+      </w:r>
+      <w:proofErr w:type="spellEnd"/>
+      <w:r>
+        <w:t xml:space="preserve"> SWOT </w:t>
+      </w:r>
+      <w:proofErr w:type="spellStart"/>
+      <w:r>
+        <w:t>clară</w:t>
+      </w:r>
+      <w:proofErr w:type="spellEnd"/>
+      <w:r>
+        <w:t>.</w:t>
+      </w:r>
+    </w:p>
+    <w:p>
+      <w:r>
+        <w:rPr>
+          <w:b/>
+          <w:bCs/>
+        </w:rPr>
+        <w:t xml:space="preserve">Pasul 3: </w:t>
+      </w:r>
+      <w:proofErr w:type="spellStart"/>
+      <w:r>
+        <w:rPr>
+          <w:b/>
+          <w:bCs/>
+        </w:rPr>
+        <w:t>Interacțiunile</w:t>
+      </w:r>
+      <w:proofErr w:type="spellEnd"/>
+      <w:r>
+        <w:rPr>
+          <w:b/>
+          <w:bCs/>
+        </w:rPr>
+        <w:t xml:space="preserve"> </w:t>
+      </w:r>
+      <w:proofErr w:type="spellStart"/>
+      <w:r>
+        <w:rPr>
+          <w:b/>
+          <w:bCs/>
+        </w:rPr>
+        <w:t>în</w:t>
+      </w:r>
+      <w:proofErr w:type="spellEnd"/>
+      <w:r>
+        <w:rPr>
+          <w:b/>
+          <w:bCs/>
+        </w:rPr>
+        <w:t xml:space="preserve"> Demo (</w:t>
+      </w:r>
+      <w:proofErr w:type="spellStart"/>
+      <w:r>
+        <w:rPr>
+          <w:b/>
+          <w:bCs/>
+        </w:rPr>
+        <w:t>Cârligele</w:t>
+      </w:r>
+      <w:proofErr w:type="spellEnd"/>
+      <w:r>
+        <w:rPr>
+          <w:b/>
+          <w:bCs/>
+        </w:rPr>
+        <w:t xml:space="preserve"> </w:t>
+      </w:r>
+      <w:proofErr w:type="spellStart"/>
+      <w:r>
+        <w:rPr>
+          <w:b/>
+          <w:bCs/>
+        </w:rPr>
+        <w:t>noastre</w:t>
+      </w:r>
+      <w:proofErr w:type="spellEnd"/>
+      <w:r>
+        <w:rPr>
+          <w:b/>
+          <w:bCs/>
+        </w:rPr>
+        <w:t xml:space="preserve"> de </w:t>
+      </w:r>
+      <w:proofErr w:type="spellStart"/>
+      <w:r>
+        <w:rPr>
+          <w:b/>
+          <w:bCs/>
+        </w:rPr>
+        <w:t>conversie</w:t>
+      </w:r>
+      <w:proofErr w:type="spellEnd"/>
+      <w:r>
+        <w:rPr>
+          <w:b/>
+          <w:bCs/>
+        </w:rPr>
+        <w:t>)</w:t>
+      </w:r>
+      <w:r>
+        <w:t xml:space="preserve"> Din </w:t>
+      </w:r>
+      <w:proofErr w:type="spellStart"/>
+      <w:r>
+        <w:t>acest</w:t>
+      </w:r>
+      <w:proofErr w:type="spellEnd"/>
+      <w:r>
+        <w:t xml:space="preserve"> moment, </w:t>
+      </w:r>
+      <w:proofErr w:type="spellStart"/>
+      <w:r>
+        <w:t>clientul</w:t>
+      </w:r>
+      <w:proofErr w:type="spellEnd"/>
+      <w:r>
+        <w:t xml:space="preserve"> </w:t>
+      </w:r>
+      <w:proofErr w:type="spellStart"/>
+      <w:r>
+        <w:t>este</w:t>
+      </w:r>
+      <w:proofErr w:type="spellEnd"/>
+      <w:r>
+        <w:t xml:space="preserve"> </w:t>
+      </w:r>
+      <w:proofErr w:type="spellStart"/>
+      <w:r>
+        <w:t>în</w:t>
+      </w:r>
+      <w:proofErr w:type="spellEnd"/>
+      <w:r>
+        <w:t xml:space="preserve"> "Plasa IdeeaTa.ai" </w:t>
+      </w:r>
+      <w:proofErr w:type="spellStart"/>
+      <w:r>
+        <w:t>și</w:t>
+      </w:r>
+      <w:proofErr w:type="spellEnd"/>
+      <w:r>
+        <w:t xml:space="preserve"> are </w:t>
+      </w:r>
+      <w:proofErr w:type="spellStart"/>
+      <w:r>
+        <w:t>următoarele</w:t>
+      </w:r>
+      <w:proofErr w:type="spellEnd"/>
+      <w:r>
+        <w:t xml:space="preserve"> </w:t>
+      </w:r>
+      <w:proofErr w:type="spellStart"/>
+      <w:r>
+        <w:t>rute</w:t>
+      </w:r>
+      <w:proofErr w:type="spellEnd"/>
+      <w:r>
+        <w:t>:</w:t>
+      </w:r>
+    </w:p>
+    <w:p>
+      <w:pPr>
+        <w:numPr>
+          <w:ilvl w:val="0"/>
+          <w:numId w:val="33"/>
+        </w:numPr>
+      </w:pPr>
+      <w:r>
+        <w:rPr>
+          <w:rFonts w:ascii="Segoe UI Emoji" w:hAnsi="Segoe UI Emoji" w:cs="Segoe UI Emoji"/>
+        </w:rPr>
+        <w:t>👆</w:t>
+      </w:r>
+      <w:r>
+        <w:t> </w:t>
+      </w:r>
+      <w:r>
+        <w:rPr>
+          <w:b/>
+          <w:bCs/>
+        </w:rPr>
+        <w:t>Ruta 1 (</w:t>
+      </w:r>
+      <w:proofErr w:type="spellStart"/>
+      <w:r>
+        <w:rPr>
+          <w:b/>
+          <w:bCs/>
+        </w:rPr>
+        <w:t>Vrea</w:t>
+      </w:r>
+      <w:proofErr w:type="spellEnd"/>
+      <w:r>
+        <w:rPr>
+          <w:b/>
+          <w:bCs/>
+        </w:rPr>
+        <w:t xml:space="preserve"> </w:t>
+      </w:r>
+      <w:proofErr w:type="spellStart"/>
+      <w:r>
+        <w:rPr>
+          <w:b/>
+          <w:bCs/>
+        </w:rPr>
+        <w:t>să</w:t>
+      </w:r>
+      <w:proofErr w:type="spellEnd"/>
+      <w:r>
+        <w:rPr>
+          <w:b/>
+          <w:bCs/>
+        </w:rPr>
+        <w:t xml:space="preserve"> </w:t>
+      </w:r>
+      <w:proofErr w:type="spellStart"/>
+      <w:r>
+        <w:rPr>
+          <w:b/>
+          <w:bCs/>
+        </w:rPr>
+        <w:t>editeze</w:t>
+      </w:r>
+      <w:proofErr w:type="spellEnd"/>
+      <w:r>
+        <w:rPr>
+          <w:b/>
+          <w:bCs/>
+        </w:rPr>
+        <w:t xml:space="preserve"> </w:t>
+      </w:r>
+      <w:proofErr w:type="spellStart"/>
+      <w:r>
+        <w:rPr>
+          <w:b/>
+          <w:bCs/>
+        </w:rPr>
+        <w:t>textul</w:t>
+      </w:r>
+      <w:proofErr w:type="spellEnd"/>
+      <w:r>
+        <w:rPr>
+          <w:b/>
+          <w:bCs/>
+        </w:rPr>
+        <w:t xml:space="preserve"> direct pe site):</w:t>
+      </w:r>
+      <w:r>
+        <w:t> </w:t>
+      </w:r>
+      <w:proofErr w:type="spellStart"/>
+      <w:r>
+        <w:t>Dă</w:t>
+      </w:r>
+      <w:proofErr w:type="spellEnd"/>
+      <w:r>
+        <w:t xml:space="preserve"> click pe text </w:t>
+      </w:r>
+      <w:proofErr w:type="spellStart"/>
+      <w:r>
+        <w:t>și</w:t>
+      </w:r>
+      <w:proofErr w:type="spellEnd"/>
+      <w:r>
+        <w:t xml:space="preserve"> </w:t>
+      </w:r>
+      <w:proofErr w:type="spellStart"/>
+      <w:r>
+        <w:t>îl</w:t>
+      </w:r>
+      <w:proofErr w:type="spellEnd"/>
+      <w:r>
+        <w:t xml:space="preserve"> </w:t>
+      </w:r>
+      <w:proofErr w:type="spellStart"/>
+      <w:r>
+        <w:t>modifică</w:t>
+      </w:r>
+      <w:proofErr w:type="spellEnd"/>
+      <w:r>
+        <w:t xml:space="preserve">, </w:t>
+      </w:r>
+      <w:proofErr w:type="spellStart"/>
+      <w:r>
+        <w:t>ba</w:t>
+      </w:r>
+      <w:proofErr w:type="spellEnd"/>
+      <w:r>
+        <w:t xml:space="preserve"> </w:t>
+      </w:r>
+      <w:proofErr w:type="spellStart"/>
+      <w:r>
+        <w:t>chiar</w:t>
+      </w:r>
+      <w:proofErr w:type="spellEnd"/>
+      <w:r>
+        <w:t xml:space="preserve"> </w:t>
+      </w:r>
+      <w:proofErr w:type="spellStart"/>
+      <w:r>
+        <w:t>folosește</w:t>
+      </w:r>
+      <w:proofErr w:type="spellEnd"/>
+      <w:r>
+        <w:t xml:space="preserve"> </w:t>
+      </w:r>
+      <w:proofErr w:type="spellStart"/>
+      <w:r>
+        <w:t>asistentul</w:t>
+      </w:r>
+      <w:proofErr w:type="spellEnd"/>
+      <w:r>
+        <w:t xml:space="preserve"> AI </w:t>
+      </w:r>
+      <w:proofErr w:type="spellStart"/>
+      <w:r>
+        <w:t>să</w:t>
+      </w:r>
+      <w:proofErr w:type="spellEnd"/>
+      <w:r>
+        <w:t xml:space="preserve"> </w:t>
+      </w:r>
+      <w:proofErr w:type="spellStart"/>
+      <w:r>
+        <w:t>îi</w:t>
+      </w:r>
+      <w:proofErr w:type="spellEnd"/>
+      <w:r>
+        <w:t xml:space="preserve"> </w:t>
+      </w:r>
+      <w:proofErr w:type="spellStart"/>
+      <w:r>
+        <w:t>rescrie</w:t>
+      </w:r>
+      <w:proofErr w:type="spellEnd"/>
+      <w:r>
+        <w:t xml:space="preserve"> </w:t>
+      </w:r>
+      <w:proofErr w:type="spellStart"/>
+      <w:r>
+        <w:t>paragraful</w:t>
+      </w:r>
+      <w:proofErr w:type="spellEnd"/>
+      <w:r>
+        <w:t xml:space="preserve">. O </w:t>
+      </w:r>
+      <w:proofErr w:type="spellStart"/>
+      <w:r>
+        <w:t>poate</w:t>
+      </w:r>
+      <w:proofErr w:type="spellEnd"/>
+      <w:r>
+        <w:t xml:space="preserve"> face de </w:t>
+      </w:r>
+      <w:r>
+        <w:rPr>
+          <w:b/>
+          <w:bCs/>
+        </w:rPr>
+        <w:t xml:space="preserve">maxim 2 </w:t>
+      </w:r>
+      <w:proofErr w:type="spellStart"/>
+      <w:r>
+        <w:rPr>
+          <w:b/>
+          <w:bCs/>
+        </w:rPr>
+        <w:t>ori</w:t>
+      </w:r>
+      <w:proofErr w:type="spellEnd"/>
+      <w:r>
+        <w:t xml:space="preserve">. La al 3-lea click pe </w:t>
+      </w:r>
+      <w:proofErr w:type="spellStart"/>
+      <w:r>
+        <w:t>editare</w:t>
+      </w:r>
+      <w:proofErr w:type="spellEnd"/>
+      <w:r>
+        <w:t xml:space="preserve">, </w:t>
+      </w:r>
+      <w:proofErr w:type="spellStart"/>
+      <w:r>
+        <w:t>îi</w:t>
+      </w:r>
+      <w:proofErr w:type="spellEnd"/>
+      <w:r>
+        <w:t xml:space="preserve"> </w:t>
+      </w:r>
+      <w:proofErr w:type="spellStart"/>
+      <w:r>
+        <w:t>apare</w:t>
+      </w:r>
+      <w:proofErr w:type="spellEnd"/>
+      <w:r>
+        <w:t> </w:t>
+      </w:r>
+      <w:proofErr w:type="spellStart"/>
+      <w:r>
+        <w:rPr>
+          <w:b/>
+          <w:bCs/>
+        </w:rPr>
+        <w:t>Modalul</w:t>
+      </w:r>
+      <w:proofErr w:type="spellEnd"/>
+      <w:r>
+        <w:rPr>
+          <w:b/>
+          <w:bCs/>
+        </w:rPr>
+        <w:t xml:space="preserve"> Premium (</w:t>
+      </w:r>
+      <w:proofErr w:type="spellStart"/>
+      <w:r>
+        <w:rPr>
+          <w:b/>
+          <w:bCs/>
+        </w:rPr>
+        <w:t>Limita</w:t>
+      </w:r>
+      <w:proofErr w:type="spellEnd"/>
+      <w:r>
+        <w:rPr>
+          <w:b/>
+          <w:bCs/>
+        </w:rPr>
+        <w:t xml:space="preserve"> </w:t>
+      </w:r>
+      <w:proofErr w:type="spellStart"/>
+      <w:r>
+        <w:rPr>
+          <w:b/>
+          <w:bCs/>
+        </w:rPr>
+        <w:t>atinsă</w:t>
+      </w:r>
+      <w:proofErr w:type="spellEnd"/>
+      <w:r>
+        <w:rPr>
+          <w:b/>
+          <w:bCs/>
+        </w:rPr>
+        <w:t>)</w:t>
+      </w:r>
+      <w:r>
+        <w:t xml:space="preserve"> care nu-l </w:t>
+      </w:r>
+      <w:proofErr w:type="spellStart"/>
+      <w:r>
+        <w:t>lasă</w:t>
+      </w:r>
+      <w:proofErr w:type="spellEnd"/>
+      <w:r>
+        <w:t xml:space="preserve"> </w:t>
+      </w:r>
+      <w:proofErr w:type="spellStart"/>
+      <w:r>
+        <w:t>mai</w:t>
+      </w:r>
+      <w:proofErr w:type="spellEnd"/>
+      <w:r>
+        <w:t xml:space="preserve"> </w:t>
+      </w:r>
+      <w:proofErr w:type="spellStart"/>
+      <w:r>
+        <w:t>departe</w:t>
+      </w:r>
+      <w:proofErr w:type="spellEnd"/>
+      <w:r>
+        <w:t xml:space="preserve"> </w:t>
+      </w:r>
+      <w:proofErr w:type="spellStart"/>
+      <w:r>
+        <w:t>și</w:t>
+      </w:r>
+      <w:proofErr w:type="spellEnd"/>
+      <w:r>
+        <w:t xml:space="preserve"> </w:t>
+      </w:r>
+      <w:proofErr w:type="spellStart"/>
+      <w:r>
+        <w:t>îi</w:t>
+      </w:r>
+      <w:proofErr w:type="spellEnd"/>
+      <w:r>
+        <w:t xml:space="preserve"> cere </w:t>
+      </w:r>
+      <w:proofErr w:type="spellStart"/>
+      <w:r>
+        <w:t>să-și</w:t>
+      </w:r>
+      <w:proofErr w:type="spellEnd"/>
+      <w:r>
+        <w:t xml:space="preserve"> </w:t>
+      </w:r>
+      <w:proofErr w:type="spellStart"/>
+      <w:r>
+        <w:t>facă</w:t>
+      </w:r>
+      <w:proofErr w:type="spellEnd"/>
+      <w:r>
+        <w:t xml:space="preserve"> </w:t>
+      </w:r>
+      <w:proofErr w:type="spellStart"/>
+      <w:r>
+        <w:t>cont</w:t>
+      </w:r>
+      <w:proofErr w:type="spellEnd"/>
+      <w:r>
+        <w:t>/</w:t>
+      </w:r>
+      <w:proofErr w:type="spellStart"/>
+      <w:r>
+        <w:t>să</w:t>
+      </w:r>
+      <w:proofErr w:type="spellEnd"/>
+      <w:r>
+        <w:t xml:space="preserve"> </w:t>
+      </w:r>
+      <w:proofErr w:type="spellStart"/>
+      <w:r>
+        <w:t>plătească</w:t>
+      </w:r>
+      <w:proofErr w:type="spellEnd"/>
+      <w:r>
+        <w:t>.</w:t>
+      </w:r>
+    </w:p>
+    <w:p>
+      <w:pPr>
+        <w:numPr>
+          <w:ilvl w:val="0"/>
+          <w:numId w:val="33"/>
+        </w:numPr>
+      </w:pPr>
+      <w:r>
+        <w:rPr>
+          <w:rFonts w:ascii="Segoe UI Emoji" w:hAnsi="Segoe UI Emoji" w:cs="Segoe UI Emoji"/>
+        </w:rPr>
+        <w:t>📥</w:t>
+      </w:r>
+      <w:r>
+        <w:t> </w:t>
+      </w:r>
+      <w:r>
+        <w:rPr>
+          <w:b/>
+          <w:bCs/>
+        </w:rPr>
+        <w:t>Ruta 2 (</w:t>
+      </w:r>
+      <w:proofErr w:type="spellStart"/>
+      <w:r>
+        <w:rPr>
+          <w:b/>
+          <w:bCs/>
+        </w:rPr>
+        <w:t>Vrea</w:t>
+      </w:r>
+      <w:proofErr w:type="spellEnd"/>
+      <w:r>
+        <w:rPr>
+          <w:b/>
+          <w:bCs/>
+        </w:rPr>
+        <w:t xml:space="preserve"> </w:t>
+      </w:r>
+      <w:proofErr w:type="spellStart"/>
+      <w:r>
+        <w:rPr>
+          <w:b/>
+          <w:bCs/>
+        </w:rPr>
+        <w:t>planul</w:t>
+      </w:r>
+      <w:proofErr w:type="spellEnd"/>
+      <w:r>
+        <w:rPr>
+          <w:b/>
+          <w:bCs/>
+        </w:rPr>
+        <w:t xml:space="preserve"> la </w:t>
+      </w:r>
+      <w:proofErr w:type="spellStart"/>
+      <w:r>
+        <w:rPr>
+          <w:b/>
+          <w:bCs/>
+        </w:rPr>
+        <w:t>el</w:t>
+      </w:r>
+      <w:proofErr w:type="spellEnd"/>
+      <w:r>
+        <w:rPr>
+          <w:b/>
+          <w:bCs/>
+        </w:rPr>
+        <w:t xml:space="preserve"> pe calculator - </w:t>
+      </w:r>
+      <w:proofErr w:type="spellStart"/>
+      <w:r>
+        <w:rPr>
+          <w:b/>
+          <w:bCs/>
+        </w:rPr>
+        <w:t>descărcări</w:t>
+      </w:r>
+      <w:proofErr w:type="spellEnd"/>
+      <w:r>
+        <w:rPr>
+          <w:b/>
+          <w:bCs/>
+        </w:rPr>
+        <w:t xml:space="preserve"> Premium):</w:t>
+      </w:r>
+      <w:r>
+        <w:t> </w:t>
+      </w:r>
+      <w:proofErr w:type="spellStart"/>
+      <w:r>
+        <w:t>Apasă</w:t>
+      </w:r>
+      <w:proofErr w:type="spellEnd"/>
+      <w:r>
+        <w:t xml:space="preserve"> </w:t>
+      </w:r>
+      <w:proofErr w:type="spellStart"/>
+      <w:r>
+        <w:t>butoanele</w:t>
+      </w:r>
+      <w:proofErr w:type="spellEnd"/>
+      <w:r>
+        <w:t xml:space="preserve"> de Word, PPTX </w:t>
+      </w:r>
+      <w:proofErr w:type="spellStart"/>
+      <w:r>
+        <w:t>sau</w:t>
+      </w:r>
+      <w:proofErr w:type="spellEnd"/>
+      <w:r>
+        <w:t xml:space="preserve"> </w:t>
+      </w:r>
+      <w:proofErr w:type="spellStart"/>
+      <w:r>
+        <w:t>Descărcare</w:t>
+      </w:r>
+      <w:proofErr w:type="spellEnd"/>
+      <w:r>
+        <w:t xml:space="preserve"> </w:t>
+      </w:r>
+      <w:proofErr w:type="spellStart"/>
+      <w:r>
+        <w:t>Completă</w:t>
+      </w:r>
+      <w:proofErr w:type="spellEnd"/>
+      <w:r>
+        <w:t xml:space="preserve">. Boom! </w:t>
+      </w:r>
+      <w:proofErr w:type="spellStart"/>
+      <w:r>
+        <w:t>Îi</w:t>
+      </w:r>
+      <w:proofErr w:type="spellEnd"/>
+      <w:r>
+        <w:t xml:space="preserve"> </w:t>
+      </w:r>
+      <w:proofErr w:type="spellStart"/>
+      <w:r>
+        <w:t>apare</w:t>
+      </w:r>
+      <w:proofErr w:type="spellEnd"/>
+      <w:r>
+        <w:t xml:space="preserve"> direct </w:t>
+      </w:r>
+      <w:proofErr w:type="spellStart"/>
+      <w:r>
+        <w:rPr>
+          <w:b/>
+          <w:bCs/>
+        </w:rPr>
+        <w:t>Modalul</w:t>
+      </w:r>
+      <w:proofErr w:type="spellEnd"/>
+      <w:r>
+        <w:rPr>
+          <w:b/>
+          <w:bCs/>
+        </w:rPr>
+        <w:t xml:space="preserve"> de </w:t>
+      </w:r>
+      <w:proofErr w:type="spellStart"/>
+      <w:r>
+        <w:rPr>
+          <w:b/>
+          <w:bCs/>
+        </w:rPr>
+        <w:t>Plată</w:t>
+      </w:r>
+      <w:proofErr w:type="spellEnd"/>
+      <w:r>
+        <w:rPr>
+          <w:b/>
+          <w:bCs/>
+        </w:rPr>
+        <w:t xml:space="preserve"> (Paywall)</w:t>
+      </w:r>
+      <w:r>
+        <w:t xml:space="preserve"> cu </w:t>
+      </w:r>
+      <w:proofErr w:type="spellStart"/>
+      <w:r>
+        <w:t>pachetele</w:t>
+      </w:r>
+      <w:proofErr w:type="spellEnd"/>
+      <w:r>
+        <w:t>.</w:t>
+      </w:r>
+    </w:p>
+    <w:p>
+      <w:pPr>
+        <w:numPr>
+          <w:ilvl w:val="0"/>
+          <w:numId w:val="33"/>
+        </w:numPr>
+      </w:pPr>
+      <w:r>
+        <w:rPr>
+          <w:rFonts w:ascii="Segoe UI Emoji" w:hAnsi="Segoe UI Emoji" w:cs="Segoe UI Emoji"/>
+        </w:rPr>
+        <w:t>🎁</w:t>
+      </w:r>
+      <w:r>
+        <w:t> </w:t>
+      </w:r>
+      <w:r>
+        <w:rPr>
+          <w:b/>
+          <w:bCs/>
+        </w:rPr>
+        <w:t>Ruta 3 (</w:t>
+      </w:r>
+      <w:proofErr w:type="spellStart"/>
+      <w:r>
+        <w:rPr>
+          <w:b/>
+          <w:bCs/>
+        </w:rPr>
+        <w:t>Alege</w:t>
+      </w:r>
+      <w:proofErr w:type="spellEnd"/>
+      <w:r>
+        <w:rPr>
+          <w:b/>
+          <w:bCs/>
+        </w:rPr>
+        <w:t xml:space="preserve"> </w:t>
+      </w:r>
+      <w:proofErr w:type="spellStart"/>
+      <w:r>
+        <w:rPr>
+          <w:b/>
+          <w:bCs/>
+        </w:rPr>
+        <w:t>să</w:t>
+      </w:r>
+      <w:proofErr w:type="spellEnd"/>
+      <w:r>
+        <w:rPr>
+          <w:b/>
+          <w:bCs/>
+        </w:rPr>
+        <w:t xml:space="preserve"> </w:t>
+      </w:r>
+      <w:proofErr w:type="spellStart"/>
+      <w:r>
+        <w:rPr>
+          <w:b/>
+          <w:bCs/>
+        </w:rPr>
+        <w:t>ia</w:t>
+      </w:r>
+      <w:proofErr w:type="spellEnd"/>
+      <w:r>
+        <w:rPr>
+          <w:b/>
+          <w:bCs/>
+        </w:rPr>
+        <w:t xml:space="preserve"> </w:t>
+      </w:r>
+      <w:proofErr w:type="spellStart"/>
+      <w:r>
+        <w:rPr>
+          <w:b/>
+          <w:bCs/>
+        </w:rPr>
+        <w:t>ce</w:t>
+      </w:r>
+      <w:proofErr w:type="spellEnd"/>
+      <w:r>
+        <w:rPr>
+          <w:b/>
+          <w:bCs/>
+        </w:rPr>
+        <w:t xml:space="preserve"> e gratis - "</w:t>
+      </w:r>
+      <w:proofErr w:type="spellStart"/>
+      <w:r>
+        <w:rPr>
+          <w:b/>
+          <w:bCs/>
+        </w:rPr>
+        <w:t>Sumarul</w:t>
+      </w:r>
+      <w:proofErr w:type="spellEnd"/>
+      <w:r>
+        <w:rPr>
+          <w:b/>
+          <w:bCs/>
+        </w:rPr>
+        <w:t xml:space="preserve"> </w:t>
+      </w:r>
+      <w:proofErr w:type="spellStart"/>
+      <w:r>
+        <w:rPr>
+          <w:b/>
+          <w:bCs/>
+        </w:rPr>
+        <w:t>Gratuit</w:t>
+      </w:r>
+      <w:proofErr w:type="spellEnd"/>
+      <w:r>
+        <w:rPr>
+          <w:b/>
+          <w:bCs/>
+        </w:rPr>
+        <w:t>"):</w:t>
+      </w:r>
+      <w:r>
+        <w:t> </w:t>
+      </w:r>
+      <w:proofErr w:type="spellStart"/>
+      <w:r>
+        <w:t>Apasă</w:t>
+      </w:r>
+      <w:proofErr w:type="spellEnd"/>
+      <w:r>
+        <w:t xml:space="preserve"> pe "Sumar </w:t>
+      </w:r>
+      <w:proofErr w:type="spellStart"/>
+      <w:r>
+        <w:t>Gratuit</w:t>
+      </w:r>
+      <w:proofErr w:type="spellEnd"/>
+      <w:r>
+        <w:t xml:space="preserve">". Se </w:t>
+      </w:r>
+      <w:proofErr w:type="spellStart"/>
+      <w:r>
+        <w:t>descarcă</w:t>
+      </w:r>
+      <w:proofErr w:type="spellEnd"/>
+      <w:r>
+        <w:t xml:space="preserve"> </w:t>
+      </w:r>
+      <w:proofErr w:type="gramStart"/>
+      <w:r>
+        <w:t>un PDF</w:t>
+      </w:r>
+      <w:proofErr w:type="gramEnd"/>
+      <w:r>
+        <w:t xml:space="preserve"> de 4 </w:t>
+      </w:r>
+      <w:proofErr w:type="spellStart"/>
+      <w:r>
+        <w:t>pagini</w:t>
+      </w:r>
+      <w:proofErr w:type="spellEnd"/>
+      <w:r>
+        <w:t xml:space="preserve"> </w:t>
+      </w:r>
+      <w:proofErr w:type="spellStart"/>
+      <w:r>
+        <w:t>frumos</w:t>
+      </w:r>
+      <w:proofErr w:type="spellEnd"/>
+      <w:r>
+        <w:t xml:space="preserve"> </w:t>
+      </w:r>
+      <w:proofErr w:type="spellStart"/>
+      <w:r>
+        <w:t>formatat</w:t>
+      </w:r>
+      <w:proofErr w:type="spellEnd"/>
+      <w:r>
+        <w:t xml:space="preserve"> (o </w:t>
+      </w:r>
+      <w:proofErr w:type="spellStart"/>
+      <w:r>
+        <w:t>mostră</w:t>
+      </w:r>
+      <w:proofErr w:type="spellEnd"/>
+      <w:r>
+        <w:t xml:space="preserve">). El </w:t>
+      </w:r>
+      <w:proofErr w:type="spellStart"/>
+      <w:r>
+        <w:t>pleacă</w:t>
+      </w:r>
+      <w:proofErr w:type="spellEnd"/>
+      <w:r>
+        <w:t xml:space="preserve"> </w:t>
+      </w:r>
+      <w:proofErr w:type="spellStart"/>
+      <w:r>
+        <w:t>fericit</w:t>
+      </w:r>
+      <w:proofErr w:type="spellEnd"/>
+      <w:r>
+        <w:t xml:space="preserve"> de pe site cu PDF-ul. </w:t>
+      </w:r>
+      <w:r>
+        <w:rPr>
+          <w:b/>
+          <w:bCs/>
+        </w:rPr>
+        <w:t xml:space="preserve">Dar </w:t>
+      </w:r>
+      <w:proofErr w:type="spellStart"/>
+      <w:r>
+        <w:rPr>
+          <w:b/>
+          <w:bCs/>
+        </w:rPr>
+        <w:t>surpriză</w:t>
+      </w:r>
+      <w:proofErr w:type="spellEnd"/>
+      <w:r>
+        <w:rPr>
+          <w:b/>
+          <w:bCs/>
+        </w:rPr>
+        <w:t>!</w:t>
+      </w:r>
+      <w:r>
+        <w:t> </w:t>
+      </w:r>
+      <w:proofErr w:type="spellStart"/>
+      <w:r>
+        <w:t>Când</w:t>
+      </w:r>
+      <w:proofErr w:type="spellEnd"/>
+      <w:r>
+        <w:t xml:space="preserve"> </w:t>
+      </w:r>
+      <w:proofErr w:type="spellStart"/>
+      <w:r>
+        <w:t>îl</w:t>
+      </w:r>
+      <w:proofErr w:type="spellEnd"/>
+      <w:r>
+        <w:t xml:space="preserve"> </w:t>
+      </w:r>
+      <w:proofErr w:type="spellStart"/>
+      <w:r>
+        <w:t>citește</w:t>
+      </w:r>
+      <w:proofErr w:type="spellEnd"/>
+      <w:r>
+        <w:t xml:space="preserve"> pe </w:t>
+      </w:r>
+      <w:proofErr w:type="spellStart"/>
+      <w:r>
+        <w:t>telefon</w:t>
+      </w:r>
+      <w:proofErr w:type="spellEnd"/>
+      <w:r>
+        <w:t xml:space="preserve"> </w:t>
+      </w:r>
+      <w:proofErr w:type="spellStart"/>
+      <w:r>
+        <w:t>sau</w:t>
+      </w:r>
+      <w:proofErr w:type="spellEnd"/>
+      <w:r>
+        <w:t xml:space="preserve"> </w:t>
+      </w:r>
+      <w:proofErr w:type="spellStart"/>
+      <w:r>
+        <w:t>dă</w:t>
+      </w:r>
+      <w:proofErr w:type="spellEnd"/>
+      <w:r>
+        <w:t xml:space="preserve"> share la un </w:t>
+      </w:r>
+      <w:proofErr w:type="spellStart"/>
+      <w:r>
+        <w:t>prieten</w:t>
+      </w:r>
+      <w:proofErr w:type="spellEnd"/>
+      <w:r>
+        <w:t xml:space="preserve">, </w:t>
+      </w:r>
+      <w:proofErr w:type="spellStart"/>
+      <w:r>
+        <w:t>dă</w:t>
+      </w:r>
+      <w:proofErr w:type="spellEnd"/>
+      <w:r>
+        <w:t xml:space="preserve"> click din </w:t>
+      </w:r>
+      <w:proofErr w:type="spellStart"/>
+      <w:r>
+        <w:t>greșeală</w:t>
+      </w:r>
+      <w:proofErr w:type="spellEnd"/>
+      <w:r>
+        <w:t xml:space="preserve"> (</w:t>
+      </w:r>
+      <w:proofErr w:type="spellStart"/>
+      <w:r>
+        <w:t>sau</w:t>
+      </w:r>
+      <w:proofErr w:type="spellEnd"/>
+      <w:r>
+        <w:t xml:space="preserve"> </w:t>
+      </w:r>
+      <w:proofErr w:type="spellStart"/>
+      <w:r>
+        <w:t>voit</w:t>
+      </w:r>
+      <w:proofErr w:type="spellEnd"/>
+      <w:r>
+        <w:t xml:space="preserve">) pe </w:t>
+      </w:r>
+      <w:proofErr w:type="spellStart"/>
+      <w:r>
+        <w:t>butonul</w:t>
+      </w:r>
+      <w:proofErr w:type="spellEnd"/>
+      <w:r>
+        <w:t xml:space="preserve"> </w:t>
+      </w:r>
+      <w:proofErr w:type="spellStart"/>
+      <w:r>
+        <w:t>imens</w:t>
+      </w:r>
+      <w:proofErr w:type="spellEnd"/>
+      <w:r>
+        <w:t xml:space="preserve"> din ultima </w:t>
+      </w:r>
+      <w:proofErr w:type="spellStart"/>
+      <w:r>
+        <w:t>pagină</w:t>
+      </w:r>
+      <w:proofErr w:type="spellEnd"/>
+      <w:r>
+        <w:t xml:space="preserve"> a PDF-</w:t>
+      </w:r>
+      <w:proofErr w:type="spellStart"/>
+      <w:r>
+        <w:t>ului</w:t>
+      </w:r>
+      <w:proofErr w:type="spellEnd"/>
+      <w:r>
+        <w:t xml:space="preserve"> </w:t>
+      </w:r>
+      <w:proofErr w:type="spellStart"/>
+      <w:r>
+        <w:t>sau</w:t>
+      </w:r>
+      <w:proofErr w:type="spellEnd"/>
+      <w:r>
+        <w:t xml:space="preserve"> pe watermark. Este </w:t>
+      </w:r>
+      <w:proofErr w:type="spellStart"/>
+      <w:r>
+        <w:t>readus</w:t>
+      </w:r>
+      <w:proofErr w:type="spellEnd"/>
+      <w:r>
+        <w:t xml:space="preserve"> instant </w:t>
+      </w:r>
+      <w:proofErr w:type="spellStart"/>
+      <w:r>
+        <w:t>în</w:t>
+      </w:r>
+      <w:proofErr w:type="spellEnd"/>
+      <w:r>
+        <w:t xml:space="preserve"> </w:t>
+      </w:r>
+      <w:proofErr w:type="spellStart"/>
+      <w:r>
+        <w:t>platformă</w:t>
+      </w:r>
+      <w:proofErr w:type="spellEnd"/>
+      <w:r>
+        <w:t xml:space="preserve">, exact la </w:t>
+      </w:r>
+      <w:proofErr w:type="spellStart"/>
+      <w:r>
+        <w:t>planul</w:t>
+      </w:r>
+      <w:proofErr w:type="spellEnd"/>
+      <w:r>
+        <w:t xml:space="preserve"> </w:t>
+      </w:r>
+      <w:proofErr w:type="spellStart"/>
+      <w:r>
+        <w:t>lui</w:t>
+      </w:r>
+      <w:proofErr w:type="spellEnd"/>
+      <w:r>
+        <w:t xml:space="preserve">, </w:t>
+      </w:r>
+      <w:proofErr w:type="spellStart"/>
+      <w:r>
+        <w:t>iar</w:t>
+      </w:r>
+      <w:proofErr w:type="spellEnd"/>
+      <w:r>
+        <w:t xml:space="preserve"> </w:t>
+      </w:r>
+      <w:proofErr w:type="spellStart"/>
+      <w:r>
+        <w:t>noi</w:t>
+      </w:r>
+      <w:proofErr w:type="spellEnd"/>
+      <w:r>
+        <w:t xml:space="preserve"> </w:t>
+      </w:r>
+      <w:proofErr w:type="spellStart"/>
+      <w:r>
+        <w:t>îl</w:t>
+      </w:r>
+      <w:proofErr w:type="spellEnd"/>
+      <w:r>
+        <w:t xml:space="preserve"> </w:t>
+      </w:r>
+      <w:proofErr w:type="spellStart"/>
+      <w:r>
+        <w:t>întâmpinăm</w:t>
+      </w:r>
+      <w:proofErr w:type="spellEnd"/>
+      <w:r>
+        <w:t xml:space="preserve"> cu </w:t>
+      </w:r>
+      <w:proofErr w:type="spellStart"/>
+      <w:r>
+        <w:rPr>
+          <w:b/>
+          <w:bCs/>
+        </w:rPr>
+        <w:t>Modalul</w:t>
+      </w:r>
+      <w:proofErr w:type="spellEnd"/>
+      <w:r>
+        <w:rPr>
+          <w:b/>
+          <w:bCs/>
+        </w:rPr>
+        <w:t xml:space="preserve"> "Welcome Back"</w:t>
+      </w:r>
+      <w:r>
+        <w:t>: </w:t>
+      </w:r>
+      <w:r>
+        <w:rPr>
+          <w:i/>
+          <w:iCs/>
+        </w:rPr>
+        <w:t xml:space="preserve">"Ai </w:t>
+      </w:r>
+      <w:proofErr w:type="spellStart"/>
+      <w:r>
+        <w:rPr>
+          <w:i/>
+          <w:iCs/>
+        </w:rPr>
+        <w:t>revenit</w:t>
+      </w:r>
+      <w:proofErr w:type="spellEnd"/>
+      <w:r>
+        <w:rPr>
+          <w:i/>
+          <w:iCs/>
+        </w:rPr>
+        <w:t xml:space="preserve">! E </w:t>
+      </w:r>
+      <w:proofErr w:type="spellStart"/>
+      <w:r>
+        <w:rPr>
+          <w:i/>
+          <w:iCs/>
+        </w:rPr>
+        <w:t>timpul</w:t>
+      </w:r>
+      <w:proofErr w:type="spellEnd"/>
+      <w:r>
+        <w:rPr>
+          <w:i/>
+          <w:iCs/>
+        </w:rPr>
+        <w:t xml:space="preserve"> </w:t>
+      </w:r>
+      <w:proofErr w:type="spellStart"/>
+      <w:r>
+        <w:rPr>
+          <w:i/>
+          <w:iCs/>
+        </w:rPr>
+        <w:t>să</w:t>
+      </w:r>
+      <w:proofErr w:type="spellEnd"/>
+      <w:r>
+        <w:rPr>
+          <w:i/>
+          <w:iCs/>
+        </w:rPr>
+        <w:t xml:space="preserve"> </w:t>
+      </w:r>
+      <w:proofErr w:type="spellStart"/>
+      <w:r>
+        <w:rPr>
+          <w:i/>
+          <w:iCs/>
+        </w:rPr>
+        <w:t>facem</w:t>
+      </w:r>
+      <w:proofErr w:type="spellEnd"/>
+      <w:r>
+        <w:rPr>
+          <w:i/>
+          <w:iCs/>
+        </w:rPr>
+        <w:t xml:space="preserve"> </w:t>
+      </w:r>
+      <w:proofErr w:type="spellStart"/>
+      <w:r>
+        <w:rPr>
+          <w:i/>
+          <w:iCs/>
+        </w:rPr>
+        <w:t>lucruri</w:t>
+      </w:r>
+      <w:proofErr w:type="spellEnd"/>
+      <w:r>
+        <w:rPr>
+          <w:i/>
+          <w:iCs/>
+        </w:rPr>
+        <w:t xml:space="preserve"> </w:t>
+      </w:r>
+      <w:proofErr w:type="spellStart"/>
+      <w:r>
+        <w:rPr>
+          <w:i/>
+          <w:iCs/>
+        </w:rPr>
+        <w:t>serioase</w:t>
+      </w:r>
+      <w:proofErr w:type="spellEnd"/>
+      <w:r>
+        <w:rPr>
+          <w:i/>
+          <w:iCs/>
+        </w:rPr>
+        <w:t xml:space="preserve">. </w:t>
+      </w:r>
+      <w:proofErr w:type="spellStart"/>
+      <w:r>
+        <w:rPr>
+          <w:i/>
+          <w:iCs/>
+        </w:rPr>
+        <w:t>Editează</w:t>
+      </w:r>
+      <w:proofErr w:type="spellEnd"/>
+      <w:r>
+        <w:rPr>
+          <w:i/>
+          <w:iCs/>
+        </w:rPr>
+        <w:t xml:space="preserve"> </w:t>
+      </w:r>
+      <w:proofErr w:type="spellStart"/>
+      <w:r>
+        <w:rPr>
+          <w:i/>
+          <w:iCs/>
+        </w:rPr>
+        <w:t>planul</w:t>
+      </w:r>
+      <w:proofErr w:type="spellEnd"/>
+      <w:r>
+        <w:rPr>
+          <w:i/>
+          <w:iCs/>
+        </w:rPr>
+        <w:t xml:space="preserve"> / </w:t>
+      </w:r>
+      <w:proofErr w:type="spellStart"/>
+      <w:r>
+        <w:rPr>
+          <w:i/>
+          <w:iCs/>
+        </w:rPr>
+        <w:t>Cumpără</w:t>
+      </w:r>
+      <w:proofErr w:type="spellEnd"/>
+      <w:r>
+        <w:rPr>
+          <w:i/>
+          <w:iCs/>
+        </w:rPr>
+        <w:t xml:space="preserve"> un </w:t>
+      </w:r>
+      <w:proofErr w:type="spellStart"/>
+      <w:r>
+        <w:rPr>
+          <w:i/>
+          <w:iCs/>
+        </w:rPr>
+        <w:t>pachet</w:t>
+      </w:r>
+      <w:proofErr w:type="spellEnd"/>
+      <w:r>
+        <w:rPr>
+          <w:i/>
+          <w:iCs/>
+        </w:rPr>
+        <w:t>."</w:t>
+      </w:r>
+    </w:p>
+    <w:p>
+      <w:proofErr w:type="spellStart"/>
+      <w:r>
+        <w:rPr>
+          <w:b/>
+          <w:bCs/>
+        </w:rPr>
+        <w:lastRenderedPageBreak/>
+        <w:t>Practic</w:t>
+      </w:r>
+      <w:proofErr w:type="spellEnd"/>
+      <w:r>
+        <w:rPr>
+          <w:b/>
+          <w:bCs/>
+        </w:rPr>
+        <w:t xml:space="preserve">, </w:t>
+      </w:r>
+      <w:proofErr w:type="spellStart"/>
+      <w:r>
+        <w:rPr>
+          <w:b/>
+          <w:bCs/>
+        </w:rPr>
+        <w:t>clientul</w:t>
+      </w:r>
+      <w:proofErr w:type="spellEnd"/>
+      <w:r>
+        <w:rPr>
+          <w:b/>
+          <w:bCs/>
+        </w:rPr>
+        <w:t xml:space="preserve"> nu are </w:t>
+      </w:r>
+      <w:proofErr w:type="spellStart"/>
+      <w:r>
+        <w:rPr>
+          <w:b/>
+          <w:bCs/>
+        </w:rPr>
+        <w:t>scăpare</w:t>
+      </w:r>
+      <w:proofErr w:type="spellEnd"/>
+      <w:r>
+        <w:rPr>
+          <w:b/>
+          <w:bCs/>
+        </w:rPr>
+        <w:t>:</w:t>
+      </w:r>
+      <w:r>
+        <w:t xml:space="preserve"> Orice </w:t>
+      </w:r>
+      <w:proofErr w:type="spellStart"/>
+      <w:r>
+        <w:t>acțiune</w:t>
+      </w:r>
+      <w:proofErr w:type="spellEnd"/>
+      <w:r>
+        <w:t xml:space="preserve"> </w:t>
+      </w:r>
+      <w:proofErr w:type="spellStart"/>
+      <w:r>
+        <w:t>avansată</w:t>
+      </w:r>
+      <w:proofErr w:type="spellEnd"/>
+      <w:r>
+        <w:t xml:space="preserve"> </w:t>
+      </w:r>
+      <w:proofErr w:type="spellStart"/>
+      <w:r>
+        <w:t>vrea</w:t>
+      </w:r>
+      <w:proofErr w:type="spellEnd"/>
+      <w:r>
+        <w:t xml:space="preserve"> </w:t>
+      </w:r>
+      <w:proofErr w:type="spellStart"/>
+      <w:r>
+        <w:t>să</w:t>
+      </w:r>
+      <w:proofErr w:type="spellEnd"/>
+      <w:r>
+        <w:t xml:space="preserve"> </w:t>
+      </w:r>
+      <w:proofErr w:type="spellStart"/>
+      <w:r>
+        <w:t>facă</w:t>
+      </w:r>
+      <w:proofErr w:type="spellEnd"/>
+      <w:r>
+        <w:t xml:space="preserve">, </w:t>
+      </w:r>
+      <w:proofErr w:type="spellStart"/>
+      <w:r>
+        <w:t>sistemul</w:t>
+      </w:r>
+      <w:proofErr w:type="spellEnd"/>
+      <w:r>
+        <w:t xml:space="preserve"> </w:t>
+      </w:r>
+      <w:proofErr w:type="spellStart"/>
+      <w:r>
+        <w:t>îl</w:t>
+      </w:r>
+      <w:proofErr w:type="spellEnd"/>
+      <w:r>
+        <w:t xml:space="preserve"> </w:t>
+      </w:r>
+      <w:proofErr w:type="spellStart"/>
+      <w:r>
+        <w:t>redirecționează</w:t>
+      </w:r>
+      <w:proofErr w:type="spellEnd"/>
+      <w:r>
+        <w:t xml:space="preserve"> </w:t>
+      </w:r>
+      <w:proofErr w:type="spellStart"/>
+      <w:r>
+        <w:t>subtil</w:t>
+      </w:r>
+      <w:proofErr w:type="spellEnd"/>
+      <w:r>
+        <w:t xml:space="preserve">, </w:t>
+      </w:r>
+      <w:proofErr w:type="spellStart"/>
+      <w:r>
+        <w:t>dar</w:t>
+      </w:r>
+      <w:proofErr w:type="spellEnd"/>
+      <w:r>
+        <w:t xml:space="preserve"> </w:t>
+      </w:r>
+      <w:proofErr w:type="spellStart"/>
+      <w:r>
+        <w:t>sigur</w:t>
+      </w:r>
+      <w:proofErr w:type="spellEnd"/>
+      <w:r>
+        <w:t xml:space="preserve">, </w:t>
+      </w:r>
+      <w:proofErr w:type="spellStart"/>
+      <w:r>
+        <w:t>către</w:t>
+      </w:r>
+      <w:proofErr w:type="spellEnd"/>
+      <w:r>
+        <w:t xml:space="preserve"> a-</w:t>
+      </w:r>
+      <w:proofErr w:type="spellStart"/>
+      <w:r>
+        <w:t>și</w:t>
+      </w:r>
+      <w:proofErr w:type="spellEnd"/>
+      <w:r>
+        <w:t xml:space="preserve"> </w:t>
+      </w:r>
+      <w:proofErr w:type="spellStart"/>
+      <w:r>
+        <w:t>crea</w:t>
+      </w:r>
+      <w:proofErr w:type="spellEnd"/>
+      <w:r>
+        <w:t xml:space="preserve"> un </w:t>
+      </w:r>
+      <w:proofErr w:type="spellStart"/>
+      <w:r>
+        <w:t>cont</w:t>
+      </w:r>
+      <w:proofErr w:type="spellEnd"/>
+      <w:r>
+        <w:t xml:space="preserve"> </w:t>
+      </w:r>
+      <w:proofErr w:type="spellStart"/>
+      <w:r>
+        <w:t>și</w:t>
+      </w:r>
+      <w:proofErr w:type="spellEnd"/>
+      <w:r>
+        <w:t xml:space="preserve"> a </w:t>
+      </w:r>
+      <w:proofErr w:type="spellStart"/>
+      <w:r>
+        <w:t>cumpăra</w:t>
+      </w:r>
+      <w:proofErr w:type="spellEnd"/>
+      <w:r>
+        <w:t xml:space="preserve"> </w:t>
+      </w:r>
+      <w:proofErr w:type="spellStart"/>
+      <w:r>
+        <w:t>acces</w:t>
+      </w:r>
+      <w:proofErr w:type="spellEnd"/>
+      <w:r>
+        <w:t xml:space="preserve"> premium, </w:t>
+      </w:r>
+      <w:proofErr w:type="spellStart"/>
+      <w:r>
+        <w:t>oferindu-i</w:t>
+      </w:r>
+      <w:proofErr w:type="spellEnd"/>
+      <w:r>
+        <w:t xml:space="preserve"> </w:t>
+      </w:r>
+      <w:proofErr w:type="spellStart"/>
+      <w:r>
+        <w:t>în</w:t>
+      </w:r>
+      <w:proofErr w:type="spellEnd"/>
+      <w:r>
+        <w:t xml:space="preserve"> </w:t>
+      </w:r>
+      <w:proofErr w:type="spellStart"/>
+      <w:r>
+        <w:t>același</w:t>
+      </w:r>
+      <w:proofErr w:type="spellEnd"/>
+      <w:r>
+        <w:t xml:space="preserve"> </w:t>
+      </w:r>
+      <w:proofErr w:type="spellStart"/>
+      <w:r>
+        <w:t>timp</w:t>
+      </w:r>
+      <w:proofErr w:type="spellEnd"/>
+      <w:r>
+        <w:t xml:space="preserve"> </w:t>
+      </w:r>
+      <w:proofErr w:type="spellStart"/>
+      <w:r>
+        <w:t>suficientă</w:t>
+      </w:r>
+      <w:proofErr w:type="spellEnd"/>
+      <w:r>
+        <w:t xml:space="preserve"> </w:t>
+      </w:r>
+      <w:proofErr w:type="spellStart"/>
+      <w:r>
+        <w:t>valoare</w:t>
+      </w:r>
+      <w:proofErr w:type="spellEnd"/>
+      <w:r>
+        <w:t xml:space="preserve"> </w:t>
+      </w:r>
+      <w:proofErr w:type="spellStart"/>
+      <w:r>
+        <w:t>gratuită</w:t>
+      </w:r>
+      <w:proofErr w:type="spellEnd"/>
+      <w:r>
+        <w:t xml:space="preserve"> </w:t>
+      </w:r>
+      <w:proofErr w:type="spellStart"/>
+      <w:r>
+        <w:t>încât</w:t>
+      </w:r>
+      <w:proofErr w:type="spellEnd"/>
+      <w:r>
+        <w:t xml:space="preserve"> </w:t>
+      </w:r>
+      <w:proofErr w:type="spellStart"/>
+      <w:r>
+        <w:t>să</w:t>
+      </w:r>
+      <w:proofErr w:type="spellEnd"/>
+      <w:r>
+        <w:t xml:space="preserve"> </w:t>
+      </w:r>
+      <w:proofErr w:type="spellStart"/>
+      <w:r>
+        <w:t>capete</w:t>
+      </w:r>
+      <w:proofErr w:type="spellEnd"/>
+      <w:r>
+        <w:t xml:space="preserve"> </w:t>
+      </w:r>
+      <w:proofErr w:type="spellStart"/>
+      <w:r>
+        <w:t>încredere</w:t>
+      </w:r>
+      <w:proofErr w:type="spellEnd"/>
+      <w:r>
+        <w:t xml:space="preserve"> </w:t>
+      </w:r>
+      <w:proofErr w:type="spellStart"/>
+      <w:r>
+        <w:t>în</w:t>
+      </w:r>
+      <w:proofErr w:type="spellEnd"/>
+      <w:r>
+        <w:t xml:space="preserve"> </w:t>
+      </w:r>
+      <w:proofErr w:type="spellStart"/>
+      <w:r>
+        <w:t>aplicație</w:t>
+      </w:r>
+      <w:proofErr w:type="spellEnd"/>
+      <w:r>
+        <w:t>.</w:t>
       </w:r>
     </w:p>
     <w:p/>
@@ -43206,6 +45393,155 @@
     </w:lvl>
   </w:abstractNum>
   <w:abstractNum w:abstractNumId="24" w15:restartNumberingAfterBreak="0">
+    <w:nsid w:val="64B8329A"/>
+    <w:multiLevelType w:val="multilevel"/>
+    <w:tmpl w:val="F45651C4"/>
+    <w:lvl w:ilvl="0">
+      <w:start w:val="1"/>
+      <w:numFmt w:val="bullet"/>
+      <w:lvlText w:val=""/>
+      <w:lvlJc w:val="left"/>
+      <w:pPr>
+        <w:tabs>
+          <w:tab w:val="num" w:pos="720"/>
+        </w:tabs>
+        <w:ind w:left="720" w:hanging="360"/>
+      </w:pPr>
+      <w:rPr>
+        <w:rFonts w:ascii="Symbol" w:hAnsi="Symbol" w:hint="default"/>
+        <w:sz w:val="20"/>
+      </w:rPr>
+    </w:lvl>
+    <w:lvl w:ilvl="1" w:tentative="1">
+      <w:start w:val="1"/>
+      <w:numFmt w:val="bullet"/>
+      <w:lvlText w:val=""/>
+      <w:lvlJc w:val="left"/>
+      <w:pPr>
+        <w:tabs>
+          <w:tab w:val="num" w:pos="1440"/>
+        </w:tabs>
+        <w:ind w:left="1440" w:hanging="360"/>
+      </w:pPr>
+      <w:rPr>
+        <w:rFonts w:ascii="Symbol" w:hAnsi="Symbol" w:hint="default"/>
+        <w:sz w:val="20"/>
+      </w:rPr>
+    </w:lvl>
+    <w:lvl w:ilvl="2" w:tentative="1">
+      <w:start w:val="1"/>
+      <w:numFmt w:val="bullet"/>
+      <w:lvlText w:val=""/>
+      <w:lvlJc w:val="left"/>
+      <w:pPr>
+        <w:tabs>
+          <w:tab w:val="num" w:pos="2160"/>
+        </w:tabs>
+        <w:ind w:left="2160" w:hanging="360"/>
+      </w:pPr>
+      <w:rPr>
+        <w:rFonts w:ascii="Symbol" w:hAnsi="Symbol" w:hint="default"/>
+        <w:sz w:val="20"/>
+      </w:rPr>
+    </w:lvl>
+    <w:lvl w:ilvl="3" w:tentative="1">
+      <w:start w:val="1"/>
+      <w:numFmt w:val="bullet"/>
+      <w:lvlText w:val=""/>
+      <w:lvlJc w:val="left"/>
+      <w:pPr>
+        <w:tabs>
+          <w:tab w:val="num" w:pos="2880"/>
+        </w:tabs>
+        <w:ind w:left="2880" w:hanging="360"/>
+      </w:pPr>
+      <w:rPr>
+        <w:rFonts w:ascii="Symbol" w:hAnsi="Symbol" w:hint="default"/>
+        <w:sz w:val="20"/>
+      </w:rPr>
+    </w:lvl>
+    <w:lvl w:ilvl="4" w:tentative="1">
+      <w:start w:val="1"/>
+      <w:numFmt w:val="bullet"/>
+      <w:lvlText w:val=""/>
+      <w:lvlJc w:val="left"/>
+      <w:pPr>
+        <w:tabs>
+          <w:tab w:val="num" w:pos="3600"/>
+        </w:tabs>
+        <w:ind w:left="3600" w:hanging="360"/>
+      </w:pPr>
+      <w:rPr>
+        <w:rFonts w:ascii="Symbol" w:hAnsi="Symbol" w:hint="default"/>
+        <w:sz w:val="20"/>
+      </w:rPr>
+    </w:lvl>
+    <w:lvl w:ilvl="5" w:tentative="1">
+      <w:start w:val="1"/>
+      <w:numFmt w:val="bullet"/>
+      <w:lvlText w:val=""/>
+      <w:lvlJc w:val="left"/>
+      <w:pPr>
+        <w:tabs>
+          <w:tab w:val="num" w:pos="4320"/>
+        </w:tabs>
+        <w:ind w:left="4320" w:hanging="360"/>
+      </w:pPr>
+      <w:rPr>
+        <w:rFonts w:ascii="Symbol" w:hAnsi="Symbol" w:hint="default"/>
+        <w:sz w:val="20"/>
+      </w:rPr>
+    </w:lvl>
+    <w:lvl w:ilvl="6" w:tentative="1">
+      <w:start w:val="1"/>
+      <w:numFmt w:val="bullet"/>
+      <w:lvlText w:val=""/>
+      <w:lvlJc w:val="left"/>
+      <w:pPr>
+        <w:tabs>
+          <w:tab w:val="num" w:pos="5040"/>
+        </w:tabs>
+        <w:ind w:left="5040" w:hanging="360"/>
+      </w:pPr>
+      <w:rPr>
+        <w:rFonts w:ascii="Symbol" w:hAnsi="Symbol" w:hint="default"/>
+        <w:sz w:val="20"/>
+      </w:rPr>
+    </w:lvl>
+    <w:lvl w:ilvl="7" w:tentative="1">
+      <w:start w:val="1"/>
+      <w:numFmt w:val="bullet"/>
+      <w:lvlText w:val=""/>
+      <w:lvlJc w:val="left"/>
+      <w:pPr>
+        <w:tabs>
+          <w:tab w:val="num" w:pos="5760"/>
+        </w:tabs>
+        <w:ind w:left="5760" w:hanging="360"/>
+      </w:pPr>
+      <w:rPr>
+        <w:rFonts w:ascii="Symbol" w:hAnsi="Symbol" w:hint="default"/>
+        <w:sz w:val="20"/>
+      </w:rPr>
+    </w:lvl>
+    <w:lvl w:ilvl="8" w:tentative="1">
+      <w:start w:val="1"/>
+      <w:numFmt w:val="bullet"/>
+      <w:lvlText w:val=""/>
+      <w:lvlJc w:val="left"/>
+      <w:pPr>
+        <w:tabs>
+          <w:tab w:val="num" w:pos="6480"/>
+        </w:tabs>
+        <w:ind w:left="6480" w:hanging="360"/>
+      </w:pPr>
+      <w:rPr>
+        <w:rFonts w:ascii="Symbol" w:hAnsi="Symbol" w:hint="default"/>
+        <w:sz w:val="20"/>
+      </w:rPr>
+    </w:lvl>
+  </w:abstractNum>
+  <w:abstractNum w:abstractNumId="25" w15:restartNumberingAfterBreak="0">
     <w:nsid w:val="69244E7A"/>
     <w:multiLevelType w:val="multilevel"/>
     <w:tmpl w:val="D820DD34"/>
@@ -43354,7 +45690,156 @@
       </w:rPr>
     </w:lvl>
   </w:abstractNum>
-  <w:abstractNum w:abstractNumId="25" w15:restartNumberingAfterBreak="0">
+  <w:abstractNum w:abstractNumId="26" w15:restartNumberingAfterBreak="0">
+    <w:nsid w:val="6D396BBD"/>
+    <w:multiLevelType w:val="multilevel"/>
+    <w:tmpl w:val="04B60C1C"/>
+    <w:lvl w:ilvl="0">
+      <w:start w:val="1"/>
+      <w:numFmt w:val="bullet"/>
+      <w:lvlText w:val=""/>
+      <w:lvlJc w:val="left"/>
+      <w:pPr>
+        <w:tabs>
+          <w:tab w:val="num" w:pos="720"/>
+        </w:tabs>
+        <w:ind w:left="720" w:hanging="360"/>
+      </w:pPr>
+      <w:rPr>
+        <w:rFonts w:ascii="Symbol" w:hAnsi="Symbol" w:hint="default"/>
+        <w:sz w:val="20"/>
+      </w:rPr>
+    </w:lvl>
+    <w:lvl w:ilvl="1" w:tentative="1">
+      <w:start w:val="1"/>
+      <w:numFmt w:val="bullet"/>
+      <w:lvlText w:val=""/>
+      <w:lvlJc w:val="left"/>
+      <w:pPr>
+        <w:tabs>
+          <w:tab w:val="num" w:pos="1440"/>
+        </w:tabs>
+        <w:ind w:left="1440" w:hanging="360"/>
+      </w:pPr>
+      <w:rPr>
+        <w:rFonts w:ascii="Symbol" w:hAnsi="Symbol" w:hint="default"/>
+        <w:sz w:val="20"/>
+      </w:rPr>
+    </w:lvl>
+    <w:lvl w:ilvl="2" w:tentative="1">
+      <w:start w:val="1"/>
+      <w:numFmt w:val="bullet"/>
+      <w:lvlText w:val=""/>
+      <w:lvlJc w:val="left"/>
+      <w:pPr>
+        <w:tabs>
+          <w:tab w:val="num" w:pos="2160"/>
+        </w:tabs>
+        <w:ind w:left="2160" w:hanging="360"/>
+      </w:pPr>
+      <w:rPr>
+        <w:rFonts w:ascii="Symbol" w:hAnsi="Symbol" w:hint="default"/>
+        <w:sz w:val="20"/>
+      </w:rPr>
+    </w:lvl>
+    <w:lvl w:ilvl="3" w:tentative="1">
+      <w:start w:val="1"/>
+      <w:numFmt w:val="bullet"/>
+      <w:lvlText w:val=""/>
+      <w:lvlJc w:val="left"/>
+      <w:pPr>
+        <w:tabs>
+          <w:tab w:val="num" w:pos="2880"/>
+        </w:tabs>
+        <w:ind w:left="2880" w:hanging="360"/>
+      </w:pPr>
+      <w:rPr>
+        <w:rFonts w:ascii="Symbol" w:hAnsi="Symbol" w:hint="default"/>
+        <w:sz w:val="20"/>
+      </w:rPr>
+    </w:lvl>
+    <w:lvl w:ilvl="4" w:tentative="1">
+      <w:start w:val="1"/>
+      <w:numFmt w:val="bullet"/>
+      <w:lvlText w:val=""/>
+      <w:lvlJc w:val="left"/>
+      <w:pPr>
+        <w:tabs>
+          <w:tab w:val="num" w:pos="3600"/>
+        </w:tabs>
+        <w:ind w:left="3600" w:hanging="360"/>
+      </w:pPr>
+      <w:rPr>
+        <w:rFonts w:ascii="Symbol" w:hAnsi="Symbol" w:hint="default"/>
+        <w:sz w:val="20"/>
+      </w:rPr>
+    </w:lvl>
+    <w:lvl w:ilvl="5" w:tentative="1">
+      <w:start w:val="1"/>
+      <w:numFmt w:val="bullet"/>
+      <w:lvlText w:val=""/>
+      <w:lvlJc w:val="left"/>
+      <w:pPr>
+        <w:tabs>
+          <w:tab w:val="num" w:pos="4320"/>
+        </w:tabs>
+        <w:ind w:left="4320" w:hanging="360"/>
+      </w:pPr>
+      <w:rPr>
+        <w:rFonts w:ascii="Symbol" w:hAnsi="Symbol" w:hint="default"/>
+        <w:sz w:val="20"/>
+      </w:rPr>
+    </w:lvl>
+    <w:lvl w:ilvl="6" w:tentative="1">
+      <w:start w:val="1"/>
+      <w:numFmt w:val="bullet"/>
+      <w:lvlText w:val=""/>
+      <w:lvlJc w:val="left"/>
+      <w:pPr>
+        <w:tabs>
+          <w:tab w:val="num" w:pos="5040"/>
+        </w:tabs>
+        <w:ind w:left="5040" w:hanging="360"/>
+      </w:pPr>
+      <w:rPr>
+        <w:rFonts w:ascii="Symbol" w:hAnsi="Symbol" w:hint="default"/>
+        <w:sz w:val="20"/>
+      </w:rPr>
+    </w:lvl>
+    <w:lvl w:ilvl="7" w:tentative="1">
+      <w:start w:val="1"/>
+      <w:numFmt w:val="bullet"/>
+      <w:lvlText w:val=""/>
+      <w:lvlJc w:val="left"/>
+      <w:pPr>
+        <w:tabs>
+          <w:tab w:val="num" w:pos="5760"/>
+        </w:tabs>
+        <w:ind w:left="5760" w:hanging="360"/>
+      </w:pPr>
+      <w:rPr>
+        <w:rFonts w:ascii="Symbol" w:hAnsi="Symbol" w:hint="default"/>
+        <w:sz w:val="20"/>
+      </w:rPr>
+    </w:lvl>
+    <w:lvl w:ilvl="8" w:tentative="1">
+      <w:start w:val="1"/>
+      <w:numFmt w:val="bullet"/>
+      <w:lvlText w:val=""/>
+      <w:lvlJc w:val="left"/>
+      <w:pPr>
+        <w:tabs>
+          <w:tab w:val="num" w:pos="6480"/>
+        </w:tabs>
+        <w:ind w:left="6480" w:hanging="360"/>
+      </w:pPr>
+      <w:rPr>
+        <w:rFonts w:ascii="Symbol" w:hAnsi="Symbol" w:hint="default"/>
+        <w:sz w:val="20"/>
+      </w:rPr>
+    </w:lvl>
+  </w:abstractNum>
+  <w:abstractNum w:abstractNumId="27" w15:restartNumberingAfterBreak="0">
     <w:nsid w:val="704D15E2"/>
     <w:multiLevelType w:val="multilevel"/>
     <w:tmpl w:val="7F4AD972"/>
@@ -43467,7 +45952,156 @@
       </w:pPr>
     </w:lvl>
   </w:abstractNum>
-  <w:abstractNum w:abstractNumId="26" w15:restartNumberingAfterBreak="0">
+  <w:abstractNum w:abstractNumId="28" w15:restartNumberingAfterBreak="0">
+    <w:nsid w:val="76C959E9"/>
+    <w:multiLevelType w:val="multilevel"/>
+    <w:tmpl w:val="270AF63A"/>
+    <w:lvl w:ilvl="0">
+      <w:start w:val="1"/>
+      <w:numFmt w:val="bullet"/>
+      <w:lvlText w:val=""/>
+      <w:lvlJc w:val="left"/>
+      <w:pPr>
+        <w:tabs>
+          <w:tab w:val="num" w:pos="720"/>
+        </w:tabs>
+        <w:ind w:left="720" w:hanging="360"/>
+      </w:pPr>
+      <w:rPr>
+        <w:rFonts w:ascii="Symbol" w:hAnsi="Symbol" w:hint="default"/>
+        <w:sz w:val="20"/>
+      </w:rPr>
+    </w:lvl>
+    <w:lvl w:ilvl="1" w:tentative="1">
+      <w:start w:val="1"/>
+      <w:numFmt w:val="bullet"/>
+      <w:lvlText w:val=""/>
+      <w:lvlJc w:val="left"/>
+      <w:pPr>
+        <w:tabs>
+          <w:tab w:val="num" w:pos="1440"/>
+        </w:tabs>
+        <w:ind w:left="1440" w:hanging="360"/>
+      </w:pPr>
+      <w:rPr>
+        <w:rFonts w:ascii="Symbol" w:hAnsi="Symbol" w:hint="default"/>
+        <w:sz w:val="20"/>
+      </w:rPr>
+    </w:lvl>
+    <w:lvl w:ilvl="2" w:tentative="1">
+      <w:start w:val="1"/>
+      <w:numFmt w:val="bullet"/>
+      <w:lvlText w:val=""/>
+      <w:lvlJc w:val="left"/>
+      <w:pPr>
+        <w:tabs>
+          <w:tab w:val="num" w:pos="2160"/>
+        </w:tabs>
+        <w:ind w:left="2160" w:hanging="360"/>
+      </w:pPr>
+      <w:rPr>
+        <w:rFonts w:ascii="Symbol" w:hAnsi="Symbol" w:hint="default"/>
+        <w:sz w:val="20"/>
+      </w:rPr>
+    </w:lvl>
+    <w:lvl w:ilvl="3" w:tentative="1">
+      <w:start w:val="1"/>
+      <w:numFmt w:val="bullet"/>
+      <w:lvlText w:val=""/>
+      <w:lvlJc w:val="left"/>
+      <w:pPr>
+        <w:tabs>
+          <w:tab w:val="num" w:pos="2880"/>
+        </w:tabs>
+        <w:ind w:left="2880" w:hanging="360"/>
+      </w:pPr>
+      <w:rPr>
+        <w:rFonts w:ascii="Symbol" w:hAnsi="Symbol" w:hint="default"/>
+        <w:sz w:val="20"/>
+      </w:rPr>
+    </w:lvl>
+    <w:lvl w:ilvl="4" w:tentative="1">
+      <w:start w:val="1"/>
+      <w:numFmt w:val="bullet"/>
+      <w:lvlText w:val=""/>
+      <w:lvlJc w:val="left"/>
+      <w:pPr>
+        <w:tabs>
+          <w:tab w:val="num" w:pos="3600"/>
+        </w:tabs>
+        <w:ind w:left="3600" w:hanging="360"/>
+      </w:pPr>
+      <w:rPr>
+        <w:rFonts w:ascii="Symbol" w:hAnsi="Symbol" w:hint="default"/>
+        <w:sz w:val="20"/>
+      </w:rPr>
+    </w:lvl>
+    <w:lvl w:ilvl="5" w:tentative="1">
+      <w:start w:val="1"/>
+      <w:numFmt w:val="bullet"/>
+      <w:lvlText w:val=""/>
+      <w:lvlJc w:val="left"/>
+      <w:pPr>
+        <w:tabs>
+          <w:tab w:val="num" w:pos="4320"/>
+        </w:tabs>
+        <w:ind w:left="4320" w:hanging="360"/>
+      </w:pPr>
+      <w:rPr>
+        <w:rFonts w:ascii="Symbol" w:hAnsi="Symbol" w:hint="default"/>
+        <w:sz w:val="20"/>
+      </w:rPr>
+    </w:lvl>
+    <w:lvl w:ilvl="6" w:tentative="1">
+      <w:start w:val="1"/>
+      <w:numFmt w:val="bullet"/>
+      <w:lvlText w:val=""/>
+      <w:lvlJc w:val="left"/>
+      <w:pPr>
+        <w:tabs>
+          <w:tab w:val="num" w:pos="5040"/>
+        </w:tabs>
+        <w:ind w:left="5040" w:hanging="360"/>
+      </w:pPr>
+      <w:rPr>
+        <w:rFonts w:ascii="Symbol" w:hAnsi="Symbol" w:hint="default"/>
+        <w:sz w:val="20"/>
+      </w:rPr>
+    </w:lvl>
+    <w:lvl w:ilvl="7" w:tentative="1">
+      <w:start w:val="1"/>
+      <w:numFmt w:val="bullet"/>
+      <w:lvlText w:val=""/>
+      <w:lvlJc w:val="left"/>
+      <w:pPr>
+        <w:tabs>
+          <w:tab w:val="num" w:pos="5760"/>
+        </w:tabs>
+        <w:ind w:left="5760" w:hanging="360"/>
+      </w:pPr>
+      <w:rPr>
+        <w:rFonts w:ascii="Symbol" w:hAnsi="Symbol" w:hint="default"/>
+        <w:sz w:val="20"/>
+      </w:rPr>
+    </w:lvl>
+    <w:lvl w:ilvl="8" w:tentative="1">
+      <w:start w:val="1"/>
+      <w:numFmt w:val="bullet"/>
+      <w:lvlText w:val=""/>
+      <w:lvlJc w:val="left"/>
+      <w:pPr>
+        <w:tabs>
+          <w:tab w:val="num" w:pos="6480"/>
+        </w:tabs>
+        <w:ind w:left="6480" w:hanging="360"/>
+      </w:pPr>
+      <w:rPr>
+        <w:rFonts w:ascii="Symbol" w:hAnsi="Symbol" w:hint="default"/>
+        <w:sz w:val="20"/>
+      </w:rPr>
+    </w:lvl>
+  </w:abstractNum>
+  <w:abstractNum w:abstractNumId="29" w15:restartNumberingAfterBreak="0">
     <w:nsid w:val="78966E5B"/>
     <w:multiLevelType w:val="multilevel"/>
     <w:tmpl w:val="ED36EF66"/>
@@ -43580,7 +46214,7 @@
       </w:pPr>
     </w:lvl>
   </w:abstractNum>
-  <w:abstractNum w:abstractNumId="27" w15:restartNumberingAfterBreak="0">
+  <w:abstractNum w:abstractNumId="30" w15:restartNumberingAfterBreak="0">
     <w:nsid w:val="794B0439"/>
     <w:multiLevelType w:val="multilevel"/>
     <w:tmpl w:val="7C4CDFAE"/>
@@ -43693,7 +46327,7 @@
       </w:pPr>
     </w:lvl>
   </w:abstractNum>
-  <w:abstractNum w:abstractNumId="28" w15:restartNumberingAfterBreak="0">
+  <w:abstractNum w:abstractNumId="31" w15:restartNumberingAfterBreak="0">
     <w:nsid w:val="79DA7676"/>
     <w:multiLevelType w:val="multilevel"/>
     <w:tmpl w:val="DF2639A2"/>
@@ -43810,7 +46444,7 @@
       </w:pPr>
     </w:lvl>
   </w:abstractNum>
-  <w:abstractNum w:abstractNumId="29" w15:restartNumberingAfterBreak="0">
+  <w:abstractNum w:abstractNumId="32" w15:restartNumberingAfterBreak="0">
     <w:nsid w:val="7A3F26DD"/>
     <w:multiLevelType w:val="multilevel"/>
     <w:tmpl w:val="271E1636"/>
@@ -43945,7 +46579,7 @@
     <w:abstractNumId w:val="14"/>
   </w:num>
   <w:num w:numId="8" w16cid:durableId="1189416595">
-    <w:abstractNumId w:val="24"/>
+    <w:abstractNumId w:val="25"/>
   </w:num>
   <w:num w:numId="9" w16cid:durableId="186061792">
     <w:abstractNumId w:val="19"/>
@@ -43978,7 +46612,7 @@
     <w:abstractNumId w:val="9"/>
   </w:num>
   <w:num w:numId="19" w16cid:durableId="1924800153">
-    <w:abstractNumId w:val="26"/>
+    <w:abstractNumId w:val="29"/>
   </w:num>
   <w:num w:numId="20" w16cid:durableId="1696881846">
     <w:abstractNumId w:val="8"/>
@@ -43999,19 +46633,28 @@
     <w:abstractNumId w:val="12"/>
   </w:num>
   <w:num w:numId="26" w16cid:durableId="959461528">
-    <w:abstractNumId w:val="29"/>
+    <w:abstractNumId w:val="32"/>
   </w:num>
   <w:num w:numId="27" w16cid:durableId="1004671226">
-    <w:abstractNumId w:val="25"/>
+    <w:abstractNumId w:val="27"/>
   </w:num>
   <w:num w:numId="28" w16cid:durableId="1564487679">
-    <w:abstractNumId w:val="27"/>
+    <w:abstractNumId w:val="30"/>
   </w:num>
   <w:num w:numId="29" w16cid:durableId="859272753">
-    <w:abstractNumId w:val="28"/>
+    <w:abstractNumId w:val="31"/>
   </w:num>
   <w:num w:numId="30" w16cid:durableId="961500578">
     <w:abstractNumId w:val="3"/>
+  </w:num>
+  <w:num w:numId="31" w16cid:durableId="660810920">
+    <w:abstractNumId w:val="24"/>
+  </w:num>
+  <w:num w:numId="32" w16cid:durableId="1272322208">
+    <w:abstractNumId w:val="28"/>
+  </w:num>
+  <w:num w:numId="33" w16cid:durableId="1898736511">
+    <w:abstractNumId w:val="26"/>
   </w:num>
 </w:numbering>
 </file>

</xml_diff>

<commit_message>
UX: Absolute position the pie chart legend so Recharts gives the pie full charting space. Result: Pie chart is much larger and perfectly centered in its half of the screen.
</commit_message>
<xml_diff>
--- a/google_adsens.docx
+++ b/google_adsens.docx
@@ -4,29 +4,19 @@
   <w:body>
     <w:p>
       <w:r>
-        <w:fldChar w:fldCharType="begin"/>
-      </w:r>
-      <w:r>
-        <w:instrText>HYPERLINK "</w:instrText>
-      </w:r>
-      <w:r>
-        <w:instrText>https://adsense.google.com/adsense/u/0/pub-5089980515174940/onboarding</w:instrText>
-      </w:r>
-      <w:r>
-        <w:instrText>"</w:instrText>
-      </w:r>
-      <w:r>
-        <w:fldChar w:fldCharType="separate"/>
-      </w:r>
-      <w:r>
-        <w:rPr>
-          <w:rStyle w:val="Hyperlink"/>
-        </w:rPr>
-        <w:t>https://adsense.google.com/adsense/u/0/pub-5089980515174940/onboarding</w:t>
-      </w:r>
-      <w:r>
-        <w:fldChar w:fldCharType="end"/>
-      </w:r>
+        <w:t>https://ideea-ta-ai.vercel.app/start?dev=true</w:t>
+      </w:r>
+    </w:p>
+    <w:p/>
+    <w:p>
+      <w:hyperlink r:id="rId5" w:history="1">
+        <w:r>
+          <w:rPr>
+            <w:rStyle w:val="Hyperlink"/>
+          </w:rPr>
+          <w:t>https://adsense.google.com/adsense/u/0/pub-5089980515174940/onboarding</w:t>
+        </w:r>
+      </w:hyperlink>
     </w:p>
     <w:p/>
     <w:p>
@@ -236,74 +226,6 @@
                 <pic:pic xmlns:pic="http://schemas.openxmlformats.org/drawingml/2006/picture">
                   <pic:nvPicPr>
                     <pic:cNvPr id="597708322" name=""/>
-                    <pic:cNvPicPr/>
-                  </pic:nvPicPr>
-                  <pic:blipFill>
-                    <a:blip r:embed="rId5"/>
-                    <a:stretch>
-                      <a:fillRect/>
-                    </a:stretch>
-                  </pic:blipFill>
-                  <pic:spPr>
-                    <a:xfrm>
-                      <a:off x="0" y="0"/>
-                      <a:ext cx="5943600" cy="3343275"/>
-                    </a:xfrm>
-                    <a:prstGeom prst="rect">
-                      <a:avLst/>
-                    </a:prstGeom>
-                  </pic:spPr>
-                </pic:pic>
-              </a:graphicData>
-            </a:graphic>
-          </wp:inline>
-        </w:drawing>
-      </w:r>
-    </w:p>
-    <w:p/>
-    <w:p>
-      <w:r>
-        <w:t>Si</w:t>
-      </w:r>
-    </w:p>
-    <w:p/>
-    <w:p>
-      <w:r>
-        <w:t xml:space="preserve">Cod donate, </w:t>
-      </w:r>
-      <w:proofErr w:type="spellStart"/>
-      <w:r>
-        <w:t>adica</w:t>
-      </w:r>
-      <w:proofErr w:type="spellEnd"/>
-      <w:r>
-        <w:t xml:space="preserve"> </w:t>
-      </w:r>
-      <w:proofErr w:type="spellStart"/>
-      <w:r>
-        <w:t>byemeacoffe</w:t>
-      </w:r>
-      <w:proofErr w:type="spellEnd"/>
-    </w:p>
-    <w:p>
-      <w:r>
-        <w:rPr>
-          <w:noProof/>
-        </w:rPr>
-        <w:lastRenderedPageBreak/>
-        <w:drawing>
-          <wp:inline distT="0" distB="0" distL="0" distR="0" wp14:anchorId="7519B944" wp14:editId="058E63C7">
-            <wp:extent cx="5943600" cy="3343275"/>
-            <wp:effectExtent l="0" t="0" r="0" b="9525"/>
-            <wp:docPr id="1925702587" name="Picture 1"/>
-            <wp:cNvGraphicFramePr>
-              <a:graphicFrameLocks xmlns:a="http://schemas.openxmlformats.org/drawingml/2006/main" noChangeAspect="1"/>
-            </wp:cNvGraphicFramePr>
-            <a:graphic xmlns:a="http://schemas.openxmlformats.org/drawingml/2006/main">
-              <a:graphicData uri="http://schemas.openxmlformats.org/drawingml/2006/picture">
-                <pic:pic xmlns:pic="http://schemas.openxmlformats.org/drawingml/2006/picture">
-                  <pic:nvPicPr>
-                    <pic:cNvPr id="1925702587" name=""/>
                     <pic:cNvPicPr/>
                   </pic:nvPicPr>
                   <pic:blipFill>
@@ -331,6 +253,74 @@
     <w:p/>
     <w:p>
       <w:r>
+        <w:t>Si</w:t>
+      </w:r>
+    </w:p>
+    <w:p/>
+    <w:p>
+      <w:r>
+        <w:t xml:space="preserve">Cod donate, </w:t>
+      </w:r>
+      <w:proofErr w:type="spellStart"/>
+      <w:r>
+        <w:t>adica</w:t>
+      </w:r>
+      <w:proofErr w:type="spellEnd"/>
+      <w:r>
+        <w:t xml:space="preserve"> </w:t>
+      </w:r>
+      <w:proofErr w:type="spellStart"/>
+      <w:r>
+        <w:t>byemeacoffe</w:t>
+      </w:r>
+      <w:proofErr w:type="spellEnd"/>
+    </w:p>
+    <w:p>
+      <w:r>
+        <w:rPr>
+          <w:noProof/>
+        </w:rPr>
+        <w:lastRenderedPageBreak/>
+        <w:drawing>
+          <wp:inline distT="0" distB="0" distL="0" distR="0" wp14:anchorId="7519B944" wp14:editId="058E63C7">
+            <wp:extent cx="5943600" cy="3343275"/>
+            <wp:effectExtent l="0" t="0" r="0" b="9525"/>
+            <wp:docPr id="1925702587" name="Picture 1"/>
+            <wp:cNvGraphicFramePr>
+              <a:graphicFrameLocks xmlns:a="http://schemas.openxmlformats.org/drawingml/2006/main" noChangeAspect="1"/>
+            </wp:cNvGraphicFramePr>
+            <a:graphic xmlns:a="http://schemas.openxmlformats.org/drawingml/2006/main">
+              <a:graphicData uri="http://schemas.openxmlformats.org/drawingml/2006/picture">
+                <pic:pic xmlns:pic="http://schemas.openxmlformats.org/drawingml/2006/picture">
+                  <pic:nvPicPr>
+                    <pic:cNvPr id="1925702587" name=""/>
+                    <pic:cNvPicPr/>
+                  </pic:nvPicPr>
+                  <pic:blipFill>
+                    <a:blip r:embed="rId7"/>
+                    <a:stretch>
+                      <a:fillRect/>
+                    </a:stretch>
+                  </pic:blipFill>
+                  <pic:spPr>
+                    <a:xfrm>
+                      <a:off x="0" y="0"/>
+                      <a:ext cx="5943600" cy="3343275"/>
+                    </a:xfrm>
+                    <a:prstGeom prst="rect">
+                      <a:avLst/>
+                    </a:prstGeom>
+                  </pic:spPr>
+                </pic:pic>
+              </a:graphicData>
+            </a:graphic>
+          </wp:inline>
+        </w:drawing>
+      </w:r>
+    </w:p>
+    <w:p/>
+    <w:p>
+      <w:r>
         <w:rPr>
           <w:noProof/>
         </w:rPr>
@@ -353,7 +343,7 @@
                     </pic:cNvPicPr>
                   </pic:nvPicPr>
                   <pic:blipFill>
-                    <a:blip r:embed="rId7">
+                    <a:blip r:embed="rId8">
                       <a:extLst>
                         <a:ext uri="{28A0092B-C50C-407E-A947-70E740481C1C}">
                           <a14:useLocalDpi xmlns:a14="http://schemas.microsoft.com/office/drawing/2010/main" val="0"/>
@@ -409,7 +399,7 @@
                     <pic:cNvPicPr/>
                   </pic:nvPicPr>
                   <pic:blipFill>
-                    <a:blip r:embed="rId8"/>
+                    <a:blip r:embed="rId9"/>
                     <a:stretch>
                       <a:fillRect/>
                     </a:stretch>
@@ -4120,15 +4110,7 @@
       </w:r>
       <w:proofErr w:type="spellEnd"/>
       <w:r>
-        <w:t xml:space="preserve"> le-</w:t>
-      </w:r>
-      <w:proofErr w:type="gramStart"/>
-      <w:r>
-        <w:t>a</w:t>
-      </w:r>
-      <w:proofErr w:type="gramEnd"/>
-      <w:r>
-        <w:t xml:space="preserve"> </w:t>
+        <w:t xml:space="preserve"> le-a </w:t>
       </w:r>
       <w:proofErr w:type="spellStart"/>
       <w:r>
@@ -7699,15 +7681,7 @@
       </w:r>
       <w:proofErr w:type="spellEnd"/>
       <w:r>
-        <w:t xml:space="preserve"> le-</w:t>
-      </w:r>
-      <w:proofErr w:type="gramStart"/>
-      <w:r>
-        <w:t>a</w:t>
-      </w:r>
-      <w:proofErr w:type="gramEnd"/>
-      <w:r>
-        <w:t xml:space="preserve"> </w:t>
+        <w:t xml:space="preserve"> le-a </w:t>
       </w:r>
       <w:proofErr w:type="spellStart"/>
       <w:r>
@@ -10996,15 +10970,7 @@
       </w:r>
       <w:proofErr w:type="spellEnd"/>
       <w:r>
-        <w:t xml:space="preserve"> </w:t>
-      </w:r>
-      <w:proofErr w:type="gramStart"/>
-      <w:r>
-        <w:t>un plan</w:t>
-      </w:r>
-      <w:proofErr w:type="gramEnd"/>
-      <w:r>
-        <w:t xml:space="preserve"> </w:t>
+        <w:t xml:space="preserve"> un plan </w:t>
       </w:r>
       <w:proofErr w:type="spellStart"/>
       <w:r>
@@ -16012,12 +15978,10 @@
         <w:t xml:space="preserve"> de pe TikTok, Facebook, Instagram, Telegram </w:t>
       </w:r>
       <w:proofErr w:type="spellStart"/>
-      <w:proofErr w:type="gramStart"/>
       <w:r>
         <w:t>etc.Cum</w:t>
       </w:r>
       <w:proofErr w:type="spellEnd"/>
-      <w:proofErr w:type="gramEnd"/>
       <w:r>
         <w:t xml:space="preserve"> </w:t>
       </w:r>
@@ -16088,15 +16052,7 @@
       </w:r>
       <w:proofErr w:type="spellEnd"/>
       <w:r>
-        <w:t xml:space="preserve"> </w:t>
-      </w:r>
-      <w:proofErr w:type="gramStart"/>
-      <w:r>
-        <w:t>un link</w:t>
-      </w:r>
-      <w:proofErr w:type="gramEnd"/>
-      <w:r>
-        <w:t xml:space="preserve"> special, de </w:t>
+        <w:t xml:space="preserve"> un link special, de </w:t>
       </w:r>
       <w:proofErr w:type="spellStart"/>
       <w:r>
@@ -16870,17 +16826,12 @@
         <w:t xml:space="preserve">cum pot </w:t>
       </w:r>
       <w:proofErr w:type="spellStart"/>
-      <w:proofErr w:type="gramStart"/>
       <w:r>
         <w:t>verifica</w:t>
       </w:r>
       <w:proofErr w:type="spellEnd"/>
       <w:r>
-        <w:t xml:space="preserve"> ?</w:t>
-      </w:r>
-      <w:proofErr w:type="gramEnd"/>
-      <w:r>
-        <w:t xml:space="preserve"> am telegram, </w:t>
+        <w:t xml:space="preserve"> ? am telegram, </w:t>
       </w:r>
       <w:proofErr w:type="spellStart"/>
       <w:r>
@@ -17668,15 +17619,7 @@
       </w:r>
       <w:proofErr w:type="spellEnd"/>
       <w:r>
-        <w:t>-</w:t>
-      </w:r>
-      <w:proofErr w:type="gramStart"/>
-      <w:r>
-        <w:t>un Story</w:t>
-      </w:r>
-      <w:proofErr w:type="gramEnd"/>
-      <w:r>
-        <w:t xml:space="preserve"> pe Instagram pe </w:t>
+        <w:t xml:space="preserve">-un Story pe Instagram pe </w:t>
       </w:r>
       <w:proofErr w:type="spellStart"/>
       <w:r>
@@ -19454,15 +19397,7 @@
       </w:r>
       <w:proofErr w:type="spellEnd"/>
       <w:r>
-        <w:t xml:space="preserve"> a </w:t>
-      </w:r>
-      <w:proofErr w:type="gramStart"/>
-      <w:r>
-        <w:t>continua</w:t>
-      </w:r>
-      <w:proofErr w:type="gramEnd"/>
-      <w:r>
-        <w:t xml:space="preserve">."* 2. **Are </w:t>
+        <w:t xml:space="preserve"> a continua."* 2. **Are </w:t>
       </w:r>
       <w:proofErr w:type="spellStart"/>
       <w:r>
@@ -19502,15 +19437,7 @@
       </w:r>
       <w:proofErr w:type="spellEnd"/>
       <w:r>
-        <w:t xml:space="preserve"> EXACT DE DOUĂ </w:t>
-      </w:r>
-      <w:proofErr w:type="gramStart"/>
-      <w:r>
-        <w:t>ORI.*</w:t>
-      </w:r>
-      <w:proofErr w:type="gramEnd"/>
-      <w:r>
-        <w:t xml:space="preserve">* (Ex: </w:t>
+        <w:t xml:space="preserve"> EXACT DE DOUĂ ORI.** (Ex: </w:t>
       </w:r>
       <w:proofErr w:type="spellStart"/>
       <w:r>
@@ -20236,15 +20163,7 @@
       </w:r>
       <w:proofErr w:type="spellEnd"/>
       <w:r>
-        <w:t xml:space="preserve"> din spate" (</w:t>
-      </w:r>
-      <w:proofErr w:type="gramStart"/>
-      <w:r>
-        <w:t>un link</w:t>
-      </w:r>
-      <w:proofErr w:type="gramEnd"/>
-      <w:r>
-        <w:t xml:space="preserve"> secret) pe care o </w:t>
+        <w:t xml:space="preserve"> din spate" (un link secret) pe care o </w:t>
       </w:r>
       <w:proofErr w:type="spellStart"/>
       <w:r>
@@ -20462,7 +20381,7 @@
         </w:rPr>
         <w:t> </w:t>
       </w:r>
-      <w:hyperlink r:id="rId9" w:history="1">
+      <w:hyperlink r:id="rId10" w:history="1">
         <w:r>
           <w:rPr>
             <w:rStyle w:val="Hyperlink"/>
@@ -20479,17 +20398,12 @@
         <w:t xml:space="preserve">Acel </w:t>
       </w:r>
       <w:proofErr w:type="spellStart"/>
-      <w:proofErr w:type="gramStart"/>
       <w:r>
         <w:t>cuvânt</w:t>
       </w:r>
       <w:proofErr w:type="spellEnd"/>
       <w:r>
-        <w:t> ?dev</w:t>
-      </w:r>
-      <w:proofErr w:type="gramEnd"/>
-      <w:r>
-        <w:t xml:space="preserve">=true de la </w:t>
+        <w:t xml:space="preserve"> ?dev=true de la </w:t>
       </w:r>
       <w:proofErr w:type="spellStart"/>
       <w:r>
@@ -21581,15 +21495,7 @@
       </w:r>
       <w:proofErr w:type="spellEnd"/>
       <w:r>
-        <w:t xml:space="preserve"> de </w:t>
-      </w:r>
-      <w:proofErr w:type="gramStart"/>
-      <w:r>
-        <w:t>a</w:t>
-      </w:r>
-      <w:proofErr w:type="gramEnd"/>
-      <w:r>
-        <w:t xml:space="preserve"> </w:t>
+        <w:t xml:space="preserve"> de a </w:t>
       </w:r>
       <w:proofErr w:type="spellStart"/>
       <w:r>
@@ -21896,15 +21802,7 @@
       </w:r>
       <w:proofErr w:type="spellEnd"/>
       <w:r>
-        <w:t xml:space="preserve"> </w:t>
-      </w:r>
-      <w:proofErr w:type="gramStart"/>
-      <w:r>
-        <w:t>un ID</w:t>
-      </w:r>
-      <w:proofErr w:type="gramEnd"/>
-      <w:r>
-        <w:t xml:space="preserve"> </w:t>
+        <w:t xml:space="preserve"> un ID </w:t>
       </w:r>
       <w:proofErr w:type="spellStart"/>
       <w:r>
@@ -21944,15 +21842,7 @@
       </w:r>
       <w:proofErr w:type="spellEnd"/>
       <w:r>
-        <w:t xml:space="preserve"> PDF </w:t>
-      </w:r>
-      <w:proofErr w:type="gramStart"/>
-      <w:r>
-        <w:t>un link</w:t>
-      </w:r>
-      <w:proofErr w:type="gramEnd"/>
-      <w:r>
-        <w:t xml:space="preserve"> </w:t>
+        <w:t xml:space="preserve"> PDF un link </w:t>
       </w:r>
       <w:proofErr w:type="spellStart"/>
       <w:r>
@@ -22210,15 +22100,7 @@
       </w:r>
       <w:proofErr w:type="spellEnd"/>
       <w:r>
-        <w:t xml:space="preserve"> (</w:t>
-      </w:r>
-      <w:proofErr w:type="gramStart"/>
-      <w:r>
-        <w:t>un Pop-up</w:t>
-      </w:r>
-      <w:proofErr w:type="gramEnd"/>
-      <w:r>
-        <w:t xml:space="preserve"> </w:t>
+        <w:t xml:space="preserve"> (un Pop-up </w:t>
       </w:r>
       <w:proofErr w:type="spellStart"/>
       <w:r>
@@ -23002,12 +22884,10 @@
         <w:t> </w:t>
       </w:r>
       <w:proofErr w:type="spellStart"/>
-      <w:proofErr w:type="gramStart"/>
       <w:r>
         <w:t>pdf.link</w:t>
       </w:r>
       <w:proofErr w:type="spellEnd"/>
-      <w:proofErr w:type="gramEnd"/>
       <w:r>
         <w:t>(...).</w:t>
       </w:r>
@@ -23815,15 +23695,7 @@
       </w:r>
       <w:proofErr w:type="spellEnd"/>
       <w:r>
-        <w:t xml:space="preserve"> </w:t>
-      </w:r>
-      <w:proofErr w:type="gramStart"/>
-      <w:r>
-        <w:t>un ID</w:t>
-      </w:r>
-      <w:proofErr w:type="gramEnd"/>
-      <w:r>
-        <w:t xml:space="preserve"> </w:t>
+        <w:t xml:space="preserve"> un ID </w:t>
       </w:r>
       <w:proofErr w:type="spellStart"/>
       <w:r>
@@ -23931,15 +23803,7 @@
       </w:r>
       <w:proofErr w:type="spellEnd"/>
       <w:r>
-        <w:t xml:space="preserve"> </w:t>
-      </w:r>
-      <w:proofErr w:type="gramStart"/>
-      <w:r>
-        <w:t>a</w:t>
-      </w:r>
-      <w:proofErr w:type="gramEnd"/>
-      <w:r>
-        <w:t xml:space="preserve"> </w:t>
+        <w:t xml:space="preserve"> a </w:t>
       </w:r>
       <w:proofErr w:type="spellStart"/>
       <w:r>
@@ -25018,17 +24882,12 @@
         <w:t xml:space="preserve"> ID-ul ca link </w:t>
       </w:r>
       <w:proofErr w:type="spellStart"/>
-      <w:proofErr w:type="gramStart"/>
       <w:r>
         <w:t>unic</w:t>
       </w:r>
       <w:proofErr w:type="spellEnd"/>
       <w:r>
-        <w:t xml:space="preserve">  il</w:t>
-      </w:r>
-      <w:proofErr w:type="gramEnd"/>
-      <w:r>
-        <w:t xml:space="preserve"> </w:t>
+        <w:t xml:space="preserve">  il </w:t>
       </w:r>
       <w:proofErr w:type="spellStart"/>
       <w:r>
@@ -25079,7 +24938,6 @@
         <w:t xml:space="preserve"> de </w:t>
       </w:r>
       <w:proofErr w:type="spellStart"/>
-      <w:proofErr w:type="gramStart"/>
       <w:r>
         <w:t>aplicatii</w:t>
       </w:r>
@@ -25088,7 +24946,6 @@
         <w:t>(</w:t>
       </w:r>
       <w:proofErr w:type="spellStart"/>
-      <w:proofErr w:type="gramEnd"/>
       <w:r>
         <w:t>ce</w:t>
       </w:r>
@@ -25724,26 +25581,14 @@
         </w:numPr>
       </w:pPr>
       <w:r>
-        <w:t xml:space="preserve">Am pus </w:t>
-      </w:r>
-      <w:proofErr w:type="gramStart"/>
-      <w:r>
-        <w:t>un </w:t>
-      </w:r>
-      <w:r>
-        <w:rPr>
-          <w:b/>
-          <w:bCs/>
-        </w:rPr>
-        <w:t>DELAY</w:t>
-      </w:r>
-      <w:proofErr w:type="gramEnd"/>
-      <w:r>
-        <w:rPr>
-          <w:b/>
-          <w:bCs/>
-        </w:rPr>
-        <w:t xml:space="preserve"> (</w:t>
+        <w:t>Am pus un </w:t>
+      </w:r>
+      <w:r>
+        <w:rPr>
+          <w:b/>
+          <w:bCs/>
+        </w:rPr>
+        <w:t>DELAY (</w:t>
       </w:r>
       <w:proofErr w:type="spellStart"/>
       <w:r>
@@ -26405,15 +26250,7 @@
       </w:r>
       <w:proofErr w:type="spellEnd"/>
       <w:r>
-        <w:t xml:space="preserve"> direct click pe </w:t>
-      </w:r>
-      <w:proofErr w:type="gramStart"/>
-      <w:r>
-        <w:t>un PDF</w:t>
-      </w:r>
-      <w:proofErr w:type="gramEnd"/>
-      <w:r>
-        <w:t xml:space="preserve"> </w:t>
+        <w:t xml:space="preserve"> direct click pe un PDF </w:t>
       </w:r>
       <w:proofErr w:type="spellStart"/>
       <w:r>
@@ -27175,15 +27012,7 @@
       </w:r>
       <w:proofErr w:type="spellEnd"/>
       <w:r>
-        <w:t xml:space="preserve"> </w:t>
-      </w:r>
-      <w:proofErr w:type="gramStart"/>
-      <w:r>
-        <w:t>a</w:t>
-      </w:r>
-      <w:proofErr w:type="gramEnd"/>
-      <w:r>
-        <w:t xml:space="preserve"> </w:t>
+        <w:t xml:space="preserve"> a </w:t>
       </w:r>
       <w:proofErr w:type="spellStart"/>
       <w:r>
@@ -29033,17 +28862,12 @@
         <w:t xml:space="preserve"> e </w:t>
       </w:r>
       <w:proofErr w:type="spellStart"/>
-      <w:proofErr w:type="gramStart"/>
       <w:r>
         <w:t>varianta</w:t>
       </w:r>
       <w:proofErr w:type="spellEnd"/>
       <w:r>
-        <w:t xml:space="preserve"> :Cea</w:t>
-      </w:r>
-      <w:proofErr w:type="gramEnd"/>
-      <w:r>
-        <w:t xml:space="preserve"> </w:t>
+        <w:t xml:space="preserve"> :Cea </w:t>
       </w:r>
       <w:proofErr w:type="spellStart"/>
       <w:r>
@@ -31433,7 +31257,7 @@
                     <pic:cNvPicPr/>
                   </pic:nvPicPr>
                   <pic:blipFill>
-                    <a:blip r:embed="rId10"/>
+                    <a:blip r:embed="rId11"/>
                     <a:stretch>
                       <a:fillRect/>
                     </a:stretch>
@@ -32546,18 +32370,13 @@
       </w:r>
       <w:proofErr w:type="spellEnd"/>
       <w:r>
-        <w:t xml:space="preserve"> in </w:t>
-      </w:r>
-      <w:proofErr w:type="gramStart"/>
-      <w:r>
-        <w:t>pdf ;</w:t>
+        <w:t xml:space="preserve"> in pdf ;</w:t>
       </w:r>
       <w:proofErr w:type="spellStart"/>
       <w:r>
         <w:t>i</w:t>
       </w:r>
       <w:proofErr w:type="spellEnd"/>
-      <w:proofErr w:type="gramEnd"/>
       <w:r>
         <w:t xml:space="preserve"> in </w:t>
       </w:r>
@@ -34215,15 +34034,7 @@
       </w:r>
       <w:proofErr w:type="spellEnd"/>
       <w:r>
-        <w:t xml:space="preserve"> </w:t>
-      </w:r>
-      <w:proofErr w:type="gramStart"/>
-      <w:r>
-        <w:t>a</w:t>
-      </w:r>
-      <w:proofErr w:type="gramEnd"/>
-      <w:r>
-        <w:t xml:space="preserve"> </w:t>
+        <w:t xml:space="preserve"> a </w:t>
       </w:r>
       <w:proofErr w:type="spellStart"/>
       <w:r>
@@ -34540,15 +34351,7 @@
       </w:r>
       <w:proofErr w:type="spellEnd"/>
       <w:r>
-        <w:t xml:space="preserve"> fie </w:t>
-      </w:r>
-      <w:proofErr w:type="gramStart"/>
-      <w:r>
-        <w:t>un link</w:t>
-      </w:r>
-      <w:proofErr w:type="gramEnd"/>
-      <w:r>
-        <w:t xml:space="preserve"> pe care </w:t>
+        <w:t xml:space="preserve"> fie un link pe care </w:t>
       </w:r>
       <w:proofErr w:type="spellStart"/>
       <w:r>
@@ -34663,15 +34466,7 @@
       </w:r>
       <w:proofErr w:type="spellEnd"/>
       <w:r>
-        <w:t xml:space="preserve"> </w:t>
-      </w:r>
-      <w:proofErr w:type="gramStart"/>
-      <w:r>
-        <w:t>un link</w:t>
-      </w:r>
-      <w:proofErr w:type="gramEnd"/>
-      <w:r>
-        <w:t xml:space="preserve"> </w:t>
+        <w:t xml:space="preserve"> un link </w:t>
       </w:r>
       <w:proofErr w:type="spellStart"/>
       <w:r>
@@ -35174,15 +34969,7 @@
       </w:r>
       <w:proofErr w:type="spellEnd"/>
       <w:r>
-        <w:t xml:space="preserve"> fie </w:t>
-      </w:r>
-      <w:proofErr w:type="gramStart"/>
-      <w:r>
-        <w:t>un link</w:t>
-      </w:r>
-      <w:proofErr w:type="gramEnd"/>
-      <w:r>
-        <w:t xml:space="preserve"> pe care </w:t>
+        <w:t xml:space="preserve"> fie un link pe care </w:t>
       </w:r>
       <w:proofErr w:type="spellStart"/>
       <w:r>
@@ -35262,15 +35049,7 @@
       </w:r>
       <w:proofErr w:type="spellEnd"/>
       <w:r>
-        <w:t xml:space="preserve"> </w:t>
-      </w:r>
-      <w:proofErr w:type="gramStart"/>
-      <w:r>
-        <w:t>un link</w:t>
-      </w:r>
-      <w:proofErr w:type="gramEnd"/>
-      <w:r>
-        <w:t xml:space="preserve"> </w:t>
+        <w:t xml:space="preserve"> un link </w:t>
       </w:r>
       <w:proofErr w:type="spellStart"/>
       <w:r>
@@ -35694,23 +35473,7 @@
           <w:b/>
           <w:bCs/>
         </w:rPr>
-        <w:t xml:space="preserve"> fie </w:t>
-      </w:r>
-      <w:proofErr w:type="gramStart"/>
-      <w:r>
-        <w:rPr>
-          <w:b/>
-          <w:bCs/>
-        </w:rPr>
-        <w:t>un link</w:t>
-      </w:r>
-      <w:proofErr w:type="gramEnd"/>
-      <w:r>
-        <w:rPr>
-          <w:b/>
-          <w:bCs/>
-        </w:rPr>
-        <w:t xml:space="preserve"> </w:t>
+        <w:t xml:space="preserve"> fie un link </w:t>
       </w:r>
       <w:proofErr w:type="spellStart"/>
       <w:r>
@@ -36094,7 +35857,6 @@
         </w:rPr>
         <w:t>🚀</w:t>
       </w:r>
-      <w:proofErr w:type="gramStart"/>
       <w:r>
         <w:rPr>
           <w:i/>
@@ -36103,11 +35865,7 @@
         <w:t>"</w:t>
       </w:r>
       <w:r>
-        <w:t>.</w:t>
-      </w:r>
-      <w:proofErr w:type="gramEnd"/>
-      <w:r>
-        <w:t xml:space="preserve"> </w:t>
+        <w:t xml:space="preserve">. </w:t>
       </w:r>
       <w:proofErr w:type="spellStart"/>
       <w:r>
@@ -36280,26 +36038,14 @@
       </w:r>
       <w:proofErr w:type="spellEnd"/>
       <w:r>
-        <w:t xml:space="preserve"> </w:t>
-      </w:r>
-      <w:proofErr w:type="gramStart"/>
-      <w:r>
-        <w:t>un </w:t>
-      </w:r>
-      <w:r>
-        <w:rPr>
-          <w:b/>
-          <w:bCs/>
-        </w:rPr>
-        <w:t>Refresh</w:t>
-      </w:r>
-      <w:proofErr w:type="gramEnd"/>
-      <w:r>
-        <w:rPr>
-          <w:b/>
-          <w:bCs/>
-        </w:rPr>
-        <w:t xml:space="preserve"> (F5)</w:t>
+        <w:t xml:space="preserve"> un </w:t>
+      </w:r>
+      <w:r>
+        <w:rPr>
+          <w:b/>
+          <w:bCs/>
+        </w:rPr>
+        <w:t>Refresh (F5)</w:t>
       </w:r>
       <w:r>
         <w:t xml:space="preserve"> la site, </w:t>
@@ -36568,59 +36314,6 @@
                 <pic:pic xmlns:pic="http://schemas.openxmlformats.org/drawingml/2006/picture">
                   <pic:nvPicPr>
                     <pic:cNvPr id="0" name="Picture 18" descr="User uploaded media 1"/>
-                    <pic:cNvPicPr>
-                      <a:picLocks noChangeAspect="1" noChangeArrowheads="1"/>
-                    </pic:cNvPicPr>
-                  </pic:nvPicPr>
-                  <pic:blipFill>
-                    <a:blip r:embed="rId11">
-                      <a:extLst>
-                        <a:ext uri="{28A0092B-C50C-407E-A947-70E740481C1C}">
-                          <a14:useLocalDpi xmlns:a14="http://schemas.microsoft.com/office/drawing/2010/main" val="0"/>
-                        </a:ext>
-                      </a:extLst>
-                    </a:blip>
-                    <a:srcRect/>
-                    <a:stretch>
-                      <a:fillRect/>
-                    </a:stretch>
-                  </pic:blipFill>
-                  <pic:spPr bwMode="auto">
-                    <a:xfrm>
-                      <a:off x="0" y="0"/>
-                      <a:ext cx="3048000" cy="1714500"/>
-                    </a:xfrm>
-                    <a:prstGeom prst="rect">
-                      <a:avLst/>
-                    </a:prstGeom>
-                    <a:noFill/>
-                    <a:ln>
-                      <a:noFill/>
-                    </a:ln>
-                  </pic:spPr>
-                </pic:pic>
-              </a:graphicData>
-            </a:graphic>
-          </wp:inline>
-        </w:drawing>
-      </w:r>
-    </w:p>
-    <w:p>
-      <w:r>
-        <w:lastRenderedPageBreak/>
-        <w:drawing>
-          <wp:inline distT="0" distB="0" distL="0" distR="0" wp14:anchorId="2C367578" wp14:editId="42B742E5">
-            <wp:extent cx="3048000" cy="1714500"/>
-            <wp:effectExtent l="0" t="0" r="0" b="0"/>
-            <wp:docPr id="1305483680" name="Picture 5" descr="User uploaded media 2"/>
-            <wp:cNvGraphicFramePr>
-              <a:graphicFrameLocks xmlns:a="http://schemas.openxmlformats.org/drawingml/2006/main" noChangeAspect="1"/>
-            </wp:cNvGraphicFramePr>
-            <a:graphic xmlns:a="http://schemas.openxmlformats.org/drawingml/2006/main">
-              <a:graphicData uri="http://schemas.openxmlformats.org/drawingml/2006/picture">
-                <pic:pic xmlns:pic="http://schemas.openxmlformats.org/drawingml/2006/picture">
-                  <pic:nvPicPr>
-                    <pic:cNvPr id="0" name="Picture 19" descr="User uploaded media 2"/>
                     <pic:cNvPicPr>
                       <a:picLocks noChangeAspect="1" noChangeArrowheads="1"/>
                     </pic:cNvPicPr>
@@ -36660,11 +36353,12 @@
     </w:p>
     <w:p>
       <w:r>
+        <w:lastRenderedPageBreak/>
         <w:drawing>
-          <wp:inline distT="0" distB="0" distL="0" distR="0" wp14:anchorId="404543ED" wp14:editId="2B998371">
+          <wp:inline distT="0" distB="0" distL="0" distR="0" wp14:anchorId="2C367578" wp14:editId="42B742E5">
             <wp:extent cx="3048000" cy="1714500"/>
             <wp:effectExtent l="0" t="0" r="0" b="0"/>
-            <wp:docPr id="132365242" name="Picture 4" descr="User uploaded media 3"/>
+            <wp:docPr id="1305483680" name="Picture 5" descr="User uploaded media 2"/>
             <wp:cNvGraphicFramePr>
               <a:graphicFrameLocks xmlns:a="http://schemas.openxmlformats.org/drawingml/2006/main" noChangeAspect="1"/>
             </wp:cNvGraphicFramePr>
@@ -36672,7 +36366,7 @@
               <a:graphicData uri="http://schemas.openxmlformats.org/drawingml/2006/picture">
                 <pic:pic xmlns:pic="http://schemas.openxmlformats.org/drawingml/2006/picture">
                   <pic:nvPicPr>
-                    <pic:cNvPr id="0" name="Picture 20" descr="User uploaded media 3"/>
+                    <pic:cNvPr id="0" name="Picture 19" descr="User uploaded media 2"/>
                     <pic:cNvPicPr>
                       <a:picLocks noChangeAspect="1" noChangeArrowheads="1"/>
                     </pic:cNvPicPr>
@@ -36712,168 +36406,207 @@
     </w:p>
     <w:p>
       <w:r>
-        <w:t xml:space="preserve">inca o data </w:t>
-      </w:r>
-      <w:proofErr w:type="spellStart"/>
-      <w:r>
-        <w:t>neprofesional</w:t>
-      </w:r>
-      <w:proofErr w:type="spellEnd"/>
-      <w:r>
-        <w:t xml:space="preserve"> cu text </w:t>
-      </w:r>
-      <w:proofErr w:type="spellStart"/>
-      <w:r>
-        <w:t>trunchiat</w:t>
-      </w:r>
-      <w:proofErr w:type="spellEnd"/>
-      <w:r>
-        <w:t xml:space="preserve"> </w:t>
-      </w:r>
-      <w:proofErr w:type="spellStart"/>
-      <w:r>
-        <w:t>arata</w:t>
-      </w:r>
-      <w:proofErr w:type="spellEnd"/>
-      <w:r>
-        <w:t xml:space="preserve"> </w:t>
-      </w:r>
-      <w:proofErr w:type="spellStart"/>
-      <w:r>
-        <w:t>oribil</w:t>
-      </w:r>
-      <w:proofErr w:type="spellEnd"/>
-      <w:r>
-        <w:t>. m-</w:t>
-      </w:r>
-      <w:proofErr w:type="gramStart"/>
-      <w:r>
-        <w:t>a</w:t>
-      </w:r>
-      <w:proofErr w:type="gramEnd"/>
-      <w:r>
-        <w:t xml:space="preserve"> </w:t>
-      </w:r>
-      <w:proofErr w:type="spellStart"/>
-      <w:r>
-        <w:t>adus</w:t>
-      </w:r>
-      <w:proofErr w:type="spellEnd"/>
-      <w:r>
-        <w:t xml:space="preserve"> direct in </w:t>
-      </w:r>
-      <w:proofErr w:type="spellStart"/>
-      <w:r>
-        <w:t>proiectul</w:t>
-      </w:r>
-      <w:proofErr w:type="spellEnd"/>
-      <w:r>
-        <w:t xml:space="preserve"> din pdf</w:t>
-      </w:r>
-      <w:proofErr w:type="gramStart"/>
-      <w:r>
-        <w:t>....super</w:t>
-      </w:r>
-      <w:proofErr w:type="gramEnd"/>
+        <w:drawing>
+          <wp:inline distT="0" distB="0" distL="0" distR="0" wp14:anchorId="404543ED" wp14:editId="2B998371">
+            <wp:extent cx="3048000" cy="1714500"/>
+            <wp:effectExtent l="0" t="0" r="0" b="0"/>
+            <wp:docPr id="132365242" name="Picture 4" descr="User uploaded media 3"/>
+            <wp:cNvGraphicFramePr>
+              <a:graphicFrameLocks xmlns:a="http://schemas.openxmlformats.org/drawingml/2006/main" noChangeAspect="1"/>
+            </wp:cNvGraphicFramePr>
+            <a:graphic xmlns:a="http://schemas.openxmlformats.org/drawingml/2006/main">
+              <a:graphicData uri="http://schemas.openxmlformats.org/drawingml/2006/picture">
+                <pic:pic xmlns:pic="http://schemas.openxmlformats.org/drawingml/2006/picture">
+                  <pic:nvPicPr>
+                    <pic:cNvPr id="0" name="Picture 20" descr="User uploaded media 3"/>
+                    <pic:cNvPicPr>
+                      <a:picLocks noChangeAspect="1" noChangeArrowheads="1"/>
+                    </pic:cNvPicPr>
+                  </pic:nvPicPr>
+                  <pic:blipFill>
+                    <a:blip r:embed="rId14">
+                      <a:extLst>
+                        <a:ext uri="{28A0092B-C50C-407E-A947-70E740481C1C}">
+                          <a14:useLocalDpi xmlns:a14="http://schemas.microsoft.com/office/drawing/2010/main" val="0"/>
+                        </a:ext>
+                      </a:extLst>
+                    </a:blip>
+                    <a:srcRect/>
+                    <a:stretch>
+                      <a:fillRect/>
+                    </a:stretch>
+                  </pic:blipFill>
+                  <pic:spPr bwMode="auto">
+                    <a:xfrm>
+                      <a:off x="0" y="0"/>
+                      <a:ext cx="3048000" cy="1714500"/>
+                    </a:xfrm>
+                    <a:prstGeom prst="rect">
+                      <a:avLst/>
+                    </a:prstGeom>
+                    <a:noFill/>
+                    <a:ln>
+                      <a:noFill/>
+                    </a:ln>
+                  </pic:spPr>
+                </pic:pic>
+              </a:graphicData>
+            </a:graphic>
+          </wp:inline>
+        </w:drawing>
+      </w:r>
     </w:p>
     <w:p>
       <w:r>
-        <w:t>5:44 PM</w:t>
+        <w:t xml:space="preserve">inca o data </w:t>
+      </w:r>
+      <w:proofErr w:type="spellStart"/>
+      <w:r>
+        <w:t>neprofesional</w:t>
+      </w:r>
+      <w:proofErr w:type="spellEnd"/>
+      <w:r>
+        <w:t xml:space="preserve"> cu text </w:t>
+      </w:r>
+      <w:proofErr w:type="spellStart"/>
+      <w:r>
+        <w:t>trunchiat</w:t>
+      </w:r>
+      <w:proofErr w:type="spellEnd"/>
+      <w:r>
+        <w:t xml:space="preserve"> </w:t>
+      </w:r>
+      <w:proofErr w:type="spellStart"/>
+      <w:r>
+        <w:t>arata</w:t>
+      </w:r>
+      <w:proofErr w:type="spellEnd"/>
+      <w:r>
+        <w:t xml:space="preserve"> </w:t>
+      </w:r>
+      <w:proofErr w:type="spellStart"/>
+      <w:r>
+        <w:t>oribil</w:t>
+      </w:r>
+      <w:proofErr w:type="spellEnd"/>
+      <w:r>
+        <w:t xml:space="preserve">. m-a </w:t>
+      </w:r>
+      <w:proofErr w:type="spellStart"/>
+      <w:r>
+        <w:t>adus</w:t>
+      </w:r>
+      <w:proofErr w:type="spellEnd"/>
+      <w:r>
+        <w:t xml:space="preserve"> direct in </w:t>
+      </w:r>
+      <w:proofErr w:type="spellStart"/>
+      <w:r>
+        <w:t>proiectul</w:t>
+      </w:r>
+      <w:proofErr w:type="spellEnd"/>
+      <w:r>
+        <w:t xml:space="preserve"> din pdf....super</w:t>
       </w:r>
     </w:p>
     <w:p>
       <w:r>
-        <w:t xml:space="preserve">Ai </w:t>
-      </w:r>
-      <w:proofErr w:type="spellStart"/>
-      <w:r>
-        <w:t>perfectă</w:t>
-      </w:r>
-      <w:proofErr w:type="spellEnd"/>
-      <w:r>
-        <w:t xml:space="preserve"> </w:t>
-      </w:r>
-      <w:proofErr w:type="spellStart"/>
-      <w:r>
-        <w:t>dreptate</w:t>
-      </w:r>
-      <w:proofErr w:type="spellEnd"/>
-      <w:r>
-        <w:t xml:space="preserve">, am </w:t>
-      </w:r>
-      <w:proofErr w:type="spellStart"/>
-      <w:r>
-        <w:t>fost</w:t>
-      </w:r>
-      <w:proofErr w:type="spellEnd"/>
-      <w:r>
-        <w:t xml:space="preserve"> </w:t>
-      </w:r>
-      <w:proofErr w:type="spellStart"/>
-      <w:r>
-        <w:t>prea</w:t>
-      </w:r>
-      <w:proofErr w:type="spellEnd"/>
-      <w:r>
-        <w:t xml:space="preserve"> "</w:t>
-      </w:r>
-      <w:proofErr w:type="spellStart"/>
-      <w:r>
-        <w:t>zbir</w:t>
-      </w:r>
-      <w:proofErr w:type="spellEnd"/>
-      <w:r>
-        <w:t xml:space="preserve">" cu </w:t>
-      </w:r>
-      <w:proofErr w:type="spellStart"/>
-      <w:r>
-        <w:t>limitările</w:t>
-      </w:r>
-      <w:proofErr w:type="spellEnd"/>
-      <w:r>
-        <w:t xml:space="preserve"> de design </w:t>
-      </w:r>
-      <w:proofErr w:type="spellStart"/>
-      <w:r>
-        <w:t>și</w:t>
-      </w:r>
-      <w:proofErr w:type="spellEnd"/>
-      <w:r>
-        <w:t xml:space="preserve"> </w:t>
-      </w:r>
-      <w:proofErr w:type="spellStart"/>
-      <w:r>
-        <w:t>îmi</w:t>
-      </w:r>
-      <w:proofErr w:type="spellEnd"/>
-      <w:r>
-        <w:t xml:space="preserve"> </w:t>
-      </w:r>
-      <w:proofErr w:type="spellStart"/>
-      <w:r>
-        <w:t>cer</w:t>
-      </w:r>
-      <w:proofErr w:type="spellEnd"/>
-      <w:r>
-        <w:t xml:space="preserve"> </w:t>
-      </w:r>
-      <w:proofErr w:type="spellStart"/>
-      <w:r>
-        <w:t>scuze</w:t>
-      </w:r>
-      <w:proofErr w:type="spellEnd"/>
-      <w:r>
-        <w:t xml:space="preserve">! </w:t>
-      </w:r>
-      <w:r>
-        <w:rPr>
-          <w:rFonts w:ascii="Segoe UI Emoji" w:hAnsi="Segoe UI Emoji" w:cs="Segoe UI Emoji"/>
-        </w:rPr>
-        <w:t>😅</w:t>
+        <w:t>5:44 PM</w:t>
       </w:r>
     </w:p>
     <w:p>
       <w:r>
+        <w:t xml:space="preserve">Ai </w:t>
+      </w:r>
+      <w:proofErr w:type="spellStart"/>
+      <w:r>
+        <w:t>perfectă</w:t>
+      </w:r>
+      <w:proofErr w:type="spellEnd"/>
+      <w:r>
+        <w:t xml:space="preserve"> </w:t>
+      </w:r>
+      <w:proofErr w:type="spellStart"/>
+      <w:r>
+        <w:t>dreptate</w:t>
+      </w:r>
+      <w:proofErr w:type="spellEnd"/>
+      <w:r>
+        <w:t xml:space="preserve">, am </w:t>
+      </w:r>
+      <w:proofErr w:type="spellStart"/>
+      <w:r>
+        <w:t>fost</w:t>
+      </w:r>
+      <w:proofErr w:type="spellEnd"/>
+      <w:r>
+        <w:t xml:space="preserve"> </w:t>
+      </w:r>
+      <w:proofErr w:type="spellStart"/>
+      <w:r>
+        <w:t>prea</w:t>
+      </w:r>
+      <w:proofErr w:type="spellEnd"/>
+      <w:r>
+        <w:t xml:space="preserve"> "</w:t>
+      </w:r>
+      <w:proofErr w:type="spellStart"/>
+      <w:r>
+        <w:t>zbir</w:t>
+      </w:r>
+      <w:proofErr w:type="spellEnd"/>
+      <w:r>
+        <w:t xml:space="preserve">" cu </w:t>
+      </w:r>
+      <w:proofErr w:type="spellStart"/>
+      <w:r>
+        <w:t>limitările</w:t>
+      </w:r>
+      <w:proofErr w:type="spellEnd"/>
+      <w:r>
+        <w:t xml:space="preserve"> de design </w:t>
+      </w:r>
+      <w:proofErr w:type="spellStart"/>
+      <w:r>
+        <w:t>și</w:t>
+      </w:r>
+      <w:proofErr w:type="spellEnd"/>
+      <w:r>
+        <w:t xml:space="preserve"> </w:t>
+      </w:r>
+      <w:proofErr w:type="spellStart"/>
+      <w:r>
+        <w:t>îmi</w:t>
+      </w:r>
+      <w:proofErr w:type="spellEnd"/>
+      <w:r>
+        <w:t xml:space="preserve"> </w:t>
+      </w:r>
+      <w:proofErr w:type="spellStart"/>
+      <w:r>
+        <w:t>cer</w:t>
+      </w:r>
+      <w:proofErr w:type="spellEnd"/>
+      <w:r>
+        <w:t xml:space="preserve"> </w:t>
+      </w:r>
+      <w:proofErr w:type="spellStart"/>
+      <w:r>
+        <w:t>scuze</w:t>
+      </w:r>
+      <w:proofErr w:type="spellEnd"/>
+      <w:r>
+        <w:t xml:space="preserve">! </w:t>
+      </w:r>
+      <w:r>
+        <w:rPr>
+          <w:rFonts w:ascii="Segoe UI Emoji" w:hAnsi="Segoe UI Emoji" w:cs="Segoe UI Emoji"/>
+        </w:rPr>
+        <w:t>😅</w:t>
+      </w:r>
+    </w:p>
+    <w:p>
+      <w:r>
         <w:rPr>
           <w:b/>
           <w:bCs/>
@@ -37153,15 +36886,7 @@
       </w:r>
       <w:proofErr w:type="spellEnd"/>
       <w:r>
-        <w:t xml:space="preserve"> </w:t>
-      </w:r>
-      <w:proofErr w:type="gramStart"/>
-      <w:r>
-        <w:t>un plan</w:t>
-      </w:r>
-      <w:proofErr w:type="gramEnd"/>
-      <w:r>
-        <w:t xml:space="preserve"> </w:t>
+        <w:t xml:space="preserve"> un plan </w:t>
       </w:r>
       <w:proofErr w:type="spellStart"/>
       <w:r>
@@ -38916,15 +38641,7 @@
       </w:r>
       <w:proofErr w:type="spellEnd"/>
       <w:r>
-        <w:t xml:space="preserve"> </w:t>
-      </w:r>
-      <w:proofErr w:type="gramStart"/>
-      <w:r>
-        <w:t>un Pop-Up</w:t>
-      </w:r>
-      <w:proofErr w:type="gramEnd"/>
-      <w:r>
-        <w:t xml:space="preserve"> elegant </w:t>
+        <w:t xml:space="preserve"> un Pop-Up elegant </w:t>
       </w:r>
       <w:proofErr w:type="spellStart"/>
       <w:r>
@@ -39772,15 +39489,7 @@
       </w:r>
       <w:proofErr w:type="spellEnd"/>
       <w:r>
-        <w:t xml:space="preserve"> </w:t>
-      </w:r>
-      <w:proofErr w:type="gramStart"/>
-      <w:r>
-        <w:t>un plan</w:t>
-      </w:r>
-      <w:proofErr w:type="gramEnd"/>
-      <w:r>
-        <w:t xml:space="preserve"> </w:t>
+        <w:t xml:space="preserve"> un plan </w:t>
       </w:r>
       <w:proofErr w:type="spellStart"/>
       <w:r>
@@ -39962,15 +39671,7 @@
       </w:r>
       <w:proofErr w:type="spellEnd"/>
       <w:r>
-        <w:t xml:space="preserve"> de </w:t>
-      </w:r>
-      <w:proofErr w:type="gramStart"/>
-      <w:r>
-        <w:t>a</w:t>
-      </w:r>
-      <w:proofErr w:type="gramEnd"/>
-      <w:r>
-        <w:t xml:space="preserve"> "</w:t>
+        <w:t xml:space="preserve"> de a "</w:t>
       </w:r>
       <w:proofErr w:type="spellStart"/>
       <w:r>
@@ -40154,23 +39855,7 @@
           <w:b/>
           <w:bCs/>
         </w:rPr>
-        <w:t xml:space="preserve"> </w:t>
-      </w:r>
-      <w:proofErr w:type="gramStart"/>
-      <w:r>
-        <w:rPr>
-          <w:b/>
-          <w:bCs/>
-        </w:rPr>
-        <w:t>un Client</w:t>
-      </w:r>
-      <w:proofErr w:type="gramEnd"/>
-      <w:r>
-        <w:rPr>
-          <w:b/>
-          <w:bCs/>
-        </w:rPr>
-        <w:t xml:space="preserve"> nou (Demo):</w:t>
+        <w:t xml:space="preserve"> un Client nou (Demo):</w:t>
       </w:r>
     </w:p>
     <w:p>
@@ -41417,15 +41102,7 @@
       </w:r>
       <w:proofErr w:type="spellEnd"/>
       <w:r>
-        <w:t xml:space="preserve"> </w:t>
-      </w:r>
-      <w:proofErr w:type="gramStart"/>
-      <w:r>
-        <w:t>un PDF</w:t>
-      </w:r>
-      <w:proofErr w:type="gramEnd"/>
-      <w:r>
-        <w:t xml:space="preserve"> de 4 </w:t>
+        <w:t xml:space="preserve"> un PDF de 4 </w:t>
       </w:r>
       <w:proofErr w:type="spellStart"/>
       <w:r>
@@ -43240,23 +42917,23 @@
           <w:i/>
           <w:iCs/>
         </w:rPr>
-        <w:t xml:space="preserve">"Aha, are </w:t>
-      </w:r>
-      <w:proofErr w:type="gramStart"/>
+        <w:t xml:space="preserve">"Aha, are un plan </w:t>
+      </w:r>
+      <w:proofErr w:type="spellStart"/>
       <w:r>
         <w:rPr>
           <w:i/>
           <w:iCs/>
         </w:rPr>
-        <w:t>un plan</w:t>
-      </w:r>
-      <w:proofErr w:type="gramEnd"/>
+        <w:t>salvat</w:t>
+      </w:r>
+      <w:proofErr w:type="spellEnd"/>
       <w:r>
         <w:rPr>
           <w:i/>
           <w:iCs/>
         </w:rPr>
-        <w:t xml:space="preserve"> </w:t>
+        <w:t xml:space="preserve">, </w:t>
       </w:r>
       <w:proofErr w:type="spellStart"/>
       <w:r>
@@ -43264,7 +42941,7 @@
           <w:i/>
           <w:iCs/>
         </w:rPr>
-        <w:t>salvat</w:t>
+        <w:t>i</w:t>
       </w:r>
       <w:proofErr w:type="spellEnd"/>
       <w:r>
@@ -43272,7 +42949,7 @@
           <w:i/>
           <w:iCs/>
         </w:rPr>
-        <w:t xml:space="preserve">, </w:t>
+        <w:t xml:space="preserve">-l </w:t>
       </w:r>
       <w:proofErr w:type="spellStart"/>
       <w:r>
@@ -43280,7 +42957,7 @@
           <w:i/>
           <w:iCs/>
         </w:rPr>
-        <w:t>i</w:t>
+        <w:t>arăt</w:t>
       </w:r>
       <w:proofErr w:type="spellEnd"/>
       <w:r>
@@ -43288,22 +42965,6 @@
           <w:i/>
           <w:iCs/>
         </w:rPr>
-        <w:t xml:space="preserve">-l </w:t>
-      </w:r>
-      <w:proofErr w:type="spellStart"/>
-      <w:r>
-        <w:rPr>
-          <w:i/>
-          <w:iCs/>
-        </w:rPr>
-        <w:t>arăt</w:t>
-      </w:r>
-      <w:proofErr w:type="spellEnd"/>
-      <w:r>
-        <w:rPr>
-          <w:i/>
-          <w:iCs/>
-        </w:rPr>
         <w:t xml:space="preserve"> direct"</w:t>
       </w:r>
       <w:r>
@@ -43339,15 +43000,7 @@
       </w:r>
       <w:proofErr w:type="spellEnd"/>
       <w:r>
-        <w:t xml:space="preserve"> </w:t>
-      </w:r>
-      <w:proofErr w:type="gramStart"/>
-      <w:r>
-        <w:t>a</w:t>
-      </w:r>
-      <w:proofErr w:type="gramEnd"/>
-      <w:r>
-        <w:t xml:space="preserve"> </w:t>
+        <w:t xml:space="preserve"> a </w:t>
       </w:r>
       <w:proofErr w:type="spellStart"/>
       <w:r>
@@ -43750,15 +43403,7 @@
       </w:r>
       <w:proofErr w:type="spellEnd"/>
       <w:r>
-        <w:t xml:space="preserve"> </w:t>
-      </w:r>
-      <w:proofErr w:type="gramStart"/>
-      <w:r>
-        <w:t>un Refresh</w:t>
-      </w:r>
-      <w:proofErr w:type="gramEnd"/>
-      <w:r>
-        <w:t xml:space="preserve"> pe site </w:t>
+        <w:t xml:space="preserve"> un Refresh pe site </w:t>
       </w:r>
       <w:proofErr w:type="spellStart"/>
       <w:r>
@@ -44596,15 +44241,7 @@
       </w:r>
       <w:proofErr w:type="spellEnd"/>
       <w:r>
-        <w:t xml:space="preserve"> </w:t>
-      </w:r>
-      <w:proofErr w:type="gramStart"/>
-      <w:r>
-        <w:t>a</w:t>
-      </w:r>
-      <w:proofErr w:type="gramEnd"/>
-      <w:r>
-        <w:t xml:space="preserve"> </w:t>
+        <w:t xml:space="preserve"> a </w:t>
       </w:r>
       <w:proofErr w:type="spellStart"/>
       <w:r>

</xml_diff>